<commit_message>
Align covers with official template, approved editions, filled research rubric
- Cover pages of plan and paper now follow the official Moodle cover
  template (خطة بحث بعنوان / إعداد الطالب / مقدمة إلى / تاريخ التسليم).
- The four-madhhab bibliography entries now cite the exact editions from
  the course's approved fiqh sources list.
- New standalone filled research evaluation guide (موجه تقييم البحث)
  reconstructed from the course form, with per-criterion self-assessment.

Co-Authored-By: Claude Fable 5 <noreply@anthropic.com>
Claude-Session: https://claude.ai/code/session_01ESPDZE2KAqBUfzv5HLVvG7
</commit_message>
<xml_diff>
--- a/seminar/Abd Almahdi Dahla 212684527 - Research Plan.docx
+++ b/seminar/Abd Almahdi Dahla 212684527 - Research Plan.docx
@@ -57,7 +57,7 @@
           <w:szCs w:val="26"/>
           <w:rtl/>
         </w:rPr>
-        <w:t xml:space="preserve">مقترح خطّة بحث بعنوان:</w:t>
+        <w:t xml:space="preserve">خطة بحث بعنوان:</w:t>
       </w:r>
     </w:p>
     <w:p>
@@ -130,7 +130,7 @@
           <w:szCs w:val="28"/>
           <w:rtl/>
         </w:rPr>
-        <w:t xml:space="preserve">حلقة بحث في الدين الإسلاميّ - سيمنار</w:t>
+        <w:t xml:space="preserve">حلقة بحث قضايا فقهيّة ودينيّة معاصرة - سيمنار</w:t>
       </w:r>
     </w:p>
     <w:p/>
@@ -149,7 +149,7 @@
           <w:szCs w:val="26"/>
           <w:rtl/>
         </w:rPr>
-        <w:t xml:space="preserve">مقدَّم من الطالب:</w:t>
+        <w:t xml:space="preserve">إعداد الطالب:</w:t>
       </w:r>
     </w:p>
     <w:p>
@@ -167,7 +167,7 @@
           <w:szCs w:val="28"/>
           <w:rtl/>
         </w:rPr>
-        <w:t xml:space="preserve">عبد المهدي دحلة - 212684527</w:t>
+        <w:t xml:space="preserve">عبد المهدي دحلة</w:t>
       </w:r>
     </w:p>
     <w:p>
@@ -185,10 +185,9 @@
           <w:szCs w:val="26"/>
           <w:rtl/>
         </w:rPr>
-        <w:t xml:space="preserve">التخصص: دين ولغة عربية</w:t>
-      </w:r>
-    </w:p>
-    <w:p/>
+        <w:t xml:space="preserve">رقم هويّة: 212684527</w:t>
+      </w:r>
+    </w:p>
     <w:p>
       <w:pPr>
         <w:bidi/>
@@ -204,9 +203,10 @@
           <w:szCs w:val="26"/>
           <w:rtl/>
         </w:rPr>
-        <w:t xml:space="preserve">مقدَّم إلى المحاضر:</w:t>
-      </w:r>
-    </w:p>
+        <w:t xml:space="preserve">التخصص: دين ولغة عربية</w:t>
+      </w:r>
+    </w:p>
+    <w:p/>
     <w:p>
       <w:pPr>
         <w:bidi/>
@@ -218,14 +218,13 @@
           <w:rFonts w:ascii="Simplified Arabic" w:cs="Simplified Arabic" w:eastAsia="Simplified Arabic" w:hAnsi="Simplified Arabic"/>
           <w:b/>
           <w:bCs/>
-          <w:sz w:val="28"/>
-          <w:szCs w:val="28"/>
-          <w:rtl/>
-        </w:rPr>
-        <w:t xml:space="preserve">د. عوني مصاروة</w:t>
-      </w:r>
-    </w:p>
-    <w:p/>
+          <w:sz w:val="26"/>
+          <w:szCs w:val="26"/>
+          <w:rtl/>
+        </w:rPr>
+        <w:t xml:space="preserve">مقدمة إلى:</w:t>
+      </w:r>
+    </w:p>
     <w:p>
       <w:pPr>
         <w:bidi/>
@@ -237,11 +236,30 @@
           <w:rFonts w:ascii="Simplified Arabic" w:cs="Simplified Arabic" w:eastAsia="Simplified Arabic" w:hAnsi="Simplified Arabic"/>
           <w:b/>
           <w:bCs/>
+          <w:sz w:val="28"/>
+          <w:szCs w:val="28"/>
+          <w:rtl/>
+        </w:rPr>
+        <w:t xml:space="preserve">د. عوني أحمد مصاروة</w:t>
+      </w:r>
+    </w:p>
+    <w:p/>
+    <w:p>
+      <w:pPr>
+        <w:bidi/>
+        <w:spacing w:after="200" w:line="360"/>
+        <w:jc w:val="center"/>
+      </w:pPr>
+      <w:r>
+        <w:rPr>
+          <w:rFonts w:ascii="Simplified Arabic" w:cs="Simplified Arabic" w:eastAsia="Simplified Arabic" w:hAnsi="Simplified Arabic"/>
+          <w:b/>
+          <w:bCs/>
           <w:sz w:val="26"/>
           <w:szCs w:val="26"/>
           <w:rtl/>
         </w:rPr>
-        <w:t xml:space="preserve">السنة الدراسيّة:</w:t>
+        <w:t xml:space="preserve">السّنة الدّراسية: 2026-2025 / 1447هـ</w:t>
       </w:r>
     </w:p>
     <w:p>
@@ -259,25 +277,7 @@
           <w:szCs w:val="26"/>
           <w:rtl/>
         </w:rPr>
-        <w:t xml:space="preserve">1447هـ</w:t>
-      </w:r>
-    </w:p>
-    <w:p>
-      <w:pPr>
-        <w:bidi/>
-        <w:spacing w:after="200" w:line="360"/>
-        <w:jc w:val="center"/>
-      </w:pPr>
-      <w:r>
-        <w:rPr>
-          <w:rFonts w:ascii="Simplified Arabic" w:cs="Simplified Arabic" w:eastAsia="Simplified Arabic" w:hAnsi="Simplified Arabic"/>
-          <w:b/>
-          <w:bCs/>
-          <w:sz w:val="26"/>
-          <w:szCs w:val="26"/>
-          <w:rtl/>
-        </w:rPr>
-        <w:t xml:space="preserve">2025/2026م</w:t>
+        <w:t xml:space="preserve">تاريخ التّسليم: __\__\2026م</w:t>
       </w:r>
     </w:p>
     <w:p>
@@ -7304,7 +7304,7 @@
           <w:szCs w:val="28"/>
           <w:rtl/>
         </w:rPr>
-        <w:t xml:space="preserve">رتّبت المصادر ترتيبًا ألفبائيًّا داخل كلّ قسم.</w:t>
+        <w:t xml:space="preserve">رتّبت المصادر ترتيبًا ألفبائيًّا داخل كلّ قسم، وكتب المذاهب الأربعة مأخوذة من قائمة المصادر الفقهيّة المعتمدة الخاصة بالمساق.</w:t>
       </w:r>
     </w:p>
     <w:p>
@@ -7721,7 +7721,7 @@
           <w:szCs w:val="28"/>
           <w:rtl/>
         </w:rPr>
-        <w:t xml:space="preserve">ابن عابدين، محمد أمين. ردّ المحتار على الدرّ المختار (حاشية ابن عابدين). بيروت: دار الفكر.</w:t>
+        <w:t xml:space="preserve">ابن عابدين، محمد أمين (1421هـ). ردّ المحتار على الدرّ المختار (حاشية ابن عابدين). بيروت: دار الفكر.</w:t>
       </w:r>
     </w:p>
     <w:p>
@@ -7779,7 +7779,7 @@
           <w:szCs w:val="28"/>
           <w:rtl/>
         </w:rPr>
-        <w:t xml:space="preserve">الكاساني، علاء الدين أبو بكر. بدائع الصنائع في ترتيب الشرائع. بيروت: دار الكتب العلمية.</w:t>
+        <w:t xml:space="preserve">الكاساني، علاء الدين أبو بكر (1982). بدائع الصنائع في ترتيب الشرائع. بيروت: دار الكتاب العربي.</w:t>
       </w:r>
     </w:p>
     <w:p>
@@ -7826,7 +7826,7 @@
           <w:szCs w:val="28"/>
           <w:rtl/>
         </w:rPr>
-        <w:t xml:space="preserve">الحطّاب، محمد بن محمد. مواهب الجليل في شرح مختصر خليل. بيروت: دار الفكر.</w:t>
+        <w:t xml:space="preserve">الحطّاب، محمد بن محمد (1398هـ). مواهب الجليل في شرح مختصر خليل. بيروت: دار الفكر.</w:t>
       </w:r>
     </w:p>
     <w:p>
@@ -7884,7 +7884,7 @@
           <w:szCs w:val="28"/>
           <w:rtl/>
         </w:rPr>
-        <w:t xml:space="preserve">القرافي، أحمد بن إدريس. الذخيرة. بيروت: دار الغرب الإسلامي.</w:t>
+        <w:t xml:space="preserve">القرافي، أحمد بن إدريس (1994). الذخيرة. بيروت: دار الغرب.</w:t>
       </w:r>
     </w:p>
     <w:p>
@@ -7931,65 +7931,65 @@
           <w:szCs w:val="28"/>
           <w:rtl/>
         </w:rPr>
-        <w:t xml:space="preserve">الرملي، محمد بن أحمد. نهاية المحتاج إلى شرح المنهاج. بيروت: دار الفكر.</w:t>
-      </w:r>
-    </w:p>
-    <w:p>
-      <w:pPr>
-        <w:bidi/>
-        <w:spacing w:after="160" w:line="360"/>
-        <w:jc w:val="both"/>
-      </w:pPr>
-      <w:r>
-        <w:rPr>
-          <w:rFonts w:ascii="Simplified Arabic" w:cs="Simplified Arabic" w:eastAsia="Simplified Arabic" w:hAnsi="Simplified Arabic"/>
-          <w:b w:val="false"/>
-          <w:bCs w:val="false"/>
-          <w:sz w:val="28"/>
-          <w:szCs w:val="28"/>
-          <w:rtl/>
-        </w:rPr>
-        <w:t xml:space="preserve">- </w:t>
-      </w:r>
-      <w:r>
-        <w:rPr>
-          <w:rFonts w:ascii="Simplified Arabic" w:cs="Simplified Arabic" w:eastAsia="Simplified Arabic" w:hAnsi="Simplified Arabic"/>
-          <w:b w:val="false"/>
-          <w:bCs w:val="false"/>
-          <w:sz w:val="28"/>
-          <w:szCs w:val="28"/>
-          <w:rtl/>
-        </w:rPr>
-        <w:t xml:space="preserve">الشربيني، محمد بن أحمد الخطيب. مغني المحتاج إلى معرفة معاني ألفاظ المنهاج. بيروت: دار الكتب العلمية.</w:t>
-      </w:r>
-    </w:p>
-    <w:p>
-      <w:pPr>
-        <w:bidi/>
-        <w:spacing w:after="160" w:line="360"/>
-        <w:jc w:val="both"/>
-      </w:pPr>
-      <w:r>
-        <w:rPr>
-          <w:rFonts w:ascii="Simplified Arabic" w:cs="Simplified Arabic" w:eastAsia="Simplified Arabic" w:hAnsi="Simplified Arabic"/>
-          <w:b w:val="false"/>
-          <w:bCs w:val="false"/>
-          <w:sz w:val="28"/>
-          <w:szCs w:val="28"/>
-          <w:rtl/>
-        </w:rPr>
-        <w:t xml:space="preserve">- </w:t>
-      </w:r>
-      <w:r>
-        <w:rPr>
-          <w:rFonts w:ascii="Simplified Arabic" w:cs="Simplified Arabic" w:eastAsia="Simplified Arabic" w:hAnsi="Simplified Arabic"/>
-          <w:b w:val="false"/>
-          <w:bCs w:val="false"/>
-          <w:sz w:val="28"/>
-          <w:szCs w:val="28"/>
-          <w:rtl/>
-        </w:rPr>
-        <w:t xml:space="preserve">النووي، يحيى بن شرف. المجموع شرح المهذّب. بيروت: دار الفكر.</w:t>
+        <w:t xml:space="preserve">الرملي، محمد بن أحمد (1404هـ). نهاية المحتاج إلى شرح المنهاج. بيروت: دار الفكر للطباعة.</w:t>
+      </w:r>
+    </w:p>
+    <w:p>
+      <w:pPr>
+        <w:bidi/>
+        <w:spacing w:after="160" w:line="360"/>
+        <w:jc w:val="both"/>
+      </w:pPr>
+      <w:r>
+        <w:rPr>
+          <w:rFonts w:ascii="Simplified Arabic" w:cs="Simplified Arabic" w:eastAsia="Simplified Arabic" w:hAnsi="Simplified Arabic"/>
+          <w:b w:val="false"/>
+          <w:bCs w:val="false"/>
+          <w:sz w:val="28"/>
+          <w:szCs w:val="28"/>
+          <w:rtl/>
+        </w:rPr>
+        <w:t xml:space="preserve">- </w:t>
+      </w:r>
+      <w:r>
+        <w:rPr>
+          <w:rFonts w:ascii="Simplified Arabic" w:cs="Simplified Arabic" w:eastAsia="Simplified Arabic" w:hAnsi="Simplified Arabic"/>
+          <w:b w:val="false"/>
+          <w:bCs w:val="false"/>
+          <w:sz w:val="28"/>
+          <w:szCs w:val="28"/>
+          <w:rtl/>
+        </w:rPr>
+        <w:t xml:space="preserve">الشربيني، محمد بن أحمد الخطيب. مغني المحتاج إلى معرفة معاني ألفاظ المنهاج. بيروت: دار الفكر.</w:t>
+      </w:r>
+    </w:p>
+    <w:p>
+      <w:pPr>
+        <w:bidi/>
+        <w:spacing w:after="160" w:line="360"/>
+        <w:jc w:val="both"/>
+      </w:pPr>
+      <w:r>
+        <w:rPr>
+          <w:rFonts w:ascii="Simplified Arabic" w:cs="Simplified Arabic" w:eastAsia="Simplified Arabic" w:hAnsi="Simplified Arabic"/>
+          <w:b w:val="false"/>
+          <w:bCs w:val="false"/>
+          <w:sz w:val="28"/>
+          <w:szCs w:val="28"/>
+          <w:rtl/>
+        </w:rPr>
+        <w:t xml:space="preserve">- </w:t>
+      </w:r>
+      <w:r>
+        <w:rPr>
+          <w:rFonts w:ascii="Simplified Arabic" w:cs="Simplified Arabic" w:eastAsia="Simplified Arabic" w:hAnsi="Simplified Arabic"/>
+          <w:b w:val="false"/>
+          <w:bCs w:val="false"/>
+          <w:sz w:val="28"/>
+          <w:szCs w:val="28"/>
+          <w:rtl/>
+        </w:rPr>
+        <w:t xml:space="preserve">النووي، يحيى بن شرف (1997). المجموع شرح المهذّب. بيروت: دار الفكر.</w:t>
       </w:r>
     </w:p>
     <w:p>
@@ -8036,36 +8036,36 @@
           <w:szCs w:val="28"/>
           <w:rtl/>
         </w:rPr>
-        <w:t xml:space="preserve">ابن قدامة، عبد الله بن أحمد المقدسي. المغني. القاهرة: مكتبة القاهرة.</w:t>
-      </w:r>
-    </w:p>
-    <w:p>
-      <w:pPr>
-        <w:bidi/>
-        <w:spacing w:after="160" w:line="360"/>
-        <w:jc w:val="both"/>
-      </w:pPr>
-      <w:r>
-        <w:rPr>
-          <w:rFonts w:ascii="Simplified Arabic" w:cs="Simplified Arabic" w:eastAsia="Simplified Arabic" w:hAnsi="Simplified Arabic"/>
-          <w:b w:val="false"/>
-          <w:bCs w:val="false"/>
-          <w:sz w:val="28"/>
-          <w:szCs w:val="28"/>
-          <w:rtl/>
-        </w:rPr>
-        <w:t xml:space="preserve">- </w:t>
-      </w:r>
-      <w:r>
-        <w:rPr>
-          <w:rFonts w:ascii="Simplified Arabic" w:cs="Simplified Arabic" w:eastAsia="Simplified Arabic" w:hAnsi="Simplified Arabic"/>
-          <w:b w:val="false"/>
-          <w:bCs w:val="false"/>
-          <w:sz w:val="28"/>
-          <w:szCs w:val="28"/>
-          <w:rtl/>
-        </w:rPr>
-        <w:t xml:space="preserve">البهوتي، منصور بن يونس. كشّاف القناع عن متن الإقناع. بيروت: دار الكتب العلمية.</w:t>
+        <w:t xml:space="preserve">ابن قدامة، عبد الله بن أحمد المقدسي (1405هـ). المغني. بيروت: دار الفكر.</w:t>
+      </w:r>
+    </w:p>
+    <w:p>
+      <w:pPr>
+        <w:bidi/>
+        <w:spacing w:after="160" w:line="360"/>
+        <w:jc w:val="both"/>
+      </w:pPr>
+      <w:r>
+        <w:rPr>
+          <w:rFonts w:ascii="Simplified Arabic" w:cs="Simplified Arabic" w:eastAsia="Simplified Arabic" w:hAnsi="Simplified Arabic"/>
+          <w:b w:val="false"/>
+          <w:bCs w:val="false"/>
+          <w:sz w:val="28"/>
+          <w:szCs w:val="28"/>
+          <w:rtl/>
+        </w:rPr>
+        <w:t xml:space="preserve">- </w:t>
+      </w:r>
+      <w:r>
+        <w:rPr>
+          <w:rFonts w:ascii="Simplified Arabic" w:cs="Simplified Arabic" w:eastAsia="Simplified Arabic" w:hAnsi="Simplified Arabic"/>
+          <w:b w:val="false"/>
+          <w:bCs w:val="false"/>
+          <w:sz w:val="28"/>
+          <w:szCs w:val="28"/>
+          <w:rtl/>
+        </w:rPr>
+        <w:t xml:space="preserve">البهوتي، منصور بن يونس (1402هـ). كشّاف القناع عن متن الإقناع. بيروت: دار الفكر.</w:t>
       </w:r>
     </w:p>
     <w:p>

</xml_diff>

<commit_message>
Add official academy logo to cover pages of seminar and research plan
Co-Authored-By: Claude Fable 5 <noreply@anthropic.com>
Claude-Session: https://claude.ai/code/session_01ESPDZE2KAqBUfzv5HLVvG7
</commit_message>
<xml_diff>
--- a/seminar/Abd Almahdi Dahla 212684527 - Research Plan.docx
+++ b/seminar/Abd Almahdi Dahla 212684527 - Research Plan.docx
@@ -3,7 +3,52 @@
 <w:document xmlns:wpc="http://schemas.microsoft.com/office/word/2010/wordprocessingCanvas" xmlns:mc="http://schemas.openxmlformats.org/markup-compatibility/2006" xmlns:o="urn:schemas-microsoft-com:office:office" xmlns:r="http://schemas.openxmlformats.org/officeDocument/2006/relationships" xmlns:m="http://schemas.openxmlformats.org/officeDocument/2006/math" xmlns:v="urn:schemas-microsoft-com:vml" xmlns:wp14="http://schemas.microsoft.com/office/word/2010/wordprocessingDrawing" xmlns:wp="http://schemas.openxmlformats.org/drawingml/2006/wordprocessingDrawing" xmlns:w10="urn:schemas-microsoft-com:office:word" xmlns:w="http://schemas.openxmlformats.org/wordprocessingml/2006/main" xmlns:w14="http://schemas.microsoft.com/office/word/2010/wordml" xmlns:w15="http://schemas.microsoft.com/office/word/2012/wordml" xmlns:wpg="http://schemas.microsoft.com/office/word/2010/wordprocessingGroup" xmlns:wpi="http://schemas.microsoft.com/office/word/2010/wordprocessingInk" xmlns:wne="http://schemas.microsoft.com/office/word/2006/wordml" xmlns:wps="http://schemas.microsoft.com/office/word/2010/wordprocessingShape" xmlns:cx="http://schemas.microsoft.com/office/drawing/2014/chartex" xmlns:cx1="http://schemas.microsoft.com/office/drawing/2015/9/8/chartex" xmlns:cx2="http://schemas.microsoft.com/office/drawing/2015/10/21/chartex" xmlns:cx3="http://schemas.microsoft.com/office/drawing/2016/5/9/chartex" xmlns:cx4="http://schemas.microsoft.com/office/drawing/2016/5/10/chartex" xmlns:cx5="http://schemas.microsoft.com/office/drawing/2016/5/11/chartex" xmlns:cx6="http://schemas.microsoft.com/office/drawing/2016/5/12/chartex" xmlns:cx7="http://schemas.microsoft.com/office/drawing/2016/5/13/chartex" xmlns:cx8="http://schemas.microsoft.com/office/drawing/2016/5/14/chartex" xmlns:aink="http://schemas.microsoft.com/office/drawing/2016/ink" xmlns:am3d="http://schemas.microsoft.com/office/drawing/2017/model3d" xmlns:w16cex="http://schemas.microsoft.com/office/word/2018/wordml/cex" xmlns:w16cid="http://schemas.microsoft.com/office/word/2016/wordml/cid" xmlns:w16="http://schemas.microsoft.com/office/word/2018/wordml" xmlns:w16sdtdh="http://schemas.microsoft.com/office/word/2020/wordml/sdtdatahash" xmlns:w16se="http://schemas.microsoft.com/office/word/2015/wordml/symex" mc:Ignorable="w14 w15 wp14">
   <w:body>
     <w:p/>
-    <w:p/>
+    <w:p>
+      <w:pPr>
+        <w:spacing w:after="200"/>
+        <w:jc w:val="center"/>
+      </w:pPr>
+      <w:r>
+        <w:drawing>
+          <wp:inline distT="0" distB="0" distL="0" distR="0">
+            <wp:extent cx="1238250" cy="1228725"/>
+            <wp:effectExtent t="0" r="0" b="0" l="0"/>
+            <wp:docPr id="1" name="" descr="" title=""/>
+            <wp:cNvGraphicFramePr>
+              <a:graphicFrameLocks xmlns:a="http://schemas.openxmlformats.org/drawingml/2006/main" noChangeAspect="1"/>
+            </wp:cNvGraphicFramePr>
+            <a:graphic xmlns:a="http://schemas.openxmlformats.org/drawingml/2006/main">
+              <a:graphicData uri="http://schemas.openxmlformats.org/drawingml/2006/picture">
+                <pic:pic xmlns:pic="http://schemas.openxmlformats.org/drawingml/2006/picture">
+                  <pic:nvPicPr>
+                    <pic:cNvPr id="0" name="" descr=""/>
+                    <pic:cNvPicPr>
+                      <a:picLocks noChangeAspect="1" noChangeArrowheads="1"/>
+                    </pic:cNvPicPr>
+                  </pic:nvPicPr>
+                  <pic:blipFill>
+                    <a:blip r:embed="rId8" cstate="none"/>
+                    <a:srcRect/>
+                    <a:stretch>
+                      <a:fillRect/>
+                    </a:stretch>
+                  </pic:blipFill>
+                  <pic:spPr bwMode="auto">
+                    <a:xfrm>
+                      <a:off x="0" y="0"/>
+                      <a:ext cx="1238250" cy="1228725"/>
+                    </a:xfrm>
+                    <a:prstGeom prst="rect">
+                      <a:avLst/>
+                    </a:prstGeom>
+                  </pic:spPr>
+                </pic:pic>
+              </a:graphicData>
+            </a:graphic>
+          </wp:inline>
+        </w:drawing>
+      </w:r>
+    </w:p>
     <w:p>
       <w:pPr>
         <w:bidi/>

</xml_diff>

<commit_message>
Make study links active hyperlinks in seminar and research plan
Each of the 27 previous-studies entries now has a clickable hyperlink
labeled next to the plain URL, in both documents; proofing-hide settings
re-applied after rebuild.

Co-Authored-By: Claude Fable 5 <noreply@anthropic.com>
Claude-Session: https://claude.ai/code/session_01ESPDZE2KAqBUfzv5HLVvG7
</commit_message>
<xml_diff>
--- a/seminar/Abd Almahdi Dahla 212684527 - Research Plan.docx
+++ b/seminar/Abd Almahdi Dahla 212684527 - Research Plan.docx
@@ -610,16 +610,31 @@
         </w:rPr>
         <w:t xml:space="preserve">رابط الدراسة: </w:t>
       </w:r>
-      <w:r>
-        <w:rPr>
-          <w:rFonts w:ascii="Simplified Arabic" w:cs="Simplified Arabic" w:eastAsia="Simplified Arabic" w:hAnsi="Simplified Arabic"/>
-          <w:b w:val="false"/>
-          <w:bCs w:val="false"/>
-          <w:sz w:val="28"/>
-          <w:szCs w:val="28"/>
-          <w:rtl/>
-        </w:rPr>
-        <w:t xml:space="preserve">https://journals.ekb.eg/article_368941_0.html</w:t>
+      <w:hyperlink w:history="1" r:id="rId9xcu8igdslh3lvh-iaolv">
+        <w:r>
+          <w:rPr>
+            <w:rFonts w:ascii="Simplified Arabic" w:cs="Simplified Arabic" w:eastAsia="Simplified Arabic" w:hAnsi="Simplified Arabic"/>
+            <w:b/>
+            <w:bCs/>
+            <w:color w:val="0563C1"/>
+            <w:sz w:val="28"/>
+            <w:szCs w:val="28"/>
+            <w:u w:val="single"/>
+            <w:rtl/>
+          </w:rPr>
+          <w:t xml:space="preserve">موقع الدراسة</w:t>
+        </w:r>
+      </w:hyperlink>
+      <w:r>
+        <w:rPr>
+          <w:rFonts w:ascii="Simplified Arabic" w:cs="Simplified Arabic" w:eastAsia="Simplified Arabic" w:hAnsi="Simplified Arabic"/>
+          <w:b w:val="false"/>
+          <w:bCs w:val="false"/>
+          <w:sz w:val="28"/>
+          <w:szCs w:val="28"/>
+          <w:rtl/>
+        </w:rPr>
+        <w:t xml:space="preserve">  ( https://journals.ekb.eg/article_368941_0.html )</w:t>
       </w:r>
     </w:p>
     <w:p>
@@ -756,16 +771,31 @@
         </w:rPr>
         <w:t xml:space="preserve">رابط الدراسة: </w:t>
       </w:r>
-      <w:r>
-        <w:rPr>
-          <w:rFonts w:ascii="Simplified Arabic" w:cs="Simplified Arabic" w:eastAsia="Simplified Arabic" w:hAnsi="Simplified Arabic"/>
-          <w:b w:val="false"/>
-          <w:bCs w:val="false"/>
-          <w:sz w:val="28"/>
-          <w:szCs w:val="28"/>
-          <w:rtl/>
-        </w:rPr>
-        <w:t xml:space="preserve">https://mjle.journals.ekb.eg/article_368941_50690f4113b5efc26ad3acb040dabad4.pdf</w:t>
+      <w:hyperlink w:history="1" r:id="rId4pjjygyudm8e37odg5dfi">
+        <w:r>
+          <w:rPr>
+            <w:rFonts w:ascii="Simplified Arabic" w:cs="Simplified Arabic" w:eastAsia="Simplified Arabic" w:hAnsi="Simplified Arabic"/>
+            <w:b/>
+            <w:bCs/>
+            <w:color w:val="0563C1"/>
+            <w:sz w:val="28"/>
+            <w:szCs w:val="28"/>
+            <w:u w:val="single"/>
+            <w:rtl/>
+          </w:rPr>
+          <w:t xml:space="preserve">موقع الدراسة</w:t>
+        </w:r>
+      </w:hyperlink>
+      <w:r>
+        <w:rPr>
+          <w:rFonts w:ascii="Simplified Arabic" w:cs="Simplified Arabic" w:eastAsia="Simplified Arabic" w:hAnsi="Simplified Arabic"/>
+          <w:b w:val="false"/>
+          <w:bCs w:val="false"/>
+          <w:sz w:val="28"/>
+          <w:szCs w:val="28"/>
+          <w:rtl/>
+        </w:rPr>
+        <w:t xml:space="preserve">  ( https://mjle.journals.ekb.eg/article_368941_50690f4113b5efc26ad3acb040dabad4.pdf )</w:t>
       </w:r>
     </w:p>
     <w:p>
@@ -902,16 +932,31 @@
         </w:rPr>
         <w:t xml:space="preserve">رابط الدراسة: </w:t>
       </w:r>
-      <w:r>
-        <w:rPr>
-          <w:rFonts w:ascii="Simplified Arabic" w:cs="Simplified Arabic" w:eastAsia="Simplified Arabic" w:hAnsi="Simplified Arabic"/>
-          <w:b w:val="false"/>
-          <w:bCs w:val="false"/>
-          <w:sz w:val="28"/>
-          <w:szCs w:val="28"/>
-          <w:rtl/>
-        </w:rPr>
-        <w:t xml:space="preserve">https://search.mandumah.com/Record/1633970</w:t>
+      <w:hyperlink w:history="1" r:id="rId5-yrwt9mp8hc1sqkerzfn">
+        <w:r>
+          <w:rPr>
+            <w:rFonts w:ascii="Simplified Arabic" w:cs="Simplified Arabic" w:eastAsia="Simplified Arabic" w:hAnsi="Simplified Arabic"/>
+            <w:b/>
+            <w:bCs/>
+            <w:color w:val="0563C1"/>
+            <w:sz w:val="28"/>
+            <w:szCs w:val="28"/>
+            <w:u w:val="single"/>
+            <w:rtl/>
+          </w:rPr>
+          <w:t xml:space="preserve">موقع الدراسة</w:t>
+        </w:r>
+      </w:hyperlink>
+      <w:r>
+        <w:rPr>
+          <w:rFonts w:ascii="Simplified Arabic" w:cs="Simplified Arabic" w:eastAsia="Simplified Arabic" w:hAnsi="Simplified Arabic"/>
+          <w:b w:val="false"/>
+          <w:bCs w:val="false"/>
+          <w:sz w:val="28"/>
+          <w:szCs w:val="28"/>
+          <w:rtl/>
+        </w:rPr>
+        <w:t xml:space="preserve">  ( https://search.mandumah.com/Record/1633970 )</w:t>
       </w:r>
     </w:p>
     <w:p>
@@ -1048,16 +1093,31 @@
         </w:rPr>
         <w:t xml:space="preserve">رابط الدراسة: </w:t>
       </w:r>
-      <w:r>
-        <w:rPr>
-          <w:rFonts w:ascii="Simplified Arabic" w:cs="Simplified Arabic" w:eastAsia="Simplified Arabic" w:hAnsi="Simplified Arabic"/>
-          <w:b w:val="false"/>
-          <w:bCs w:val="false"/>
-          <w:sz w:val="28"/>
-          <w:szCs w:val="28"/>
-          <w:rtl/>
-        </w:rPr>
-        <w:t xml:space="preserve">https://doi.org/10.65414/najsp.v2i4.281</w:t>
+      <w:hyperlink w:history="1" r:id="rIdhhlbfyou-wvgmz-c74ejk">
+        <w:r>
+          <w:rPr>
+            <w:rFonts w:ascii="Simplified Arabic" w:cs="Simplified Arabic" w:eastAsia="Simplified Arabic" w:hAnsi="Simplified Arabic"/>
+            <w:b/>
+            <w:bCs/>
+            <w:color w:val="0563C1"/>
+            <w:sz w:val="28"/>
+            <w:szCs w:val="28"/>
+            <w:u w:val="single"/>
+            <w:rtl/>
+          </w:rPr>
+          <w:t xml:space="preserve">موقع الدراسة</w:t>
+        </w:r>
+      </w:hyperlink>
+      <w:r>
+        <w:rPr>
+          <w:rFonts w:ascii="Simplified Arabic" w:cs="Simplified Arabic" w:eastAsia="Simplified Arabic" w:hAnsi="Simplified Arabic"/>
+          <w:b w:val="false"/>
+          <w:bCs w:val="false"/>
+          <w:sz w:val="28"/>
+          <w:szCs w:val="28"/>
+          <w:rtl/>
+        </w:rPr>
+        <w:t xml:space="preserve">  ( https://doi.org/10.65414/najsp.v2i4.281 )</w:t>
       </w:r>
     </w:p>
     <w:p>
@@ -1194,16 +1254,31 @@
         </w:rPr>
         <w:t xml:space="preserve">رابط الدراسة: </w:t>
       </w:r>
-      <w:r>
-        <w:rPr>
-          <w:rFonts w:ascii="Simplified Arabic" w:cs="Simplified Arabic" w:eastAsia="Simplified Arabic" w:hAnsi="Simplified Arabic"/>
-          <w:b w:val="false"/>
-          <w:bCs w:val="false"/>
-          <w:sz w:val="28"/>
-          <w:szCs w:val="28"/>
-          <w:rtl/>
-        </w:rPr>
-        <w:t xml:space="preserve">https://doi.org/10.61353/ma.0000141</w:t>
+      <w:hyperlink w:history="1" r:id="rIdkjqk0x0g06rzhn51akenu">
+        <w:r>
+          <w:rPr>
+            <w:rFonts w:ascii="Simplified Arabic" w:cs="Simplified Arabic" w:eastAsia="Simplified Arabic" w:hAnsi="Simplified Arabic"/>
+            <w:b/>
+            <w:bCs/>
+            <w:color w:val="0563C1"/>
+            <w:sz w:val="28"/>
+            <w:szCs w:val="28"/>
+            <w:u w:val="single"/>
+            <w:rtl/>
+          </w:rPr>
+          <w:t xml:space="preserve">موقع الدراسة</w:t>
+        </w:r>
+      </w:hyperlink>
+      <w:r>
+        <w:rPr>
+          <w:rFonts w:ascii="Simplified Arabic" w:cs="Simplified Arabic" w:eastAsia="Simplified Arabic" w:hAnsi="Simplified Arabic"/>
+          <w:b w:val="false"/>
+          <w:bCs w:val="false"/>
+          <w:sz w:val="28"/>
+          <w:szCs w:val="28"/>
+          <w:rtl/>
+        </w:rPr>
+        <w:t xml:space="preserve">  ( https://doi.org/10.61353/ma.0000141 )</w:t>
       </w:r>
     </w:p>
     <w:p>
@@ -1340,16 +1415,31 @@
         </w:rPr>
         <w:t xml:space="preserve">رابط الدراسة: </w:t>
       </w:r>
-      <w:r>
-        <w:rPr>
-          <w:rFonts w:ascii="Simplified Arabic" w:cs="Simplified Arabic" w:eastAsia="Simplified Arabic" w:hAnsi="Simplified Arabic"/>
-          <w:b w:val="false"/>
-          <w:bCs w:val="false"/>
-          <w:sz w:val="28"/>
-          <w:szCs w:val="28"/>
-          <w:rtl/>
-        </w:rPr>
-        <w:t xml:space="preserve">https://www.researchgate.net/publication/393318043</w:t>
+      <w:hyperlink w:history="1" r:id="rIdhne-6qjr54fewkaryf2jk">
+        <w:r>
+          <w:rPr>
+            <w:rFonts w:ascii="Simplified Arabic" w:cs="Simplified Arabic" w:eastAsia="Simplified Arabic" w:hAnsi="Simplified Arabic"/>
+            <w:b/>
+            <w:bCs/>
+            <w:color w:val="0563C1"/>
+            <w:sz w:val="28"/>
+            <w:szCs w:val="28"/>
+            <w:u w:val="single"/>
+            <w:rtl/>
+          </w:rPr>
+          <w:t xml:space="preserve">موقع الدراسة</w:t>
+        </w:r>
+      </w:hyperlink>
+      <w:r>
+        <w:rPr>
+          <w:rFonts w:ascii="Simplified Arabic" w:cs="Simplified Arabic" w:eastAsia="Simplified Arabic" w:hAnsi="Simplified Arabic"/>
+          <w:b w:val="false"/>
+          <w:bCs w:val="false"/>
+          <w:sz w:val="28"/>
+          <w:szCs w:val="28"/>
+          <w:rtl/>
+        </w:rPr>
+        <w:t xml:space="preserve">  ( https://www.researchgate.net/publication/393318043 )</w:t>
       </w:r>
     </w:p>
     <w:p>
@@ -1486,16 +1576,31 @@
         </w:rPr>
         <w:t xml:space="preserve">رابط الدراسة: </w:t>
       </w:r>
-      <w:r>
-        <w:rPr>
-          <w:rFonts w:ascii="Simplified Arabic" w:cs="Simplified Arabic" w:eastAsia="Simplified Arabic" w:hAnsi="Simplified Arabic"/>
-          <w:b w:val="false"/>
-          <w:bCs w:val="false"/>
-          <w:sz w:val="28"/>
-          <w:szCs w:val="28"/>
-          <w:rtl/>
-        </w:rPr>
-        <w:t xml:space="preserve">https://bcchj.uobabylon.edu.iq/index.php/bcchj/ar/article/view/1016</w:t>
+      <w:hyperlink w:history="1" r:id="rIdwr-peeriyiy_b9l3wohad">
+        <w:r>
+          <w:rPr>
+            <w:rFonts w:ascii="Simplified Arabic" w:cs="Simplified Arabic" w:eastAsia="Simplified Arabic" w:hAnsi="Simplified Arabic"/>
+            <w:b/>
+            <w:bCs/>
+            <w:color w:val="0563C1"/>
+            <w:sz w:val="28"/>
+            <w:szCs w:val="28"/>
+            <w:u w:val="single"/>
+            <w:rtl/>
+          </w:rPr>
+          <w:t xml:space="preserve">موقع الدراسة</w:t>
+        </w:r>
+      </w:hyperlink>
+      <w:r>
+        <w:rPr>
+          <w:rFonts w:ascii="Simplified Arabic" w:cs="Simplified Arabic" w:eastAsia="Simplified Arabic" w:hAnsi="Simplified Arabic"/>
+          <w:b w:val="false"/>
+          <w:bCs w:val="false"/>
+          <w:sz w:val="28"/>
+          <w:szCs w:val="28"/>
+          <w:rtl/>
+        </w:rPr>
+        <w:t xml:space="preserve">  ( https://bcchj.uobabylon.edu.iq/index.php/bcchj/ar/article/view/1016 )</w:t>
       </w:r>
     </w:p>
     <w:p>
@@ -1632,16 +1737,31 @@
         </w:rPr>
         <w:t xml:space="preserve">رابط الدراسة: </w:t>
       </w:r>
-      <w:r>
-        <w:rPr>
-          <w:rFonts w:ascii="Simplified Arabic" w:cs="Simplified Arabic" w:eastAsia="Simplified Arabic" w:hAnsi="Simplified Arabic"/>
-          <w:b w:val="false"/>
-          <w:bCs w:val="false"/>
-          <w:sz w:val="28"/>
-          <w:szCs w:val="28"/>
-          <w:rtl/>
-        </w:rPr>
-        <w:t xml:space="preserve">https://asjp.cerist.dz/en/article/198662</w:t>
+      <w:hyperlink w:history="1" r:id="rIdxki9qeiuv8hn2sb-4xd5o">
+        <w:r>
+          <w:rPr>
+            <w:rFonts w:ascii="Simplified Arabic" w:cs="Simplified Arabic" w:eastAsia="Simplified Arabic" w:hAnsi="Simplified Arabic"/>
+            <w:b/>
+            <w:bCs/>
+            <w:color w:val="0563C1"/>
+            <w:sz w:val="28"/>
+            <w:szCs w:val="28"/>
+            <w:u w:val="single"/>
+            <w:rtl/>
+          </w:rPr>
+          <w:t xml:space="preserve">موقع الدراسة</w:t>
+        </w:r>
+      </w:hyperlink>
+      <w:r>
+        <w:rPr>
+          <w:rFonts w:ascii="Simplified Arabic" w:cs="Simplified Arabic" w:eastAsia="Simplified Arabic" w:hAnsi="Simplified Arabic"/>
+          <w:b w:val="false"/>
+          <w:bCs w:val="false"/>
+          <w:sz w:val="28"/>
+          <w:szCs w:val="28"/>
+          <w:rtl/>
+        </w:rPr>
+        <w:t xml:space="preserve">  ( https://asjp.cerist.dz/en/article/198662 )</w:t>
       </w:r>
     </w:p>
     <w:p>
@@ -1778,16 +1898,31 @@
         </w:rPr>
         <w:t xml:space="preserve">رابط الدراسة: </w:t>
       </w:r>
-      <w:r>
-        <w:rPr>
-          <w:rFonts w:ascii="Simplified Arabic" w:cs="Simplified Arabic" w:eastAsia="Simplified Arabic" w:hAnsi="Simplified Arabic"/>
-          <w:b w:val="false"/>
-          <w:bCs w:val="false"/>
-          <w:sz w:val="28"/>
-          <w:szCs w:val="28"/>
-          <w:rtl/>
-        </w:rPr>
-        <w:t xml:space="preserve">https://search.mandumah.com/Record/1232048</w:t>
+      <w:hyperlink w:history="1" r:id="rIdgz_ayuxzeb_15ebqp4zav">
+        <w:r>
+          <w:rPr>
+            <w:rFonts w:ascii="Simplified Arabic" w:cs="Simplified Arabic" w:eastAsia="Simplified Arabic" w:hAnsi="Simplified Arabic"/>
+            <w:b/>
+            <w:bCs/>
+            <w:color w:val="0563C1"/>
+            <w:sz w:val="28"/>
+            <w:szCs w:val="28"/>
+            <w:u w:val="single"/>
+            <w:rtl/>
+          </w:rPr>
+          <w:t xml:space="preserve">موقع الدراسة</w:t>
+        </w:r>
+      </w:hyperlink>
+      <w:r>
+        <w:rPr>
+          <w:rFonts w:ascii="Simplified Arabic" w:cs="Simplified Arabic" w:eastAsia="Simplified Arabic" w:hAnsi="Simplified Arabic"/>
+          <w:b w:val="false"/>
+          <w:bCs w:val="false"/>
+          <w:sz w:val="28"/>
+          <w:szCs w:val="28"/>
+          <w:rtl/>
+        </w:rPr>
+        <w:t xml:space="preserve">  ( https://search.mandumah.com/Record/1232048 )</w:t>
       </w:r>
     </w:p>
     <w:p>
@@ -1924,16 +2059,31 @@
         </w:rPr>
         <w:t xml:space="preserve">رابط الدراسة: </w:t>
       </w:r>
-      <w:r>
-        <w:rPr>
-          <w:rFonts w:ascii="Simplified Arabic" w:cs="Simplified Arabic" w:eastAsia="Simplified Arabic" w:hAnsi="Simplified Arabic"/>
-          <w:b w:val="false"/>
-          <w:bCs w:val="false"/>
-          <w:sz w:val="28"/>
-          <w:szCs w:val="28"/>
-          <w:rtl/>
-        </w:rPr>
-        <w:t xml:space="preserve">https://journals.alqasimia.ac.ae/index.php/ssis/article/view/66</w:t>
+      <w:hyperlink w:history="1" r:id="rIdnjazdtmvxjnvhgykgzwph">
+        <w:r>
+          <w:rPr>
+            <w:rFonts w:ascii="Simplified Arabic" w:cs="Simplified Arabic" w:eastAsia="Simplified Arabic" w:hAnsi="Simplified Arabic"/>
+            <w:b/>
+            <w:bCs/>
+            <w:color w:val="0563C1"/>
+            <w:sz w:val="28"/>
+            <w:szCs w:val="28"/>
+            <w:u w:val="single"/>
+            <w:rtl/>
+          </w:rPr>
+          <w:t xml:space="preserve">موقع الدراسة</w:t>
+        </w:r>
+      </w:hyperlink>
+      <w:r>
+        <w:rPr>
+          <w:rFonts w:ascii="Simplified Arabic" w:cs="Simplified Arabic" w:eastAsia="Simplified Arabic" w:hAnsi="Simplified Arabic"/>
+          <w:b w:val="false"/>
+          <w:bCs w:val="false"/>
+          <w:sz w:val="28"/>
+          <w:szCs w:val="28"/>
+          <w:rtl/>
+        </w:rPr>
+        <w:t xml:space="preserve">  ( https://journals.alqasimia.ac.ae/index.php/ssis/article/view/66 )</w:t>
       </w:r>
     </w:p>
     <w:p>
@@ -2070,16 +2220,31 @@
         </w:rPr>
         <w:t xml:space="preserve">رابط الدراسة: </w:t>
       </w:r>
-      <w:r>
-        <w:rPr>
-          <w:rFonts w:ascii="Simplified Arabic" w:cs="Simplified Arabic" w:eastAsia="Simplified Arabic" w:hAnsi="Simplified Arabic"/>
-          <w:b w:val="false"/>
-          <w:bCs w:val="false"/>
-          <w:sz w:val="28"/>
-          <w:szCs w:val="28"/>
-          <w:rtl/>
-        </w:rPr>
-        <w:t xml:space="preserve">https://www.ajrsp.com/vol/issue31/</w:t>
+      <w:hyperlink w:history="1" r:id="rIdy9_kso70wozdiiohperdk">
+        <w:r>
+          <w:rPr>
+            <w:rFonts w:ascii="Simplified Arabic" w:cs="Simplified Arabic" w:eastAsia="Simplified Arabic" w:hAnsi="Simplified Arabic"/>
+            <w:b/>
+            <w:bCs/>
+            <w:color w:val="0563C1"/>
+            <w:sz w:val="28"/>
+            <w:szCs w:val="28"/>
+            <w:u w:val="single"/>
+            <w:rtl/>
+          </w:rPr>
+          <w:t xml:space="preserve">موقع الدراسة</w:t>
+        </w:r>
+      </w:hyperlink>
+      <w:r>
+        <w:rPr>
+          <w:rFonts w:ascii="Simplified Arabic" w:cs="Simplified Arabic" w:eastAsia="Simplified Arabic" w:hAnsi="Simplified Arabic"/>
+          <w:b w:val="false"/>
+          <w:bCs w:val="false"/>
+          <w:sz w:val="28"/>
+          <w:szCs w:val="28"/>
+          <w:rtl/>
+        </w:rPr>
+        <w:t xml:space="preserve">  ( https://www.ajrsp.com/vol/issue31/ )</w:t>
       </w:r>
     </w:p>
     <w:p>
@@ -2216,16 +2381,31 @@
         </w:rPr>
         <w:t xml:space="preserve">رابط الدراسة: </w:t>
       </w:r>
-      <w:r>
-        <w:rPr>
-          <w:rFonts w:ascii="Simplified Arabic" w:cs="Simplified Arabic" w:eastAsia="Simplified Arabic" w:hAnsi="Simplified Arabic"/>
-          <w:b w:val="false"/>
-          <w:bCs w:val="false"/>
-          <w:sz w:val="28"/>
-          <w:szCs w:val="28"/>
-          <w:rtl/>
-        </w:rPr>
-        <w:t xml:space="preserve">https://dspace.univ-eloued.dz/handle/123456789/15831</w:t>
+      <w:hyperlink w:history="1" r:id="rIdnccce-tsp0k8gjzdw4gqh">
+        <w:r>
+          <w:rPr>
+            <w:rFonts w:ascii="Simplified Arabic" w:cs="Simplified Arabic" w:eastAsia="Simplified Arabic" w:hAnsi="Simplified Arabic"/>
+            <w:b/>
+            <w:bCs/>
+            <w:color w:val="0563C1"/>
+            <w:sz w:val="28"/>
+            <w:szCs w:val="28"/>
+            <w:u w:val="single"/>
+            <w:rtl/>
+          </w:rPr>
+          <w:t xml:space="preserve">موقع الدراسة</w:t>
+        </w:r>
+      </w:hyperlink>
+      <w:r>
+        <w:rPr>
+          <w:rFonts w:ascii="Simplified Arabic" w:cs="Simplified Arabic" w:eastAsia="Simplified Arabic" w:hAnsi="Simplified Arabic"/>
+          <w:b w:val="false"/>
+          <w:bCs w:val="false"/>
+          <w:sz w:val="28"/>
+          <w:szCs w:val="28"/>
+          <w:rtl/>
+        </w:rPr>
+        <w:t xml:space="preserve">  ( https://dspace.univ-eloued.dz/handle/123456789/15831 )</w:t>
       </w:r>
     </w:p>
     <w:p>
@@ -2362,16 +2542,31 @@
         </w:rPr>
         <w:t xml:space="preserve">رابط الدراسة: </w:t>
       </w:r>
-      <w:r>
-        <w:rPr>
-          <w:rFonts w:ascii="Simplified Arabic" w:cs="Simplified Arabic" w:eastAsia="Simplified Arabic" w:hAnsi="Simplified Arabic"/>
-          <w:b w:val="false"/>
-          <w:bCs w:val="false"/>
-          <w:sz w:val="28"/>
-          <w:szCs w:val="28"/>
-          <w:rtl/>
-        </w:rPr>
-        <w:t xml:space="preserve">https://asjp.cerist.dz/en/article/91461</w:t>
+      <w:hyperlink w:history="1" r:id="rIdklvrffpstqy58_nsfnt1f">
+        <w:r>
+          <w:rPr>
+            <w:rFonts w:ascii="Simplified Arabic" w:cs="Simplified Arabic" w:eastAsia="Simplified Arabic" w:hAnsi="Simplified Arabic"/>
+            <w:b/>
+            <w:bCs/>
+            <w:color w:val="0563C1"/>
+            <w:sz w:val="28"/>
+            <w:szCs w:val="28"/>
+            <w:u w:val="single"/>
+            <w:rtl/>
+          </w:rPr>
+          <w:t xml:space="preserve">موقع الدراسة</w:t>
+        </w:r>
+      </w:hyperlink>
+      <w:r>
+        <w:rPr>
+          <w:rFonts w:ascii="Simplified Arabic" w:cs="Simplified Arabic" w:eastAsia="Simplified Arabic" w:hAnsi="Simplified Arabic"/>
+          <w:b w:val="false"/>
+          <w:bCs w:val="false"/>
+          <w:sz w:val="28"/>
+          <w:szCs w:val="28"/>
+          <w:rtl/>
+        </w:rPr>
+        <w:t xml:space="preserve">  ( https://asjp.cerist.dz/en/article/91461 )</w:t>
       </w:r>
     </w:p>
     <w:p>
@@ -2508,16 +2703,31 @@
         </w:rPr>
         <w:t xml:space="preserve">رابط الدراسة: </w:t>
       </w:r>
-      <w:r>
-        <w:rPr>
-          <w:rFonts w:ascii="Simplified Arabic" w:cs="Simplified Arabic" w:eastAsia="Simplified Arabic" w:hAnsi="Simplified Arabic"/>
-          <w:b w:val="false"/>
-          <w:bCs w:val="false"/>
-          <w:sz w:val="28"/>
-          <w:szCs w:val="28"/>
-          <w:rtl/>
-        </w:rPr>
-        <w:t xml:space="preserve">https://asjp.cerist.dz/en/article/26599</w:t>
+      <w:hyperlink w:history="1" r:id="rIdngcogsrtpaztnwhju9_9p">
+        <w:r>
+          <w:rPr>
+            <w:rFonts w:ascii="Simplified Arabic" w:cs="Simplified Arabic" w:eastAsia="Simplified Arabic" w:hAnsi="Simplified Arabic"/>
+            <w:b/>
+            <w:bCs/>
+            <w:color w:val="0563C1"/>
+            <w:sz w:val="28"/>
+            <w:szCs w:val="28"/>
+            <w:u w:val="single"/>
+            <w:rtl/>
+          </w:rPr>
+          <w:t xml:space="preserve">موقع الدراسة</w:t>
+        </w:r>
+      </w:hyperlink>
+      <w:r>
+        <w:rPr>
+          <w:rFonts w:ascii="Simplified Arabic" w:cs="Simplified Arabic" w:eastAsia="Simplified Arabic" w:hAnsi="Simplified Arabic"/>
+          <w:b w:val="false"/>
+          <w:bCs w:val="false"/>
+          <w:sz w:val="28"/>
+          <w:szCs w:val="28"/>
+          <w:rtl/>
+        </w:rPr>
+        <w:t xml:space="preserve">  ( https://asjp.cerist.dz/en/article/26599 )</w:t>
       </w:r>
     </w:p>
     <w:p>
@@ -2654,16 +2864,31 @@
         </w:rPr>
         <w:t xml:space="preserve">رابط الدراسة: </w:t>
       </w:r>
-      <w:r>
-        <w:rPr>
-          <w:rFonts w:ascii="Simplified Arabic" w:cs="Simplified Arabic" w:eastAsia="Simplified Arabic" w:hAnsi="Simplified Arabic"/>
-          <w:b w:val="false"/>
-          <w:bCs w:val="false"/>
-          <w:sz w:val="28"/>
-          <w:szCs w:val="28"/>
-          <w:rtl/>
-        </w:rPr>
-        <w:t xml:space="preserve">https://www.damascusuniversity.edu.sy/mag/law/images/stories/479-500.pdf</w:t>
+      <w:hyperlink w:history="1" r:id="rIdrktxh1axizsm73y_s9ggd">
+        <w:r>
+          <w:rPr>
+            <w:rFonts w:ascii="Simplified Arabic" w:cs="Simplified Arabic" w:eastAsia="Simplified Arabic" w:hAnsi="Simplified Arabic"/>
+            <w:b/>
+            <w:bCs/>
+            <w:color w:val="0563C1"/>
+            <w:sz w:val="28"/>
+            <w:szCs w:val="28"/>
+            <w:u w:val="single"/>
+            <w:rtl/>
+          </w:rPr>
+          <w:t xml:space="preserve">موقع الدراسة</w:t>
+        </w:r>
+      </w:hyperlink>
+      <w:r>
+        <w:rPr>
+          <w:rFonts w:ascii="Simplified Arabic" w:cs="Simplified Arabic" w:eastAsia="Simplified Arabic" w:hAnsi="Simplified Arabic"/>
+          <w:b w:val="false"/>
+          <w:bCs w:val="false"/>
+          <w:sz w:val="28"/>
+          <w:szCs w:val="28"/>
+          <w:rtl/>
+        </w:rPr>
+        <w:t xml:space="preserve">  ( https://www.damascusuniversity.edu.sy/mag/law/images/stories/479-500.pdf )</w:t>
       </w:r>
     </w:p>
     <w:p>
@@ -2800,16 +3025,31 @@
         </w:rPr>
         <w:t xml:space="preserve">رابط الدراسة: </w:t>
       </w:r>
-      <w:r>
-        <w:rPr>
-          <w:rFonts w:ascii="Simplified Arabic" w:cs="Simplified Arabic" w:eastAsia="Simplified Arabic" w:hAnsi="Simplified Arabic"/>
-          <w:b w:val="false"/>
-          <w:bCs w:val="false"/>
-          <w:sz w:val="28"/>
-          <w:szCs w:val="28"/>
-          <w:rtl/>
-        </w:rPr>
-        <w:t xml:space="preserve">https://search.mandumah.com/Record/167975</w:t>
+      <w:hyperlink w:history="1" r:id="rIdowj9q6ghiee6u2ntzcvjh">
+        <w:r>
+          <w:rPr>
+            <w:rFonts w:ascii="Simplified Arabic" w:cs="Simplified Arabic" w:eastAsia="Simplified Arabic" w:hAnsi="Simplified Arabic"/>
+            <w:b/>
+            <w:bCs/>
+            <w:color w:val="0563C1"/>
+            <w:sz w:val="28"/>
+            <w:szCs w:val="28"/>
+            <w:u w:val="single"/>
+            <w:rtl/>
+          </w:rPr>
+          <w:t xml:space="preserve">موقع الدراسة</w:t>
+        </w:r>
+      </w:hyperlink>
+      <w:r>
+        <w:rPr>
+          <w:rFonts w:ascii="Simplified Arabic" w:cs="Simplified Arabic" w:eastAsia="Simplified Arabic" w:hAnsi="Simplified Arabic"/>
+          <w:b w:val="false"/>
+          <w:bCs w:val="false"/>
+          <w:sz w:val="28"/>
+          <w:szCs w:val="28"/>
+          <w:rtl/>
+        </w:rPr>
+        <w:t xml:space="preserve">  ( https://search.mandumah.com/Record/167975 )</w:t>
       </w:r>
     </w:p>
     <w:p>
@@ -2946,16 +3186,31 @@
         </w:rPr>
         <w:t xml:space="preserve">رابط الدراسة: </w:t>
       </w:r>
-      <w:r>
-        <w:rPr>
-          <w:rFonts w:ascii="Simplified Arabic" w:cs="Simplified Arabic" w:eastAsia="Simplified Arabic" w:hAnsi="Simplified Arabic"/>
-          <w:b w:val="false"/>
-          <w:bCs w:val="false"/>
-          <w:sz w:val="28"/>
-          <w:szCs w:val="28"/>
-          <w:rtl/>
-        </w:rPr>
-        <w:t xml:space="preserve">https://iifa-aifi.org/ar/journal</w:t>
+      <w:hyperlink w:history="1" r:id="rIdyhzojctdznabz10oirfqq">
+        <w:r>
+          <w:rPr>
+            <w:rFonts w:ascii="Simplified Arabic" w:cs="Simplified Arabic" w:eastAsia="Simplified Arabic" w:hAnsi="Simplified Arabic"/>
+            <w:b/>
+            <w:bCs/>
+            <w:color w:val="0563C1"/>
+            <w:sz w:val="28"/>
+            <w:szCs w:val="28"/>
+            <w:u w:val="single"/>
+            <w:rtl/>
+          </w:rPr>
+          <w:t xml:space="preserve">موقع الدراسة</w:t>
+        </w:r>
+      </w:hyperlink>
+      <w:r>
+        <w:rPr>
+          <w:rFonts w:ascii="Simplified Arabic" w:cs="Simplified Arabic" w:eastAsia="Simplified Arabic" w:hAnsi="Simplified Arabic"/>
+          <w:b w:val="false"/>
+          <w:bCs w:val="false"/>
+          <w:sz w:val="28"/>
+          <w:szCs w:val="28"/>
+          <w:rtl/>
+        </w:rPr>
+        <w:t xml:space="preserve">  ( https://iifa-aifi.org/ar/journal )</w:t>
       </w:r>
     </w:p>
     <w:p>
@@ -3112,16 +3367,31 @@
         </w:rPr>
         <w:t xml:space="preserve">رابط الدراسة: </w:t>
       </w:r>
-      <w:r>
-        <w:rPr>
-          <w:rFonts w:ascii="Simplified Arabic" w:cs="Simplified Arabic" w:eastAsia="Simplified Arabic" w:hAnsi="Simplified Arabic"/>
-          <w:b w:val="false"/>
-          <w:bCs w:val="false"/>
-          <w:sz w:val="28"/>
-          <w:szCs w:val="28"/>
-          <w:rtl/>
-        </w:rPr>
-        <w:t xml:space="preserve">https://www.cambridge.org/core/services/aop-cambridge-core/content/view/F891733330C5E4ADCB8C5BB0235E271F</w:t>
+      <w:hyperlink w:history="1" r:id="rIdzpv_dz3nptao-gscxiyp8">
+        <w:r>
+          <w:rPr>
+            <w:rFonts w:ascii="Simplified Arabic" w:cs="Simplified Arabic" w:eastAsia="Simplified Arabic" w:hAnsi="Simplified Arabic"/>
+            <w:b/>
+            <w:bCs/>
+            <w:color w:val="0563C1"/>
+            <w:sz w:val="28"/>
+            <w:szCs w:val="28"/>
+            <w:u w:val="single"/>
+            <w:rtl/>
+          </w:rPr>
+          <w:t xml:space="preserve">موقع الدراسة</w:t>
+        </w:r>
+      </w:hyperlink>
+      <w:r>
+        <w:rPr>
+          <w:rFonts w:ascii="Simplified Arabic" w:cs="Simplified Arabic" w:eastAsia="Simplified Arabic" w:hAnsi="Simplified Arabic"/>
+          <w:b w:val="false"/>
+          <w:bCs w:val="false"/>
+          <w:sz w:val="28"/>
+          <w:szCs w:val="28"/>
+          <w:rtl/>
+        </w:rPr>
+        <w:t xml:space="preserve">  ( https://www.cambridge.org/core/services/aop-cambridge-core/content/view/F891733330C5E4ADCB8C5BB0235E271F )</w:t>
       </w:r>
     </w:p>
     <w:p>
@@ -3258,16 +3528,31 @@
         </w:rPr>
         <w:t xml:space="preserve">رابط الدراسة: </w:t>
       </w:r>
-      <w:r>
-        <w:rPr>
-          <w:rFonts w:ascii="Simplified Arabic" w:cs="Simplified Arabic" w:eastAsia="Simplified Arabic" w:hAnsi="Simplified Arabic"/>
-          <w:b w:val="false"/>
-          <w:bCs w:val="false"/>
-          <w:sz w:val="28"/>
-          <w:szCs w:val="28"/>
-          <w:rtl/>
-        </w:rPr>
-        <w:t xml:space="preserve">https://doi.org/10.3389/fneur.2024.1491263</w:t>
+      <w:hyperlink w:history="1" r:id="rIdplzmiguh7ny0xgcny6nza">
+        <w:r>
+          <w:rPr>
+            <w:rFonts w:ascii="Simplified Arabic" w:cs="Simplified Arabic" w:eastAsia="Simplified Arabic" w:hAnsi="Simplified Arabic"/>
+            <w:b/>
+            <w:bCs/>
+            <w:color w:val="0563C1"/>
+            <w:sz w:val="28"/>
+            <w:szCs w:val="28"/>
+            <w:u w:val="single"/>
+            <w:rtl/>
+          </w:rPr>
+          <w:t xml:space="preserve">موقع الدراسة</w:t>
+        </w:r>
+      </w:hyperlink>
+      <w:r>
+        <w:rPr>
+          <w:rFonts w:ascii="Simplified Arabic" w:cs="Simplified Arabic" w:eastAsia="Simplified Arabic" w:hAnsi="Simplified Arabic"/>
+          <w:b w:val="false"/>
+          <w:bCs w:val="false"/>
+          <w:sz w:val="28"/>
+          <w:szCs w:val="28"/>
+          <w:rtl/>
+        </w:rPr>
+        <w:t xml:space="preserve">  ( https://doi.org/10.3389/fneur.2024.1491263 )</w:t>
       </w:r>
     </w:p>
     <w:p>
@@ -3404,16 +3689,31 @@
         </w:rPr>
         <w:t xml:space="preserve">رابط الدراسة: </w:t>
       </w:r>
-      <w:r>
-        <w:rPr>
-          <w:rFonts w:ascii="Simplified Arabic" w:cs="Simplified Arabic" w:eastAsia="Simplified Arabic" w:hAnsi="Simplified Arabic"/>
-          <w:b w:val="false"/>
-          <w:bCs w:val="false"/>
-          <w:sz w:val="28"/>
-          <w:szCs w:val="28"/>
-          <w:rtl/>
-        </w:rPr>
-        <w:t xml:space="preserve">https://www.walshmedicalmedia.com/open-access/clinical-death-a-reversible-state-of-cardiac-arrest-119791.html</w:t>
+      <w:hyperlink w:history="1" r:id="rId1dfazi4lutmlgmozosdgo">
+        <w:r>
+          <w:rPr>
+            <w:rFonts w:ascii="Simplified Arabic" w:cs="Simplified Arabic" w:eastAsia="Simplified Arabic" w:hAnsi="Simplified Arabic"/>
+            <w:b/>
+            <w:bCs/>
+            <w:color w:val="0563C1"/>
+            <w:sz w:val="28"/>
+            <w:szCs w:val="28"/>
+            <w:u w:val="single"/>
+            <w:rtl/>
+          </w:rPr>
+          <w:t xml:space="preserve">موقع الدراسة</w:t>
+        </w:r>
+      </w:hyperlink>
+      <w:r>
+        <w:rPr>
+          <w:rFonts w:ascii="Simplified Arabic" w:cs="Simplified Arabic" w:eastAsia="Simplified Arabic" w:hAnsi="Simplified Arabic"/>
+          <w:b w:val="false"/>
+          <w:bCs w:val="false"/>
+          <w:sz w:val="28"/>
+          <w:szCs w:val="28"/>
+          <w:rtl/>
+        </w:rPr>
+        <w:t xml:space="preserve">  ( https://www.walshmedicalmedia.com/open-access/clinical-death-a-reversible-state-of-cardiac-arrest-119791.html )</w:t>
       </w:r>
     </w:p>
     <w:p>
@@ -3550,16 +3850,31 @@
         </w:rPr>
         <w:t xml:space="preserve">رابط الدراسة: </w:t>
       </w:r>
-      <w:r>
-        <w:rPr>
-          <w:rFonts w:ascii="Simplified Arabic" w:cs="Simplified Arabic" w:eastAsia="Simplified Arabic" w:hAnsi="Simplified Arabic"/>
-          <w:b w:val="false"/>
-          <w:bCs w:val="false"/>
-          <w:sz w:val="28"/>
-          <w:szCs w:val="28"/>
-          <w:rtl/>
-        </w:rPr>
-        <w:t xml:space="preserve">https://doi.org/10.1212/WNL.0000000000207740</w:t>
+      <w:hyperlink w:history="1" r:id="rIdvr1tw4n9f2qe1mzqgrti4">
+        <w:r>
+          <w:rPr>
+            <w:rFonts w:ascii="Simplified Arabic" w:cs="Simplified Arabic" w:eastAsia="Simplified Arabic" w:hAnsi="Simplified Arabic"/>
+            <w:b/>
+            <w:bCs/>
+            <w:color w:val="0563C1"/>
+            <w:sz w:val="28"/>
+            <w:szCs w:val="28"/>
+            <w:u w:val="single"/>
+            <w:rtl/>
+          </w:rPr>
+          <w:t xml:space="preserve">موقع الدراسة</w:t>
+        </w:r>
+      </w:hyperlink>
+      <w:r>
+        <w:rPr>
+          <w:rFonts w:ascii="Simplified Arabic" w:cs="Simplified Arabic" w:eastAsia="Simplified Arabic" w:hAnsi="Simplified Arabic"/>
+          <w:b w:val="false"/>
+          <w:bCs w:val="false"/>
+          <w:sz w:val="28"/>
+          <w:szCs w:val="28"/>
+          <w:rtl/>
+        </w:rPr>
+        <w:t xml:space="preserve">  ( https://doi.org/10.1212/WNL.0000000000207740 )</w:t>
       </w:r>
     </w:p>
     <w:p>
@@ -3696,16 +4011,31 @@
         </w:rPr>
         <w:t xml:space="preserve">رابط الدراسة: </w:t>
       </w:r>
-      <w:r>
-        <w:rPr>
-          <w:rFonts w:ascii="Simplified Arabic" w:cs="Simplified Arabic" w:eastAsia="Simplified Arabic" w:hAnsi="Simplified Arabic"/>
-          <w:b w:val="false"/>
-          <w:bCs w:val="false"/>
-          <w:sz w:val="28"/>
-          <w:szCs w:val="28"/>
-          <w:rtl/>
-        </w:rPr>
-        <w:t xml:space="preserve">https://doi.org/10.1001/jama.2020.11586</w:t>
+      <w:hyperlink w:history="1" r:id="rIdx3usx5vqln4wrl3xu0fit">
+        <w:r>
+          <w:rPr>
+            <w:rFonts w:ascii="Simplified Arabic" w:cs="Simplified Arabic" w:eastAsia="Simplified Arabic" w:hAnsi="Simplified Arabic"/>
+            <w:b/>
+            <w:bCs/>
+            <w:color w:val="0563C1"/>
+            <w:sz w:val="28"/>
+            <w:szCs w:val="28"/>
+            <w:u w:val="single"/>
+            <w:rtl/>
+          </w:rPr>
+          <w:t xml:space="preserve">موقع الدراسة</w:t>
+        </w:r>
+      </w:hyperlink>
+      <w:r>
+        <w:rPr>
+          <w:rFonts w:ascii="Simplified Arabic" w:cs="Simplified Arabic" w:eastAsia="Simplified Arabic" w:hAnsi="Simplified Arabic"/>
+          <w:b w:val="false"/>
+          <w:bCs w:val="false"/>
+          <w:sz w:val="28"/>
+          <w:szCs w:val="28"/>
+          <w:rtl/>
+        </w:rPr>
+        <w:t xml:space="preserve">  ( https://doi.org/10.1001/jama.2020.11586 )</w:t>
       </w:r>
     </w:p>
     <w:p>
@@ -3842,16 +4172,31 @@
         </w:rPr>
         <w:t xml:space="preserve">رابط الدراسة: </w:t>
       </w:r>
-      <w:r>
-        <w:rPr>
-          <w:rFonts w:ascii="Simplified Arabic" w:cs="Simplified Arabic" w:eastAsia="Simplified Arabic" w:hAnsi="Simplified Arabic"/>
-          <w:b w:val="false"/>
-          <w:bCs w:val="false"/>
-          <w:sz w:val="28"/>
-          <w:szCs w:val="28"/>
-          <w:rtl/>
-        </w:rPr>
-        <w:t xml:space="preserve">https://doi.org/10.1038/nrneurol.2017.172</w:t>
+      <w:hyperlink w:history="1" r:id="rIddp0o1rffr9gs6dhmzzduc">
+        <w:r>
+          <w:rPr>
+            <w:rFonts w:ascii="Simplified Arabic" w:cs="Simplified Arabic" w:eastAsia="Simplified Arabic" w:hAnsi="Simplified Arabic"/>
+            <w:b/>
+            <w:bCs/>
+            <w:color w:val="0563C1"/>
+            <w:sz w:val="28"/>
+            <w:szCs w:val="28"/>
+            <w:u w:val="single"/>
+            <w:rtl/>
+          </w:rPr>
+          <w:t xml:space="preserve">موقع الدراسة</w:t>
+        </w:r>
+      </w:hyperlink>
+      <w:r>
+        <w:rPr>
+          <w:rFonts w:ascii="Simplified Arabic" w:cs="Simplified Arabic" w:eastAsia="Simplified Arabic" w:hAnsi="Simplified Arabic"/>
+          <w:b w:val="false"/>
+          <w:bCs w:val="false"/>
+          <w:sz w:val="28"/>
+          <w:szCs w:val="28"/>
+          <w:rtl/>
+        </w:rPr>
+        <w:t xml:space="preserve">  ( https://doi.org/10.1038/nrneurol.2017.172 )</w:t>
       </w:r>
     </w:p>
     <w:p>
@@ -3988,16 +4333,31 @@
         </w:rPr>
         <w:t xml:space="preserve">رابط الدراسة: </w:t>
       </w:r>
-      <w:r>
-        <w:rPr>
-          <w:rFonts w:ascii="Simplified Arabic" w:cs="Simplified Arabic" w:eastAsia="Simplified Arabic" w:hAnsi="Simplified Arabic"/>
-          <w:b w:val="false"/>
-          <w:bCs w:val="false"/>
-          <w:sz w:val="28"/>
-          <w:szCs w:val="28"/>
-          <w:rtl/>
-        </w:rPr>
-        <w:t xml:space="preserve">https://pmc.ncbi.nlm.nih.gov/articles/PMC7595719/</w:t>
+      <w:hyperlink w:history="1" r:id="rIdsynrryntqklw7utsigbc6">
+        <w:r>
+          <w:rPr>
+            <w:rFonts w:ascii="Simplified Arabic" w:cs="Simplified Arabic" w:eastAsia="Simplified Arabic" w:hAnsi="Simplified Arabic"/>
+            <w:b/>
+            <w:bCs/>
+            <w:color w:val="0563C1"/>
+            <w:sz w:val="28"/>
+            <w:szCs w:val="28"/>
+            <w:u w:val="single"/>
+            <w:rtl/>
+          </w:rPr>
+          <w:t xml:space="preserve">موقع الدراسة</w:t>
+        </w:r>
+      </w:hyperlink>
+      <w:r>
+        <w:rPr>
+          <w:rFonts w:ascii="Simplified Arabic" w:cs="Simplified Arabic" w:eastAsia="Simplified Arabic" w:hAnsi="Simplified Arabic"/>
+          <w:b w:val="false"/>
+          <w:bCs w:val="false"/>
+          <w:sz w:val="28"/>
+          <w:szCs w:val="28"/>
+          <w:rtl/>
+        </w:rPr>
+        <w:t xml:space="preserve">  ( https://pmc.ncbi.nlm.nih.gov/articles/PMC7595719/ )</w:t>
       </w:r>
     </w:p>
     <w:p>
@@ -4134,16 +4494,31 @@
         </w:rPr>
         <w:t xml:space="preserve">رابط الدراسة: </w:t>
       </w:r>
-      <w:r>
-        <w:rPr>
-          <w:rFonts w:ascii="Simplified Arabic" w:cs="Simplified Arabic" w:eastAsia="Simplified Arabic" w:hAnsi="Simplified Arabic"/>
-          <w:b w:val="false"/>
-          <w:bCs w:val="false"/>
-          <w:sz w:val="28"/>
-          <w:szCs w:val="28"/>
-          <w:rtl/>
-        </w:rPr>
-        <w:t xml:space="preserve">https://doi.org/10.1212/WNL.0000000000006750</w:t>
+      <w:hyperlink w:history="1" r:id="rIdotjydt9bypl4dplfjk4ht">
+        <w:r>
+          <w:rPr>
+            <w:rFonts w:ascii="Simplified Arabic" w:cs="Simplified Arabic" w:eastAsia="Simplified Arabic" w:hAnsi="Simplified Arabic"/>
+            <w:b/>
+            <w:bCs/>
+            <w:color w:val="0563C1"/>
+            <w:sz w:val="28"/>
+            <w:szCs w:val="28"/>
+            <w:u w:val="single"/>
+            <w:rtl/>
+          </w:rPr>
+          <w:t xml:space="preserve">موقع الدراسة</w:t>
+        </w:r>
+      </w:hyperlink>
+      <w:r>
+        <w:rPr>
+          <w:rFonts w:ascii="Simplified Arabic" w:cs="Simplified Arabic" w:eastAsia="Simplified Arabic" w:hAnsi="Simplified Arabic"/>
+          <w:b w:val="false"/>
+          <w:bCs w:val="false"/>
+          <w:sz w:val="28"/>
+          <w:szCs w:val="28"/>
+          <w:rtl/>
+        </w:rPr>
+        <w:t xml:space="preserve">  ( https://doi.org/10.1212/WNL.0000000000006750 )</w:t>
       </w:r>
     </w:p>
     <w:p>
@@ -4280,16 +4655,31 @@
         </w:rPr>
         <w:t xml:space="preserve">رابط الدراسة: </w:t>
       </w:r>
-      <w:r>
-        <w:rPr>
-          <w:rFonts w:ascii="Simplified Arabic" w:cs="Simplified Arabic" w:eastAsia="Simplified Arabic" w:hAnsi="Simplified Arabic"/>
-          <w:b w:val="false"/>
-          <w:bCs w:val="false"/>
-          <w:sz w:val="28"/>
-          <w:szCs w:val="28"/>
-          <w:rtl/>
-        </w:rPr>
-        <w:t xml:space="preserve">https://doi.org/10.2147/MB.S70369</w:t>
+      <w:hyperlink w:history="1" r:id="rIddhvdsofjsumswyqyicruy">
+        <w:r>
+          <w:rPr>
+            <w:rFonts w:ascii="Simplified Arabic" w:cs="Simplified Arabic" w:eastAsia="Simplified Arabic" w:hAnsi="Simplified Arabic"/>
+            <w:b/>
+            <w:bCs/>
+            <w:color w:val="0563C1"/>
+            <w:sz w:val="28"/>
+            <w:szCs w:val="28"/>
+            <w:u w:val="single"/>
+            <w:rtl/>
+          </w:rPr>
+          <w:t xml:space="preserve">موقع الدراسة</w:t>
+        </w:r>
+      </w:hyperlink>
+      <w:r>
+        <w:rPr>
+          <w:rFonts w:ascii="Simplified Arabic" w:cs="Simplified Arabic" w:eastAsia="Simplified Arabic" w:hAnsi="Simplified Arabic"/>
+          <w:b w:val="false"/>
+          <w:bCs w:val="false"/>
+          <w:sz w:val="28"/>
+          <w:szCs w:val="28"/>
+          <w:rtl/>
+        </w:rPr>
+        <w:t xml:space="preserve">  ( https://doi.org/10.2147/MB.S70369 )</w:t>
       </w:r>
     </w:p>
     <w:p>
@@ -4426,16 +4816,31 @@
         </w:rPr>
         <w:t xml:space="preserve">رابط الدراسة: </w:t>
       </w:r>
-      <w:r>
-        <w:rPr>
-          <w:rFonts w:ascii="Simplified Arabic" w:cs="Simplified Arabic" w:eastAsia="Simplified Arabic" w:hAnsi="Simplified Arabic"/>
-          <w:b w:val="false"/>
-          <w:bCs w:val="false"/>
-          <w:sz w:val="28"/>
-          <w:szCs w:val="28"/>
-          <w:rtl/>
-        </w:rPr>
-        <w:t xml:space="preserve">http://jama.jamanetwork.com/article.aspx?articleid=1818922</w:t>
+      <w:hyperlink w:history="1" r:id="rId8ju6s9fqisognfcg3so0y">
+        <w:r>
+          <w:rPr>
+            <w:rFonts w:ascii="Simplified Arabic" w:cs="Simplified Arabic" w:eastAsia="Simplified Arabic" w:hAnsi="Simplified Arabic"/>
+            <w:b/>
+            <w:bCs/>
+            <w:color w:val="0563C1"/>
+            <w:sz w:val="28"/>
+            <w:szCs w:val="28"/>
+            <w:u w:val="single"/>
+            <w:rtl/>
+          </w:rPr>
+          <w:t xml:space="preserve">موقع الدراسة</w:t>
+        </w:r>
+      </w:hyperlink>
+      <w:r>
+        <w:rPr>
+          <w:rFonts w:ascii="Simplified Arabic" w:cs="Simplified Arabic" w:eastAsia="Simplified Arabic" w:hAnsi="Simplified Arabic"/>
+          <w:b w:val="false"/>
+          <w:bCs w:val="false"/>
+          <w:sz w:val="28"/>
+          <w:szCs w:val="28"/>
+          <w:rtl/>
+        </w:rPr>
+        <w:t xml:space="preserve">  ( http://jama.jamanetwork.com/article.aspx?articleid=1818922 )</w:t>
       </w:r>
     </w:p>
     <w:p>

</xml_diff>

<commit_message>
Tighten spacing: right-align URL lines, remove extra paragraph gaps
Co-Authored-By: Claude Fable 5 <noreply@anthropic.com>
Claude-Session: https://claude.ai/code/session_01ESPDZE2KAqBUfzv5HLVvG7
</commit_message>
<xml_diff>
--- a/seminar/Abd Almahdi Dahla 212684527 - Research Plan.docx
+++ b/seminar/Abd Almahdi Dahla 212684527 - Research Plan.docx
@@ -349,7 +349,7 @@
     <w:p>
       <w:pPr>
         <w:bidi/>
-        <w:spacing w:after="160" w:line="360"/>
+        <w:spacing w:after="60" w:line="360"/>
         <w:jc w:val="both"/>
       </w:pPr>
       <w:r>
@@ -367,7 +367,7 @@
     <w:p>
       <w:pPr>
         <w:bidi/>
-        <w:spacing w:after="160" w:line="360"/>
+        <w:spacing w:after="60" w:line="360"/>
         <w:jc w:val="both"/>
       </w:pPr>
       <w:r>
@@ -419,7 +419,7 @@
     <w:p>
       <w:pPr>
         <w:bidi/>
-        <w:spacing w:after="160" w:line="360"/>
+        <w:spacing w:after="60" w:line="360"/>
         <w:jc w:val="both"/>
       </w:pPr>
       <w:r>
@@ -454,7 +454,7 @@
     <w:p>
       <w:pPr>
         <w:bidi/>
-        <w:spacing w:after="160" w:line="360"/>
+        <w:spacing w:after="60" w:line="360"/>
         <w:jc w:val="both"/>
       </w:pPr>
       <w:r>
@@ -472,7 +472,7 @@
     <w:p>
       <w:pPr>
         <w:bidi/>
-        <w:spacing w:after="160" w:line="360"/>
+        <w:spacing w:after="60" w:line="360"/>
         <w:jc w:val="both"/>
       </w:pPr>
       <w:r>
@@ -511,7 +511,7 @@
     <w:p>
       <w:pPr>
         <w:bidi/>
-        <w:spacing w:after="160" w:line="360"/>
+        <w:spacing w:after="60" w:line="360"/>
         <w:jc w:val="both"/>
       </w:pPr>
       <w:r>
@@ -549,7 +549,7 @@
     <w:p>
       <w:pPr>
         <w:bidi/>
-        <w:spacing w:after="160" w:line="360"/>
+        <w:spacing w:after="60" w:line="360"/>
         <w:jc w:val="both"/>
       </w:pPr>
       <w:r>
@@ -567,7 +567,7 @@
     <w:p>
       <w:pPr>
         <w:bidi/>
-        <w:spacing w:after="160" w:line="360"/>
+        <w:spacing w:after="60" w:line="360"/>
         <w:jc w:val="both"/>
       </w:pPr>
       <w:r>
@@ -596,8 +596,8 @@
     <w:p>
       <w:pPr>
         <w:bidi/>
-        <w:spacing w:after="160" w:line="360"/>
-        <w:jc w:val="both"/>
+        <w:spacing w:after="60" w:line="360"/>
+        <w:jc w:val="right"/>
       </w:pPr>
       <w:r>
         <w:rPr>
@@ -610,7 +610,7 @@
         </w:rPr>
         <w:t xml:space="preserve">رابط الدراسة: </w:t>
       </w:r>
-      <w:hyperlink w:history="1" r:id="rId9xcu8igdslh3lvh-iaolv">
+      <w:hyperlink w:history="1" r:id="rIdk8kdp6vdw73lnz9mubnln">
         <w:r>
           <w:rPr>
             <w:rFonts w:ascii="Simplified Arabic" w:cs="Simplified Arabic" w:eastAsia="Simplified Arabic" w:hAnsi="Simplified Arabic"/>
@@ -640,7 +640,7 @@
     <w:p>
       <w:pPr>
         <w:bidi/>
-        <w:spacing w:after="160" w:line="360"/>
+        <w:spacing w:after="60" w:line="360"/>
         <w:jc w:val="both"/>
       </w:pPr>
       <w:r>
@@ -680,7 +680,7 @@
     <w:p>
       <w:pPr>
         <w:bidi/>
-        <w:spacing w:after="160" w:line="360"/>
+        <w:spacing w:after="60" w:line="360"/>
         <w:jc w:val="both"/>
       </w:pPr>
       <w:r>
@@ -710,7 +710,7 @@
     <w:p>
       <w:pPr>
         <w:bidi/>
-        <w:spacing w:after="160" w:line="360"/>
+        <w:spacing w:after="60" w:line="360"/>
         <w:jc w:val="both"/>
       </w:pPr>
       <w:r>
@@ -728,7 +728,7 @@
     <w:p>
       <w:pPr>
         <w:bidi/>
-        <w:spacing w:after="160" w:line="360"/>
+        <w:spacing w:after="60" w:line="360"/>
         <w:jc w:val="both"/>
       </w:pPr>
       <w:r>
@@ -757,8 +757,8 @@
     <w:p>
       <w:pPr>
         <w:bidi/>
-        <w:spacing w:after="160" w:line="360"/>
-        <w:jc w:val="both"/>
+        <w:spacing w:after="60" w:line="360"/>
+        <w:jc w:val="right"/>
       </w:pPr>
       <w:r>
         <w:rPr>
@@ -771,7 +771,7 @@
         </w:rPr>
         <w:t xml:space="preserve">رابط الدراسة: </w:t>
       </w:r>
-      <w:hyperlink w:history="1" r:id="rId4pjjygyudm8e37odg5dfi">
+      <w:hyperlink w:history="1" r:id="rIdzd405gdylpzohrztox5di">
         <w:r>
           <w:rPr>
             <w:rFonts w:ascii="Simplified Arabic" w:cs="Simplified Arabic" w:eastAsia="Simplified Arabic" w:hAnsi="Simplified Arabic"/>
@@ -801,7 +801,7 @@
     <w:p>
       <w:pPr>
         <w:bidi/>
-        <w:spacing w:after="160" w:line="360"/>
+        <w:spacing w:after="60" w:line="360"/>
         <w:jc w:val="both"/>
       </w:pPr>
       <w:r>
@@ -841,7 +841,7 @@
     <w:p>
       <w:pPr>
         <w:bidi/>
-        <w:spacing w:after="160" w:line="360"/>
+        <w:spacing w:after="60" w:line="360"/>
         <w:jc w:val="both"/>
       </w:pPr>
       <w:r>
@@ -871,7 +871,7 @@
     <w:p>
       <w:pPr>
         <w:bidi/>
-        <w:spacing w:after="160" w:line="360"/>
+        <w:spacing w:after="60" w:line="360"/>
         <w:jc w:val="both"/>
       </w:pPr>
       <w:r>
@@ -889,7 +889,7 @@
     <w:p>
       <w:pPr>
         <w:bidi/>
-        <w:spacing w:after="160" w:line="360"/>
+        <w:spacing w:after="60" w:line="360"/>
         <w:jc w:val="both"/>
       </w:pPr>
       <w:r>
@@ -918,8 +918,8 @@
     <w:p>
       <w:pPr>
         <w:bidi/>
-        <w:spacing w:after="160" w:line="360"/>
-        <w:jc w:val="both"/>
+        <w:spacing w:after="60" w:line="360"/>
+        <w:jc w:val="right"/>
       </w:pPr>
       <w:r>
         <w:rPr>
@@ -932,7 +932,7 @@
         </w:rPr>
         <w:t xml:space="preserve">رابط الدراسة: </w:t>
       </w:r>
-      <w:hyperlink w:history="1" r:id="rId5-yrwt9mp8hc1sqkerzfn">
+      <w:hyperlink w:history="1" r:id="rIduys8sknvf2yfuunspo0uk">
         <w:r>
           <w:rPr>
             <w:rFonts w:ascii="Simplified Arabic" w:cs="Simplified Arabic" w:eastAsia="Simplified Arabic" w:hAnsi="Simplified Arabic"/>
@@ -962,7 +962,7 @@
     <w:p>
       <w:pPr>
         <w:bidi/>
-        <w:spacing w:after="160" w:line="360"/>
+        <w:spacing w:after="60" w:line="360"/>
         <w:jc w:val="both"/>
       </w:pPr>
       <w:r>
@@ -1002,7 +1002,7 @@
     <w:p>
       <w:pPr>
         <w:bidi/>
-        <w:spacing w:after="160" w:line="360"/>
+        <w:spacing w:after="60" w:line="360"/>
         <w:jc w:val="both"/>
       </w:pPr>
       <w:r>
@@ -1032,7 +1032,7 @@
     <w:p>
       <w:pPr>
         <w:bidi/>
-        <w:spacing w:after="160" w:line="360"/>
+        <w:spacing w:after="60" w:line="360"/>
         <w:jc w:val="both"/>
       </w:pPr>
       <w:r>
@@ -1050,7 +1050,7 @@
     <w:p>
       <w:pPr>
         <w:bidi/>
-        <w:spacing w:after="160" w:line="360"/>
+        <w:spacing w:after="60" w:line="360"/>
         <w:jc w:val="both"/>
       </w:pPr>
       <w:r>
@@ -1079,8 +1079,8 @@
     <w:p>
       <w:pPr>
         <w:bidi/>
-        <w:spacing w:after="160" w:line="360"/>
-        <w:jc w:val="both"/>
+        <w:spacing w:after="60" w:line="360"/>
+        <w:jc w:val="right"/>
       </w:pPr>
       <w:r>
         <w:rPr>
@@ -1093,7 +1093,7 @@
         </w:rPr>
         <w:t xml:space="preserve">رابط الدراسة: </w:t>
       </w:r>
-      <w:hyperlink w:history="1" r:id="rIdhhlbfyou-wvgmz-c74ejk">
+      <w:hyperlink w:history="1" r:id="rIdjffbzpkumdi1lkaoeb0lc">
         <w:r>
           <w:rPr>
             <w:rFonts w:ascii="Simplified Arabic" w:cs="Simplified Arabic" w:eastAsia="Simplified Arabic" w:hAnsi="Simplified Arabic"/>
@@ -1123,7 +1123,7 @@
     <w:p>
       <w:pPr>
         <w:bidi/>
-        <w:spacing w:after="160" w:line="360"/>
+        <w:spacing w:after="60" w:line="360"/>
         <w:jc w:val="both"/>
       </w:pPr>
       <w:r>
@@ -1163,7 +1163,7 @@
     <w:p>
       <w:pPr>
         <w:bidi/>
-        <w:spacing w:after="160" w:line="360"/>
+        <w:spacing w:after="60" w:line="360"/>
         <w:jc w:val="both"/>
       </w:pPr>
       <w:r>
@@ -1193,7 +1193,7 @@
     <w:p>
       <w:pPr>
         <w:bidi/>
-        <w:spacing w:after="160" w:line="360"/>
+        <w:spacing w:after="60" w:line="360"/>
         <w:jc w:val="both"/>
       </w:pPr>
       <w:r>
@@ -1211,7 +1211,7 @@
     <w:p>
       <w:pPr>
         <w:bidi/>
-        <w:spacing w:after="160" w:line="360"/>
+        <w:spacing w:after="60" w:line="360"/>
         <w:jc w:val="both"/>
       </w:pPr>
       <w:r>
@@ -1240,8 +1240,8 @@
     <w:p>
       <w:pPr>
         <w:bidi/>
-        <w:spacing w:after="160" w:line="360"/>
-        <w:jc w:val="both"/>
+        <w:spacing w:after="60" w:line="360"/>
+        <w:jc w:val="right"/>
       </w:pPr>
       <w:r>
         <w:rPr>
@@ -1254,7 +1254,7 @@
         </w:rPr>
         <w:t xml:space="preserve">رابط الدراسة: </w:t>
       </w:r>
-      <w:hyperlink w:history="1" r:id="rIdkjqk0x0g06rzhn51akenu">
+      <w:hyperlink w:history="1" r:id="rIdryrd8m9ts_i9ynvco_pci">
         <w:r>
           <w:rPr>
             <w:rFonts w:ascii="Simplified Arabic" w:cs="Simplified Arabic" w:eastAsia="Simplified Arabic" w:hAnsi="Simplified Arabic"/>
@@ -1284,7 +1284,7 @@
     <w:p>
       <w:pPr>
         <w:bidi/>
-        <w:spacing w:after="160" w:line="360"/>
+        <w:spacing w:after="60" w:line="360"/>
         <w:jc w:val="both"/>
       </w:pPr>
       <w:r>
@@ -1324,7 +1324,7 @@
     <w:p>
       <w:pPr>
         <w:bidi/>
-        <w:spacing w:after="160" w:line="360"/>
+        <w:spacing w:after="60" w:line="360"/>
         <w:jc w:val="both"/>
       </w:pPr>
       <w:r>
@@ -1354,7 +1354,7 @@
     <w:p>
       <w:pPr>
         <w:bidi/>
-        <w:spacing w:after="160" w:line="360"/>
+        <w:spacing w:after="60" w:line="360"/>
         <w:jc w:val="both"/>
       </w:pPr>
       <w:r>
@@ -1372,7 +1372,7 @@
     <w:p>
       <w:pPr>
         <w:bidi/>
-        <w:spacing w:after="160" w:line="360"/>
+        <w:spacing w:after="60" w:line="360"/>
         <w:jc w:val="both"/>
       </w:pPr>
       <w:r>
@@ -1401,8 +1401,8 @@
     <w:p>
       <w:pPr>
         <w:bidi/>
-        <w:spacing w:after="160" w:line="360"/>
-        <w:jc w:val="both"/>
+        <w:spacing w:after="60" w:line="360"/>
+        <w:jc w:val="right"/>
       </w:pPr>
       <w:r>
         <w:rPr>
@@ -1415,7 +1415,7 @@
         </w:rPr>
         <w:t xml:space="preserve">رابط الدراسة: </w:t>
       </w:r>
-      <w:hyperlink w:history="1" r:id="rIdhne-6qjr54fewkaryf2jk">
+      <w:hyperlink w:history="1" r:id="rIdlrxx34cnclcvdjomcshpp">
         <w:r>
           <w:rPr>
             <w:rFonts w:ascii="Simplified Arabic" w:cs="Simplified Arabic" w:eastAsia="Simplified Arabic" w:hAnsi="Simplified Arabic"/>
@@ -1445,7 +1445,7 @@
     <w:p>
       <w:pPr>
         <w:bidi/>
-        <w:spacing w:after="160" w:line="360"/>
+        <w:spacing w:after="60" w:line="360"/>
         <w:jc w:val="both"/>
       </w:pPr>
       <w:r>
@@ -1485,7 +1485,7 @@
     <w:p>
       <w:pPr>
         <w:bidi/>
-        <w:spacing w:after="160" w:line="360"/>
+        <w:spacing w:after="60" w:line="360"/>
         <w:jc w:val="both"/>
       </w:pPr>
       <w:r>
@@ -1515,7 +1515,7 @@
     <w:p>
       <w:pPr>
         <w:bidi/>
-        <w:spacing w:after="160" w:line="360"/>
+        <w:spacing w:after="60" w:line="360"/>
         <w:jc w:val="both"/>
       </w:pPr>
       <w:r>
@@ -1533,7 +1533,7 @@
     <w:p>
       <w:pPr>
         <w:bidi/>
-        <w:spacing w:after="160" w:line="360"/>
+        <w:spacing w:after="60" w:line="360"/>
         <w:jc w:val="both"/>
       </w:pPr>
       <w:r>
@@ -1562,8 +1562,8 @@
     <w:p>
       <w:pPr>
         <w:bidi/>
-        <w:spacing w:after="160" w:line="360"/>
-        <w:jc w:val="both"/>
+        <w:spacing w:after="60" w:line="360"/>
+        <w:jc w:val="right"/>
       </w:pPr>
       <w:r>
         <w:rPr>
@@ -1576,7 +1576,7 @@
         </w:rPr>
         <w:t xml:space="preserve">رابط الدراسة: </w:t>
       </w:r>
-      <w:hyperlink w:history="1" r:id="rIdwr-peeriyiy_b9l3wohad">
+      <w:hyperlink w:history="1" r:id="rIdzz6lnnn4qnw0jg3-tyvcx">
         <w:r>
           <w:rPr>
             <w:rFonts w:ascii="Simplified Arabic" w:cs="Simplified Arabic" w:eastAsia="Simplified Arabic" w:hAnsi="Simplified Arabic"/>
@@ -1606,7 +1606,7 @@
     <w:p>
       <w:pPr>
         <w:bidi/>
-        <w:spacing w:after="160" w:line="360"/>
+        <w:spacing w:after="60" w:line="360"/>
         <w:jc w:val="both"/>
       </w:pPr>
       <w:r>
@@ -1646,7 +1646,7 @@
     <w:p>
       <w:pPr>
         <w:bidi/>
-        <w:spacing w:after="160" w:line="360"/>
+        <w:spacing w:after="60" w:line="360"/>
         <w:jc w:val="both"/>
       </w:pPr>
       <w:r>
@@ -1676,7 +1676,7 @@
     <w:p>
       <w:pPr>
         <w:bidi/>
-        <w:spacing w:after="160" w:line="360"/>
+        <w:spacing w:after="60" w:line="360"/>
         <w:jc w:val="both"/>
       </w:pPr>
       <w:r>
@@ -1694,7 +1694,7 @@
     <w:p>
       <w:pPr>
         <w:bidi/>
-        <w:spacing w:after="160" w:line="360"/>
+        <w:spacing w:after="60" w:line="360"/>
         <w:jc w:val="both"/>
       </w:pPr>
       <w:r>
@@ -1723,8 +1723,8 @@
     <w:p>
       <w:pPr>
         <w:bidi/>
-        <w:spacing w:after="160" w:line="360"/>
-        <w:jc w:val="both"/>
+        <w:spacing w:after="60" w:line="360"/>
+        <w:jc w:val="right"/>
       </w:pPr>
       <w:r>
         <w:rPr>
@@ -1737,7 +1737,7 @@
         </w:rPr>
         <w:t xml:space="preserve">رابط الدراسة: </w:t>
       </w:r>
-      <w:hyperlink w:history="1" r:id="rIdxki9qeiuv8hn2sb-4xd5o">
+      <w:hyperlink w:history="1" r:id="rIdk5mftuazyxd_-kh0c2w45">
         <w:r>
           <w:rPr>
             <w:rFonts w:ascii="Simplified Arabic" w:cs="Simplified Arabic" w:eastAsia="Simplified Arabic" w:hAnsi="Simplified Arabic"/>
@@ -1767,7 +1767,7 @@
     <w:p>
       <w:pPr>
         <w:bidi/>
-        <w:spacing w:after="160" w:line="360"/>
+        <w:spacing w:after="60" w:line="360"/>
         <w:jc w:val="both"/>
       </w:pPr>
       <w:r>
@@ -1807,7 +1807,7 @@
     <w:p>
       <w:pPr>
         <w:bidi/>
-        <w:spacing w:after="160" w:line="360"/>
+        <w:spacing w:after="60" w:line="360"/>
         <w:jc w:val="both"/>
       </w:pPr>
       <w:r>
@@ -1837,7 +1837,7 @@
     <w:p>
       <w:pPr>
         <w:bidi/>
-        <w:spacing w:after="160" w:line="360"/>
+        <w:spacing w:after="60" w:line="360"/>
         <w:jc w:val="both"/>
       </w:pPr>
       <w:r>
@@ -1855,7 +1855,7 @@
     <w:p>
       <w:pPr>
         <w:bidi/>
-        <w:spacing w:after="160" w:line="360"/>
+        <w:spacing w:after="60" w:line="360"/>
         <w:jc w:val="both"/>
       </w:pPr>
       <w:r>
@@ -1884,8 +1884,8 @@
     <w:p>
       <w:pPr>
         <w:bidi/>
-        <w:spacing w:after="160" w:line="360"/>
-        <w:jc w:val="both"/>
+        <w:spacing w:after="60" w:line="360"/>
+        <w:jc w:val="right"/>
       </w:pPr>
       <w:r>
         <w:rPr>
@@ -1898,7 +1898,7 @@
         </w:rPr>
         <w:t xml:space="preserve">رابط الدراسة: </w:t>
       </w:r>
-      <w:hyperlink w:history="1" r:id="rIdgz_ayuxzeb_15ebqp4zav">
+      <w:hyperlink w:history="1" r:id="rIdxl9-efii1sotysszf2qe7">
         <w:r>
           <w:rPr>
             <w:rFonts w:ascii="Simplified Arabic" w:cs="Simplified Arabic" w:eastAsia="Simplified Arabic" w:hAnsi="Simplified Arabic"/>
@@ -1928,7 +1928,7 @@
     <w:p>
       <w:pPr>
         <w:bidi/>
-        <w:spacing w:after="160" w:line="360"/>
+        <w:spacing w:after="60" w:line="360"/>
         <w:jc w:val="both"/>
       </w:pPr>
       <w:r>
@@ -1968,7 +1968,7 @@
     <w:p>
       <w:pPr>
         <w:bidi/>
-        <w:spacing w:after="160" w:line="360"/>
+        <w:spacing w:after="60" w:line="360"/>
         <w:jc w:val="both"/>
       </w:pPr>
       <w:r>
@@ -1998,7 +1998,7 @@
     <w:p>
       <w:pPr>
         <w:bidi/>
-        <w:spacing w:after="160" w:line="360"/>
+        <w:spacing w:after="60" w:line="360"/>
         <w:jc w:val="both"/>
       </w:pPr>
       <w:r>
@@ -2016,7 +2016,7 @@
     <w:p>
       <w:pPr>
         <w:bidi/>
-        <w:spacing w:after="160" w:line="360"/>
+        <w:spacing w:after="60" w:line="360"/>
         <w:jc w:val="both"/>
       </w:pPr>
       <w:r>
@@ -2045,8 +2045,8 @@
     <w:p>
       <w:pPr>
         <w:bidi/>
-        <w:spacing w:after="160" w:line="360"/>
-        <w:jc w:val="both"/>
+        <w:spacing w:after="60" w:line="360"/>
+        <w:jc w:val="right"/>
       </w:pPr>
       <w:r>
         <w:rPr>
@@ -2059,7 +2059,7 @@
         </w:rPr>
         <w:t xml:space="preserve">رابط الدراسة: </w:t>
       </w:r>
-      <w:hyperlink w:history="1" r:id="rIdnjazdtmvxjnvhgykgzwph">
+      <w:hyperlink w:history="1" r:id="rIdwqei9uenl0wmt3p3zwers">
         <w:r>
           <w:rPr>
             <w:rFonts w:ascii="Simplified Arabic" w:cs="Simplified Arabic" w:eastAsia="Simplified Arabic" w:hAnsi="Simplified Arabic"/>
@@ -2089,7 +2089,7 @@
     <w:p>
       <w:pPr>
         <w:bidi/>
-        <w:spacing w:after="160" w:line="360"/>
+        <w:spacing w:after="60" w:line="360"/>
         <w:jc w:val="both"/>
       </w:pPr>
       <w:r>
@@ -2129,7 +2129,7 @@
     <w:p>
       <w:pPr>
         <w:bidi/>
-        <w:spacing w:after="160" w:line="360"/>
+        <w:spacing w:after="60" w:line="360"/>
         <w:jc w:val="both"/>
       </w:pPr>
       <w:r>
@@ -2159,7 +2159,7 @@
     <w:p>
       <w:pPr>
         <w:bidi/>
-        <w:spacing w:after="160" w:line="360"/>
+        <w:spacing w:after="60" w:line="360"/>
         <w:jc w:val="both"/>
       </w:pPr>
       <w:r>
@@ -2177,7 +2177,7 @@
     <w:p>
       <w:pPr>
         <w:bidi/>
-        <w:spacing w:after="160" w:line="360"/>
+        <w:spacing w:after="60" w:line="360"/>
         <w:jc w:val="both"/>
       </w:pPr>
       <w:r>
@@ -2206,8 +2206,8 @@
     <w:p>
       <w:pPr>
         <w:bidi/>
-        <w:spacing w:after="160" w:line="360"/>
-        <w:jc w:val="both"/>
+        <w:spacing w:after="60" w:line="360"/>
+        <w:jc w:val="right"/>
       </w:pPr>
       <w:r>
         <w:rPr>
@@ -2220,7 +2220,7 @@
         </w:rPr>
         <w:t xml:space="preserve">رابط الدراسة: </w:t>
       </w:r>
-      <w:hyperlink w:history="1" r:id="rIdy9_kso70wozdiiohperdk">
+      <w:hyperlink w:history="1" r:id="rIdtnipwidgtkbq76v3ologk">
         <w:r>
           <w:rPr>
             <w:rFonts w:ascii="Simplified Arabic" w:cs="Simplified Arabic" w:eastAsia="Simplified Arabic" w:hAnsi="Simplified Arabic"/>
@@ -2250,7 +2250,7 @@
     <w:p>
       <w:pPr>
         <w:bidi/>
-        <w:spacing w:after="160" w:line="360"/>
+        <w:spacing w:after="60" w:line="360"/>
         <w:jc w:val="both"/>
       </w:pPr>
       <w:r>
@@ -2290,7 +2290,7 @@
     <w:p>
       <w:pPr>
         <w:bidi/>
-        <w:spacing w:after="160" w:line="360"/>
+        <w:spacing w:after="60" w:line="360"/>
         <w:jc w:val="both"/>
       </w:pPr>
       <w:r>
@@ -2320,7 +2320,7 @@
     <w:p>
       <w:pPr>
         <w:bidi/>
-        <w:spacing w:after="160" w:line="360"/>
+        <w:spacing w:after="60" w:line="360"/>
         <w:jc w:val="both"/>
       </w:pPr>
       <w:r>
@@ -2338,7 +2338,7 @@
     <w:p>
       <w:pPr>
         <w:bidi/>
-        <w:spacing w:after="160" w:line="360"/>
+        <w:spacing w:after="60" w:line="360"/>
         <w:jc w:val="both"/>
       </w:pPr>
       <w:r>
@@ -2367,8 +2367,8 @@
     <w:p>
       <w:pPr>
         <w:bidi/>
-        <w:spacing w:after="160" w:line="360"/>
-        <w:jc w:val="both"/>
+        <w:spacing w:after="60" w:line="360"/>
+        <w:jc w:val="right"/>
       </w:pPr>
       <w:r>
         <w:rPr>
@@ -2381,7 +2381,7 @@
         </w:rPr>
         <w:t xml:space="preserve">رابط الدراسة: </w:t>
       </w:r>
-      <w:hyperlink w:history="1" r:id="rIdnccce-tsp0k8gjzdw4gqh">
+      <w:hyperlink w:history="1" r:id="rId8i_p1nqpksr2vwimgll8m">
         <w:r>
           <w:rPr>
             <w:rFonts w:ascii="Simplified Arabic" w:cs="Simplified Arabic" w:eastAsia="Simplified Arabic" w:hAnsi="Simplified Arabic"/>
@@ -2411,7 +2411,7 @@
     <w:p>
       <w:pPr>
         <w:bidi/>
-        <w:spacing w:after="160" w:line="360"/>
+        <w:spacing w:after="60" w:line="360"/>
         <w:jc w:val="both"/>
       </w:pPr>
       <w:r>
@@ -2451,7 +2451,7 @@
     <w:p>
       <w:pPr>
         <w:bidi/>
-        <w:spacing w:after="160" w:line="360"/>
+        <w:spacing w:after="60" w:line="360"/>
         <w:jc w:val="both"/>
       </w:pPr>
       <w:r>
@@ -2481,7 +2481,7 @@
     <w:p>
       <w:pPr>
         <w:bidi/>
-        <w:spacing w:after="160" w:line="360"/>
+        <w:spacing w:after="60" w:line="360"/>
         <w:jc w:val="both"/>
       </w:pPr>
       <w:r>
@@ -2499,7 +2499,7 @@
     <w:p>
       <w:pPr>
         <w:bidi/>
-        <w:spacing w:after="160" w:line="360"/>
+        <w:spacing w:after="60" w:line="360"/>
         <w:jc w:val="both"/>
       </w:pPr>
       <w:r>
@@ -2528,8 +2528,8 @@
     <w:p>
       <w:pPr>
         <w:bidi/>
-        <w:spacing w:after="160" w:line="360"/>
-        <w:jc w:val="both"/>
+        <w:spacing w:after="60" w:line="360"/>
+        <w:jc w:val="right"/>
       </w:pPr>
       <w:r>
         <w:rPr>
@@ -2542,7 +2542,7 @@
         </w:rPr>
         <w:t xml:space="preserve">رابط الدراسة: </w:t>
       </w:r>
-      <w:hyperlink w:history="1" r:id="rIdklvrffpstqy58_nsfnt1f">
+      <w:hyperlink w:history="1" r:id="rIdrlr21imvh0xtblkowvb9h">
         <w:r>
           <w:rPr>
             <w:rFonts w:ascii="Simplified Arabic" w:cs="Simplified Arabic" w:eastAsia="Simplified Arabic" w:hAnsi="Simplified Arabic"/>
@@ -2572,7 +2572,7 @@
     <w:p>
       <w:pPr>
         <w:bidi/>
-        <w:spacing w:after="160" w:line="360"/>
+        <w:spacing w:after="60" w:line="360"/>
         <w:jc w:val="both"/>
       </w:pPr>
       <w:r>
@@ -2612,7 +2612,7 @@
     <w:p>
       <w:pPr>
         <w:bidi/>
-        <w:spacing w:after="160" w:line="360"/>
+        <w:spacing w:after="60" w:line="360"/>
         <w:jc w:val="both"/>
       </w:pPr>
       <w:r>
@@ -2642,7 +2642,7 @@
     <w:p>
       <w:pPr>
         <w:bidi/>
-        <w:spacing w:after="160" w:line="360"/>
+        <w:spacing w:after="60" w:line="360"/>
         <w:jc w:val="both"/>
       </w:pPr>
       <w:r>
@@ -2660,7 +2660,7 @@
     <w:p>
       <w:pPr>
         <w:bidi/>
-        <w:spacing w:after="160" w:line="360"/>
+        <w:spacing w:after="60" w:line="360"/>
         <w:jc w:val="both"/>
       </w:pPr>
       <w:r>
@@ -2689,8 +2689,8 @@
     <w:p>
       <w:pPr>
         <w:bidi/>
-        <w:spacing w:after="160" w:line="360"/>
-        <w:jc w:val="both"/>
+        <w:spacing w:after="60" w:line="360"/>
+        <w:jc w:val="right"/>
       </w:pPr>
       <w:r>
         <w:rPr>
@@ -2703,7 +2703,7 @@
         </w:rPr>
         <w:t xml:space="preserve">رابط الدراسة: </w:t>
       </w:r>
-      <w:hyperlink w:history="1" r:id="rIdngcogsrtpaztnwhju9_9p">
+      <w:hyperlink w:history="1" r:id="rIdm1btrktiluqorzdauvwp2">
         <w:r>
           <w:rPr>
             <w:rFonts w:ascii="Simplified Arabic" w:cs="Simplified Arabic" w:eastAsia="Simplified Arabic" w:hAnsi="Simplified Arabic"/>
@@ -2733,7 +2733,7 @@
     <w:p>
       <w:pPr>
         <w:bidi/>
-        <w:spacing w:after="160" w:line="360"/>
+        <w:spacing w:after="60" w:line="360"/>
         <w:jc w:val="both"/>
       </w:pPr>
       <w:r>
@@ -2773,7 +2773,7 @@
     <w:p>
       <w:pPr>
         <w:bidi/>
-        <w:spacing w:after="160" w:line="360"/>
+        <w:spacing w:after="60" w:line="360"/>
         <w:jc w:val="both"/>
       </w:pPr>
       <w:r>
@@ -2803,7 +2803,7 @@
     <w:p>
       <w:pPr>
         <w:bidi/>
-        <w:spacing w:after="160" w:line="360"/>
+        <w:spacing w:after="60" w:line="360"/>
         <w:jc w:val="both"/>
       </w:pPr>
       <w:r>
@@ -2821,7 +2821,7 @@
     <w:p>
       <w:pPr>
         <w:bidi/>
-        <w:spacing w:after="160" w:line="360"/>
+        <w:spacing w:after="60" w:line="360"/>
         <w:jc w:val="both"/>
       </w:pPr>
       <w:r>
@@ -2850,8 +2850,8 @@
     <w:p>
       <w:pPr>
         <w:bidi/>
-        <w:spacing w:after="160" w:line="360"/>
-        <w:jc w:val="both"/>
+        <w:spacing w:after="60" w:line="360"/>
+        <w:jc w:val="right"/>
       </w:pPr>
       <w:r>
         <w:rPr>
@@ -2864,7 +2864,7 @@
         </w:rPr>
         <w:t xml:space="preserve">رابط الدراسة: </w:t>
       </w:r>
-      <w:hyperlink w:history="1" r:id="rIdrktxh1axizsm73y_s9ggd">
+      <w:hyperlink w:history="1" r:id="rIdhcwxdefsoaqrhi_f0q8md">
         <w:r>
           <w:rPr>
             <w:rFonts w:ascii="Simplified Arabic" w:cs="Simplified Arabic" w:eastAsia="Simplified Arabic" w:hAnsi="Simplified Arabic"/>
@@ -2894,7 +2894,7 @@
     <w:p>
       <w:pPr>
         <w:bidi/>
-        <w:spacing w:after="160" w:line="360"/>
+        <w:spacing w:after="60" w:line="360"/>
         <w:jc w:val="both"/>
       </w:pPr>
       <w:r>
@@ -2934,7 +2934,7 @@
     <w:p>
       <w:pPr>
         <w:bidi/>
-        <w:spacing w:after="160" w:line="360"/>
+        <w:spacing w:after="60" w:line="360"/>
         <w:jc w:val="both"/>
       </w:pPr>
       <w:r>
@@ -2964,7 +2964,7 @@
     <w:p>
       <w:pPr>
         <w:bidi/>
-        <w:spacing w:after="160" w:line="360"/>
+        <w:spacing w:after="60" w:line="360"/>
         <w:jc w:val="both"/>
       </w:pPr>
       <w:r>
@@ -2982,7 +2982,7 @@
     <w:p>
       <w:pPr>
         <w:bidi/>
-        <w:spacing w:after="160" w:line="360"/>
+        <w:spacing w:after="60" w:line="360"/>
         <w:jc w:val="both"/>
       </w:pPr>
       <w:r>
@@ -3011,8 +3011,8 @@
     <w:p>
       <w:pPr>
         <w:bidi/>
-        <w:spacing w:after="160" w:line="360"/>
-        <w:jc w:val="both"/>
+        <w:spacing w:after="60" w:line="360"/>
+        <w:jc w:val="right"/>
       </w:pPr>
       <w:r>
         <w:rPr>
@@ -3025,7 +3025,7 @@
         </w:rPr>
         <w:t xml:space="preserve">رابط الدراسة: </w:t>
       </w:r>
-      <w:hyperlink w:history="1" r:id="rIdowj9q6ghiee6u2ntzcvjh">
+      <w:hyperlink w:history="1" r:id="rId8dk6gemjesk98i_myea9r">
         <w:r>
           <w:rPr>
             <w:rFonts w:ascii="Simplified Arabic" w:cs="Simplified Arabic" w:eastAsia="Simplified Arabic" w:hAnsi="Simplified Arabic"/>
@@ -3055,7 +3055,7 @@
     <w:p>
       <w:pPr>
         <w:bidi/>
-        <w:spacing w:after="160" w:line="360"/>
+        <w:spacing w:after="60" w:line="360"/>
         <w:jc w:val="both"/>
       </w:pPr>
       <w:r>
@@ -3095,7 +3095,7 @@
     <w:p>
       <w:pPr>
         <w:bidi/>
-        <w:spacing w:after="160" w:line="360"/>
+        <w:spacing w:after="60" w:line="360"/>
         <w:jc w:val="both"/>
       </w:pPr>
       <w:r>
@@ -3125,7 +3125,7 @@
     <w:p>
       <w:pPr>
         <w:bidi/>
-        <w:spacing w:after="160" w:line="360"/>
+        <w:spacing w:after="60" w:line="360"/>
         <w:jc w:val="both"/>
       </w:pPr>
       <w:r>
@@ -3143,7 +3143,7 @@
     <w:p>
       <w:pPr>
         <w:bidi/>
-        <w:spacing w:after="160" w:line="360"/>
+        <w:spacing w:after="60" w:line="360"/>
         <w:jc w:val="both"/>
       </w:pPr>
       <w:r>
@@ -3172,8 +3172,8 @@
     <w:p>
       <w:pPr>
         <w:bidi/>
-        <w:spacing w:after="160" w:line="360"/>
-        <w:jc w:val="both"/>
+        <w:spacing w:after="60" w:line="360"/>
+        <w:jc w:val="right"/>
       </w:pPr>
       <w:r>
         <w:rPr>
@@ -3186,7 +3186,7 @@
         </w:rPr>
         <w:t xml:space="preserve">رابط الدراسة: </w:t>
       </w:r>
-      <w:hyperlink w:history="1" r:id="rIdyhzojctdznabz10oirfqq">
+      <w:hyperlink w:history="1" r:id="rIdv3ytkv7zjhxs2faqoedgj">
         <w:r>
           <w:rPr>
             <w:rFonts w:ascii="Simplified Arabic" w:cs="Simplified Arabic" w:eastAsia="Simplified Arabic" w:hAnsi="Simplified Arabic"/>
@@ -3216,7 +3216,7 @@
     <w:p>
       <w:pPr>
         <w:bidi/>
-        <w:spacing w:after="160" w:line="360"/>
+        <w:spacing w:after="60" w:line="360"/>
         <w:jc w:val="both"/>
       </w:pPr>
       <w:r>
@@ -3256,7 +3256,7 @@
     <w:p>
       <w:pPr>
         <w:bidi/>
-        <w:spacing w:after="160" w:line="360"/>
+        <w:spacing w:after="60" w:line="360"/>
         <w:jc w:val="both"/>
       </w:pPr>
       <w:r>
@@ -3306,7 +3306,7 @@
     <w:p>
       <w:pPr>
         <w:bidi/>
-        <w:spacing w:after="160" w:line="360"/>
+        <w:spacing w:after="60" w:line="360"/>
         <w:jc w:val="both"/>
       </w:pPr>
       <w:r>
@@ -3324,7 +3324,7 @@
     <w:p>
       <w:pPr>
         <w:bidi/>
-        <w:spacing w:after="160" w:line="360"/>
+        <w:spacing w:after="60" w:line="360"/>
         <w:jc w:val="both"/>
       </w:pPr>
       <w:r>
@@ -3353,8 +3353,8 @@
     <w:p>
       <w:pPr>
         <w:bidi/>
-        <w:spacing w:after="160" w:line="360"/>
-        <w:jc w:val="both"/>
+        <w:spacing w:after="60" w:line="360"/>
+        <w:jc w:val="right"/>
       </w:pPr>
       <w:r>
         <w:rPr>
@@ -3367,7 +3367,7 @@
         </w:rPr>
         <w:t xml:space="preserve">رابط الدراسة: </w:t>
       </w:r>
-      <w:hyperlink w:history="1" r:id="rIdzpv_dz3nptao-gscxiyp8">
+      <w:hyperlink w:history="1" r:id="rIdt_nc7wxw72df2oqrkpdrl">
         <w:r>
           <w:rPr>
             <w:rFonts w:ascii="Simplified Arabic" w:cs="Simplified Arabic" w:eastAsia="Simplified Arabic" w:hAnsi="Simplified Arabic"/>
@@ -3397,7 +3397,7 @@
     <w:p>
       <w:pPr>
         <w:bidi/>
-        <w:spacing w:after="160" w:line="360"/>
+        <w:spacing w:after="60" w:line="360"/>
         <w:jc w:val="both"/>
       </w:pPr>
       <w:r>
@@ -3437,7 +3437,7 @@
     <w:p>
       <w:pPr>
         <w:bidi/>
-        <w:spacing w:after="160" w:line="360"/>
+        <w:spacing w:after="60" w:line="360"/>
         <w:jc w:val="both"/>
       </w:pPr>
       <w:r>
@@ -3467,7 +3467,7 @@
     <w:p>
       <w:pPr>
         <w:bidi/>
-        <w:spacing w:after="160" w:line="360"/>
+        <w:spacing w:after="60" w:line="360"/>
         <w:jc w:val="both"/>
       </w:pPr>
       <w:r>
@@ -3485,7 +3485,7 @@
     <w:p>
       <w:pPr>
         <w:bidi/>
-        <w:spacing w:after="160" w:line="360"/>
+        <w:spacing w:after="60" w:line="360"/>
         <w:jc w:val="both"/>
       </w:pPr>
       <w:r>
@@ -3514,8 +3514,8 @@
     <w:p>
       <w:pPr>
         <w:bidi/>
-        <w:spacing w:after="160" w:line="360"/>
-        <w:jc w:val="both"/>
+        <w:spacing w:after="60" w:line="360"/>
+        <w:jc w:val="right"/>
       </w:pPr>
       <w:r>
         <w:rPr>
@@ -3528,7 +3528,7 @@
         </w:rPr>
         <w:t xml:space="preserve">رابط الدراسة: </w:t>
       </w:r>
-      <w:hyperlink w:history="1" r:id="rIdplzmiguh7ny0xgcny6nza">
+      <w:hyperlink w:history="1" r:id="rId_0nnuiv2buuxhhbfagek6">
         <w:r>
           <w:rPr>
             <w:rFonts w:ascii="Simplified Arabic" w:cs="Simplified Arabic" w:eastAsia="Simplified Arabic" w:hAnsi="Simplified Arabic"/>
@@ -3558,7 +3558,7 @@
     <w:p>
       <w:pPr>
         <w:bidi/>
-        <w:spacing w:after="160" w:line="360"/>
+        <w:spacing w:after="60" w:line="360"/>
         <w:jc w:val="both"/>
       </w:pPr>
       <w:r>
@@ -3598,7 +3598,7 @@
     <w:p>
       <w:pPr>
         <w:bidi/>
-        <w:spacing w:after="160" w:line="360"/>
+        <w:spacing w:after="60" w:line="360"/>
         <w:jc w:val="both"/>
       </w:pPr>
       <w:r>
@@ -3628,7 +3628,7 @@
     <w:p>
       <w:pPr>
         <w:bidi/>
-        <w:spacing w:after="160" w:line="360"/>
+        <w:spacing w:after="60" w:line="360"/>
         <w:jc w:val="both"/>
       </w:pPr>
       <w:r>
@@ -3646,7 +3646,7 @@
     <w:p>
       <w:pPr>
         <w:bidi/>
-        <w:spacing w:after="160" w:line="360"/>
+        <w:spacing w:after="60" w:line="360"/>
         <w:jc w:val="both"/>
       </w:pPr>
       <w:r>
@@ -3675,8 +3675,8 @@
     <w:p>
       <w:pPr>
         <w:bidi/>
-        <w:spacing w:after="160" w:line="360"/>
-        <w:jc w:val="both"/>
+        <w:spacing w:after="60" w:line="360"/>
+        <w:jc w:val="right"/>
       </w:pPr>
       <w:r>
         <w:rPr>
@@ -3689,7 +3689,7 @@
         </w:rPr>
         <w:t xml:space="preserve">رابط الدراسة: </w:t>
       </w:r>
-      <w:hyperlink w:history="1" r:id="rId1dfazi4lutmlgmozosdgo">
+      <w:hyperlink w:history="1" r:id="rIdtbmfaqbaozxv7143yqgru">
         <w:r>
           <w:rPr>
             <w:rFonts w:ascii="Simplified Arabic" w:cs="Simplified Arabic" w:eastAsia="Simplified Arabic" w:hAnsi="Simplified Arabic"/>
@@ -3719,7 +3719,7 @@
     <w:p>
       <w:pPr>
         <w:bidi/>
-        <w:spacing w:after="160" w:line="360"/>
+        <w:spacing w:after="60" w:line="360"/>
         <w:jc w:val="both"/>
       </w:pPr>
       <w:r>
@@ -3759,7 +3759,7 @@
     <w:p>
       <w:pPr>
         <w:bidi/>
-        <w:spacing w:after="160" w:line="360"/>
+        <w:spacing w:after="60" w:line="360"/>
         <w:jc w:val="both"/>
       </w:pPr>
       <w:r>
@@ -3789,7 +3789,7 @@
     <w:p>
       <w:pPr>
         <w:bidi/>
-        <w:spacing w:after="160" w:line="360"/>
+        <w:spacing w:after="60" w:line="360"/>
         <w:jc w:val="both"/>
       </w:pPr>
       <w:r>
@@ -3807,7 +3807,7 @@
     <w:p>
       <w:pPr>
         <w:bidi/>
-        <w:spacing w:after="160" w:line="360"/>
+        <w:spacing w:after="60" w:line="360"/>
         <w:jc w:val="both"/>
       </w:pPr>
       <w:r>
@@ -3836,8 +3836,8 @@
     <w:p>
       <w:pPr>
         <w:bidi/>
-        <w:spacing w:after="160" w:line="360"/>
-        <w:jc w:val="both"/>
+        <w:spacing w:after="60" w:line="360"/>
+        <w:jc w:val="right"/>
       </w:pPr>
       <w:r>
         <w:rPr>
@@ -3850,7 +3850,7 @@
         </w:rPr>
         <w:t xml:space="preserve">رابط الدراسة: </w:t>
       </w:r>
-      <w:hyperlink w:history="1" r:id="rIdvr1tw4n9f2qe1mzqgrti4">
+      <w:hyperlink w:history="1" r:id="rIddopqmbbetwiri5qlm8gmq">
         <w:r>
           <w:rPr>
             <w:rFonts w:ascii="Simplified Arabic" w:cs="Simplified Arabic" w:eastAsia="Simplified Arabic" w:hAnsi="Simplified Arabic"/>
@@ -3880,7 +3880,7 @@
     <w:p>
       <w:pPr>
         <w:bidi/>
-        <w:spacing w:after="160" w:line="360"/>
+        <w:spacing w:after="60" w:line="360"/>
         <w:jc w:val="both"/>
       </w:pPr>
       <w:r>
@@ -3920,7 +3920,7 @@
     <w:p>
       <w:pPr>
         <w:bidi/>
-        <w:spacing w:after="160" w:line="360"/>
+        <w:spacing w:after="60" w:line="360"/>
         <w:jc w:val="both"/>
       </w:pPr>
       <w:r>
@@ -3950,7 +3950,7 @@
     <w:p>
       <w:pPr>
         <w:bidi/>
-        <w:spacing w:after="160" w:line="360"/>
+        <w:spacing w:after="60" w:line="360"/>
         <w:jc w:val="both"/>
       </w:pPr>
       <w:r>
@@ -3968,7 +3968,7 @@
     <w:p>
       <w:pPr>
         <w:bidi/>
-        <w:spacing w:after="160" w:line="360"/>
+        <w:spacing w:after="60" w:line="360"/>
         <w:jc w:val="both"/>
       </w:pPr>
       <w:r>
@@ -3997,8 +3997,8 @@
     <w:p>
       <w:pPr>
         <w:bidi/>
-        <w:spacing w:after="160" w:line="360"/>
-        <w:jc w:val="both"/>
+        <w:spacing w:after="60" w:line="360"/>
+        <w:jc w:val="right"/>
       </w:pPr>
       <w:r>
         <w:rPr>
@@ -4011,7 +4011,7 @@
         </w:rPr>
         <w:t xml:space="preserve">رابط الدراسة: </w:t>
       </w:r>
-      <w:hyperlink w:history="1" r:id="rIdx3usx5vqln4wrl3xu0fit">
+      <w:hyperlink w:history="1" r:id="rIdi0x7xrykw9tfulsu_g-vb">
         <w:r>
           <w:rPr>
             <w:rFonts w:ascii="Simplified Arabic" w:cs="Simplified Arabic" w:eastAsia="Simplified Arabic" w:hAnsi="Simplified Arabic"/>
@@ -4041,7 +4041,7 @@
     <w:p>
       <w:pPr>
         <w:bidi/>
-        <w:spacing w:after="160" w:line="360"/>
+        <w:spacing w:after="60" w:line="360"/>
         <w:jc w:val="both"/>
       </w:pPr>
       <w:r>
@@ -4081,7 +4081,7 @@
     <w:p>
       <w:pPr>
         <w:bidi/>
-        <w:spacing w:after="160" w:line="360"/>
+        <w:spacing w:after="60" w:line="360"/>
         <w:jc w:val="both"/>
       </w:pPr>
       <w:r>
@@ -4111,7 +4111,7 @@
     <w:p>
       <w:pPr>
         <w:bidi/>
-        <w:spacing w:after="160" w:line="360"/>
+        <w:spacing w:after="60" w:line="360"/>
         <w:jc w:val="both"/>
       </w:pPr>
       <w:r>
@@ -4129,7 +4129,7 @@
     <w:p>
       <w:pPr>
         <w:bidi/>
-        <w:spacing w:after="160" w:line="360"/>
+        <w:spacing w:after="60" w:line="360"/>
         <w:jc w:val="both"/>
       </w:pPr>
       <w:r>
@@ -4158,8 +4158,8 @@
     <w:p>
       <w:pPr>
         <w:bidi/>
-        <w:spacing w:after="160" w:line="360"/>
-        <w:jc w:val="both"/>
+        <w:spacing w:after="60" w:line="360"/>
+        <w:jc w:val="right"/>
       </w:pPr>
       <w:r>
         <w:rPr>
@@ -4172,7 +4172,7 @@
         </w:rPr>
         <w:t xml:space="preserve">رابط الدراسة: </w:t>
       </w:r>
-      <w:hyperlink w:history="1" r:id="rIddp0o1rffr9gs6dhmzzduc">
+      <w:hyperlink w:history="1" r:id="rIdsgjufrzm0iuk60j5n9vxz">
         <w:r>
           <w:rPr>
             <w:rFonts w:ascii="Simplified Arabic" w:cs="Simplified Arabic" w:eastAsia="Simplified Arabic" w:hAnsi="Simplified Arabic"/>
@@ -4202,7 +4202,7 @@
     <w:p>
       <w:pPr>
         <w:bidi/>
-        <w:spacing w:after="160" w:line="360"/>
+        <w:spacing w:after="60" w:line="360"/>
         <w:jc w:val="both"/>
       </w:pPr>
       <w:r>
@@ -4242,7 +4242,7 @@
     <w:p>
       <w:pPr>
         <w:bidi/>
-        <w:spacing w:after="160" w:line="360"/>
+        <w:spacing w:after="60" w:line="360"/>
         <w:jc w:val="both"/>
       </w:pPr>
       <w:r>
@@ -4272,7 +4272,7 @@
     <w:p>
       <w:pPr>
         <w:bidi/>
-        <w:spacing w:after="160" w:line="360"/>
+        <w:spacing w:after="60" w:line="360"/>
         <w:jc w:val="both"/>
       </w:pPr>
       <w:r>
@@ -4290,7 +4290,7 @@
     <w:p>
       <w:pPr>
         <w:bidi/>
-        <w:spacing w:after="160" w:line="360"/>
+        <w:spacing w:after="60" w:line="360"/>
         <w:jc w:val="both"/>
       </w:pPr>
       <w:r>
@@ -4319,8 +4319,8 @@
     <w:p>
       <w:pPr>
         <w:bidi/>
-        <w:spacing w:after="160" w:line="360"/>
-        <w:jc w:val="both"/>
+        <w:spacing w:after="60" w:line="360"/>
+        <w:jc w:val="right"/>
       </w:pPr>
       <w:r>
         <w:rPr>
@@ -4333,7 +4333,7 @@
         </w:rPr>
         <w:t xml:space="preserve">رابط الدراسة: </w:t>
       </w:r>
-      <w:hyperlink w:history="1" r:id="rIdsynrryntqklw7utsigbc6">
+      <w:hyperlink w:history="1" r:id="rIdrppced77qlsknrnocp6is">
         <w:r>
           <w:rPr>
             <w:rFonts w:ascii="Simplified Arabic" w:cs="Simplified Arabic" w:eastAsia="Simplified Arabic" w:hAnsi="Simplified Arabic"/>
@@ -4363,7 +4363,7 @@
     <w:p>
       <w:pPr>
         <w:bidi/>
-        <w:spacing w:after="160" w:line="360"/>
+        <w:spacing w:after="60" w:line="360"/>
         <w:jc w:val="both"/>
       </w:pPr>
       <w:r>
@@ -4403,7 +4403,7 @@
     <w:p>
       <w:pPr>
         <w:bidi/>
-        <w:spacing w:after="160" w:line="360"/>
+        <w:spacing w:after="60" w:line="360"/>
         <w:jc w:val="both"/>
       </w:pPr>
       <w:r>
@@ -4433,7 +4433,7 @@
     <w:p>
       <w:pPr>
         <w:bidi/>
-        <w:spacing w:after="160" w:line="360"/>
+        <w:spacing w:after="60" w:line="360"/>
         <w:jc w:val="both"/>
       </w:pPr>
       <w:r>
@@ -4451,7 +4451,7 @@
     <w:p>
       <w:pPr>
         <w:bidi/>
-        <w:spacing w:after="160" w:line="360"/>
+        <w:spacing w:after="60" w:line="360"/>
         <w:jc w:val="both"/>
       </w:pPr>
       <w:r>
@@ -4480,8 +4480,8 @@
     <w:p>
       <w:pPr>
         <w:bidi/>
-        <w:spacing w:after="160" w:line="360"/>
-        <w:jc w:val="both"/>
+        <w:spacing w:after="60" w:line="360"/>
+        <w:jc w:val="right"/>
       </w:pPr>
       <w:r>
         <w:rPr>
@@ -4494,7 +4494,7 @@
         </w:rPr>
         <w:t xml:space="preserve">رابط الدراسة: </w:t>
       </w:r>
-      <w:hyperlink w:history="1" r:id="rIdotjydt9bypl4dplfjk4ht">
+      <w:hyperlink w:history="1" r:id="rIdv6qgppfnjtnxsrnqvsuez">
         <w:r>
           <w:rPr>
             <w:rFonts w:ascii="Simplified Arabic" w:cs="Simplified Arabic" w:eastAsia="Simplified Arabic" w:hAnsi="Simplified Arabic"/>
@@ -4524,7 +4524,7 @@
     <w:p>
       <w:pPr>
         <w:bidi/>
-        <w:spacing w:after="160" w:line="360"/>
+        <w:spacing w:after="60" w:line="360"/>
         <w:jc w:val="both"/>
       </w:pPr>
       <w:r>
@@ -4564,7 +4564,7 @@
     <w:p>
       <w:pPr>
         <w:bidi/>
-        <w:spacing w:after="160" w:line="360"/>
+        <w:spacing w:after="60" w:line="360"/>
         <w:jc w:val="both"/>
       </w:pPr>
       <w:r>
@@ -4594,7 +4594,7 @@
     <w:p>
       <w:pPr>
         <w:bidi/>
-        <w:spacing w:after="160" w:line="360"/>
+        <w:spacing w:after="60" w:line="360"/>
         <w:jc w:val="both"/>
       </w:pPr>
       <w:r>
@@ -4612,7 +4612,7 @@
     <w:p>
       <w:pPr>
         <w:bidi/>
-        <w:spacing w:after="160" w:line="360"/>
+        <w:spacing w:after="60" w:line="360"/>
         <w:jc w:val="both"/>
       </w:pPr>
       <w:r>
@@ -4641,8 +4641,8 @@
     <w:p>
       <w:pPr>
         <w:bidi/>
-        <w:spacing w:after="160" w:line="360"/>
-        <w:jc w:val="both"/>
+        <w:spacing w:after="60" w:line="360"/>
+        <w:jc w:val="right"/>
       </w:pPr>
       <w:r>
         <w:rPr>
@@ -4655,7 +4655,7 @@
         </w:rPr>
         <w:t xml:space="preserve">رابط الدراسة: </w:t>
       </w:r>
-      <w:hyperlink w:history="1" r:id="rIddhvdsofjsumswyqyicruy">
+      <w:hyperlink w:history="1" r:id="rId-l_qog8sbuaxcc5ux9wv-">
         <w:r>
           <w:rPr>
             <w:rFonts w:ascii="Simplified Arabic" w:cs="Simplified Arabic" w:eastAsia="Simplified Arabic" w:hAnsi="Simplified Arabic"/>
@@ -4685,7 +4685,7 @@
     <w:p>
       <w:pPr>
         <w:bidi/>
-        <w:spacing w:after="160" w:line="360"/>
+        <w:spacing w:after="60" w:line="360"/>
         <w:jc w:val="both"/>
       </w:pPr>
       <w:r>
@@ -4725,7 +4725,7 @@
     <w:p>
       <w:pPr>
         <w:bidi/>
-        <w:spacing w:after="160" w:line="360"/>
+        <w:spacing w:after="60" w:line="360"/>
         <w:jc w:val="both"/>
       </w:pPr>
       <w:r>
@@ -4755,7 +4755,7 @@
     <w:p>
       <w:pPr>
         <w:bidi/>
-        <w:spacing w:after="160" w:line="360"/>
+        <w:spacing w:after="60" w:line="360"/>
         <w:jc w:val="both"/>
       </w:pPr>
       <w:r>
@@ -4773,7 +4773,7 @@
     <w:p>
       <w:pPr>
         <w:bidi/>
-        <w:spacing w:after="160" w:line="360"/>
+        <w:spacing w:after="60" w:line="360"/>
         <w:jc w:val="both"/>
       </w:pPr>
       <w:r>
@@ -4802,8 +4802,8 @@
     <w:p>
       <w:pPr>
         <w:bidi/>
-        <w:spacing w:after="160" w:line="360"/>
-        <w:jc w:val="both"/>
+        <w:spacing w:after="60" w:line="360"/>
+        <w:jc w:val="right"/>
       </w:pPr>
       <w:r>
         <w:rPr>
@@ -4816,7 +4816,7 @@
         </w:rPr>
         <w:t xml:space="preserve">رابط الدراسة: </w:t>
       </w:r>
-      <w:hyperlink w:history="1" r:id="rId8ju6s9fqisognfcg3so0y">
+      <w:hyperlink w:history="1" r:id="rIdvex0kb2fenjwirhs-f5xt">
         <w:r>
           <w:rPr>
             <w:rFonts w:ascii="Simplified Arabic" w:cs="Simplified Arabic" w:eastAsia="Simplified Arabic" w:hAnsi="Simplified Arabic"/>
@@ -4846,7 +4846,7 @@
     <w:p>
       <w:pPr>
         <w:bidi/>
-        <w:spacing w:after="160" w:line="360"/>
+        <w:spacing w:after="60" w:line="360"/>
         <w:jc w:val="both"/>
       </w:pPr>
       <w:r>
@@ -4886,7 +4886,7 @@
     <w:p>
       <w:pPr>
         <w:bidi/>
-        <w:spacing w:after="160" w:line="360"/>
+        <w:spacing w:after="60" w:line="360"/>
         <w:jc w:val="both"/>
       </w:pPr>
       <w:r>
@@ -4937,7 +4937,7 @@
     <w:p>
       <w:pPr>
         <w:bidi/>
-        <w:spacing w:after="160" w:line="360"/>
+        <w:spacing w:after="60" w:line="360"/>
         <w:jc w:val="both"/>
       </w:pPr>
       <w:r>
@@ -4966,7 +4966,7 @@
     <w:p>
       <w:pPr>
         <w:bidi/>
-        <w:spacing w:after="160" w:line="360"/>
+        <w:spacing w:after="60" w:line="360"/>
         <w:jc w:val="both"/>
       </w:pPr>
       <w:r>
@@ -4995,7 +4995,7 @@
     <w:p>
       <w:pPr>
         <w:bidi/>
-        <w:spacing w:after="160" w:line="360"/>
+        <w:spacing w:after="60" w:line="360"/>
         <w:jc w:val="both"/>
       </w:pPr>
       <w:r>
@@ -5024,7 +5024,7 @@
     <w:p>
       <w:pPr>
         <w:bidi/>
-        <w:spacing w:after="160" w:line="360"/>
+        <w:spacing w:after="60" w:line="360"/>
         <w:jc w:val="both"/>
       </w:pPr>
       <w:r>
@@ -5053,7 +5053,7 @@
     <w:p>
       <w:pPr>
         <w:bidi/>
-        <w:spacing w:after="160" w:line="360"/>
+        <w:spacing w:after="60" w:line="360"/>
         <w:jc w:val="both"/>
       </w:pPr>
       <w:r>
@@ -5103,7 +5103,7 @@
     <w:p>
       <w:pPr>
         <w:bidi/>
-        <w:spacing w:after="160" w:line="360"/>
+        <w:spacing w:after="60" w:line="360"/>
         <w:jc w:val="both"/>
       </w:pPr>
       <w:r>
@@ -5132,7 +5132,7 @@
     <w:p>
       <w:pPr>
         <w:bidi/>
-        <w:spacing w:after="160" w:line="360"/>
+        <w:spacing w:after="60" w:line="360"/>
         <w:jc w:val="both"/>
       </w:pPr>
       <w:r>
@@ -5161,7 +5161,7 @@
     <w:p>
       <w:pPr>
         <w:bidi/>
-        <w:spacing w:after="160" w:line="360"/>
+        <w:spacing w:after="60" w:line="360"/>
         <w:jc w:val="both"/>
       </w:pPr>
       <w:r>
@@ -5190,7 +5190,7 @@
     <w:p>
       <w:pPr>
         <w:bidi/>
-        <w:spacing w:after="160" w:line="360"/>
+        <w:spacing w:after="60" w:line="360"/>
         <w:jc w:val="both"/>
       </w:pPr>
       <w:r>
@@ -5219,7 +5219,7 @@
     <w:p>
       <w:pPr>
         <w:bidi/>
-        <w:spacing w:after="160" w:line="360"/>
+        <w:spacing w:after="60" w:line="360"/>
         <w:jc w:val="both"/>
       </w:pPr>
       <w:r>
@@ -5269,7 +5269,7 @@
     <w:p>
       <w:pPr>
         <w:bidi/>
-        <w:spacing w:after="160" w:line="360"/>
+        <w:spacing w:after="60" w:line="360"/>
         <w:jc w:val="both"/>
       </w:pPr>
       <w:r>
@@ -5307,7 +5307,7 @@
     <w:p>
       <w:pPr>
         <w:bidi/>
-        <w:spacing w:after="160" w:line="360"/>
+        <w:spacing w:after="60" w:line="360"/>
         <w:jc w:val="both"/>
       </w:pPr>
       <w:r>
@@ -5336,7 +5336,7 @@
     <w:p>
       <w:pPr>
         <w:bidi/>
-        <w:spacing w:after="160" w:line="360"/>
+        <w:spacing w:after="60" w:line="360"/>
         <w:jc w:val="both"/>
       </w:pPr>
       <w:r>
@@ -5365,7 +5365,7 @@
     <w:p>
       <w:pPr>
         <w:bidi/>
-        <w:spacing w:after="160" w:line="360"/>
+        <w:spacing w:after="60" w:line="360"/>
         <w:jc w:val="both"/>
       </w:pPr>
       <w:r>
@@ -5394,7 +5394,7 @@
     <w:p>
       <w:pPr>
         <w:bidi/>
-        <w:spacing w:after="160" w:line="360"/>
+        <w:spacing w:after="60" w:line="360"/>
         <w:jc w:val="both"/>
       </w:pPr>
       <w:r>
@@ -5423,7 +5423,7 @@
     <w:p>
       <w:pPr>
         <w:bidi/>
-        <w:spacing w:after="160" w:line="360"/>
+        <w:spacing w:after="60" w:line="360"/>
         <w:jc w:val="both"/>
       </w:pPr>
       <w:r>
@@ -5452,7 +5452,7 @@
     <w:p>
       <w:pPr>
         <w:bidi/>
-        <w:spacing w:after="160" w:line="360"/>
+        <w:spacing w:after="60" w:line="360"/>
         <w:jc w:val="both"/>
       </w:pPr>
       <w:r>
@@ -5502,7 +5502,7 @@
     <w:p>
       <w:pPr>
         <w:bidi/>
-        <w:spacing w:after="160" w:line="360"/>
+        <w:spacing w:after="60" w:line="360"/>
         <w:jc w:val="both"/>
       </w:pPr>
       <w:r>
@@ -5561,7 +5561,7 @@
     <w:p>
       <w:pPr>
         <w:bidi/>
-        <w:spacing w:after="160" w:line="360"/>
+        <w:spacing w:after="60" w:line="360"/>
         <w:jc w:val="both"/>
       </w:pPr>
       <w:r>
@@ -5579,7 +5579,7 @@
     <w:p>
       <w:pPr>
         <w:bidi/>
-        <w:spacing w:after="160" w:line="360"/>
+        <w:spacing w:after="60" w:line="360"/>
         <w:jc w:val="both"/>
       </w:pPr>
       <w:r>
@@ -5619,7 +5619,7 @@
     <w:p>
       <w:pPr>
         <w:bidi/>
-        <w:spacing w:after="160" w:line="360"/>
+        <w:spacing w:after="60" w:line="360"/>
         <w:jc w:val="both"/>
       </w:pPr>
       <w:r>
@@ -5659,7 +5659,7 @@
     <w:p>
       <w:pPr>
         <w:bidi/>
-        <w:spacing w:after="160" w:line="360"/>
+        <w:spacing w:after="60" w:line="360"/>
         <w:jc w:val="both"/>
       </w:pPr>
       <w:r>
@@ -5699,7 +5699,7 @@
     <w:p>
       <w:pPr>
         <w:bidi/>
-        <w:spacing w:after="160" w:line="360"/>
+        <w:spacing w:after="60" w:line="360"/>
         <w:jc w:val="both"/>
       </w:pPr>
       <w:r>
@@ -5739,7 +5739,7 @@
     <w:p>
       <w:pPr>
         <w:bidi/>
-        <w:spacing w:after="160" w:line="360"/>
+        <w:spacing w:after="60" w:line="360"/>
         <w:jc w:val="both"/>
       </w:pPr>
       <w:r>
@@ -5779,7 +5779,7 @@
     <w:p>
       <w:pPr>
         <w:bidi/>
-        <w:spacing w:after="160" w:line="360"/>
+        <w:spacing w:after="60" w:line="360"/>
         <w:jc w:val="both"/>
       </w:pPr>
       <w:r>
@@ -5819,7 +5819,7 @@
     <w:p>
       <w:pPr>
         <w:bidi/>
-        <w:spacing w:after="160" w:line="360"/>
+        <w:spacing w:after="60" w:line="360"/>
         <w:jc w:val="both"/>
       </w:pPr>
       <w:r>
@@ -5859,7 +5859,7 @@
     <w:p>
       <w:pPr>
         <w:bidi/>
-        <w:spacing w:after="160" w:line="360"/>
+        <w:spacing w:after="60" w:line="360"/>
         <w:jc w:val="both"/>
       </w:pPr>
       <w:r>
@@ -5877,7 +5877,7 @@
     <w:p>
       <w:pPr>
         <w:bidi/>
-        <w:spacing w:after="160" w:line="360"/>
+        <w:spacing w:after="60" w:line="360"/>
         <w:jc w:val="both"/>
       </w:pPr>
       <w:r>
@@ -5917,7 +5917,7 @@
     <w:p>
       <w:pPr>
         <w:bidi/>
-        <w:spacing w:after="160" w:line="360"/>
+        <w:spacing w:after="60" w:line="360"/>
         <w:jc w:val="both"/>
       </w:pPr>
       <w:r>
@@ -5957,7 +5957,7 @@
     <w:p>
       <w:pPr>
         <w:bidi/>
-        <w:spacing w:after="160" w:line="360"/>
+        <w:spacing w:after="60" w:line="360"/>
         <w:jc w:val="both"/>
       </w:pPr>
       <w:r>
@@ -5997,7 +5997,7 @@
     <w:p>
       <w:pPr>
         <w:bidi/>
-        <w:spacing w:after="160" w:line="360"/>
+        <w:spacing w:after="60" w:line="360"/>
         <w:jc w:val="both"/>
       </w:pPr>
       <w:r>
@@ -6037,7 +6037,7 @@
     <w:p>
       <w:pPr>
         <w:bidi/>
-        <w:spacing w:after="160" w:line="360"/>
+        <w:spacing w:after="60" w:line="360"/>
         <w:jc w:val="both"/>
       </w:pPr>
       <w:r>
@@ -6077,7 +6077,7 @@
     <w:p>
       <w:pPr>
         <w:bidi/>
-        <w:spacing w:after="160" w:line="360"/>
+        <w:spacing w:after="60" w:line="360"/>
         <w:jc w:val="both"/>
       </w:pPr>
       <w:r>
@@ -6117,7 +6117,7 @@
     <w:p>
       <w:pPr>
         <w:bidi/>
-        <w:spacing w:after="160" w:line="360"/>
+        <w:spacing w:after="60" w:line="360"/>
         <w:jc w:val="both"/>
       </w:pPr>
       <w:r>
@@ -6157,7 +6157,7 @@
     <w:p>
       <w:pPr>
         <w:bidi/>
-        <w:spacing w:after="160" w:line="360"/>
+        <w:spacing w:after="60" w:line="360"/>
         <w:jc w:val="both"/>
       </w:pPr>
       <w:r>
@@ -6217,7 +6217,7 @@
     <w:p>
       <w:pPr>
         <w:bidi/>
-        <w:spacing w:after="160" w:line="360"/>
+        <w:spacing w:after="60" w:line="360"/>
         <w:jc w:val="both"/>
       </w:pPr>
       <w:r>
@@ -6235,7 +6235,7 @@
     <w:p>
       <w:pPr>
         <w:bidi/>
-        <w:spacing w:after="160" w:line="360"/>
+        <w:spacing w:after="60" w:line="360"/>
         <w:jc w:val="both"/>
       </w:pPr>
       <w:r>
@@ -6275,7 +6275,7 @@
     <w:p>
       <w:pPr>
         <w:bidi/>
-        <w:spacing w:after="160" w:line="360"/>
+        <w:spacing w:after="60" w:line="360"/>
         <w:jc w:val="both"/>
       </w:pPr>
       <w:r>
@@ -6315,7 +6315,7 @@
     <w:p>
       <w:pPr>
         <w:bidi/>
-        <w:spacing w:after="160" w:line="360"/>
+        <w:spacing w:after="60" w:line="360"/>
         <w:jc w:val="both"/>
       </w:pPr>
       <w:r>
@@ -6355,7 +6355,7 @@
     <w:p>
       <w:pPr>
         <w:bidi/>
-        <w:spacing w:after="160" w:line="360"/>
+        <w:spacing w:after="60" w:line="360"/>
         <w:jc w:val="both"/>
       </w:pPr>
       <w:r>
@@ -6373,7 +6373,7 @@
     <w:p>
       <w:pPr>
         <w:bidi/>
-        <w:spacing w:after="160" w:line="360"/>
+        <w:spacing w:after="60" w:line="360"/>
         <w:jc w:val="both"/>
       </w:pPr>
       <w:r>
@@ -6413,7 +6413,7 @@
     <w:p>
       <w:pPr>
         <w:bidi/>
-        <w:spacing w:after="160" w:line="360"/>
+        <w:spacing w:after="60" w:line="360"/>
         <w:jc w:val="both"/>
       </w:pPr>
       <w:r>
@@ -6453,7 +6453,7 @@
     <w:p>
       <w:pPr>
         <w:bidi/>
-        <w:spacing w:after="160" w:line="360"/>
+        <w:spacing w:after="60" w:line="360"/>
         <w:jc w:val="both"/>
       </w:pPr>
       <w:r>
@@ -6513,7 +6513,7 @@
     <w:p>
       <w:pPr>
         <w:bidi/>
-        <w:spacing w:after="160" w:line="360"/>
+        <w:spacing w:after="60" w:line="360"/>
         <w:jc w:val="both"/>
       </w:pPr>
       <w:r>
@@ -6553,7 +6553,7 @@
     <w:p>
       <w:pPr>
         <w:bidi/>
-        <w:spacing w:after="160" w:line="360"/>
+        <w:spacing w:after="60" w:line="360"/>
         <w:jc w:val="both"/>
       </w:pPr>
       <w:r>
@@ -6593,7 +6593,7 @@
     <w:p>
       <w:pPr>
         <w:bidi/>
-        <w:spacing w:after="160" w:line="360"/>
+        <w:spacing w:after="60" w:line="360"/>
         <w:jc w:val="both"/>
       </w:pPr>
       <w:r>
@@ -6633,7 +6633,7 @@
     <w:p>
       <w:pPr>
         <w:bidi/>
-        <w:spacing w:after="160" w:line="360"/>
+        <w:spacing w:after="60" w:line="360"/>
         <w:jc w:val="both"/>
       </w:pPr>
       <w:r>
@@ -6673,7 +6673,7 @@
     <w:p>
       <w:pPr>
         <w:bidi/>
-        <w:spacing w:after="160" w:line="360"/>
+        <w:spacing w:after="60" w:line="360"/>
         <w:jc w:val="both"/>
       </w:pPr>
       <w:r>
@@ -6733,7 +6733,7 @@
     <w:p>
       <w:pPr>
         <w:bidi/>
-        <w:spacing w:after="160" w:line="360"/>
+        <w:spacing w:after="60" w:line="360"/>
         <w:jc w:val="both"/>
       </w:pPr>
       <w:r>
@@ -6751,7 +6751,7 @@
     <w:p>
       <w:pPr>
         <w:bidi/>
-        <w:spacing w:after="160" w:line="360"/>
+        <w:spacing w:after="60" w:line="360"/>
         <w:jc w:val="both"/>
       </w:pPr>
       <w:r>
@@ -6791,7 +6791,7 @@
     <w:p>
       <w:pPr>
         <w:bidi/>
-        <w:spacing w:after="160" w:line="360"/>
+        <w:spacing w:after="60" w:line="360"/>
         <w:jc w:val="both"/>
       </w:pPr>
       <w:r>
@@ -6831,7 +6831,7 @@
     <w:p>
       <w:pPr>
         <w:bidi/>
-        <w:spacing w:after="160" w:line="360"/>
+        <w:spacing w:after="60" w:line="360"/>
         <w:jc w:val="both"/>
       </w:pPr>
       <w:r>
@@ -6871,7 +6871,7 @@
     <w:p>
       <w:pPr>
         <w:bidi/>
-        <w:spacing w:after="160" w:line="360"/>
+        <w:spacing w:after="60" w:line="360"/>
         <w:jc w:val="both"/>
       </w:pPr>
       <w:r>
@@ -6911,7 +6911,7 @@
     <w:p>
       <w:pPr>
         <w:bidi/>
-        <w:spacing w:after="160" w:line="360"/>
+        <w:spacing w:after="60" w:line="360"/>
         <w:jc w:val="both"/>
       </w:pPr>
       <w:r>
@@ -6929,7 +6929,7 @@
     <w:p>
       <w:pPr>
         <w:bidi/>
-        <w:spacing w:after="160" w:line="360"/>
+        <w:spacing w:after="60" w:line="360"/>
         <w:jc w:val="both"/>
       </w:pPr>
       <w:r>
@@ -6969,7 +6969,7 @@
     <w:p>
       <w:pPr>
         <w:bidi/>
-        <w:spacing w:after="160" w:line="360"/>
+        <w:spacing w:after="60" w:line="360"/>
         <w:jc w:val="both"/>
       </w:pPr>
       <w:r>
@@ -7009,7 +7009,7 @@
     <w:p>
       <w:pPr>
         <w:bidi/>
-        <w:spacing w:after="160" w:line="360"/>
+        <w:spacing w:after="60" w:line="360"/>
         <w:jc w:val="both"/>
       </w:pPr>
       <w:r>
@@ -7049,7 +7049,7 @@
     <w:p>
       <w:pPr>
         <w:bidi/>
-        <w:spacing w:after="160" w:line="360"/>
+        <w:spacing w:after="60" w:line="360"/>
         <w:jc w:val="both"/>
       </w:pPr>
       <w:r>
@@ -7089,7 +7089,7 @@
     <w:p>
       <w:pPr>
         <w:bidi/>
-        <w:spacing w:after="160" w:line="360"/>
+        <w:spacing w:after="60" w:line="360"/>
         <w:jc w:val="both"/>
       </w:pPr>
       <w:r>
@@ -7107,7 +7107,7 @@
     <w:p>
       <w:pPr>
         <w:bidi/>
-        <w:spacing w:after="160" w:line="360"/>
+        <w:spacing w:after="60" w:line="360"/>
         <w:jc w:val="both"/>
       </w:pPr>
       <w:r>
@@ -7147,7 +7147,7 @@
     <w:p>
       <w:pPr>
         <w:bidi/>
-        <w:spacing w:after="160" w:line="360"/>
+        <w:spacing w:after="60" w:line="360"/>
         <w:jc w:val="both"/>
       </w:pPr>
       <w:r>
@@ -7187,7 +7187,7 @@
     <w:p>
       <w:pPr>
         <w:bidi/>
-        <w:spacing w:after="160" w:line="360"/>
+        <w:spacing w:after="60" w:line="360"/>
         <w:jc w:val="both"/>
       </w:pPr>
       <w:r>
@@ -7227,7 +7227,7 @@
     <w:p>
       <w:pPr>
         <w:bidi/>
-        <w:spacing w:after="160" w:line="360"/>
+        <w:spacing w:after="60" w:line="360"/>
         <w:jc w:val="both"/>
       </w:pPr>
       <w:r>
@@ -7267,7 +7267,7 @@
     <w:p>
       <w:pPr>
         <w:bidi/>
-        <w:spacing w:after="160" w:line="360"/>
+        <w:spacing w:after="60" w:line="360"/>
         <w:jc w:val="both"/>
       </w:pPr>
       <w:r>
@@ -7285,7 +7285,7 @@
     <w:p>
       <w:pPr>
         <w:bidi/>
-        <w:spacing w:after="160" w:line="360"/>
+        <w:spacing w:after="60" w:line="360"/>
         <w:jc w:val="both"/>
       </w:pPr>
       <w:r>
@@ -7325,7 +7325,7 @@
     <w:p>
       <w:pPr>
         <w:bidi/>
-        <w:spacing w:after="160" w:line="360"/>
+        <w:spacing w:after="60" w:line="360"/>
         <w:jc w:val="both"/>
       </w:pPr>
       <w:r>
@@ -7365,7 +7365,7 @@
     <w:p>
       <w:pPr>
         <w:bidi/>
-        <w:spacing w:after="160" w:line="360"/>
+        <w:spacing w:after="60" w:line="360"/>
         <w:jc w:val="both"/>
       </w:pPr>
       <w:r>
@@ -7405,7 +7405,7 @@
     <w:p>
       <w:pPr>
         <w:bidi/>
-        <w:spacing w:after="160" w:line="360"/>
+        <w:spacing w:after="60" w:line="360"/>
         <w:jc w:val="both"/>
       </w:pPr>
       <w:r>
@@ -7465,7 +7465,7 @@
     <w:p>
       <w:pPr>
         <w:bidi/>
-        <w:spacing w:after="160" w:line="360"/>
+        <w:spacing w:after="60" w:line="360"/>
         <w:jc w:val="both"/>
       </w:pPr>
       <w:r>
@@ -7483,7 +7483,7 @@
     <w:p>
       <w:pPr>
         <w:bidi/>
-        <w:spacing w:after="160" w:line="360"/>
+        <w:spacing w:after="60" w:line="360"/>
         <w:jc w:val="both"/>
       </w:pPr>
       <w:r>
@@ -7523,7 +7523,7 @@
     <w:p>
       <w:pPr>
         <w:bidi/>
-        <w:spacing w:after="160" w:line="360"/>
+        <w:spacing w:after="60" w:line="360"/>
         <w:jc w:val="both"/>
       </w:pPr>
       <w:r>
@@ -7563,7 +7563,7 @@
     <w:p>
       <w:pPr>
         <w:bidi/>
-        <w:spacing w:after="160" w:line="360"/>
+        <w:spacing w:after="60" w:line="360"/>
         <w:jc w:val="both"/>
       </w:pPr>
       <w:r>
@@ -7603,7 +7603,7 @@
     <w:p>
       <w:pPr>
         <w:bidi/>
-        <w:spacing w:after="160" w:line="360"/>
+        <w:spacing w:after="60" w:line="360"/>
         <w:jc w:val="both"/>
       </w:pPr>
       <w:r>
@@ -7643,7 +7643,7 @@
     <w:p>
       <w:pPr>
         <w:bidi/>
-        <w:spacing w:after="160" w:line="360"/>
+        <w:spacing w:after="60" w:line="360"/>
         <w:jc w:val="both"/>
       </w:pPr>
       <w:r>
@@ -7661,7 +7661,7 @@
     <w:p>
       <w:pPr>
         <w:bidi/>
-        <w:spacing w:after="160" w:line="360"/>
+        <w:spacing w:after="60" w:line="360"/>
         <w:jc w:val="both"/>
       </w:pPr>
       <w:r>
@@ -7701,7 +7701,7 @@
     <w:p>
       <w:pPr>
         <w:bidi/>
-        <w:spacing w:after="160" w:line="360"/>
+        <w:spacing w:after="60" w:line="360"/>
         <w:jc w:val="both"/>
       </w:pPr>
       <w:r>
@@ -7741,7 +7741,7 @@
     <w:p>
       <w:pPr>
         <w:bidi/>
-        <w:spacing w:after="160" w:line="360"/>
+        <w:spacing w:after="60" w:line="360"/>
         <w:jc w:val="both"/>
       </w:pPr>
       <w:r>
@@ -7801,7 +7801,7 @@
     <w:p>
       <w:pPr>
         <w:bidi/>
-        <w:spacing w:after="160" w:line="360"/>
+        <w:spacing w:after="60" w:line="360"/>
         <w:jc w:val="both"/>
       </w:pPr>
       <w:r>
@@ -7830,7 +7830,7 @@
     <w:p>
       <w:pPr>
         <w:bidi/>
-        <w:spacing w:after="160" w:line="360"/>
+        <w:spacing w:after="60" w:line="360"/>
         <w:jc w:val="both"/>
       </w:pPr>
       <w:r>
@@ -7859,7 +7859,7 @@
     <w:p>
       <w:pPr>
         <w:bidi/>
-        <w:spacing w:after="160" w:line="360"/>
+        <w:spacing w:after="60" w:line="360"/>
         <w:jc w:val="both"/>
       </w:pPr>
       <w:r>
@@ -7908,7 +7908,7 @@
     <w:p>
       <w:pPr>
         <w:bidi/>
-        <w:spacing w:after="160" w:line="360"/>
+        <w:spacing w:after="60" w:line="360"/>
         <w:jc w:val="both"/>
       </w:pPr>
       <w:r>
@@ -7937,7 +7937,7 @@
     <w:p>
       <w:pPr>
         <w:bidi/>
-        <w:spacing w:after="160" w:line="360"/>
+        <w:spacing w:after="60" w:line="360"/>
         <w:jc w:val="both"/>
       </w:pPr>
       <w:r>
@@ -7966,7 +7966,7 @@
     <w:p>
       <w:pPr>
         <w:bidi/>
-        <w:spacing w:after="160" w:line="360"/>
+        <w:spacing w:after="60" w:line="360"/>
         <w:jc w:val="both"/>
       </w:pPr>
       <w:r>
@@ -7995,7 +7995,7 @@
     <w:p>
       <w:pPr>
         <w:bidi/>
-        <w:spacing w:after="160" w:line="360"/>
+        <w:spacing w:after="60" w:line="360"/>
         <w:jc w:val="both"/>
       </w:pPr>
       <w:r>
@@ -8024,7 +8024,7 @@
     <w:p>
       <w:pPr>
         <w:bidi/>
-        <w:spacing w:after="160" w:line="360"/>
+        <w:spacing w:after="60" w:line="360"/>
         <w:jc w:val="both"/>
       </w:pPr>
       <w:r>
@@ -8074,7 +8074,7 @@
     <w:p>
       <w:pPr>
         <w:bidi/>
-        <w:spacing w:after="160" w:line="360"/>
+        <w:spacing w:after="60" w:line="360"/>
         <w:jc w:val="both"/>
       </w:pPr>
       <w:r>
@@ -8132,7 +8132,7 @@
     <w:p>
       <w:pPr>
         <w:bidi/>
-        <w:spacing w:after="160" w:line="360"/>
+        <w:spacing w:after="60" w:line="360"/>
         <w:jc w:val="both"/>
       </w:pPr>
       <w:r>
@@ -8161,7 +8161,7 @@
     <w:p>
       <w:pPr>
         <w:bidi/>
-        <w:spacing w:after="160" w:line="360"/>
+        <w:spacing w:after="60" w:line="360"/>
         <w:jc w:val="both"/>
       </w:pPr>
       <w:r>
@@ -8190,7 +8190,7 @@
     <w:p>
       <w:pPr>
         <w:bidi/>
-        <w:spacing w:after="160" w:line="360"/>
+        <w:spacing w:after="60" w:line="360"/>
         <w:jc w:val="both"/>
       </w:pPr>
       <w:r>
@@ -8219,7 +8219,7 @@
     <w:p>
       <w:pPr>
         <w:bidi/>
-        <w:spacing w:after="160" w:line="360"/>
+        <w:spacing w:after="60" w:line="360"/>
         <w:jc w:val="both"/>
       </w:pPr>
       <w:r>
@@ -8248,7 +8248,7 @@
     <w:p>
       <w:pPr>
         <w:bidi/>
-        <w:spacing w:after="160" w:line="360"/>
+        <w:spacing w:after="60" w:line="360"/>
         <w:jc w:val="both"/>
       </w:pPr>
       <w:r>
@@ -8297,7 +8297,7 @@
     <w:p>
       <w:pPr>
         <w:bidi/>
-        <w:spacing w:after="160" w:line="360"/>
+        <w:spacing w:after="60" w:line="360"/>
         <w:jc w:val="both"/>
       </w:pPr>
       <w:r>
@@ -8326,7 +8326,7 @@
     <w:p>
       <w:pPr>
         <w:bidi/>
-        <w:spacing w:after="160" w:line="360"/>
+        <w:spacing w:after="60" w:line="360"/>
         <w:jc w:val="both"/>
       </w:pPr>
       <w:r>
@@ -8355,7 +8355,7 @@
     <w:p>
       <w:pPr>
         <w:bidi/>
-        <w:spacing w:after="160" w:line="360"/>
+        <w:spacing w:after="60" w:line="360"/>
         <w:jc w:val="both"/>
       </w:pPr>
       <w:r>
@@ -8384,7 +8384,7 @@
     <w:p>
       <w:pPr>
         <w:bidi/>
-        <w:spacing w:after="160" w:line="360"/>
+        <w:spacing w:after="60" w:line="360"/>
         <w:jc w:val="both"/>
       </w:pPr>
       <w:r>
@@ -8413,7 +8413,7 @@
     <w:p>
       <w:pPr>
         <w:bidi/>
-        <w:spacing w:after="160" w:line="360"/>
+        <w:spacing w:after="60" w:line="360"/>
         <w:jc w:val="both"/>
       </w:pPr>
       <w:r>
@@ -8462,7 +8462,7 @@
     <w:p>
       <w:pPr>
         <w:bidi/>
-        <w:spacing w:after="160" w:line="360"/>
+        <w:spacing w:after="60" w:line="360"/>
         <w:jc w:val="both"/>
       </w:pPr>
       <w:r>
@@ -8480,7 +8480,7 @@
     <w:p>
       <w:pPr>
         <w:bidi/>
-        <w:spacing w:after="160" w:line="360"/>
+        <w:spacing w:after="60" w:line="360"/>
         <w:jc w:val="both"/>
       </w:pPr>
       <w:r>
@@ -8509,7 +8509,7 @@
     <w:p>
       <w:pPr>
         <w:bidi/>
-        <w:spacing w:after="160" w:line="360"/>
+        <w:spacing w:after="60" w:line="360"/>
         <w:jc w:val="both"/>
       </w:pPr>
       <w:r>
@@ -8538,7 +8538,7 @@
     <w:p>
       <w:pPr>
         <w:bidi/>
-        <w:spacing w:after="160" w:line="360"/>
+        <w:spacing w:after="60" w:line="360"/>
         <w:jc w:val="both"/>
       </w:pPr>
       <w:r>
@@ -8567,7 +8567,7 @@
     <w:p>
       <w:pPr>
         <w:bidi/>
-        <w:spacing w:after="160" w:line="360"/>
+        <w:spacing w:after="60" w:line="360"/>
         <w:jc w:val="both"/>
       </w:pPr>
       <w:r>
@@ -8585,7 +8585,7 @@
     <w:p>
       <w:pPr>
         <w:bidi/>
-        <w:spacing w:after="160" w:line="360"/>
+        <w:spacing w:after="60" w:line="360"/>
         <w:jc w:val="both"/>
       </w:pPr>
       <w:r>
@@ -8614,7 +8614,7 @@
     <w:p>
       <w:pPr>
         <w:bidi/>
-        <w:spacing w:after="160" w:line="360"/>
+        <w:spacing w:after="60" w:line="360"/>
         <w:jc w:val="both"/>
       </w:pPr>
       <w:r>
@@ -8643,7 +8643,7 @@
     <w:p>
       <w:pPr>
         <w:bidi/>
-        <w:spacing w:after="160" w:line="360"/>
+        <w:spacing w:after="60" w:line="360"/>
         <w:jc w:val="both"/>
       </w:pPr>
       <w:r>
@@ -8672,7 +8672,7 @@
     <w:p>
       <w:pPr>
         <w:bidi/>
-        <w:spacing w:after="160" w:line="360"/>
+        <w:spacing w:after="60" w:line="360"/>
         <w:jc w:val="both"/>
       </w:pPr>
       <w:r>
@@ -8690,7 +8690,7 @@
     <w:p>
       <w:pPr>
         <w:bidi/>
-        <w:spacing w:after="160" w:line="360"/>
+        <w:spacing w:after="60" w:line="360"/>
         <w:jc w:val="both"/>
       </w:pPr>
       <w:r>
@@ -8719,7 +8719,7 @@
     <w:p>
       <w:pPr>
         <w:bidi/>
-        <w:spacing w:after="160" w:line="360"/>
+        <w:spacing w:after="60" w:line="360"/>
         <w:jc w:val="both"/>
       </w:pPr>
       <w:r>
@@ -8748,7 +8748,7 @@
     <w:p>
       <w:pPr>
         <w:bidi/>
-        <w:spacing w:after="160" w:line="360"/>
+        <w:spacing w:after="60" w:line="360"/>
         <w:jc w:val="both"/>
       </w:pPr>
       <w:r>
@@ -8777,7 +8777,7 @@
     <w:p>
       <w:pPr>
         <w:bidi/>
-        <w:spacing w:after="160" w:line="360"/>
+        <w:spacing w:after="60" w:line="360"/>
         <w:jc w:val="both"/>
       </w:pPr>
       <w:r>
@@ -8795,7 +8795,7 @@
     <w:p>
       <w:pPr>
         <w:bidi/>
-        <w:spacing w:after="160" w:line="360"/>
+        <w:spacing w:after="60" w:line="360"/>
         <w:jc w:val="both"/>
       </w:pPr>
       <w:r>
@@ -8824,7 +8824,7 @@
     <w:p>
       <w:pPr>
         <w:bidi/>
-        <w:spacing w:after="160" w:line="360"/>
+        <w:spacing w:after="60" w:line="360"/>
         <w:jc w:val="both"/>
       </w:pPr>
       <w:r>
@@ -8853,7 +8853,7 @@
     <w:p>
       <w:pPr>
         <w:bidi/>
-        <w:spacing w:after="160" w:line="360"/>
+        <w:spacing w:after="60" w:line="360"/>
         <w:jc w:val="both"/>
       </w:pPr>
       <w:r>
@@ -8902,7 +8902,7 @@
     <w:p>
       <w:pPr>
         <w:bidi/>
-        <w:spacing w:after="160" w:line="360"/>
+        <w:spacing w:after="60" w:line="360"/>
         <w:jc w:val="both"/>
       </w:pPr>
       <w:r>
@@ -8931,7 +8931,7 @@
     <w:p>
       <w:pPr>
         <w:bidi/>
-        <w:spacing w:after="160" w:line="360"/>
+        <w:spacing w:after="60" w:line="360"/>
         <w:jc w:val="both"/>
       </w:pPr>
       <w:r>
@@ -8960,7 +8960,7 @@
     <w:p>
       <w:pPr>
         <w:bidi/>
-        <w:spacing w:after="160" w:line="360"/>
+        <w:spacing w:after="60" w:line="360"/>
         <w:jc w:val="both"/>
       </w:pPr>
       <w:r>
@@ -8989,7 +8989,7 @@
     <w:p>
       <w:pPr>
         <w:bidi/>
-        <w:spacing w:after="160" w:line="360"/>
+        <w:spacing w:after="60" w:line="360"/>
         <w:jc w:val="both"/>
       </w:pPr>
       <w:r>
@@ -9018,7 +9018,7 @@
     <w:p>
       <w:pPr>
         <w:bidi/>
-        <w:spacing w:after="160" w:line="360"/>
+        <w:spacing w:after="60" w:line="360"/>
         <w:jc w:val="both"/>
       </w:pPr>
       <w:r>
@@ -9047,7 +9047,7 @@
     <w:p>
       <w:pPr>
         <w:bidi/>
-        <w:spacing w:after="160" w:line="360"/>
+        <w:spacing w:after="60" w:line="360"/>
         <w:jc w:val="both"/>
       </w:pPr>
       <w:r>
@@ -9096,7 +9096,7 @@
     <w:p>
       <w:pPr>
         <w:bidi/>
-        <w:spacing w:after="160" w:line="360"/>
+        <w:spacing w:after="60" w:line="360"/>
         <w:jc w:val="both"/>
       </w:pPr>
       <w:r>
@@ -9125,7 +9125,7 @@
     <w:p>
       <w:pPr>
         <w:bidi/>
-        <w:spacing w:after="160" w:line="360"/>
+        <w:spacing w:after="60" w:line="360"/>
         <w:jc w:val="both"/>
       </w:pPr>
       <w:r>
@@ -9154,7 +9154,7 @@
     <w:p>
       <w:pPr>
         <w:bidi/>
-        <w:spacing w:after="160" w:line="360"/>
+        <w:spacing w:after="60" w:line="360"/>
         <w:jc w:val="both"/>
       </w:pPr>
       <w:r>
@@ -9183,8 +9183,8 @@
     <w:p>
       <w:pPr>
         <w:bidi/>
-        <w:spacing w:after="160" w:line="360"/>
-        <w:jc w:val="both"/>
+        <w:spacing w:after="60" w:line="360"/>
+        <w:jc w:val="right"/>
       </w:pPr>
       <w:r>
         <w:rPr>
@@ -9212,7 +9212,7 @@
     <w:p>
       <w:pPr>
         <w:bidi/>
-        <w:spacing w:after="160" w:line="360"/>
+        <w:spacing w:after="60" w:line="360"/>
         <w:jc w:val="both"/>
       </w:pPr>
       <w:r>
@@ -9241,8 +9241,8 @@
     <w:p>
       <w:pPr>
         <w:bidi/>
-        <w:spacing w:after="160" w:line="360"/>
-        <w:jc w:val="both"/>
+        <w:spacing w:after="60" w:line="360"/>
+        <w:jc w:val="right"/>
       </w:pPr>
       <w:r>
         <w:rPr>
@@ -9270,7 +9270,7 @@
     <w:p>
       <w:pPr>
         <w:bidi/>
-        <w:spacing w:after="160" w:line="360"/>
+        <w:spacing w:after="60" w:line="360"/>
         <w:jc w:val="both"/>
       </w:pPr>
       <w:r>
@@ -9299,7 +9299,7 @@
     <w:p>
       <w:pPr>
         <w:bidi/>
-        <w:spacing w:after="160" w:line="360"/>
+        <w:spacing w:after="60" w:line="360"/>
         <w:jc w:val="both"/>
       </w:pPr>
       <w:r>
@@ -9328,7 +9328,7 @@
     <w:p>
       <w:pPr>
         <w:bidi/>
-        <w:spacing w:after="160" w:line="360"/>
+        <w:spacing w:after="60" w:line="360"/>
         <w:jc w:val="both"/>
       </w:pPr>
       <w:r>
@@ -9357,7 +9357,7 @@
     <w:p>
       <w:pPr>
         <w:bidi/>
-        <w:spacing w:after="160" w:line="360"/>
+        <w:spacing w:after="60" w:line="360"/>
         <w:jc w:val="both"/>
       </w:pPr>
       <w:r>
@@ -9395,8 +9395,8 @@
     <w:p>
       <w:pPr>
         <w:bidi/>
-        <w:spacing w:after="160" w:line="360"/>
-        <w:jc w:val="both"/>
+        <w:spacing w:after="60" w:line="360"/>
+        <w:jc w:val="right"/>
       </w:pPr>
       <w:r>
         <w:rPr>
@@ -9424,7 +9424,7 @@
     <w:p>
       <w:pPr>
         <w:bidi/>
-        <w:spacing w:after="160" w:line="360"/>
+        <w:spacing w:after="60" w:line="360"/>
         <w:jc w:val="both"/>
       </w:pPr>
       <w:r>
@@ -9453,7 +9453,7 @@
     <w:p>
       <w:pPr>
         <w:bidi/>
-        <w:spacing w:after="160" w:line="360"/>
+        <w:spacing w:after="60" w:line="360"/>
         <w:jc w:val="both"/>
       </w:pPr>
       <w:r>
@@ -9482,7 +9482,7 @@
     <w:p>
       <w:pPr>
         <w:bidi/>
-        <w:spacing w:after="160" w:line="360"/>
+        <w:spacing w:after="60" w:line="360"/>
         <w:jc w:val="both"/>
       </w:pPr>
       <w:r>
@@ -9511,8 +9511,8 @@
     <w:p>
       <w:pPr>
         <w:bidi/>
-        <w:spacing w:after="160" w:line="360"/>
-        <w:jc w:val="both"/>
+        <w:spacing w:after="60" w:line="360"/>
+        <w:jc w:val="right"/>
       </w:pPr>
       <w:r>
         <w:rPr>
@@ -9540,8 +9540,8 @@
     <w:p>
       <w:pPr>
         <w:bidi/>
-        <w:spacing w:after="160" w:line="360"/>
-        <w:jc w:val="both"/>
+        <w:spacing w:after="60" w:line="360"/>
+        <w:jc w:val="right"/>
       </w:pPr>
       <w:r>
         <w:rPr>
@@ -9569,8 +9569,8 @@
     <w:p>
       <w:pPr>
         <w:bidi/>
-        <w:spacing w:after="160" w:line="360"/>
-        <w:jc w:val="both"/>
+        <w:spacing w:after="60" w:line="360"/>
+        <w:jc w:val="right"/>
       </w:pPr>
       <w:r>
         <w:rPr>
@@ -9618,7 +9618,7 @@
     <w:p>
       <w:pPr>
         <w:bidi/>
-        <w:spacing w:after="160" w:line="360"/>
+        <w:spacing w:after="60" w:line="360"/>
         <w:jc w:val="both"/>
       </w:pPr>
       <w:r>
@@ -9647,7 +9647,7 @@
     <w:p>
       <w:pPr>
         <w:bidi/>
-        <w:spacing w:after="160" w:line="360"/>
+        <w:spacing w:after="60" w:line="360"/>
         <w:jc w:val="both"/>
       </w:pPr>
       <w:r>
@@ -9676,7 +9676,7 @@
     <w:p>
       <w:pPr>
         <w:bidi/>
-        <w:spacing w:after="160" w:line="360"/>
+        <w:spacing w:after="60" w:line="360"/>
         <w:jc w:val="both"/>
       </w:pPr>
       <w:r>
@@ -9705,7 +9705,7 @@
     <w:p>
       <w:pPr>
         <w:bidi/>
-        <w:spacing w:after="160" w:line="360"/>
+        <w:spacing w:after="60" w:line="360"/>
         <w:jc w:val="both"/>
       </w:pPr>
       <w:r>
@@ -9734,7 +9734,7 @@
     <w:p>
       <w:pPr>
         <w:bidi/>
-        <w:spacing w:after="160" w:line="360"/>
+        <w:spacing w:after="60" w:line="360"/>
         <w:jc w:val="both"/>
       </w:pPr>
       <w:r>
@@ -9763,7 +9763,7 @@
     <w:p>
       <w:pPr>
         <w:bidi/>
-        <w:spacing w:after="160" w:line="360"/>
+        <w:spacing w:after="60" w:line="360"/>
         <w:jc w:val="both"/>
       </w:pPr>
       <w:r>
@@ -9792,7 +9792,7 @@
     <w:p>
       <w:pPr>
         <w:bidi/>
-        <w:spacing w:after="160" w:line="360"/>
+        <w:spacing w:after="60" w:line="360"/>
         <w:jc w:val="both"/>
       </w:pPr>
       <w:r>

</xml_diff>

<commit_message>
Use kashida justification and tighter heading spacing to remove word gaps
Co-Authored-By: Claude Fable 5 <noreply@anthropic.com>
Claude-Session: https://claude.ai/code/session_01ESPDZE2KAqBUfzv5HLVvG7
</commit_message>
<xml_diff>
--- a/seminar/Abd Almahdi Dahla 212684527 - Research Plan.docx
+++ b/seminar/Abd Almahdi Dahla 212684527 - Research Plan.docx
@@ -52,7 +52,7 @@
     <w:p>
       <w:pPr>
         <w:bidi/>
-        <w:spacing w:after="200" w:line="360"/>
+        <w:spacing w:after="80" w:line="300"/>
         <w:jc w:val="center"/>
       </w:pPr>
       <w:r>
@@ -70,7 +70,7 @@
     <w:p>
       <w:pPr>
         <w:bidi/>
-        <w:spacing w:after="200" w:line="360"/>
+        <w:spacing w:after="80" w:line="300"/>
         <w:jc w:val="center"/>
       </w:pPr>
       <w:r>
@@ -90,7 +90,7 @@
     <w:p>
       <w:pPr>
         <w:bidi/>
-        <w:spacing w:after="200" w:line="360"/>
+        <w:spacing w:after="80" w:line="300"/>
         <w:jc w:val="center"/>
       </w:pPr>
       <w:r>
@@ -108,7 +108,7 @@
     <w:p>
       <w:pPr>
         <w:bidi/>
-        <w:spacing w:after="200" w:line="360"/>
+        <w:spacing w:after="80" w:line="300"/>
         <w:jc w:val="center"/>
       </w:pPr>
       <w:r>
@@ -126,7 +126,7 @@
     <w:p>
       <w:pPr>
         <w:bidi/>
-        <w:spacing w:after="200" w:line="360"/>
+        <w:spacing w:after="80" w:line="300"/>
         <w:jc w:val="center"/>
       </w:pPr>
       <w:r>
@@ -145,7 +145,7 @@
     <w:p>
       <w:pPr>
         <w:bidi/>
-        <w:spacing w:after="200" w:line="360"/>
+        <w:spacing w:after="80" w:line="300"/>
         <w:jc w:val="center"/>
       </w:pPr>
       <w:r>
@@ -163,7 +163,7 @@
     <w:p>
       <w:pPr>
         <w:bidi/>
-        <w:spacing w:after="200" w:line="360"/>
+        <w:spacing w:after="80" w:line="300"/>
         <w:jc w:val="center"/>
       </w:pPr>
       <w:r>
@@ -182,7 +182,7 @@
     <w:p>
       <w:pPr>
         <w:bidi/>
-        <w:spacing w:after="200" w:line="360"/>
+        <w:spacing w:after="80" w:line="300"/>
         <w:jc w:val="center"/>
       </w:pPr>
       <w:r>
@@ -200,7 +200,7 @@
     <w:p>
       <w:pPr>
         <w:bidi/>
-        <w:spacing w:after="200" w:line="360"/>
+        <w:spacing w:after="80" w:line="300"/>
         <w:jc w:val="center"/>
       </w:pPr>
       <w:r>
@@ -218,7 +218,7 @@
     <w:p>
       <w:pPr>
         <w:bidi/>
-        <w:spacing w:after="200" w:line="360"/>
+        <w:spacing w:after="80" w:line="300"/>
         <w:jc w:val="center"/>
       </w:pPr>
       <w:r>
@@ -236,7 +236,7 @@
     <w:p>
       <w:pPr>
         <w:bidi/>
-        <w:spacing w:after="200" w:line="360"/>
+        <w:spacing w:after="80" w:line="300"/>
         <w:jc w:val="center"/>
       </w:pPr>
       <w:r>
@@ -255,7 +255,7 @@
     <w:p>
       <w:pPr>
         <w:bidi/>
-        <w:spacing w:after="200" w:line="360"/>
+        <w:spacing w:after="80" w:line="300"/>
         <w:jc w:val="center"/>
       </w:pPr>
       <w:r>
@@ -273,7 +273,7 @@
     <w:p>
       <w:pPr>
         <w:bidi/>
-        <w:spacing w:after="200" w:line="360"/>
+        <w:spacing w:after="80" w:line="300"/>
         <w:jc w:val="center"/>
       </w:pPr>
       <w:r>
@@ -292,7 +292,7 @@
     <w:p>
       <w:pPr>
         <w:bidi/>
-        <w:spacing w:after="200" w:line="360"/>
+        <w:spacing w:after="80" w:line="300"/>
         <w:jc w:val="center"/>
       </w:pPr>
       <w:r>
@@ -310,7 +310,7 @@
     <w:p>
       <w:pPr>
         <w:bidi/>
-        <w:spacing w:after="200" w:line="360"/>
+        <w:spacing w:after="80" w:line="300"/>
         <w:jc w:val="center"/>
       </w:pPr>
       <w:r>
@@ -330,7 +330,7 @@
         <w:pStyle w:val="Heading1"/>
         <w:pageBreakBefore/>
         <w:bidi/>
-        <w:spacing w:after="240" w:before="240" w:line="360"/>
+        <w:spacing w:after="160" w:before="120" w:line="360"/>
         <w:jc w:val="center"/>
       </w:pPr>
       <w:r>
@@ -350,7 +350,7 @@
       <w:pPr>
         <w:bidi/>
         <w:spacing w:after="60" w:line="360"/>
-        <w:jc w:val="both"/>
+        <w:jc w:val="lowKashida"/>
       </w:pPr>
       <w:r>
         <w:rPr>
@@ -368,7 +368,7 @@
       <w:pPr>
         <w:bidi/>
         <w:spacing w:after="60" w:line="360"/>
-        <w:jc w:val="both"/>
+        <w:jc w:val="lowKashida"/>
       </w:pPr>
       <w:r>
         <w:rPr>
@@ -420,7 +420,7 @@
       <w:pPr>
         <w:bidi/>
         <w:spacing w:after="60" w:line="360"/>
-        <w:jc w:val="both"/>
+        <w:jc w:val="lowKashida"/>
       </w:pPr>
       <w:r>
         <w:rPr>
@@ -455,7 +455,7 @@
       <w:pPr>
         <w:bidi/>
         <w:spacing w:after="60" w:line="360"/>
-        <w:jc w:val="both"/>
+        <w:jc w:val="lowKashida"/>
       </w:pPr>
       <w:r>
         <w:rPr>
@@ -473,7 +473,7 @@
       <w:pPr>
         <w:bidi/>
         <w:spacing w:after="60" w:line="360"/>
-        <w:jc w:val="both"/>
+        <w:jc w:val="lowKashida"/>
       </w:pPr>
       <w:r>
         <w:rPr>
@@ -492,7 +492,7 @@
         <w:pStyle w:val="Heading1"/>
         <w:pageBreakBefore/>
         <w:bidi/>
-        <w:spacing w:after="240" w:before="240" w:line="360"/>
+        <w:spacing w:after="160" w:before="120" w:line="360"/>
         <w:jc w:val="center"/>
       </w:pPr>
       <w:r>
@@ -512,7 +512,7 @@
       <w:pPr>
         <w:bidi/>
         <w:spacing w:after="60" w:line="360"/>
-        <w:jc w:val="both"/>
+        <w:jc w:val="lowKashida"/>
       </w:pPr>
       <w:r>
         <w:rPr>
@@ -530,7 +530,7 @@
       <w:pPr>
         <w:pStyle w:val="Heading3"/>
         <w:bidi/>
-        <w:spacing w:after="160" w:before="200" w:line="360"/>
+        <w:spacing w:after="80" w:before="120" w:line="360"/>
         <w:jc w:val="right"/>
       </w:pPr>
       <w:r>
@@ -550,7 +550,7 @@
       <w:pPr>
         <w:bidi/>
         <w:spacing w:after="60" w:line="360"/>
-        <w:jc w:val="both"/>
+        <w:jc w:val="lowKashida"/>
       </w:pPr>
       <w:r>
         <w:rPr>
@@ -568,7 +568,7 @@
       <w:pPr>
         <w:bidi/>
         <w:spacing w:after="60" w:line="360"/>
-        <w:jc w:val="both"/>
+        <w:jc w:val="lowKashida"/>
       </w:pPr>
       <w:r>
         <w:rPr>
@@ -610,7 +610,7 @@
         </w:rPr>
         <w:t xml:space="preserve">رابط الدراسة: </w:t>
       </w:r>
-      <w:hyperlink w:history="1" r:id="rIdk8kdp6vdw73lnz9mubnln">
+      <w:hyperlink w:history="1" r:id="rIdpnxk33ge4ptbckfhf8qv4">
         <w:r>
           <w:rPr>
             <w:rFonts w:ascii="Simplified Arabic" w:cs="Simplified Arabic" w:eastAsia="Simplified Arabic" w:hAnsi="Simplified Arabic"/>
@@ -641,7 +641,7 @@
       <w:pPr>
         <w:bidi/>
         <w:spacing w:after="60" w:line="360"/>
-        <w:jc w:val="both"/>
+        <w:jc w:val="lowKashida"/>
       </w:pPr>
       <w:r>
         <w:rPr>
@@ -681,7 +681,7 @@
       <w:pPr>
         <w:bidi/>
         <w:spacing w:after="60" w:line="360"/>
-        <w:jc w:val="both"/>
+        <w:jc w:val="lowKashida"/>
       </w:pPr>
       <w:r>
         <w:rPr>
@@ -711,7 +711,7 @@
       <w:pPr>
         <w:bidi/>
         <w:spacing w:after="60" w:line="360"/>
-        <w:jc w:val="both"/>
+        <w:jc w:val="lowKashida"/>
       </w:pPr>
       <w:r>
         <w:rPr>
@@ -729,7 +729,7 @@
       <w:pPr>
         <w:bidi/>
         <w:spacing w:after="60" w:line="360"/>
-        <w:jc w:val="both"/>
+        <w:jc w:val="lowKashida"/>
       </w:pPr>
       <w:r>
         <w:rPr>
@@ -771,7 +771,7 @@
         </w:rPr>
         <w:t xml:space="preserve">رابط الدراسة: </w:t>
       </w:r>
-      <w:hyperlink w:history="1" r:id="rIdzd405gdylpzohrztox5di">
+      <w:hyperlink w:history="1" r:id="rIdbyrhfyf10ygw5he-_hf_w">
         <w:r>
           <w:rPr>
             <w:rFonts w:ascii="Simplified Arabic" w:cs="Simplified Arabic" w:eastAsia="Simplified Arabic" w:hAnsi="Simplified Arabic"/>
@@ -802,7 +802,7 @@
       <w:pPr>
         <w:bidi/>
         <w:spacing w:after="60" w:line="360"/>
-        <w:jc w:val="both"/>
+        <w:jc w:val="lowKashida"/>
       </w:pPr>
       <w:r>
         <w:rPr>
@@ -842,7 +842,7 @@
       <w:pPr>
         <w:bidi/>
         <w:spacing w:after="60" w:line="360"/>
-        <w:jc w:val="both"/>
+        <w:jc w:val="lowKashida"/>
       </w:pPr>
       <w:r>
         <w:rPr>
@@ -872,7 +872,7 @@
       <w:pPr>
         <w:bidi/>
         <w:spacing w:after="60" w:line="360"/>
-        <w:jc w:val="both"/>
+        <w:jc w:val="lowKashida"/>
       </w:pPr>
       <w:r>
         <w:rPr>
@@ -890,7 +890,7 @@
       <w:pPr>
         <w:bidi/>
         <w:spacing w:after="60" w:line="360"/>
-        <w:jc w:val="both"/>
+        <w:jc w:val="lowKashida"/>
       </w:pPr>
       <w:r>
         <w:rPr>
@@ -932,7 +932,7 @@
         </w:rPr>
         <w:t xml:space="preserve">رابط الدراسة: </w:t>
       </w:r>
-      <w:hyperlink w:history="1" r:id="rIduys8sknvf2yfuunspo0uk">
+      <w:hyperlink w:history="1" r:id="rIdwuenk_zmfz1ny9f2hlalg">
         <w:r>
           <w:rPr>
             <w:rFonts w:ascii="Simplified Arabic" w:cs="Simplified Arabic" w:eastAsia="Simplified Arabic" w:hAnsi="Simplified Arabic"/>
@@ -963,7 +963,7 @@
       <w:pPr>
         <w:bidi/>
         <w:spacing w:after="60" w:line="360"/>
-        <w:jc w:val="both"/>
+        <w:jc w:val="lowKashida"/>
       </w:pPr>
       <w:r>
         <w:rPr>
@@ -1003,7 +1003,7 @@
       <w:pPr>
         <w:bidi/>
         <w:spacing w:after="60" w:line="360"/>
-        <w:jc w:val="both"/>
+        <w:jc w:val="lowKashida"/>
       </w:pPr>
       <w:r>
         <w:rPr>
@@ -1033,7 +1033,7 @@
       <w:pPr>
         <w:bidi/>
         <w:spacing w:after="60" w:line="360"/>
-        <w:jc w:val="both"/>
+        <w:jc w:val="lowKashida"/>
       </w:pPr>
       <w:r>
         <w:rPr>
@@ -1051,7 +1051,7 @@
       <w:pPr>
         <w:bidi/>
         <w:spacing w:after="60" w:line="360"/>
-        <w:jc w:val="both"/>
+        <w:jc w:val="lowKashida"/>
       </w:pPr>
       <w:r>
         <w:rPr>
@@ -1093,7 +1093,7 @@
         </w:rPr>
         <w:t xml:space="preserve">رابط الدراسة: </w:t>
       </w:r>
-      <w:hyperlink w:history="1" r:id="rIdjffbzpkumdi1lkaoeb0lc">
+      <w:hyperlink w:history="1" r:id="rIdbj6ixmwgpysedw7ha4gjz">
         <w:r>
           <w:rPr>
             <w:rFonts w:ascii="Simplified Arabic" w:cs="Simplified Arabic" w:eastAsia="Simplified Arabic" w:hAnsi="Simplified Arabic"/>
@@ -1124,7 +1124,7 @@
       <w:pPr>
         <w:bidi/>
         <w:spacing w:after="60" w:line="360"/>
-        <w:jc w:val="both"/>
+        <w:jc w:val="lowKashida"/>
       </w:pPr>
       <w:r>
         <w:rPr>
@@ -1164,7 +1164,7 @@
       <w:pPr>
         <w:bidi/>
         <w:spacing w:after="60" w:line="360"/>
-        <w:jc w:val="both"/>
+        <w:jc w:val="lowKashida"/>
       </w:pPr>
       <w:r>
         <w:rPr>
@@ -1194,7 +1194,7 @@
       <w:pPr>
         <w:bidi/>
         <w:spacing w:after="60" w:line="360"/>
-        <w:jc w:val="both"/>
+        <w:jc w:val="lowKashida"/>
       </w:pPr>
       <w:r>
         <w:rPr>
@@ -1212,7 +1212,7 @@
       <w:pPr>
         <w:bidi/>
         <w:spacing w:after="60" w:line="360"/>
-        <w:jc w:val="both"/>
+        <w:jc w:val="lowKashida"/>
       </w:pPr>
       <w:r>
         <w:rPr>
@@ -1254,7 +1254,7 @@
         </w:rPr>
         <w:t xml:space="preserve">رابط الدراسة: </w:t>
       </w:r>
-      <w:hyperlink w:history="1" r:id="rIdryrd8m9ts_i9ynvco_pci">
+      <w:hyperlink w:history="1" r:id="rIdddhuhgsoocrh15wn-jyf9">
         <w:r>
           <w:rPr>
             <w:rFonts w:ascii="Simplified Arabic" w:cs="Simplified Arabic" w:eastAsia="Simplified Arabic" w:hAnsi="Simplified Arabic"/>
@@ -1285,7 +1285,7 @@
       <w:pPr>
         <w:bidi/>
         <w:spacing w:after="60" w:line="360"/>
-        <w:jc w:val="both"/>
+        <w:jc w:val="lowKashida"/>
       </w:pPr>
       <w:r>
         <w:rPr>
@@ -1325,7 +1325,7 @@
       <w:pPr>
         <w:bidi/>
         <w:spacing w:after="60" w:line="360"/>
-        <w:jc w:val="both"/>
+        <w:jc w:val="lowKashida"/>
       </w:pPr>
       <w:r>
         <w:rPr>
@@ -1355,7 +1355,7 @@
       <w:pPr>
         <w:bidi/>
         <w:spacing w:after="60" w:line="360"/>
-        <w:jc w:val="both"/>
+        <w:jc w:val="lowKashida"/>
       </w:pPr>
       <w:r>
         <w:rPr>
@@ -1373,7 +1373,7 @@
       <w:pPr>
         <w:bidi/>
         <w:spacing w:after="60" w:line="360"/>
-        <w:jc w:val="both"/>
+        <w:jc w:val="lowKashida"/>
       </w:pPr>
       <w:r>
         <w:rPr>
@@ -1415,7 +1415,7 @@
         </w:rPr>
         <w:t xml:space="preserve">رابط الدراسة: </w:t>
       </w:r>
-      <w:hyperlink w:history="1" r:id="rIdlrxx34cnclcvdjomcshpp">
+      <w:hyperlink w:history="1" r:id="rIdszbouu26jhqtvjka94ebq">
         <w:r>
           <w:rPr>
             <w:rFonts w:ascii="Simplified Arabic" w:cs="Simplified Arabic" w:eastAsia="Simplified Arabic" w:hAnsi="Simplified Arabic"/>
@@ -1446,7 +1446,7 @@
       <w:pPr>
         <w:bidi/>
         <w:spacing w:after="60" w:line="360"/>
-        <w:jc w:val="both"/>
+        <w:jc w:val="lowKashida"/>
       </w:pPr>
       <w:r>
         <w:rPr>
@@ -1486,7 +1486,7 @@
       <w:pPr>
         <w:bidi/>
         <w:spacing w:after="60" w:line="360"/>
-        <w:jc w:val="both"/>
+        <w:jc w:val="lowKashida"/>
       </w:pPr>
       <w:r>
         <w:rPr>
@@ -1516,7 +1516,7 @@
       <w:pPr>
         <w:bidi/>
         <w:spacing w:after="60" w:line="360"/>
-        <w:jc w:val="both"/>
+        <w:jc w:val="lowKashida"/>
       </w:pPr>
       <w:r>
         <w:rPr>
@@ -1534,7 +1534,7 @@
       <w:pPr>
         <w:bidi/>
         <w:spacing w:after="60" w:line="360"/>
-        <w:jc w:val="both"/>
+        <w:jc w:val="lowKashida"/>
       </w:pPr>
       <w:r>
         <w:rPr>
@@ -1576,7 +1576,7 @@
         </w:rPr>
         <w:t xml:space="preserve">رابط الدراسة: </w:t>
       </w:r>
-      <w:hyperlink w:history="1" r:id="rIdzz6lnnn4qnw0jg3-tyvcx">
+      <w:hyperlink w:history="1" r:id="rId_q2f2vbta_hbdesorf4es">
         <w:r>
           <w:rPr>
             <w:rFonts w:ascii="Simplified Arabic" w:cs="Simplified Arabic" w:eastAsia="Simplified Arabic" w:hAnsi="Simplified Arabic"/>
@@ -1607,7 +1607,7 @@
       <w:pPr>
         <w:bidi/>
         <w:spacing w:after="60" w:line="360"/>
-        <w:jc w:val="both"/>
+        <w:jc w:val="lowKashida"/>
       </w:pPr>
       <w:r>
         <w:rPr>
@@ -1647,7 +1647,7 @@
       <w:pPr>
         <w:bidi/>
         <w:spacing w:after="60" w:line="360"/>
-        <w:jc w:val="both"/>
+        <w:jc w:val="lowKashida"/>
       </w:pPr>
       <w:r>
         <w:rPr>
@@ -1677,7 +1677,7 @@
       <w:pPr>
         <w:bidi/>
         <w:spacing w:after="60" w:line="360"/>
-        <w:jc w:val="both"/>
+        <w:jc w:val="lowKashida"/>
       </w:pPr>
       <w:r>
         <w:rPr>
@@ -1695,7 +1695,7 @@
       <w:pPr>
         <w:bidi/>
         <w:spacing w:after="60" w:line="360"/>
-        <w:jc w:val="both"/>
+        <w:jc w:val="lowKashida"/>
       </w:pPr>
       <w:r>
         <w:rPr>
@@ -1737,7 +1737,7 @@
         </w:rPr>
         <w:t xml:space="preserve">رابط الدراسة: </w:t>
       </w:r>
-      <w:hyperlink w:history="1" r:id="rIdk5mftuazyxd_-kh0c2w45">
+      <w:hyperlink w:history="1" r:id="rIdns2ta3h774-huhlw9exrh">
         <w:r>
           <w:rPr>
             <w:rFonts w:ascii="Simplified Arabic" w:cs="Simplified Arabic" w:eastAsia="Simplified Arabic" w:hAnsi="Simplified Arabic"/>
@@ -1768,7 +1768,7 @@
       <w:pPr>
         <w:bidi/>
         <w:spacing w:after="60" w:line="360"/>
-        <w:jc w:val="both"/>
+        <w:jc w:val="lowKashida"/>
       </w:pPr>
       <w:r>
         <w:rPr>
@@ -1808,7 +1808,7 @@
       <w:pPr>
         <w:bidi/>
         <w:spacing w:after="60" w:line="360"/>
-        <w:jc w:val="both"/>
+        <w:jc w:val="lowKashida"/>
       </w:pPr>
       <w:r>
         <w:rPr>
@@ -1838,7 +1838,7 @@
       <w:pPr>
         <w:bidi/>
         <w:spacing w:after="60" w:line="360"/>
-        <w:jc w:val="both"/>
+        <w:jc w:val="lowKashida"/>
       </w:pPr>
       <w:r>
         <w:rPr>
@@ -1856,7 +1856,7 @@
       <w:pPr>
         <w:bidi/>
         <w:spacing w:after="60" w:line="360"/>
-        <w:jc w:val="both"/>
+        <w:jc w:val="lowKashida"/>
       </w:pPr>
       <w:r>
         <w:rPr>
@@ -1898,7 +1898,7 @@
         </w:rPr>
         <w:t xml:space="preserve">رابط الدراسة: </w:t>
       </w:r>
-      <w:hyperlink w:history="1" r:id="rIdxl9-efii1sotysszf2qe7">
+      <w:hyperlink w:history="1" r:id="rIdqee6bsmdurmglund6wbi5">
         <w:r>
           <w:rPr>
             <w:rFonts w:ascii="Simplified Arabic" w:cs="Simplified Arabic" w:eastAsia="Simplified Arabic" w:hAnsi="Simplified Arabic"/>
@@ -1929,7 +1929,7 @@
       <w:pPr>
         <w:bidi/>
         <w:spacing w:after="60" w:line="360"/>
-        <w:jc w:val="both"/>
+        <w:jc w:val="lowKashida"/>
       </w:pPr>
       <w:r>
         <w:rPr>
@@ -1969,7 +1969,7 @@
       <w:pPr>
         <w:bidi/>
         <w:spacing w:after="60" w:line="360"/>
-        <w:jc w:val="both"/>
+        <w:jc w:val="lowKashida"/>
       </w:pPr>
       <w:r>
         <w:rPr>
@@ -1999,7 +1999,7 @@
       <w:pPr>
         <w:bidi/>
         <w:spacing w:after="60" w:line="360"/>
-        <w:jc w:val="both"/>
+        <w:jc w:val="lowKashida"/>
       </w:pPr>
       <w:r>
         <w:rPr>
@@ -2017,7 +2017,7 @@
       <w:pPr>
         <w:bidi/>
         <w:spacing w:after="60" w:line="360"/>
-        <w:jc w:val="both"/>
+        <w:jc w:val="lowKashida"/>
       </w:pPr>
       <w:r>
         <w:rPr>
@@ -2059,7 +2059,7 @@
         </w:rPr>
         <w:t xml:space="preserve">رابط الدراسة: </w:t>
       </w:r>
-      <w:hyperlink w:history="1" r:id="rIdwqei9uenl0wmt3p3zwers">
+      <w:hyperlink w:history="1" r:id="rId1-3i_a5nrpekr85ye_rqh">
         <w:r>
           <w:rPr>
             <w:rFonts w:ascii="Simplified Arabic" w:cs="Simplified Arabic" w:eastAsia="Simplified Arabic" w:hAnsi="Simplified Arabic"/>
@@ -2090,7 +2090,7 @@
       <w:pPr>
         <w:bidi/>
         <w:spacing w:after="60" w:line="360"/>
-        <w:jc w:val="both"/>
+        <w:jc w:val="lowKashida"/>
       </w:pPr>
       <w:r>
         <w:rPr>
@@ -2130,7 +2130,7 @@
       <w:pPr>
         <w:bidi/>
         <w:spacing w:after="60" w:line="360"/>
-        <w:jc w:val="both"/>
+        <w:jc w:val="lowKashida"/>
       </w:pPr>
       <w:r>
         <w:rPr>
@@ -2160,7 +2160,7 @@
       <w:pPr>
         <w:bidi/>
         <w:spacing w:after="60" w:line="360"/>
-        <w:jc w:val="both"/>
+        <w:jc w:val="lowKashida"/>
       </w:pPr>
       <w:r>
         <w:rPr>
@@ -2178,7 +2178,7 @@
       <w:pPr>
         <w:bidi/>
         <w:spacing w:after="60" w:line="360"/>
-        <w:jc w:val="both"/>
+        <w:jc w:val="lowKashida"/>
       </w:pPr>
       <w:r>
         <w:rPr>
@@ -2220,7 +2220,7 @@
         </w:rPr>
         <w:t xml:space="preserve">رابط الدراسة: </w:t>
       </w:r>
-      <w:hyperlink w:history="1" r:id="rIdtnipwidgtkbq76v3ologk">
+      <w:hyperlink w:history="1" r:id="rIdxbj70bzeqzqv_3qcsc_5p">
         <w:r>
           <w:rPr>
             <w:rFonts w:ascii="Simplified Arabic" w:cs="Simplified Arabic" w:eastAsia="Simplified Arabic" w:hAnsi="Simplified Arabic"/>
@@ -2251,7 +2251,7 @@
       <w:pPr>
         <w:bidi/>
         <w:spacing w:after="60" w:line="360"/>
-        <w:jc w:val="both"/>
+        <w:jc w:val="lowKashida"/>
       </w:pPr>
       <w:r>
         <w:rPr>
@@ -2291,7 +2291,7 @@
       <w:pPr>
         <w:bidi/>
         <w:spacing w:after="60" w:line="360"/>
-        <w:jc w:val="both"/>
+        <w:jc w:val="lowKashida"/>
       </w:pPr>
       <w:r>
         <w:rPr>
@@ -2321,7 +2321,7 @@
       <w:pPr>
         <w:bidi/>
         <w:spacing w:after="60" w:line="360"/>
-        <w:jc w:val="both"/>
+        <w:jc w:val="lowKashida"/>
       </w:pPr>
       <w:r>
         <w:rPr>
@@ -2339,7 +2339,7 @@
       <w:pPr>
         <w:bidi/>
         <w:spacing w:after="60" w:line="360"/>
-        <w:jc w:val="both"/>
+        <w:jc w:val="lowKashida"/>
       </w:pPr>
       <w:r>
         <w:rPr>
@@ -2381,7 +2381,7 @@
         </w:rPr>
         <w:t xml:space="preserve">رابط الدراسة: </w:t>
       </w:r>
-      <w:hyperlink w:history="1" r:id="rId8i_p1nqpksr2vwimgll8m">
+      <w:hyperlink w:history="1" r:id="rIdorz2cmmlnlmlgnzebd_ef">
         <w:r>
           <w:rPr>
             <w:rFonts w:ascii="Simplified Arabic" w:cs="Simplified Arabic" w:eastAsia="Simplified Arabic" w:hAnsi="Simplified Arabic"/>
@@ -2412,7 +2412,7 @@
       <w:pPr>
         <w:bidi/>
         <w:spacing w:after="60" w:line="360"/>
-        <w:jc w:val="both"/>
+        <w:jc w:val="lowKashida"/>
       </w:pPr>
       <w:r>
         <w:rPr>
@@ -2452,7 +2452,7 @@
       <w:pPr>
         <w:bidi/>
         <w:spacing w:after="60" w:line="360"/>
-        <w:jc w:val="both"/>
+        <w:jc w:val="lowKashida"/>
       </w:pPr>
       <w:r>
         <w:rPr>
@@ -2482,7 +2482,7 @@
       <w:pPr>
         <w:bidi/>
         <w:spacing w:after="60" w:line="360"/>
-        <w:jc w:val="both"/>
+        <w:jc w:val="lowKashida"/>
       </w:pPr>
       <w:r>
         <w:rPr>
@@ -2500,7 +2500,7 @@
       <w:pPr>
         <w:bidi/>
         <w:spacing w:after="60" w:line="360"/>
-        <w:jc w:val="both"/>
+        <w:jc w:val="lowKashida"/>
       </w:pPr>
       <w:r>
         <w:rPr>
@@ -2542,7 +2542,7 @@
         </w:rPr>
         <w:t xml:space="preserve">رابط الدراسة: </w:t>
       </w:r>
-      <w:hyperlink w:history="1" r:id="rIdrlr21imvh0xtblkowvb9h">
+      <w:hyperlink w:history="1" r:id="rIdk6ifvsu93m6nuyy0q3w3n">
         <w:r>
           <w:rPr>
             <w:rFonts w:ascii="Simplified Arabic" w:cs="Simplified Arabic" w:eastAsia="Simplified Arabic" w:hAnsi="Simplified Arabic"/>
@@ -2573,7 +2573,7 @@
       <w:pPr>
         <w:bidi/>
         <w:spacing w:after="60" w:line="360"/>
-        <w:jc w:val="both"/>
+        <w:jc w:val="lowKashida"/>
       </w:pPr>
       <w:r>
         <w:rPr>
@@ -2613,7 +2613,7 @@
       <w:pPr>
         <w:bidi/>
         <w:spacing w:after="60" w:line="360"/>
-        <w:jc w:val="both"/>
+        <w:jc w:val="lowKashida"/>
       </w:pPr>
       <w:r>
         <w:rPr>
@@ -2643,7 +2643,7 @@
       <w:pPr>
         <w:bidi/>
         <w:spacing w:after="60" w:line="360"/>
-        <w:jc w:val="both"/>
+        <w:jc w:val="lowKashida"/>
       </w:pPr>
       <w:r>
         <w:rPr>
@@ -2661,7 +2661,7 @@
       <w:pPr>
         <w:bidi/>
         <w:spacing w:after="60" w:line="360"/>
-        <w:jc w:val="both"/>
+        <w:jc w:val="lowKashida"/>
       </w:pPr>
       <w:r>
         <w:rPr>
@@ -2703,7 +2703,7 @@
         </w:rPr>
         <w:t xml:space="preserve">رابط الدراسة: </w:t>
       </w:r>
-      <w:hyperlink w:history="1" r:id="rIdm1btrktiluqorzdauvwp2">
+      <w:hyperlink w:history="1" r:id="rIdrjcimx_arw5kevz0w7eik">
         <w:r>
           <w:rPr>
             <w:rFonts w:ascii="Simplified Arabic" w:cs="Simplified Arabic" w:eastAsia="Simplified Arabic" w:hAnsi="Simplified Arabic"/>
@@ -2734,7 +2734,7 @@
       <w:pPr>
         <w:bidi/>
         <w:spacing w:after="60" w:line="360"/>
-        <w:jc w:val="both"/>
+        <w:jc w:val="lowKashida"/>
       </w:pPr>
       <w:r>
         <w:rPr>
@@ -2774,7 +2774,7 @@
       <w:pPr>
         <w:bidi/>
         <w:spacing w:after="60" w:line="360"/>
-        <w:jc w:val="both"/>
+        <w:jc w:val="lowKashida"/>
       </w:pPr>
       <w:r>
         <w:rPr>
@@ -2804,7 +2804,7 @@
       <w:pPr>
         <w:bidi/>
         <w:spacing w:after="60" w:line="360"/>
-        <w:jc w:val="both"/>
+        <w:jc w:val="lowKashida"/>
       </w:pPr>
       <w:r>
         <w:rPr>
@@ -2822,7 +2822,7 @@
       <w:pPr>
         <w:bidi/>
         <w:spacing w:after="60" w:line="360"/>
-        <w:jc w:val="both"/>
+        <w:jc w:val="lowKashida"/>
       </w:pPr>
       <w:r>
         <w:rPr>
@@ -2864,7 +2864,7 @@
         </w:rPr>
         <w:t xml:space="preserve">رابط الدراسة: </w:t>
       </w:r>
-      <w:hyperlink w:history="1" r:id="rIdhcwxdefsoaqrhi_f0q8md">
+      <w:hyperlink w:history="1" r:id="rId2rxqz21tblxvgfzbwxkw7">
         <w:r>
           <w:rPr>
             <w:rFonts w:ascii="Simplified Arabic" w:cs="Simplified Arabic" w:eastAsia="Simplified Arabic" w:hAnsi="Simplified Arabic"/>
@@ -2895,7 +2895,7 @@
       <w:pPr>
         <w:bidi/>
         <w:spacing w:after="60" w:line="360"/>
-        <w:jc w:val="both"/>
+        <w:jc w:val="lowKashida"/>
       </w:pPr>
       <w:r>
         <w:rPr>
@@ -2935,7 +2935,7 @@
       <w:pPr>
         <w:bidi/>
         <w:spacing w:after="60" w:line="360"/>
-        <w:jc w:val="both"/>
+        <w:jc w:val="lowKashida"/>
       </w:pPr>
       <w:r>
         <w:rPr>
@@ -2965,7 +2965,7 @@
       <w:pPr>
         <w:bidi/>
         <w:spacing w:after="60" w:line="360"/>
-        <w:jc w:val="both"/>
+        <w:jc w:val="lowKashida"/>
       </w:pPr>
       <w:r>
         <w:rPr>
@@ -2983,7 +2983,7 @@
       <w:pPr>
         <w:bidi/>
         <w:spacing w:after="60" w:line="360"/>
-        <w:jc w:val="both"/>
+        <w:jc w:val="lowKashida"/>
       </w:pPr>
       <w:r>
         <w:rPr>
@@ -3025,7 +3025,7 @@
         </w:rPr>
         <w:t xml:space="preserve">رابط الدراسة: </w:t>
       </w:r>
-      <w:hyperlink w:history="1" r:id="rId8dk6gemjesk98i_myea9r">
+      <w:hyperlink w:history="1" r:id="rId3yneddej9qpfpiau7qo9r">
         <w:r>
           <w:rPr>
             <w:rFonts w:ascii="Simplified Arabic" w:cs="Simplified Arabic" w:eastAsia="Simplified Arabic" w:hAnsi="Simplified Arabic"/>
@@ -3056,7 +3056,7 @@
       <w:pPr>
         <w:bidi/>
         <w:spacing w:after="60" w:line="360"/>
-        <w:jc w:val="both"/>
+        <w:jc w:val="lowKashida"/>
       </w:pPr>
       <w:r>
         <w:rPr>
@@ -3096,7 +3096,7 @@
       <w:pPr>
         <w:bidi/>
         <w:spacing w:after="60" w:line="360"/>
-        <w:jc w:val="both"/>
+        <w:jc w:val="lowKashida"/>
       </w:pPr>
       <w:r>
         <w:rPr>
@@ -3126,7 +3126,7 @@
       <w:pPr>
         <w:bidi/>
         <w:spacing w:after="60" w:line="360"/>
-        <w:jc w:val="both"/>
+        <w:jc w:val="lowKashida"/>
       </w:pPr>
       <w:r>
         <w:rPr>
@@ -3144,7 +3144,7 @@
       <w:pPr>
         <w:bidi/>
         <w:spacing w:after="60" w:line="360"/>
-        <w:jc w:val="both"/>
+        <w:jc w:val="lowKashida"/>
       </w:pPr>
       <w:r>
         <w:rPr>
@@ -3186,7 +3186,7 @@
         </w:rPr>
         <w:t xml:space="preserve">رابط الدراسة: </w:t>
       </w:r>
-      <w:hyperlink w:history="1" r:id="rIdv3ytkv7zjhxs2faqoedgj">
+      <w:hyperlink w:history="1" r:id="rIdgvsmqiqible4v9_mcj6oh">
         <w:r>
           <w:rPr>
             <w:rFonts w:ascii="Simplified Arabic" w:cs="Simplified Arabic" w:eastAsia="Simplified Arabic" w:hAnsi="Simplified Arabic"/>
@@ -3217,7 +3217,7 @@
       <w:pPr>
         <w:bidi/>
         <w:spacing w:after="60" w:line="360"/>
-        <w:jc w:val="both"/>
+        <w:jc w:val="lowKashida"/>
       </w:pPr>
       <w:r>
         <w:rPr>
@@ -3257,7 +3257,7 @@
       <w:pPr>
         <w:bidi/>
         <w:spacing w:after="60" w:line="360"/>
-        <w:jc w:val="both"/>
+        <w:jc w:val="lowKashida"/>
       </w:pPr>
       <w:r>
         <w:rPr>
@@ -3287,7 +3287,7 @@
       <w:pPr>
         <w:pStyle w:val="Heading3"/>
         <w:bidi/>
-        <w:spacing w:after="160" w:before="200" w:line="360"/>
+        <w:spacing w:after="80" w:before="120" w:line="360"/>
         <w:jc w:val="right"/>
       </w:pPr>
       <w:r>
@@ -3307,7 +3307,7 @@
       <w:pPr>
         <w:bidi/>
         <w:spacing w:after="60" w:line="360"/>
-        <w:jc w:val="both"/>
+        <w:jc w:val="lowKashida"/>
       </w:pPr>
       <w:r>
         <w:rPr>
@@ -3325,7 +3325,7 @@
       <w:pPr>
         <w:bidi/>
         <w:spacing w:after="60" w:line="360"/>
-        <w:jc w:val="both"/>
+        <w:jc w:val="lowKashida"/>
       </w:pPr>
       <w:r>
         <w:rPr>
@@ -3367,7 +3367,7 @@
         </w:rPr>
         <w:t xml:space="preserve">رابط الدراسة: </w:t>
       </w:r>
-      <w:hyperlink w:history="1" r:id="rIdt_nc7wxw72df2oqrkpdrl">
+      <w:hyperlink w:history="1" r:id="rIdmfw822wpduqgacto58d6k">
         <w:r>
           <w:rPr>
             <w:rFonts w:ascii="Simplified Arabic" w:cs="Simplified Arabic" w:eastAsia="Simplified Arabic" w:hAnsi="Simplified Arabic"/>
@@ -3398,7 +3398,7 @@
       <w:pPr>
         <w:bidi/>
         <w:spacing w:after="60" w:line="360"/>
-        <w:jc w:val="both"/>
+        <w:jc w:val="lowKashida"/>
       </w:pPr>
       <w:r>
         <w:rPr>
@@ -3438,7 +3438,7 @@
       <w:pPr>
         <w:bidi/>
         <w:spacing w:after="60" w:line="360"/>
-        <w:jc w:val="both"/>
+        <w:jc w:val="lowKashida"/>
       </w:pPr>
       <w:r>
         <w:rPr>
@@ -3468,7 +3468,7 @@
       <w:pPr>
         <w:bidi/>
         <w:spacing w:after="60" w:line="360"/>
-        <w:jc w:val="both"/>
+        <w:jc w:val="lowKashida"/>
       </w:pPr>
       <w:r>
         <w:rPr>
@@ -3486,7 +3486,7 @@
       <w:pPr>
         <w:bidi/>
         <w:spacing w:after="60" w:line="360"/>
-        <w:jc w:val="both"/>
+        <w:jc w:val="lowKashida"/>
       </w:pPr>
       <w:r>
         <w:rPr>
@@ -3528,7 +3528,7 @@
         </w:rPr>
         <w:t xml:space="preserve">رابط الدراسة: </w:t>
       </w:r>
-      <w:hyperlink w:history="1" r:id="rId_0nnuiv2buuxhhbfagek6">
+      <w:hyperlink w:history="1" r:id="rId_ebgr8sy2cemobevkzid2">
         <w:r>
           <w:rPr>
             <w:rFonts w:ascii="Simplified Arabic" w:cs="Simplified Arabic" w:eastAsia="Simplified Arabic" w:hAnsi="Simplified Arabic"/>
@@ -3559,7 +3559,7 @@
       <w:pPr>
         <w:bidi/>
         <w:spacing w:after="60" w:line="360"/>
-        <w:jc w:val="both"/>
+        <w:jc w:val="lowKashida"/>
       </w:pPr>
       <w:r>
         <w:rPr>
@@ -3599,7 +3599,7 @@
       <w:pPr>
         <w:bidi/>
         <w:spacing w:after="60" w:line="360"/>
-        <w:jc w:val="both"/>
+        <w:jc w:val="lowKashida"/>
       </w:pPr>
       <w:r>
         <w:rPr>
@@ -3629,7 +3629,7 @@
       <w:pPr>
         <w:bidi/>
         <w:spacing w:after="60" w:line="360"/>
-        <w:jc w:val="both"/>
+        <w:jc w:val="lowKashida"/>
       </w:pPr>
       <w:r>
         <w:rPr>
@@ -3647,7 +3647,7 @@
       <w:pPr>
         <w:bidi/>
         <w:spacing w:after="60" w:line="360"/>
-        <w:jc w:val="both"/>
+        <w:jc w:val="lowKashida"/>
       </w:pPr>
       <w:r>
         <w:rPr>
@@ -3689,7 +3689,7 @@
         </w:rPr>
         <w:t xml:space="preserve">رابط الدراسة: </w:t>
       </w:r>
-      <w:hyperlink w:history="1" r:id="rIdtbmfaqbaozxv7143yqgru">
+      <w:hyperlink w:history="1" r:id="rIdfedw5dsaijh8vtiuvnbco">
         <w:r>
           <w:rPr>
             <w:rFonts w:ascii="Simplified Arabic" w:cs="Simplified Arabic" w:eastAsia="Simplified Arabic" w:hAnsi="Simplified Arabic"/>
@@ -3720,7 +3720,7 @@
       <w:pPr>
         <w:bidi/>
         <w:spacing w:after="60" w:line="360"/>
-        <w:jc w:val="both"/>
+        <w:jc w:val="lowKashida"/>
       </w:pPr>
       <w:r>
         <w:rPr>
@@ -3760,7 +3760,7 @@
       <w:pPr>
         <w:bidi/>
         <w:spacing w:after="60" w:line="360"/>
-        <w:jc w:val="both"/>
+        <w:jc w:val="lowKashida"/>
       </w:pPr>
       <w:r>
         <w:rPr>
@@ -3790,7 +3790,7 @@
       <w:pPr>
         <w:bidi/>
         <w:spacing w:after="60" w:line="360"/>
-        <w:jc w:val="both"/>
+        <w:jc w:val="lowKashida"/>
       </w:pPr>
       <w:r>
         <w:rPr>
@@ -3808,7 +3808,7 @@
       <w:pPr>
         <w:bidi/>
         <w:spacing w:after="60" w:line="360"/>
-        <w:jc w:val="both"/>
+        <w:jc w:val="lowKashida"/>
       </w:pPr>
       <w:r>
         <w:rPr>
@@ -3850,7 +3850,7 @@
         </w:rPr>
         <w:t xml:space="preserve">رابط الدراسة: </w:t>
       </w:r>
-      <w:hyperlink w:history="1" r:id="rIddopqmbbetwiri5qlm8gmq">
+      <w:hyperlink w:history="1" r:id="rIduib3jj7bak3xkkws09ab7">
         <w:r>
           <w:rPr>
             <w:rFonts w:ascii="Simplified Arabic" w:cs="Simplified Arabic" w:eastAsia="Simplified Arabic" w:hAnsi="Simplified Arabic"/>
@@ -3881,7 +3881,7 @@
       <w:pPr>
         <w:bidi/>
         <w:spacing w:after="60" w:line="360"/>
-        <w:jc w:val="both"/>
+        <w:jc w:val="lowKashida"/>
       </w:pPr>
       <w:r>
         <w:rPr>
@@ -3921,7 +3921,7 @@
       <w:pPr>
         <w:bidi/>
         <w:spacing w:after="60" w:line="360"/>
-        <w:jc w:val="both"/>
+        <w:jc w:val="lowKashida"/>
       </w:pPr>
       <w:r>
         <w:rPr>
@@ -3951,7 +3951,7 @@
       <w:pPr>
         <w:bidi/>
         <w:spacing w:after="60" w:line="360"/>
-        <w:jc w:val="both"/>
+        <w:jc w:val="lowKashida"/>
       </w:pPr>
       <w:r>
         <w:rPr>
@@ -3969,7 +3969,7 @@
       <w:pPr>
         <w:bidi/>
         <w:spacing w:after="60" w:line="360"/>
-        <w:jc w:val="both"/>
+        <w:jc w:val="lowKashida"/>
       </w:pPr>
       <w:r>
         <w:rPr>
@@ -4011,7 +4011,7 @@
         </w:rPr>
         <w:t xml:space="preserve">رابط الدراسة: </w:t>
       </w:r>
-      <w:hyperlink w:history="1" r:id="rIdi0x7xrykw9tfulsu_g-vb">
+      <w:hyperlink w:history="1" r:id="rIdb1jsxfkmi3da2bmg12n5f">
         <w:r>
           <w:rPr>
             <w:rFonts w:ascii="Simplified Arabic" w:cs="Simplified Arabic" w:eastAsia="Simplified Arabic" w:hAnsi="Simplified Arabic"/>
@@ -4042,7 +4042,7 @@
       <w:pPr>
         <w:bidi/>
         <w:spacing w:after="60" w:line="360"/>
-        <w:jc w:val="both"/>
+        <w:jc w:val="lowKashida"/>
       </w:pPr>
       <w:r>
         <w:rPr>
@@ -4082,7 +4082,7 @@
       <w:pPr>
         <w:bidi/>
         <w:spacing w:after="60" w:line="360"/>
-        <w:jc w:val="both"/>
+        <w:jc w:val="lowKashida"/>
       </w:pPr>
       <w:r>
         <w:rPr>
@@ -4112,7 +4112,7 @@
       <w:pPr>
         <w:bidi/>
         <w:spacing w:after="60" w:line="360"/>
-        <w:jc w:val="both"/>
+        <w:jc w:val="lowKashida"/>
       </w:pPr>
       <w:r>
         <w:rPr>
@@ -4130,7 +4130,7 @@
       <w:pPr>
         <w:bidi/>
         <w:spacing w:after="60" w:line="360"/>
-        <w:jc w:val="both"/>
+        <w:jc w:val="lowKashida"/>
       </w:pPr>
       <w:r>
         <w:rPr>
@@ -4172,7 +4172,7 @@
         </w:rPr>
         <w:t xml:space="preserve">رابط الدراسة: </w:t>
       </w:r>
-      <w:hyperlink w:history="1" r:id="rIdsgjufrzm0iuk60j5n9vxz">
+      <w:hyperlink w:history="1" r:id="rIdprbfnvrvoe_ha_o17k7tj">
         <w:r>
           <w:rPr>
             <w:rFonts w:ascii="Simplified Arabic" w:cs="Simplified Arabic" w:eastAsia="Simplified Arabic" w:hAnsi="Simplified Arabic"/>
@@ -4203,7 +4203,7 @@
       <w:pPr>
         <w:bidi/>
         <w:spacing w:after="60" w:line="360"/>
-        <w:jc w:val="both"/>
+        <w:jc w:val="lowKashida"/>
       </w:pPr>
       <w:r>
         <w:rPr>
@@ -4243,7 +4243,7 @@
       <w:pPr>
         <w:bidi/>
         <w:spacing w:after="60" w:line="360"/>
-        <w:jc w:val="both"/>
+        <w:jc w:val="lowKashida"/>
       </w:pPr>
       <w:r>
         <w:rPr>
@@ -4273,7 +4273,7 @@
       <w:pPr>
         <w:bidi/>
         <w:spacing w:after="60" w:line="360"/>
-        <w:jc w:val="both"/>
+        <w:jc w:val="lowKashida"/>
       </w:pPr>
       <w:r>
         <w:rPr>
@@ -4291,7 +4291,7 @@
       <w:pPr>
         <w:bidi/>
         <w:spacing w:after="60" w:line="360"/>
-        <w:jc w:val="both"/>
+        <w:jc w:val="lowKashida"/>
       </w:pPr>
       <w:r>
         <w:rPr>
@@ -4333,7 +4333,7 @@
         </w:rPr>
         <w:t xml:space="preserve">رابط الدراسة: </w:t>
       </w:r>
-      <w:hyperlink w:history="1" r:id="rIdrppced77qlsknrnocp6is">
+      <w:hyperlink w:history="1" r:id="rIduryjcec2t-cg8ly7ennyz">
         <w:r>
           <w:rPr>
             <w:rFonts w:ascii="Simplified Arabic" w:cs="Simplified Arabic" w:eastAsia="Simplified Arabic" w:hAnsi="Simplified Arabic"/>
@@ -4364,7 +4364,7 @@
       <w:pPr>
         <w:bidi/>
         <w:spacing w:after="60" w:line="360"/>
-        <w:jc w:val="both"/>
+        <w:jc w:val="lowKashida"/>
       </w:pPr>
       <w:r>
         <w:rPr>
@@ -4404,7 +4404,7 @@
       <w:pPr>
         <w:bidi/>
         <w:spacing w:after="60" w:line="360"/>
-        <w:jc w:val="both"/>
+        <w:jc w:val="lowKashida"/>
       </w:pPr>
       <w:r>
         <w:rPr>
@@ -4434,7 +4434,7 @@
       <w:pPr>
         <w:bidi/>
         <w:spacing w:after="60" w:line="360"/>
-        <w:jc w:val="both"/>
+        <w:jc w:val="lowKashida"/>
       </w:pPr>
       <w:r>
         <w:rPr>
@@ -4452,7 +4452,7 @@
       <w:pPr>
         <w:bidi/>
         <w:spacing w:after="60" w:line="360"/>
-        <w:jc w:val="both"/>
+        <w:jc w:val="lowKashida"/>
       </w:pPr>
       <w:r>
         <w:rPr>
@@ -4494,7 +4494,7 @@
         </w:rPr>
         <w:t xml:space="preserve">رابط الدراسة: </w:t>
       </w:r>
-      <w:hyperlink w:history="1" r:id="rIdv6qgppfnjtnxsrnqvsuez">
+      <w:hyperlink w:history="1" r:id="rIdb9hdrpblyguo9kmgugx2a">
         <w:r>
           <w:rPr>
             <w:rFonts w:ascii="Simplified Arabic" w:cs="Simplified Arabic" w:eastAsia="Simplified Arabic" w:hAnsi="Simplified Arabic"/>
@@ -4525,7 +4525,7 @@
       <w:pPr>
         <w:bidi/>
         <w:spacing w:after="60" w:line="360"/>
-        <w:jc w:val="both"/>
+        <w:jc w:val="lowKashida"/>
       </w:pPr>
       <w:r>
         <w:rPr>
@@ -4565,7 +4565,7 @@
       <w:pPr>
         <w:bidi/>
         <w:spacing w:after="60" w:line="360"/>
-        <w:jc w:val="both"/>
+        <w:jc w:val="lowKashida"/>
       </w:pPr>
       <w:r>
         <w:rPr>
@@ -4595,7 +4595,7 @@
       <w:pPr>
         <w:bidi/>
         <w:spacing w:after="60" w:line="360"/>
-        <w:jc w:val="both"/>
+        <w:jc w:val="lowKashida"/>
       </w:pPr>
       <w:r>
         <w:rPr>
@@ -4613,7 +4613,7 @@
       <w:pPr>
         <w:bidi/>
         <w:spacing w:after="60" w:line="360"/>
-        <w:jc w:val="both"/>
+        <w:jc w:val="lowKashida"/>
       </w:pPr>
       <w:r>
         <w:rPr>
@@ -4655,7 +4655,7 @@
         </w:rPr>
         <w:t xml:space="preserve">رابط الدراسة: </w:t>
       </w:r>
-      <w:hyperlink w:history="1" r:id="rId-l_qog8sbuaxcc5ux9wv-">
+      <w:hyperlink w:history="1" r:id="rIdb434f1cg9e_leipctnziv">
         <w:r>
           <w:rPr>
             <w:rFonts w:ascii="Simplified Arabic" w:cs="Simplified Arabic" w:eastAsia="Simplified Arabic" w:hAnsi="Simplified Arabic"/>
@@ -4686,7 +4686,7 @@
       <w:pPr>
         <w:bidi/>
         <w:spacing w:after="60" w:line="360"/>
-        <w:jc w:val="both"/>
+        <w:jc w:val="lowKashida"/>
       </w:pPr>
       <w:r>
         <w:rPr>
@@ -4726,7 +4726,7 @@
       <w:pPr>
         <w:bidi/>
         <w:spacing w:after="60" w:line="360"/>
-        <w:jc w:val="both"/>
+        <w:jc w:val="lowKashida"/>
       </w:pPr>
       <w:r>
         <w:rPr>
@@ -4756,7 +4756,7 @@
       <w:pPr>
         <w:bidi/>
         <w:spacing w:after="60" w:line="360"/>
-        <w:jc w:val="both"/>
+        <w:jc w:val="lowKashida"/>
       </w:pPr>
       <w:r>
         <w:rPr>
@@ -4774,7 +4774,7 @@
       <w:pPr>
         <w:bidi/>
         <w:spacing w:after="60" w:line="360"/>
-        <w:jc w:val="both"/>
+        <w:jc w:val="lowKashida"/>
       </w:pPr>
       <w:r>
         <w:rPr>
@@ -4816,7 +4816,7 @@
         </w:rPr>
         <w:t xml:space="preserve">رابط الدراسة: </w:t>
       </w:r>
-      <w:hyperlink w:history="1" r:id="rIdvex0kb2fenjwirhs-f5xt">
+      <w:hyperlink w:history="1" r:id="rIdsfdu3i8siim1szxbcnlz_">
         <w:r>
           <w:rPr>
             <w:rFonts w:ascii="Simplified Arabic" w:cs="Simplified Arabic" w:eastAsia="Simplified Arabic" w:hAnsi="Simplified Arabic"/>
@@ -4847,7 +4847,7 @@
       <w:pPr>
         <w:bidi/>
         <w:spacing w:after="60" w:line="360"/>
-        <w:jc w:val="both"/>
+        <w:jc w:val="lowKashida"/>
       </w:pPr>
       <w:r>
         <w:rPr>
@@ -4887,7 +4887,7 @@
       <w:pPr>
         <w:bidi/>
         <w:spacing w:after="60" w:line="360"/>
-        <w:jc w:val="both"/>
+        <w:jc w:val="lowKashida"/>
       </w:pPr>
       <w:r>
         <w:rPr>
@@ -4918,7 +4918,7 @@
         <w:pStyle w:val="Heading1"/>
         <w:pageBreakBefore/>
         <w:bidi/>
-        <w:spacing w:after="240" w:before="240" w:line="360"/>
+        <w:spacing w:after="160" w:before="120" w:line="360"/>
         <w:jc w:val="center"/>
       </w:pPr>
       <w:r>
@@ -4938,7 +4938,7 @@
       <w:pPr>
         <w:bidi/>
         <w:spacing w:after="60" w:line="360"/>
-        <w:jc w:val="both"/>
+        <w:jc w:val="lowKashida"/>
       </w:pPr>
       <w:r>
         <w:rPr>
@@ -4967,7 +4967,7 @@
       <w:pPr>
         <w:bidi/>
         <w:spacing w:after="60" w:line="360"/>
-        <w:jc w:val="both"/>
+        <w:jc w:val="lowKashida"/>
       </w:pPr>
       <w:r>
         <w:rPr>
@@ -4996,7 +4996,7 @@
       <w:pPr>
         <w:bidi/>
         <w:spacing w:after="60" w:line="360"/>
-        <w:jc w:val="both"/>
+        <w:jc w:val="lowKashida"/>
       </w:pPr>
       <w:r>
         <w:rPr>
@@ -5025,7 +5025,7 @@
       <w:pPr>
         <w:bidi/>
         <w:spacing w:after="60" w:line="360"/>
-        <w:jc w:val="both"/>
+        <w:jc w:val="lowKashida"/>
       </w:pPr>
       <w:r>
         <w:rPr>
@@ -5054,7 +5054,7 @@
       <w:pPr>
         <w:bidi/>
         <w:spacing w:after="60" w:line="360"/>
-        <w:jc w:val="both"/>
+        <w:jc w:val="lowKashida"/>
       </w:pPr>
       <w:r>
         <w:rPr>
@@ -5084,7 +5084,7 @@
         <w:pStyle w:val="Heading1"/>
         <w:pageBreakBefore/>
         <w:bidi/>
-        <w:spacing w:after="240" w:before="240" w:line="360"/>
+        <w:spacing w:after="160" w:before="120" w:line="360"/>
         <w:jc w:val="center"/>
       </w:pPr>
       <w:r>
@@ -5104,7 +5104,7 @@
       <w:pPr>
         <w:bidi/>
         <w:spacing w:after="60" w:line="360"/>
-        <w:jc w:val="both"/>
+        <w:jc w:val="lowKashida"/>
       </w:pPr>
       <w:r>
         <w:rPr>
@@ -5133,7 +5133,7 @@
       <w:pPr>
         <w:bidi/>
         <w:spacing w:after="60" w:line="360"/>
-        <w:jc w:val="both"/>
+        <w:jc w:val="lowKashida"/>
       </w:pPr>
       <w:r>
         <w:rPr>
@@ -5162,7 +5162,7 @@
       <w:pPr>
         <w:bidi/>
         <w:spacing w:after="60" w:line="360"/>
-        <w:jc w:val="both"/>
+        <w:jc w:val="lowKashida"/>
       </w:pPr>
       <w:r>
         <w:rPr>
@@ -5191,7 +5191,7 @@
       <w:pPr>
         <w:bidi/>
         <w:spacing w:after="60" w:line="360"/>
-        <w:jc w:val="both"/>
+        <w:jc w:val="lowKashida"/>
       </w:pPr>
       <w:r>
         <w:rPr>
@@ -5220,7 +5220,7 @@
       <w:pPr>
         <w:bidi/>
         <w:spacing w:after="60" w:line="360"/>
-        <w:jc w:val="both"/>
+        <w:jc w:val="lowKashida"/>
       </w:pPr>
       <w:r>
         <w:rPr>
@@ -5250,7 +5250,7 @@
         <w:pStyle w:val="Heading1"/>
         <w:pageBreakBefore/>
         <w:bidi/>
-        <w:spacing w:after="240" w:before="240" w:line="360"/>
+        <w:spacing w:after="160" w:before="120" w:line="360"/>
         <w:jc w:val="center"/>
       </w:pPr>
       <w:r>
@@ -5270,7 +5270,7 @@
       <w:pPr>
         <w:bidi/>
         <w:spacing w:after="60" w:line="360"/>
-        <w:jc w:val="both"/>
+        <w:jc w:val="lowKashida"/>
       </w:pPr>
       <w:r>
         <w:rPr>
@@ -5288,7 +5288,7 @@
       <w:pPr>
         <w:pStyle w:val="Heading3"/>
         <w:bidi/>
-        <w:spacing w:after="160" w:before="200" w:line="360"/>
+        <w:spacing w:after="80" w:before="120" w:line="360"/>
         <w:jc w:val="right"/>
       </w:pPr>
       <w:r>
@@ -5308,7 +5308,7 @@
       <w:pPr>
         <w:bidi/>
         <w:spacing w:after="60" w:line="360"/>
-        <w:jc w:val="both"/>
+        <w:jc w:val="lowKashida"/>
       </w:pPr>
       <w:r>
         <w:rPr>
@@ -5337,7 +5337,7 @@
       <w:pPr>
         <w:bidi/>
         <w:spacing w:after="60" w:line="360"/>
-        <w:jc w:val="both"/>
+        <w:jc w:val="lowKashida"/>
       </w:pPr>
       <w:r>
         <w:rPr>
@@ -5366,7 +5366,7 @@
       <w:pPr>
         <w:bidi/>
         <w:spacing w:after="60" w:line="360"/>
-        <w:jc w:val="both"/>
+        <w:jc w:val="lowKashida"/>
       </w:pPr>
       <w:r>
         <w:rPr>
@@ -5395,7 +5395,7 @@
       <w:pPr>
         <w:bidi/>
         <w:spacing w:after="60" w:line="360"/>
-        <w:jc w:val="both"/>
+        <w:jc w:val="lowKashida"/>
       </w:pPr>
       <w:r>
         <w:rPr>
@@ -5424,7 +5424,7 @@
       <w:pPr>
         <w:bidi/>
         <w:spacing w:after="60" w:line="360"/>
-        <w:jc w:val="both"/>
+        <w:jc w:val="lowKashida"/>
       </w:pPr>
       <w:r>
         <w:rPr>
@@ -5453,7 +5453,7 @@
       <w:pPr>
         <w:bidi/>
         <w:spacing w:after="60" w:line="360"/>
-        <w:jc w:val="both"/>
+        <w:jc w:val="lowKashida"/>
       </w:pPr>
       <w:r>
         <w:rPr>
@@ -5483,7 +5483,7 @@
         <w:pStyle w:val="Heading1"/>
         <w:pageBreakBefore/>
         <w:bidi/>
-        <w:spacing w:after="240" w:before="240" w:line="360"/>
+        <w:spacing w:after="160" w:before="120" w:line="360"/>
         <w:jc w:val="center"/>
       </w:pPr>
       <w:r>
@@ -5503,7 +5503,7 @@
       <w:pPr>
         <w:bidi/>
         <w:spacing w:after="60" w:line="360"/>
-        <w:jc w:val="both"/>
+        <w:jc w:val="lowKashida"/>
       </w:pPr>
       <w:r>
         <w:rPr>
@@ -5522,7 +5522,7 @@
         <w:pStyle w:val="Heading1"/>
         <w:pageBreakBefore/>
         <w:bidi/>
-        <w:spacing w:after="240" w:before="240" w:line="360"/>
+        <w:spacing w:after="160" w:before="120" w:line="360"/>
         <w:jc w:val="center"/>
       </w:pPr>
       <w:r>
@@ -5542,7 +5542,7 @@
       <w:pPr>
         <w:pStyle w:val="Heading3"/>
         <w:bidi/>
-        <w:spacing w:after="160" w:before="200" w:line="360"/>
+        <w:spacing w:after="80" w:before="120" w:line="360"/>
         <w:jc w:val="right"/>
       </w:pPr>
       <w:r>
@@ -5562,7 +5562,7 @@
       <w:pPr>
         <w:bidi/>
         <w:spacing w:after="60" w:line="360"/>
-        <w:jc w:val="both"/>
+        <w:jc w:val="lowKashida"/>
       </w:pPr>
       <w:r>
         <w:rPr>
@@ -5580,7 +5580,7 @@
       <w:pPr>
         <w:bidi/>
         <w:spacing w:after="60" w:line="360"/>
-        <w:jc w:val="both"/>
+        <w:jc w:val="lowKashida"/>
       </w:pPr>
       <w:r>
         <w:rPr>
@@ -5620,7 +5620,7 @@
       <w:pPr>
         <w:bidi/>
         <w:spacing w:after="60" w:line="360"/>
-        <w:jc w:val="both"/>
+        <w:jc w:val="lowKashida"/>
       </w:pPr>
       <w:r>
         <w:rPr>
@@ -5660,7 +5660,7 @@
       <w:pPr>
         <w:bidi/>
         <w:spacing w:after="60" w:line="360"/>
-        <w:jc w:val="both"/>
+        <w:jc w:val="lowKashida"/>
       </w:pPr>
       <w:r>
         <w:rPr>
@@ -5700,7 +5700,7 @@
       <w:pPr>
         <w:bidi/>
         <w:spacing w:after="60" w:line="360"/>
-        <w:jc w:val="both"/>
+        <w:jc w:val="lowKashida"/>
       </w:pPr>
       <w:r>
         <w:rPr>
@@ -5740,7 +5740,7 @@
       <w:pPr>
         <w:bidi/>
         <w:spacing w:after="60" w:line="360"/>
-        <w:jc w:val="both"/>
+        <w:jc w:val="lowKashida"/>
       </w:pPr>
       <w:r>
         <w:rPr>
@@ -5780,7 +5780,7 @@
       <w:pPr>
         <w:bidi/>
         <w:spacing w:after="60" w:line="360"/>
-        <w:jc w:val="both"/>
+        <w:jc w:val="lowKashida"/>
       </w:pPr>
       <w:r>
         <w:rPr>
@@ -5820,7 +5820,7 @@
       <w:pPr>
         <w:bidi/>
         <w:spacing w:after="60" w:line="360"/>
-        <w:jc w:val="both"/>
+        <w:jc w:val="lowKashida"/>
       </w:pPr>
       <w:r>
         <w:rPr>
@@ -5860,7 +5860,7 @@
       <w:pPr>
         <w:bidi/>
         <w:spacing w:after="60" w:line="360"/>
-        <w:jc w:val="both"/>
+        <w:jc w:val="lowKashida"/>
       </w:pPr>
       <w:r>
         <w:rPr>
@@ -5878,7 +5878,7 @@
       <w:pPr>
         <w:bidi/>
         <w:spacing w:after="60" w:line="360"/>
-        <w:jc w:val="both"/>
+        <w:jc w:val="lowKashida"/>
       </w:pPr>
       <w:r>
         <w:rPr>
@@ -5918,7 +5918,7 @@
       <w:pPr>
         <w:bidi/>
         <w:spacing w:after="60" w:line="360"/>
-        <w:jc w:val="both"/>
+        <w:jc w:val="lowKashida"/>
       </w:pPr>
       <w:r>
         <w:rPr>
@@ -5958,7 +5958,7 @@
       <w:pPr>
         <w:bidi/>
         <w:spacing w:after="60" w:line="360"/>
-        <w:jc w:val="both"/>
+        <w:jc w:val="lowKashida"/>
       </w:pPr>
       <w:r>
         <w:rPr>
@@ -5998,7 +5998,7 @@
       <w:pPr>
         <w:bidi/>
         <w:spacing w:after="60" w:line="360"/>
-        <w:jc w:val="both"/>
+        <w:jc w:val="lowKashida"/>
       </w:pPr>
       <w:r>
         <w:rPr>
@@ -6038,7 +6038,7 @@
       <w:pPr>
         <w:bidi/>
         <w:spacing w:after="60" w:line="360"/>
-        <w:jc w:val="both"/>
+        <w:jc w:val="lowKashida"/>
       </w:pPr>
       <w:r>
         <w:rPr>
@@ -6078,7 +6078,7 @@
       <w:pPr>
         <w:bidi/>
         <w:spacing w:after="60" w:line="360"/>
-        <w:jc w:val="both"/>
+        <w:jc w:val="lowKashida"/>
       </w:pPr>
       <w:r>
         <w:rPr>
@@ -6118,7 +6118,7 @@
       <w:pPr>
         <w:bidi/>
         <w:spacing w:after="60" w:line="360"/>
-        <w:jc w:val="both"/>
+        <w:jc w:val="lowKashida"/>
       </w:pPr>
       <w:r>
         <w:rPr>
@@ -6158,7 +6158,7 @@
       <w:pPr>
         <w:bidi/>
         <w:spacing w:after="60" w:line="360"/>
-        <w:jc w:val="both"/>
+        <w:jc w:val="lowKashida"/>
       </w:pPr>
       <w:r>
         <w:rPr>
@@ -6198,7 +6198,7 @@
       <w:pPr>
         <w:pStyle w:val="Heading3"/>
         <w:bidi/>
-        <w:spacing w:after="160" w:before="200" w:line="360"/>
+        <w:spacing w:after="80" w:before="120" w:line="360"/>
         <w:jc w:val="right"/>
       </w:pPr>
       <w:r>
@@ -6218,7 +6218,7 @@
       <w:pPr>
         <w:bidi/>
         <w:spacing w:after="60" w:line="360"/>
-        <w:jc w:val="both"/>
+        <w:jc w:val="lowKashida"/>
       </w:pPr>
       <w:r>
         <w:rPr>
@@ -6236,7 +6236,7 @@
       <w:pPr>
         <w:bidi/>
         <w:spacing w:after="60" w:line="360"/>
-        <w:jc w:val="both"/>
+        <w:jc w:val="lowKashida"/>
       </w:pPr>
       <w:r>
         <w:rPr>
@@ -6276,7 +6276,7 @@
       <w:pPr>
         <w:bidi/>
         <w:spacing w:after="60" w:line="360"/>
-        <w:jc w:val="both"/>
+        <w:jc w:val="lowKashida"/>
       </w:pPr>
       <w:r>
         <w:rPr>
@@ -6316,7 +6316,7 @@
       <w:pPr>
         <w:bidi/>
         <w:spacing w:after="60" w:line="360"/>
-        <w:jc w:val="both"/>
+        <w:jc w:val="lowKashida"/>
       </w:pPr>
       <w:r>
         <w:rPr>
@@ -6356,7 +6356,7 @@
       <w:pPr>
         <w:bidi/>
         <w:spacing w:after="60" w:line="360"/>
-        <w:jc w:val="both"/>
+        <w:jc w:val="lowKashida"/>
       </w:pPr>
       <w:r>
         <w:rPr>
@@ -6374,7 +6374,7 @@
       <w:pPr>
         <w:bidi/>
         <w:spacing w:after="60" w:line="360"/>
-        <w:jc w:val="both"/>
+        <w:jc w:val="lowKashida"/>
       </w:pPr>
       <w:r>
         <w:rPr>
@@ -6414,7 +6414,7 @@
       <w:pPr>
         <w:bidi/>
         <w:spacing w:after="60" w:line="360"/>
-        <w:jc w:val="both"/>
+        <w:jc w:val="lowKashida"/>
       </w:pPr>
       <w:r>
         <w:rPr>
@@ -6454,7 +6454,7 @@
       <w:pPr>
         <w:bidi/>
         <w:spacing w:after="60" w:line="360"/>
-        <w:jc w:val="both"/>
+        <w:jc w:val="lowKashida"/>
       </w:pPr>
       <w:r>
         <w:rPr>
@@ -6494,7 +6494,7 @@
       <w:pPr>
         <w:pStyle w:val="Heading3"/>
         <w:bidi/>
-        <w:spacing w:after="160" w:before="200" w:line="360"/>
+        <w:spacing w:after="80" w:before="120" w:line="360"/>
         <w:jc w:val="right"/>
       </w:pPr>
       <w:r>
@@ -6514,7 +6514,7 @@
       <w:pPr>
         <w:bidi/>
         <w:spacing w:after="60" w:line="360"/>
-        <w:jc w:val="both"/>
+        <w:jc w:val="lowKashida"/>
       </w:pPr>
       <w:r>
         <w:rPr>
@@ -6554,7 +6554,7 @@
       <w:pPr>
         <w:bidi/>
         <w:spacing w:after="60" w:line="360"/>
-        <w:jc w:val="both"/>
+        <w:jc w:val="lowKashida"/>
       </w:pPr>
       <w:r>
         <w:rPr>
@@ -6594,7 +6594,7 @@
       <w:pPr>
         <w:bidi/>
         <w:spacing w:after="60" w:line="360"/>
-        <w:jc w:val="both"/>
+        <w:jc w:val="lowKashida"/>
       </w:pPr>
       <w:r>
         <w:rPr>
@@ -6634,7 +6634,7 @@
       <w:pPr>
         <w:bidi/>
         <w:spacing w:after="60" w:line="360"/>
-        <w:jc w:val="both"/>
+        <w:jc w:val="lowKashida"/>
       </w:pPr>
       <w:r>
         <w:rPr>
@@ -6674,7 +6674,7 @@
       <w:pPr>
         <w:bidi/>
         <w:spacing w:after="60" w:line="360"/>
-        <w:jc w:val="both"/>
+        <w:jc w:val="lowKashida"/>
       </w:pPr>
       <w:r>
         <w:rPr>
@@ -6714,7 +6714,7 @@
       <w:pPr>
         <w:pStyle w:val="Heading3"/>
         <w:bidi/>
-        <w:spacing w:after="160" w:before="200" w:line="360"/>
+        <w:spacing w:after="80" w:before="120" w:line="360"/>
         <w:jc w:val="right"/>
       </w:pPr>
       <w:r>
@@ -6734,7 +6734,7 @@
       <w:pPr>
         <w:bidi/>
         <w:spacing w:after="60" w:line="360"/>
-        <w:jc w:val="both"/>
+        <w:jc w:val="lowKashida"/>
       </w:pPr>
       <w:r>
         <w:rPr>
@@ -6752,7 +6752,7 @@
       <w:pPr>
         <w:bidi/>
         <w:spacing w:after="60" w:line="360"/>
-        <w:jc w:val="both"/>
+        <w:jc w:val="lowKashida"/>
       </w:pPr>
       <w:r>
         <w:rPr>
@@ -6792,7 +6792,7 @@
       <w:pPr>
         <w:bidi/>
         <w:spacing w:after="60" w:line="360"/>
-        <w:jc w:val="both"/>
+        <w:jc w:val="lowKashida"/>
       </w:pPr>
       <w:r>
         <w:rPr>
@@ -6832,7 +6832,7 @@
       <w:pPr>
         <w:bidi/>
         <w:spacing w:after="60" w:line="360"/>
-        <w:jc w:val="both"/>
+        <w:jc w:val="lowKashida"/>
       </w:pPr>
       <w:r>
         <w:rPr>
@@ -6872,7 +6872,7 @@
       <w:pPr>
         <w:bidi/>
         <w:spacing w:after="60" w:line="360"/>
-        <w:jc w:val="both"/>
+        <w:jc w:val="lowKashida"/>
       </w:pPr>
       <w:r>
         <w:rPr>
@@ -6912,7 +6912,7 @@
       <w:pPr>
         <w:bidi/>
         <w:spacing w:after="60" w:line="360"/>
-        <w:jc w:val="both"/>
+        <w:jc w:val="lowKashida"/>
       </w:pPr>
       <w:r>
         <w:rPr>
@@ -6930,7 +6930,7 @@
       <w:pPr>
         <w:bidi/>
         <w:spacing w:after="60" w:line="360"/>
-        <w:jc w:val="both"/>
+        <w:jc w:val="lowKashida"/>
       </w:pPr>
       <w:r>
         <w:rPr>
@@ -6970,7 +6970,7 @@
       <w:pPr>
         <w:bidi/>
         <w:spacing w:after="60" w:line="360"/>
-        <w:jc w:val="both"/>
+        <w:jc w:val="lowKashida"/>
       </w:pPr>
       <w:r>
         <w:rPr>
@@ -7010,7 +7010,7 @@
       <w:pPr>
         <w:bidi/>
         <w:spacing w:after="60" w:line="360"/>
-        <w:jc w:val="both"/>
+        <w:jc w:val="lowKashida"/>
       </w:pPr>
       <w:r>
         <w:rPr>
@@ -7050,7 +7050,7 @@
       <w:pPr>
         <w:bidi/>
         <w:spacing w:after="60" w:line="360"/>
-        <w:jc w:val="both"/>
+        <w:jc w:val="lowKashida"/>
       </w:pPr>
       <w:r>
         <w:rPr>
@@ -7090,7 +7090,7 @@
       <w:pPr>
         <w:bidi/>
         <w:spacing w:after="60" w:line="360"/>
-        <w:jc w:val="both"/>
+        <w:jc w:val="lowKashida"/>
       </w:pPr>
       <w:r>
         <w:rPr>
@@ -7108,7 +7108,7 @@
       <w:pPr>
         <w:bidi/>
         <w:spacing w:after="60" w:line="360"/>
-        <w:jc w:val="both"/>
+        <w:jc w:val="lowKashida"/>
       </w:pPr>
       <w:r>
         <w:rPr>
@@ -7148,7 +7148,7 @@
       <w:pPr>
         <w:bidi/>
         <w:spacing w:after="60" w:line="360"/>
-        <w:jc w:val="both"/>
+        <w:jc w:val="lowKashida"/>
       </w:pPr>
       <w:r>
         <w:rPr>
@@ -7188,7 +7188,7 @@
       <w:pPr>
         <w:bidi/>
         <w:spacing w:after="60" w:line="360"/>
-        <w:jc w:val="both"/>
+        <w:jc w:val="lowKashida"/>
       </w:pPr>
       <w:r>
         <w:rPr>
@@ -7228,7 +7228,7 @@
       <w:pPr>
         <w:bidi/>
         <w:spacing w:after="60" w:line="360"/>
-        <w:jc w:val="both"/>
+        <w:jc w:val="lowKashida"/>
       </w:pPr>
       <w:r>
         <w:rPr>
@@ -7268,7 +7268,7 @@
       <w:pPr>
         <w:bidi/>
         <w:spacing w:after="60" w:line="360"/>
-        <w:jc w:val="both"/>
+        <w:jc w:val="lowKashida"/>
       </w:pPr>
       <w:r>
         <w:rPr>
@@ -7286,7 +7286,7 @@
       <w:pPr>
         <w:bidi/>
         <w:spacing w:after="60" w:line="360"/>
-        <w:jc w:val="both"/>
+        <w:jc w:val="lowKashida"/>
       </w:pPr>
       <w:r>
         <w:rPr>
@@ -7326,7 +7326,7 @@
       <w:pPr>
         <w:bidi/>
         <w:spacing w:after="60" w:line="360"/>
-        <w:jc w:val="both"/>
+        <w:jc w:val="lowKashida"/>
       </w:pPr>
       <w:r>
         <w:rPr>
@@ -7366,7 +7366,7 @@
       <w:pPr>
         <w:bidi/>
         <w:spacing w:after="60" w:line="360"/>
-        <w:jc w:val="both"/>
+        <w:jc w:val="lowKashida"/>
       </w:pPr>
       <w:r>
         <w:rPr>
@@ -7406,7 +7406,7 @@
       <w:pPr>
         <w:bidi/>
         <w:spacing w:after="60" w:line="360"/>
-        <w:jc w:val="both"/>
+        <w:jc w:val="lowKashida"/>
       </w:pPr>
       <w:r>
         <w:rPr>
@@ -7446,7 +7446,7 @@
       <w:pPr>
         <w:pStyle w:val="Heading3"/>
         <w:bidi/>
-        <w:spacing w:after="160" w:before="200" w:line="360"/>
+        <w:spacing w:after="80" w:before="120" w:line="360"/>
         <w:jc w:val="right"/>
       </w:pPr>
       <w:r>
@@ -7466,7 +7466,7 @@
       <w:pPr>
         <w:bidi/>
         <w:spacing w:after="60" w:line="360"/>
-        <w:jc w:val="both"/>
+        <w:jc w:val="lowKashida"/>
       </w:pPr>
       <w:r>
         <w:rPr>
@@ -7484,7 +7484,7 @@
       <w:pPr>
         <w:bidi/>
         <w:spacing w:after="60" w:line="360"/>
-        <w:jc w:val="both"/>
+        <w:jc w:val="lowKashida"/>
       </w:pPr>
       <w:r>
         <w:rPr>
@@ -7524,7 +7524,7 @@
       <w:pPr>
         <w:bidi/>
         <w:spacing w:after="60" w:line="360"/>
-        <w:jc w:val="both"/>
+        <w:jc w:val="lowKashida"/>
       </w:pPr>
       <w:r>
         <w:rPr>
@@ -7564,7 +7564,7 @@
       <w:pPr>
         <w:bidi/>
         <w:spacing w:after="60" w:line="360"/>
-        <w:jc w:val="both"/>
+        <w:jc w:val="lowKashida"/>
       </w:pPr>
       <w:r>
         <w:rPr>
@@ -7604,7 +7604,7 @@
       <w:pPr>
         <w:bidi/>
         <w:spacing w:after="60" w:line="360"/>
-        <w:jc w:val="both"/>
+        <w:jc w:val="lowKashida"/>
       </w:pPr>
       <w:r>
         <w:rPr>
@@ -7644,7 +7644,7 @@
       <w:pPr>
         <w:bidi/>
         <w:spacing w:after="60" w:line="360"/>
-        <w:jc w:val="both"/>
+        <w:jc w:val="lowKashida"/>
       </w:pPr>
       <w:r>
         <w:rPr>
@@ -7662,7 +7662,7 @@
       <w:pPr>
         <w:bidi/>
         <w:spacing w:after="60" w:line="360"/>
-        <w:jc w:val="both"/>
+        <w:jc w:val="lowKashida"/>
       </w:pPr>
       <w:r>
         <w:rPr>
@@ -7702,7 +7702,7 @@
       <w:pPr>
         <w:bidi/>
         <w:spacing w:after="60" w:line="360"/>
-        <w:jc w:val="both"/>
+        <w:jc w:val="lowKashida"/>
       </w:pPr>
       <w:r>
         <w:rPr>
@@ -7742,7 +7742,7 @@
       <w:pPr>
         <w:bidi/>
         <w:spacing w:after="60" w:line="360"/>
-        <w:jc w:val="both"/>
+        <w:jc w:val="lowKashida"/>
       </w:pPr>
       <w:r>
         <w:rPr>
@@ -7782,7 +7782,7 @@
       <w:pPr>
         <w:pStyle w:val="Heading3"/>
         <w:bidi/>
-        <w:spacing w:after="160" w:before="200" w:line="360"/>
+        <w:spacing w:after="80" w:before="120" w:line="360"/>
         <w:jc w:val="right"/>
       </w:pPr>
       <w:r>
@@ -7802,7 +7802,7 @@
       <w:pPr>
         <w:bidi/>
         <w:spacing w:after="60" w:line="360"/>
-        <w:jc w:val="both"/>
+        <w:jc w:val="lowKashida"/>
       </w:pPr>
       <w:r>
         <w:rPr>
@@ -7831,7 +7831,7 @@
       <w:pPr>
         <w:bidi/>
         <w:spacing w:after="60" w:line="360"/>
-        <w:jc w:val="both"/>
+        <w:jc w:val="lowKashida"/>
       </w:pPr>
       <w:r>
         <w:rPr>
@@ -7860,7 +7860,7 @@
       <w:pPr>
         <w:bidi/>
         <w:spacing w:after="60" w:line="360"/>
-        <w:jc w:val="both"/>
+        <w:jc w:val="lowKashida"/>
       </w:pPr>
       <w:r>
         <w:rPr>
@@ -7889,7 +7889,7 @@
       <w:pPr>
         <w:pStyle w:val="Heading3"/>
         <w:bidi/>
-        <w:spacing w:after="160" w:before="200" w:line="360"/>
+        <w:spacing w:after="80" w:before="120" w:line="360"/>
         <w:jc w:val="right"/>
       </w:pPr>
       <w:r>
@@ -7909,7 +7909,7 @@
       <w:pPr>
         <w:bidi/>
         <w:spacing w:after="60" w:line="360"/>
-        <w:jc w:val="both"/>
+        <w:jc w:val="lowKashida"/>
       </w:pPr>
       <w:r>
         <w:rPr>
@@ -7938,7 +7938,7 @@
       <w:pPr>
         <w:bidi/>
         <w:spacing w:after="60" w:line="360"/>
-        <w:jc w:val="both"/>
+        <w:jc w:val="lowKashida"/>
       </w:pPr>
       <w:r>
         <w:rPr>
@@ -7967,7 +7967,7 @@
       <w:pPr>
         <w:bidi/>
         <w:spacing w:after="60" w:line="360"/>
-        <w:jc w:val="both"/>
+        <w:jc w:val="lowKashida"/>
       </w:pPr>
       <w:r>
         <w:rPr>
@@ -7996,7 +7996,7 @@
       <w:pPr>
         <w:bidi/>
         <w:spacing w:after="60" w:line="360"/>
-        <w:jc w:val="both"/>
+        <w:jc w:val="lowKashida"/>
       </w:pPr>
       <w:r>
         <w:rPr>
@@ -8025,7 +8025,7 @@
       <w:pPr>
         <w:bidi/>
         <w:spacing w:after="60" w:line="360"/>
-        <w:jc w:val="both"/>
+        <w:jc w:val="lowKashida"/>
       </w:pPr>
       <w:r>
         <w:rPr>
@@ -8055,7 +8055,7 @@
         <w:pStyle w:val="Heading1"/>
         <w:pageBreakBefore/>
         <w:bidi/>
-        <w:spacing w:after="240" w:before="240" w:line="360"/>
+        <w:spacing w:after="160" w:before="120" w:line="360"/>
         <w:jc w:val="center"/>
       </w:pPr>
       <w:r>
@@ -8075,7 +8075,7 @@
       <w:pPr>
         <w:bidi/>
         <w:spacing w:after="60" w:line="360"/>
-        <w:jc w:val="both"/>
+        <w:jc w:val="lowKashida"/>
       </w:pPr>
       <w:r>
         <w:rPr>
@@ -8093,7 +8093,7 @@
       <w:pPr>
         <w:pStyle w:val="Heading3"/>
         <w:bidi/>
-        <w:spacing w:after="160" w:before="200" w:line="360"/>
+        <w:spacing w:after="80" w:before="120" w:line="360"/>
         <w:jc w:val="right"/>
       </w:pPr>
       <w:r>
@@ -8113,7 +8113,7 @@
       <w:pPr>
         <w:pStyle w:val="Heading3"/>
         <w:bidi/>
-        <w:spacing w:after="160" w:before="200" w:line="360"/>
+        <w:spacing w:after="80" w:before="120" w:line="360"/>
         <w:jc w:val="right"/>
       </w:pPr>
       <w:r>
@@ -8133,7 +8133,7 @@
       <w:pPr>
         <w:bidi/>
         <w:spacing w:after="60" w:line="360"/>
-        <w:jc w:val="both"/>
+        <w:jc w:val="lowKashida"/>
       </w:pPr>
       <w:r>
         <w:rPr>
@@ -8162,7 +8162,7 @@
       <w:pPr>
         <w:bidi/>
         <w:spacing w:after="60" w:line="360"/>
-        <w:jc w:val="both"/>
+        <w:jc w:val="lowKashida"/>
       </w:pPr>
       <w:r>
         <w:rPr>
@@ -8191,7 +8191,7 @@
       <w:pPr>
         <w:bidi/>
         <w:spacing w:after="60" w:line="360"/>
-        <w:jc w:val="both"/>
+        <w:jc w:val="lowKashida"/>
       </w:pPr>
       <w:r>
         <w:rPr>
@@ -8220,7 +8220,7 @@
       <w:pPr>
         <w:bidi/>
         <w:spacing w:after="60" w:line="360"/>
-        <w:jc w:val="both"/>
+        <w:jc w:val="lowKashida"/>
       </w:pPr>
       <w:r>
         <w:rPr>
@@ -8249,7 +8249,7 @@
       <w:pPr>
         <w:bidi/>
         <w:spacing w:after="60" w:line="360"/>
-        <w:jc w:val="both"/>
+        <w:jc w:val="lowKashida"/>
       </w:pPr>
       <w:r>
         <w:rPr>
@@ -8278,7 +8278,7 @@
       <w:pPr>
         <w:pStyle w:val="Heading3"/>
         <w:bidi/>
-        <w:spacing w:after="160" w:before="200" w:line="360"/>
+        <w:spacing w:after="80" w:before="120" w:line="360"/>
         <w:jc w:val="right"/>
       </w:pPr>
       <w:r>
@@ -8298,7 +8298,7 @@
       <w:pPr>
         <w:bidi/>
         <w:spacing w:after="60" w:line="360"/>
-        <w:jc w:val="both"/>
+        <w:jc w:val="lowKashida"/>
       </w:pPr>
       <w:r>
         <w:rPr>
@@ -8327,7 +8327,7 @@
       <w:pPr>
         <w:bidi/>
         <w:spacing w:after="60" w:line="360"/>
-        <w:jc w:val="both"/>
+        <w:jc w:val="lowKashida"/>
       </w:pPr>
       <w:r>
         <w:rPr>
@@ -8356,7 +8356,7 @@
       <w:pPr>
         <w:bidi/>
         <w:spacing w:after="60" w:line="360"/>
-        <w:jc w:val="both"/>
+        <w:jc w:val="lowKashida"/>
       </w:pPr>
       <w:r>
         <w:rPr>
@@ -8385,7 +8385,7 @@
       <w:pPr>
         <w:bidi/>
         <w:spacing w:after="60" w:line="360"/>
-        <w:jc w:val="both"/>
+        <w:jc w:val="lowKashida"/>
       </w:pPr>
       <w:r>
         <w:rPr>
@@ -8414,7 +8414,7 @@
       <w:pPr>
         <w:bidi/>
         <w:spacing w:after="60" w:line="360"/>
-        <w:jc w:val="both"/>
+        <w:jc w:val="lowKashida"/>
       </w:pPr>
       <w:r>
         <w:rPr>
@@ -8443,7 +8443,7 @@
       <w:pPr>
         <w:pStyle w:val="Heading3"/>
         <w:bidi/>
-        <w:spacing w:after="160" w:before="200" w:line="360"/>
+        <w:spacing w:after="80" w:before="120" w:line="360"/>
         <w:jc w:val="right"/>
       </w:pPr>
       <w:r>
@@ -8463,7 +8463,7 @@
       <w:pPr>
         <w:bidi/>
         <w:spacing w:after="60" w:line="360"/>
-        <w:jc w:val="both"/>
+        <w:jc w:val="lowKashida"/>
       </w:pPr>
       <w:r>
         <w:rPr>
@@ -8481,7 +8481,7 @@
       <w:pPr>
         <w:bidi/>
         <w:spacing w:after="60" w:line="360"/>
-        <w:jc w:val="both"/>
+        <w:jc w:val="lowKashida"/>
       </w:pPr>
       <w:r>
         <w:rPr>
@@ -8510,7 +8510,7 @@
       <w:pPr>
         <w:bidi/>
         <w:spacing w:after="60" w:line="360"/>
-        <w:jc w:val="both"/>
+        <w:jc w:val="lowKashida"/>
       </w:pPr>
       <w:r>
         <w:rPr>
@@ -8539,7 +8539,7 @@
       <w:pPr>
         <w:bidi/>
         <w:spacing w:after="60" w:line="360"/>
-        <w:jc w:val="both"/>
+        <w:jc w:val="lowKashida"/>
       </w:pPr>
       <w:r>
         <w:rPr>
@@ -8568,7 +8568,7 @@
       <w:pPr>
         <w:bidi/>
         <w:spacing w:after="60" w:line="360"/>
-        <w:jc w:val="both"/>
+        <w:jc w:val="lowKashida"/>
       </w:pPr>
       <w:r>
         <w:rPr>
@@ -8586,7 +8586,7 @@
       <w:pPr>
         <w:bidi/>
         <w:spacing w:after="60" w:line="360"/>
-        <w:jc w:val="both"/>
+        <w:jc w:val="lowKashida"/>
       </w:pPr>
       <w:r>
         <w:rPr>
@@ -8615,7 +8615,7 @@
       <w:pPr>
         <w:bidi/>
         <w:spacing w:after="60" w:line="360"/>
-        <w:jc w:val="both"/>
+        <w:jc w:val="lowKashida"/>
       </w:pPr>
       <w:r>
         <w:rPr>
@@ -8644,7 +8644,7 @@
       <w:pPr>
         <w:bidi/>
         <w:spacing w:after="60" w:line="360"/>
-        <w:jc w:val="both"/>
+        <w:jc w:val="lowKashida"/>
       </w:pPr>
       <w:r>
         <w:rPr>
@@ -8673,7 +8673,7 @@
       <w:pPr>
         <w:bidi/>
         <w:spacing w:after="60" w:line="360"/>
-        <w:jc w:val="both"/>
+        <w:jc w:val="lowKashida"/>
       </w:pPr>
       <w:r>
         <w:rPr>
@@ -8691,7 +8691,7 @@
       <w:pPr>
         <w:bidi/>
         <w:spacing w:after="60" w:line="360"/>
-        <w:jc w:val="both"/>
+        <w:jc w:val="lowKashida"/>
       </w:pPr>
       <w:r>
         <w:rPr>
@@ -8720,7 +8720,7 @@
       <w:pPr>
         <w:bidi/>
         <w:spacing w:after="60" w:line="360"/>
-        <w:jc w:val="both"/>
+        <w:jc w:val="lowKashida"/>
       </w:pPr>
       <w:r>
         <w:rPr>
@@ -8749,7 +8749,7 @@
       <w:pPr>
         <w:bidi/>
         <w:spacing w:after="60" w:line="360"/>
-        <w:jc w:val="both"/>
+        <w:jc w:val="lowKashida"/>
       </w:pPr>
       <w:r>
         <w:rPr>
@@ -8778,7 +8778,7 @@
       <w:pPr>
         <w:bidi/>
         <w:spacing w:after="60" w:line="360"/>
-        <w:jc w:val="both"/>
+        <w:jc w:val="lowKashida"/>
       </w:pPr>
       <w:r>
         <w:rPr>
@@ -8796,7 +8796,7 @@
       <w:pPr>
         <w:bidi/>
         <w:spacing w:after="60" w:line="360"/>
-        <w:jc w:val="both"/>
+        <w:jc w:val="lowKashida"/>
       </w:pPr>
       <w:r>
         <w:rPr>
@@ -8825,7 +8825,7 @@
       <w:pPr>
         <w:bidi/>
         <w:spacing w:after="60" w:line="360"/>
-        <w:jc w:val="both"/>
+        <w:jc w:val="lowKashida"/>
       </w:pPr>
       <w:r>
         <w:rPr>
@@ -8854,7 +8854,7 @@
       <w:pPr>
         <w:bidi/>
         <w:spacing w:after="60" w:line="360"/>
-        <w:jc w:val="both"/>
+        <w:jc w:val="lowKashida"/>
       </w:pPr>
       <w:r>
         <w:rPr>
@@ -8883,7 +8883,7 @@
       <w:pPr>
         <w:pStyle w:val="Heading3"/>
         <w:bidi/>
-        <w:spacing w:after="160" w:before="200" w:line="360"/>
+        <w:spacing w:after="80" w:before="120" w:line="360"/>
         <w:jc w:val="right"/>
       </w:pPr>
       <w:r>
@@ -8903,7 +8903,7 @@
       <w:pPr>
         <w:bidi/>
         <w:spacing w:after="60" w:line="360"/>
-        <w:jc w:val="both"/>
+        <w:jc w:val="lowKashida"/>
       </w:pPr>
       <w:r>
         <w:rPr>
@@ -8932,7 +8932,7 @@
       <w:pPr>
         <w:bidi/>
         <w:spacing w:after="60" w:line="360"/>
-        <w:jc w:val="both"/>
+        <w:jc w:val="lowKashida"/>
       </w:pPr>
       <w:r>
         <w:rPr>
@@ -8961,7 +8961,7 @@
       <w:pPr>
         <w:bidi/>
         <w:spacing w:after="60" w:line="360"/>
-        <w:jc w:val="both"/>
+        <w:jc w:val="lowKashida"/>
       </w:pPr>
       <w:r>
         <w:rPr>
@@ -8990,7 +8990,7 @@
       <w:pPr>
         <w:bidi/>
         <w:spacing w:after="60" w:line="360"/>
-        <w:jc w:val="both"/>
+        <w:jc w:val="lowKashida"/>
       </w:pPr>
       <w:r>
         <w:rPr>
@@ -9019,7 +9019,7 @@
       <w:pPr>
         <w:bidi/>
         <w:spacing w:after="60" w:line="360"/>
-        <w:jc w:val="both"/>
+        <w:jc w:val="lowKashida"/>
       </w:pPr>
       <w:r>
         <w:rPr>
@@ -9048,7 +9048,7 @@
       <w:pPr>
         <w:bidi/>
         <w:spacing w:after="60" w:line="360"/>
-        <w:jc w:val="both"/>
+        <w:jc w:val="lowKashida"/>
       </w:pPr>
       <w:r>
         <w:rPr>
@@ -9077,7 +9077,7 @@
       <w:pPr>
         <w:pStyle w:val="Heading3"/>
         <w:bidi/>
-        <w:spacing w:after="160" w:before="200" w:line="360"/>
+        <w:spacing w:after="80" w:before="120" w:line="360"/>
         <w:jc w:val="right"/>
       </w:pPr>
       <w:r>
@@ -9097,7 +9097,7 @@
       <w:pPr>
         <w:bidi/>
         <w:spacing w:after="60" w:line="360"/>
-        <w:jc w:val="both"/>
+        <w:jc w:val="lowKashida"/>
       </w:pPr>
       <w:r>
         <w:rPr>
@@ -9126,7 +9126,7 @@
       <w:pPr>
         <w:bidi/>
         <w:spacing w:after="60" w:line="360"/>
-        <w:jc w:val="both"/>
+        <w:jc w:val="lowKashida"/>
       </w:pPr>
       <w:r>
         <w:rPr>
@@ -9155,7 +9155,7 @@
       <w:pPr>
         <w:bidi/>
         <w:spacing w:after="60" w:line="360"/>
-        <w:jc w:val="both"/>
+        <w:jc w:val="lowKashida"/>
       </w:pPr>
       <w:r>
         <w:rPr>
@@ -9213,7 +9213,7 @@
       <w:pPr>
         <w:bidi/>
         <w:spacing w:after="60" w:line="360"/>
-        <w:jc w:val="both"/>
+        <w:jc w:val="lowKashida"/>
       </w:pPr>
       <w:r>
         <w:rPr>
@@ -9271,7 +9271,7 @@
       <w:pPr>
         <w:bidi/>
         <w:spacing w:after="60" w:line="360"/>
-        <w:jc w:val="both"/>
+        <w:jc w:val="lowKashida"/>
       </w:pPr>
       <w:r>
         <w:rPr>
@@ -9300,7 +9300,7 @@
       <w:pPr>
         <w:bidi/>
         <w:spacing w:after="60" w:line="360"/>
-        <w:jc w:val="both"/>
+        <w:jc w:val="lowKashida"/>
       </w:pPr>
       <w:r>
         <w:rPr>
@@ -9329,7 +9329,7 @@
       <w:pPr>
         <w:bidi/>
         <w:spacing w:after="60" w:line="360"/>
-        <w:jc w:val="both"/>
+        <w:jc w:val="lowKashida"/>
       </w:pPr>
       <w:r>
         <w:rPr>
@@ -9358,7 +9358,7 @@
       <w:pPr>
         <w:bidi/>
         <w:spacing w:after="60" w:line="360"/>
-        <w:jc w:val="both"/>
+        <w:jc w:val="lowKashida"/>
       </w:pPr>
       <w:r>
         <w:rPr>
@@ -9376,7 +9376,7 @@
       <w:pPr>
         <w:pStyle w:val="Heading3"/>
         <w:bidi/>
-        <w:spacing w:after="160" w:before="200" w:line="360"/>
+        <w:spacing w:after="80" w:before="120" w:line="360"/>
         <w:jc w:val="right"/>
       </w:pPr>
       <w:r>
@@ -9425,7 +9425,7 @@
       <w:pPr>
         <w:bidi/>
         <w:spacing w:after="60" w:line="360"/>
-        <w:jc w:val="both"/>
+        <w:jc w:val="lowKashida"/>
       </w:pPr>
       <w:r>
         <w:rPr>
@@ -9454,7 +9454,7 @@
       <w:pPr>
         <w:bidi/>
         <w:spacing w:after="60" w:line="360"/>
-        <w:jc w:val="both"/>
+        <w:jc w:val="lowKashida"/>
       </w:pPr>
       <w:r>
         <w:rPr>
@@ -9483,7 +9483,7 @@
       <w:pPr>
         <w:bidi/>
         <w:spacing w:after="60" w:line="360"/>
-        <w:jc w:val="both"/>
+        <w:jc w:val="lowKashida"/>
       </w:pPr>
       <w:r>
         <w:rPr>
@@ -9599,7 +9599,7 @@
       <w:pPr>
         <w:pStyle w:val="Heading3"/>
         <w:bidi/>
-        <w:spacing w:after="160" w:before="200" w:line="360"/>
+        <w:spacing w:after="80" w:before="120" w:line="360"/>
         <w:jc w:val="right"/>
       </w:pPr>
       <w:r>
@@ -9619,7 +9619,7 @@
       <w:pPr>
         <w:bidi/>
         <w:spacing w:after="60" w:line="360"/>
-        <w:jc w:val="both"/>
+        <w:jc w:val="lowKashida"/>
       </w:pPr>
       <w:r>
         <w:rPr>
@@ -9648,7 +9648,7 @@
       <w:pPr>
         <w:bidi/>
         <w:spacing w:after="60" w:line="360"/>
-        <w:jc w:val="both"/>
+        <w:jc w:val="lowKashida"/>
       </w:pPr>
       <w:r>
         <w:rPr>
@@ -9677,7 +9677,7 @@
       <w:pPr>
         <w:bidi/>
         <w:spacing w:after="60" w:line="360"/>
-        <w:jc w:val="both"/>
+        <w:jc w:val="lowKashida"/>
       </w:pPr>
       <w:r>
         <w:rPr>
@@ -9706,7 +9706,7 @@
       <w:pPr>
         <w:bidi/>
         <w:spacing w:after="60" w:line="360"/>
-        <w:jc w:val="both"/>
+        <w:jc w:val="lowKashida"/>
       </w:pPr>
       <w:r>
         <w:rPr>
@@ -9735,7 +9735,7 @@
       <w:pPr>
         <w:bidi/>
         <w:spacing w:after="60" w:line="360"/>
-        <w:jc w:val="both"/>
+        <w:jc w:val="lowKashida"/>
       </w:pPr>
       <w:r>
         <w:rPr>
@@ -9764,7 +9764,7 @@
       <w:pPr>
         <w:bidi/>
         <w:spacing w:after="60" w:line="360"/>
-        <w:jc w:val="both"/>
+        <w:jc w:val="lowKashida"/>
       </w:pPr>
       <w:r>
         <w:rPr>
@@ -9793,7 +9793,7 @@
       <w:pPr>
         <w:bidi/>
         <w:spacing w:after="60" w:line="360"/>
-        <w:jc w:val="both"/>
+        <w:jc w:val="lowKashida"/>
       </w:pPr>
       <w:r>
         <w:rPr>

</xml_diff>

<commit_message>
Remove double spaces before URL parentheses in study link lines
Co-Authored-By: Claude Fable 5 <noreply@anthropic.com>
Claude-Session: https://claude.ai/code/session_01ESPDZE2KAqBUfzv5HLVvG7
</commit_message>
<xml_diff>
--- a/seminar/Abd Almahdi Dahla 212684527 - Research Plan.docx
+++ b/seminar/Abd Almahdi Dahla 212684527 - Research Plan.docx
@@ -610,7 +610,7 @@
         </w:rPr>
         <w:t xml:space="preserve">رابط الدراسة: </w:t>
       </w:r>
-      <w:hyperlink w:history="1" r:id="rIdpnxk33ge4ptbckfhf8qv4">
+      <w:hyperlink w:history="1" r:id="rId5kxqguj_yxb52ku0yz9r8">
         <w:r>
           <w:rPr>
             <w:rFonts w:ascii="Simplified Arabic" w:cs="Simplified Arabic" w:eastAsia="Simplified Arabic" w:hAnsi="Simplified Arabic"/>
@@ -634,7 +634,7 @@
           <w:szCs w:val="28"/>
           <w:rtl/>
         </w:rPr>
-        <w:t xml:space="preserve">  ( https://journals.ekb.eg/article_368941_0.html )</w:t>
+        <w:t xml:space="preserve"> ( https://journals.ekb.eg/article_368941_0.html )</w:t>
       </w:r>
     </w:p>
     <w:p>
@@ -771,7 +771,7 @@
         </w:rPr>
         <w:t xml:space="preserve">رابط الدراسة: </w:t>
       </w:r>
-      <w:hyperlink w:history="1" r:id="rIdbyrhfyf10ygw5he-_hf_w">
+      <w:hyperlink w:history="1" r:id="rId3vvq0xvthc5tkxsv9uzjt">
         <w:r>
           <w:rPr>
             <w:rFonts w:ascii="Simplified Arabic" w:cs="Simplified Arabic" w:eastAsia="Simplified Arabic" w:hAnsi="Simplified Arabic"/>
@@ -795,7 +795,7 @@
           <w:szCs w:val="28"/>
           <w:rtl/>
         </w:rPr>
-        <w:t xml:space="preserve">  ( https://mjle.journals.ekb.eg/article_368941_50690f4113b5efc26ad3acb040dabad4.pdf )</w:t>
+        <w:t xml:space="preserve"> ( https://mjle.journals.ekb.eg/article_368941_50690f4113b5efc26ad3acb040dabad4.pdf )</w:t>
       </w:r>
     </w:p>
     <w:p>
@@ -932,7 +932,7 @@
         </w:rPr>
         <w:t xml:space="preserve">رابط الدراسة: </w:t>
       </w:r>
-      <w:hyperlink w:history="1" r:id="rIdwuenk_zmfz1ny9f2hlalg">
+      <w:hyperlink w:history="1" r:id="rIdwhih9dyciysf0t8okcgpy">
         <w:r>
           <w:rPr>
             <w:rFonts w:ascii="Simplified Arabic" w:cs="Simplified Arabic" w:eastAsia="Simplified Arabic" w:hAnsi="Simplified Arabic"/>
@@ -956,7 +956,7 @@
           <w:szCs w:val="28"/>
           <w:rtl/>
         </w:rPr>
-        <w:t xml:space="preserve">  ( https://search.mandumah.com/Record/1633970 )</w:t>
+        <w:t xml:space="preserve"> ( https://search.mandumah.com/Record/1633970 )</w:t>
       </w:r>
     </w:p>
     <w:p>
@@ -1093,7 +1093,7 @@
         </w:rPr>
         <w:t xml:space="preserve">رابط الدراسة: </w:t>
       </w:r>
-      <w:hyperlink w:history="1" r:id="rIdbj6ixmwgpysedw7ha4gjz">
+      <w:hyperlink w:history="1" r:id="rIdkqyo_tuh8uccsg__l8m3b">
         <w:r>
           <w:rPr>
             <w:rFonts w:ascii="Simplified Arabic" w:cs="Simplified Arabic" w:eastAsia="Simplified Arabic" w:hAnsi="Simplified Arabic"/>
@@ -1117,7 +1117,7 @@
           <w:szCs w:val="28"/>
           <w:rtl/>
         </w:rPr>
-        <w:t xml:space="preserve">  ( https://doi.org/10.65414/najsp.v2i4.281 )</w:t>
+        <w:t xml:space="preserve"> ( https://doi.org/10.65414/najsp.v2i4.281 )</w:t>
       </w:r>
     </w:p>
     <w:p>
@@ -1254,7 +1254,7 @@
         </w:rPr>
         <w:t xml:space="preserve">رابط الدراسة: </w:t>
       </w:r>
-      <w:hyperlink w:history="1" r:id="rIdddhuhgsoocrh15wn-jyf9">
+      <w:hyperlink w:history="1" r:id="rIdcx3sxexgmpg5langqqglp">
         <w:r>
           <w:rPr>
             <w:rFonts w:ascii="Simplified Arabic" w:cs="Simplified Arabic" w:eastAsia="Simplified Arabic" w:hAnsi="Simplified Arabic"/>
@@ -1278,7 +1278,7 @@
           <w:szCs w:val="28"/>
           <w:rtl/>
         </w:rPr>
-        <w:t xml:space="preserve">  ( https://doi.org/10.61353/ma.0000141 )</w:t>
+        <w:t xml:space="preserve"> ( https://doi.org/10.61353/ma.0000141 )</w:t>
       </w:r>
     </w:p>
     <w:p>
@@ -1415,7 +1415,7 @@
         </w:rPr>
         <w:t xml:space="preserve">رابط الدراسة: </w:t>
       </w:r>
-      <w:hyperlink w:history="1" r:id="rIdszbouu26jhqtvjka94ebq">
+      <w:hyperlink w:history="1" r:id="rIdoo7gitt6c-ed1hua05lgc">
         <w:r>
           <w:rPr>
             <w:rFonts w:ascii="Simplified Arabic" w:cs="Simplified Arabic" w:eastAsia="Simplified Arabic" w:hAnsi="Simplified Arabic"/>
@@ -1439,7 +1439,7 @@
           <w:szCs w:val="28"/>
           <w:rtl/>
         </w:rPr>
-        <w:t xml:space="preserve">  ( https://www.researchgate.net/publication/393318043 )</w:t>
+        <w:t xml:space="preserve"> ( https://www.researchgate.net/publication/393318043 )</w:t>
       </w:r>
     </w:p>
     <w:p>
@@ -1576,7 +1576,7 @@
         </w:rPr>
         <w:t xml:space="preserve">رابط الدراسة: </w:t>
       </w:r>
-      <w:hyperlink w:history="1" r:id="rId_q2f2vbta_hbdesorf4es">
+      <w:hyperlink w:history="1" r:id="rIdxynaoib4jkjsn3hois_no">
         <w:r>
           <w:rPr>
             <w:rFonts w:ascii="Simplified Arabic" w:cs="Simplified Arabic" w:eastAsia="Simplified Arabic" w:hAnsi="Simplified Arabic"/>
@@ -1600,7 +1600,7 @@
           <w:szCs w:val="28"/>
           <w:rtl/>
         </w:rPr>
-        <w:t xml:space="preserve">  ( https://bcchj.uobabylon.edu.iq/index.php/bcchj/ar/article/view/1016 )</w:t>
+        <w:t xml:space="preserve"> ( https://bcchj.uobabylon.edu.iq/index.php/bcchj/ar/article/view/1016 )</w:t>
       </w:r>
     </w:p>
     <w:p>
@@ -1737,7 +1737,7 @@
         </w:rPr>
         <w:t xml:space="preserve">رابط الدراسة: </w:t>
       </w:r>
-      <w:hyperlink w:history="1" r:id="rIdns2ta3h774-huhlw9exrh">
+      <w:hyperlink w:history="1" r:id="rIdf8kyu0wt3i2xsfbyrhn1i">
         <w:r>
           <w:rPr>
             <w:rFonts w:ascii="Simplified Arabic" w:cs="Simplified Arabic" w:eastAsia="Simplified Arabic" w:hAnsi="Simplified Arabic"/>
@@ -1761,7 +1761,7 @@
           <w:szCs w:val="28"/>
           <w:rtl/>
         </w:rPr>
-        <w:t xml:space="preserve">  ( https://asjp.cerist.dz/en/article/198662 )</w:t>
+        <w:t xml:space="preserve"> ( https://asjp.cerist.dz/en/article/198662 )</w:t>
       </w:r>
     </w:p>
     <w:p>
@@ -1898,7 +1898,7 @@
         </w:rPr>
         <w:t xml:space="preserve">رابط الدراسة: </w:t>
       </w:r>
-      <w:hyperlink w:history="1" r:id="rIdqee6bsmdurmglund6wbi5">
+      <w:hyperlink w:history="1" r:id="rIdyz9iccbu2mpzufmnz47zy">
         <w:r>
           <w:rPr>
             <w:rFonts w:ascii="Simplified Arabic" w:cs="Simplified Arabic" w:eastAsia="Simplified Arabic" w:hAnsi="Simplified Arabic"/>
@@ -1922,7 +1922,7 @@
           <w:szCs w:val="28"/>
           <w:rtl/>
         </w:rPr>
-        <w:t xml:space="preserve">  ( https://search.mandumah.com/Record/1232048 )</w:t>
+        <w:t xml:space="preserve"> ( https://search.mandumah.com/Record/1232048 )</w:t>
       </w:r>
     </w:p>
     <w:p>
@@ -2059,7 +2059,7 @@
         </w:rPr>
         <w:t xml:space="preserve">رابط الدراسة: </w:t>
       </w:r>
-      <w:hyperlink w:history="1" r:id="rId1-3i_a5nrpekr85ye_rqh">
+      <w:hyperlink w:history="1" r:id="rIdz66x_dayemvrwyvf5lf4f">
         <w:r>
           <w:rPr>
             <w:rFonts w:ascii="Simplified Arabic" w:cs="Simplified Arabic" w:eastAsia="Simplified Arabic" w:hAnsi="Simplified Arabic"/>
@@ -2083,7 +2083,7 @@
           <w:szCs w:val="28"/>
           <w:rtl/>
         </w:rPr>
-        <w:t xml:space="preserve">  ( https://journals.alqasimia.ac.ae/index.php/ssis/article/view/66 )</w:t>
+        <w:t xml:space="preserve"> ( https://journals.alqasimia.ac.ae/index.php/ssis/article/view/66 )</w:t>
       </w:r>
     </w:p>
     <w:p>
@@ -2220,7 +2220,7 @@
         </w:rPr>
         <w:t xml:space="preserve">رابط الدراسة: </w:t>
       </w:r>
-      <w:hyperlink w:history="1" r:id="rIdxbj70bzeqzqv_3qcsc_5p">
+      <w:hyperlink w:history="1" r:id="rIdppz65ufj1c8n31gq9p2bh">
         <w:r>
           <w:rPr>
             <w:rFonts w:ascii="Simplified Arabic" w:cs="Simplified Arabic" w:eastAsia="Simplified Arabic" w:hAnsi="Simplified Arabic"/>
@@ -2244,7 +2244,7 @@
           <w:szCs w:val="28"/>
           <w:rtl/>
         </w:rPr>
-        <w:t xml:space="preserve">  ( https://www.ajrsp.com/vol/issue31/ )</w:t>
+        <w:t xml:space="preserve"> ( https://www.ajrsp.com/vol/issue31/ )</w:t>
       </w:r>
     </w:p>
     <w:p>
@@ -2381,7 +2381,7 @@
         </w:rPr>
         <w:t xml:space="preserve">رابط الدراسة: </w:t>
       </w:r>
-      <w:hyperlink w:history="1" r:id="rIdorz2cmmlnlmlgnzebd_ef">
+      <w:hyperlink w:history="1" r:id="rIdg1ewoxjky2yonzyntn3xj">
         <w:r>
           <w:rPr>
             <w:rFonts w:ascii="Simplified Arabic" w:cs="Simplified Arabic" w:eastAsia="Simplified Arabic" w:hAnsi="Simplified Arabic"/>
@@ -2405,7 +2405,7 @@
           <w:szCs w:val="28"/>
           <w:rtl/>
         </w:rPr>
-        <w:t xml:space="preserve">  ( https://dspace.univ-eloued.dz/handle/123456789/15831 )</w:t>
+        <w:t xml:space="preserve"> ( https://dspace.univ-eloued.dz/handle/123456789/15831 )</w:t>
       </w:r>
     </w:p>
     <w:p>
@@ -2542,7 +2542,7 @@
         </w:rPr>
         <w:t xml:space="preserve">رابط الدراسة: </w:t>
       </w:r>
-      <w:hyperlink w:history="1" r:id="rIdk6ifvsu93m6nuyy0q3w3n">
+      <w:hyperlink w:history="1" r:id="rIdl5c_-hayewovhbcqykzuj">
         <w:r>
           <w:rPr>
             <w:rFonts w:ascii="Simplified Arabic" w:cs="Simplified Arabic" w:eastAsia="Simplified Arabic" w:hAnsi="Simplified Arabic"/>
@@ -2566,7 +2566,7 @@
           <w:szCs w:val="28"/>
           <w:rtl/>
         </w:rPr>
-        <w:t xml:space="preserve">  ( https://asjp.cerist.dz/en/article/91461 )</w:t>
+        <w:t xml:space="preserve"> ( https://asjp.cerist.dz/en/article/91461 )</w:t>
       </w:r>
     </w:p>
     <w:p>
@@ -2703,7 +2703,7 @@
         </w:rPr>
         <w:t xml:space="preserve">رابط الدراسة: </w:t>
       </w:r>
-      <w:hyperlink w:history="1" r:id="rIdrjcimx_arw5kevz0w7eik">
+      <w:hyperlink w:history="1" r:id="rIdia30zpfoqwkwonokvn51w">
         <w:r>
           <w:rPr>
             <w:rFonts w:ascii="Simplified Arabic" w:cs="Simplified Arabic" w:eastAsia="Simplified Arabic" w:hAnsi="Simplified Arabic"/>
@@ -2727,7 +2727,7 @@
           <w:szCs w:val="28"/>
           <w:rtl/>
         </w:rPr>
-        <w:t xml:space="preserve">  ( https://asjp.cerist.dz/en/article/26599 )</w:t>
+        <w:t xml:space="preserve"> ( https://asjp.cerist.dz/en/article/26599 )</w:t>
       </w:r>
     </w:p>
     <w:p>
@@ -2864,7 +2864,7 @@
         </w:rPr>
         <w:t xml:space="preserve">رابط الدراسة: </w:t>
       </w:r>
-      <w:hyperlink w:history="1" r:id="rId2rxqz21tblxvgfzbwxkw7">
+      <w:hyperlink w:history="1" r:id="rIdzvjxgiyaxhygr0hh4wq2t">
         <w:r>
           <w:rPr>
             <w:rFonts w:ascii="Simplified Arabic" w:cs="Simplified Arabic" w:eastAsia="Simplified Arabic" w:hAnsi="Simplified Arabic"/>
@@ -2888,7 +2888,7 @@
           <w:szCs w:val="28"/>
           <w:rtl/>
         </w:rPr>
-        <w:t xml:space="preserve">  ( https://www.damascusuniversity.edu.sy/mag/law/images/stories/479-500.pdf )</w:t>
+        <w:t xml:space="preserve"> ( https://www.damascusuniversity.edu.sy/mag/law/images/stories/479-500.pdf )</w:t>
       </w:r>
     </w:p>
     <w:p>
@@ -3025,7 +3025,7 @@
         </w:rPr>
         <w:t xml:space="preserve">رابط الدراسة: </w:t>
       </w:r>
-      <w:hyperlink w:history="1" r:id="rId3yneddej9qpfpiau7qo9r">
+      <w:hyperlink w:history="1" r:id="rId0hkocbllwf0tbomec-iiy">
         <w:r>
           <w:rPr>
             <w:rFonts w:ascii="Simplified Arabic" w:cs="Simplified Arabic" w:eastAsia="Simplified Arabic" w:hAnsi="Simplified Arabic"/>
@@ -3049,7 +3049,7 @@
           <w:szCs w:val="28"/>
           <w:rtl/>
         </w:rPr>
-        <w:t xml:space="preserve">  ( https://search.mandumah.com/Record/167975 )</w:t>
+        <w:t xml:space="preserve"> ( https://search.mandumah.com/Record/167975 )</w:t>
       </w:r>
     </w:p>
     <w:p>
@@ -3186,7 +3186,7 @@
         </w:rPr>
         <w:t xml:space="preserve">رابط الدراسة: </w:t>
       </w:r>
-      <w:hyperlink w:history="1" r:id="rIdgvsmqiqible4v9_mcj6oh">
+      <w:hyperlink w:history="1" r:id="rIdzvvjzbxl3i13kajeku9pd">
         <w:r>
           <w:rPr>
             <w:rFonts w:ascii="Simplified Arabic" w:cs="Simplified Arabic" w:eastAsia="Simplified Arabic" w:hAnsi="Simplified Arabic"/>
@@ -3210,7 +3210,7 @@
           <w:szCs w:val="28"/>
           <w:rtl/>
         </w:rPr>
-        <w:t xml:space="preserve">  ( https://iifa-aifi.org/ar/journal )</w:t>
+        <w:t xml:space="preserve"> ( https://iifa-aifi.org/ar/journal )</w:t>
       </w:r>
     </w:p>
     <w:p>
@@ -3367,7 +3367,7 @@
         </w:rPr>
         <w:t xml:space="preserve">رابط الدراسة: </w:t>
       </w:r>
-      <w:hyperlink w:history="1" r:id="rIdmfw822wpduqgacto58d6k">
+      <w:hyperlink w:history="1" r:id="rIdqsp9as2ccypy9-044cvio">
         <w:r>
           <w:rPr>
             <w:rFonts w:ascii="Simplified Arabic" w:cs="Simplified Arabic" w:eastAsia="Simplified Arabic" w:hAnsi="Simplified Arabic"/>
@@ -3391,7 +3391,7 @@
           <w:szCs w:val="28"/>
           <w:rtl/>
         </w:rPr>
-        <w:t xml:space="preserve">  ( https://www.cambridge.org/core/services/aop-cambridge-core/content/view/F891733330C5E4ADCB8C5BB0235E271F )</w:t>
+        <w:t xml:space="preserve"> ( https://www.cambridge.org/core/services/aop-cambridge-core/content/view/F891733330C5E4ADCB8C5BB0235E271F )</w:t>
       </w:r>
     </w:p>
     <w:p>
@@ -3528,7 +3528,7 @@
         </w:rPr>
         <w:t xml:space="preserve">رابط الدراسة: </w:t>
       </w:r>
-      <w:hyperlink w:history="1" r:id="rId_ebgr8sy2cemobevkzid2">
+      <w:hyperlink w:history="1" r:id="rId0fgtts53bztl1uwt9uglh">
         <w:r>
           <w:rPr>
             <w:rFonts w:ascii="Simplified Arabic" w:cs="Simplified Arabic" w:eastAsia="Simplified Arabic" w:hAnsi="Simplified Arabic"/>
@@ -3552,7 +3552,7 @@
           <w:szCs w:val="28"/>
           <w:rtl/>
         </w:rPr>
-        <w:t xml:space="preserve">  ( https://doi.org/10.3389/fneur.2024.1491263 )</w:t>
+        <w:t xml:space="preserve"> ( https://doi.org/10.3389/fneur.2024.1491263 )</w:t>
       </w:r>
     </w:p>
     <w:p>
@@ -3689,7 +3689,7 @@
         </w:rPr>
         <w:t xml:space="preserve">رابط الدراسة: </w:t>
       </w:r>
-      <w:hyperlink w:history="1" r:id="rIdfedw5dsaijh8vtiuvnbco">
+      <w:hyperlink w:history="1" r:id="rIdgn9luqaz0x21cs-8ad7ga">
         <w:r>
           <w:rPr>
             <w:rFonts w:ascii="Simplified Arabic" w:cs="Simplified Arabic" w:eastAsia="Simplified Arabic" w:hAnsi="Simplified Arabic"/>
@@ -3713,7 +3713,7 @@
           <w:szCs w:val="28"/>
           <w:rtl/>
         </w:rPr>
-        <w:t xml:space="preserve">  ( https://www.walshmedicalmedia.com/open-access/clinical-death-a-reversible-state-of-cardiac-arrest-119791.html )</w:t>
+        <w:t xml:space="preserve"> ( https://www.walshmedicalmedia.com/open-access/clinical-death-a-reversible-state-of-cardiac-arrest-119791.html )</w:t>
       </w:r>
     </w:p>
     <w:p>
@@ -3850,7 +3850,7 @@
         </w:rPr>
         <w:t xml:space="preserve">رابط الدراسة: </w:t>
       </w:r>
-      <w:hyperlink w:history="1" r:id="rIduib3jj7bak3xkkws09ab7">
+      <w:hyperlink w:history="1" r:id="rIdjl-mwhmofor6onbipgg56">
         <w:r>
           <w:rPr>
             <w:rFonts w:ascii="Simplified Arabic" w:cs="Simplified Arabic" w:eastAsia="Simplified Arabic" w:hAnsi="Simplified Arabic"/>
@@ -3874,7 +3874,7 @@
           <w:szCs w:val="28"/>
           <w:rtl/>
         </w:rPr>
-        <w:t xml:space="preserve">  ( https://doi.org/10.1212/WNL.0000000000207740 )</w:t>
+        <w:t xml:space="preserve"> ( https://doi.org/10.1212/WNL.0000000000207740 )</w:t>
       </w:r>
     </w:p>
     <w:p>
@@ -4011,7 +4011,7 @@
         </w:rPr>
         <w:t xml:space="preserve">رابط الدراسة: </w:t>
       </w:r>
-      <w:hyperlink w:history="1" r:id="rIdb1jsxfkmi3da2bmg12n5f">
+      <w:hyperlink w:history="1" r:id="rIdxcmdkz_wcmux9lvmtxn-v">
         <w:r>
           <w:rPr>
             <w:rFonts w:ascii="Simplified Arabic" w:cs="Simplified Arabic" w:eastAsia="Simplified Arabic" w:hAnsi="Simplified Arabic"/>
@@ -4035,7 +4035,7 @@
           <w:szCs w:val="28"/>
           <w:rtl/>
         </w:rPr>
-        <w:t xml:space="preserve">  ( https://doi.org/10.1001/jama.2020.11586 )</w:t>
+        <w:t xml:space="preserve"> ( https://doi.org/10.1001/jama.2020.11586 )</w:t>
       </w:r>
     </w:p>
     <w:p>
@@ -4172,7 +4172,7 @@
         </w:rPr>
         <w:t xml:space="preserve">رابط الدراسة: </w:t>
       </w:r>
-      <w:hyperlink w:history="1" r:id="rIdprbfnvrvoe_ha_o17k7tj">
+      <w:hyperlink w:history="1" r:id="rId620rqlqhuhpl_y18reued">
         <w:r>
           <w:rPr>
             <w:rFonts w:ascii="Simplified Arabic" w:cs="Simplified Arabic" w:eastAsia="Simplified Arabic" w:hAnsi="Simplified Arabic"/>
@@ -4196,7 +4196,7 @@
           <w:szCs w:val="28"/>
           <w:rtl/>
         </w:rPr>
-        <w:t xml:space="preserve">  ( https://doi.org/10.1038/nrneurol.2017.172 )</w:t>
+        <w:t xml:space="preserve"> ( https://doi.org/10.1038/nrneurol.2017.172 )</w:t>
       </w:r>
     </w:p>
     <w:p>
@@ -4333,7 +4333,7 @@
         </w:rPr>
         <w:t xml:space="preserve">رابط الدراسة: </w:t>
       </w:r>
-      <w:hyperlink w:history="1" r:id="rIduryjcec2t-cg8ly7ennyz">
+      <w:hyperlink w:history="1" r:id="rIdkxw_zl-trvs_p8vkbdozp">
         <w:r>
           <w:rPr>
             <w:rFonts w:ascii="Simplified Arabic" w:cs="Simplified Arabic" w:eastAsia="Simplified Arabic" w:hAnsi="Simplified Arabic"/>
@@ -4357,7 +4357,7 @@
           <w:szCs w:val="28"/>
           <w:rtl/>
         </w:rPr>
-        <w:t xml:space="preserve">  ( https://pmc.ncbi.nlm.nih.gov/articles/PMC7595719/ )</w:t>
+        <w:t xml:space="preserve"> ( https://pmc.ncbi.nlm.nih.gov/articles/PMC7595719/ )</w:t>
       </w:r>
     </w:p>
     <w:p>
@@ -4494,7 +4494,7 @@
         </w:rPr>
         <w:t xml:space="preserve">رابط الدراسة: </w:t>
       </w:r>
-      <w:hyperlink w:history="1" r:id="rIdb9hdrpblyguo9kmgugx2a">
+      <w:hyperlink w:history="1" r:id="rIdnbjov2khhh7ka5gz9eua3">
         <w:r>
           <w:rPr>
             <w:rFonts w:ascii="Simplified Arabic" w:cs="Simplified Arabic" w:eastAsia="Simplified Arabic" w:hAnsi="Simplified Arabic"/>
@@ -4518,7 +4518,7 @@
           <w:szCs w:val="28"/>
           <w:rtl/>
         </w:rPr>
-        <w:t xml:space="preserve">  ( https://doi.org/10.1212/WNL.0000000000006750 )</w:t>
+        <w:t xml:space="preserve"> ( https://doi.org/10.1212/WNL.0000000000006750 )</w:t>
       </w:r>
     </w:p>
     <w:p>
@@ -4655,7 +4655,7 @@
         </w:rPr>
         <w:t xml:space="preserve">رابط الدراسة: </w:t>
       </w:r>
-      <w:hyperlink w:history="1" r:id="rIdb434f1cg9e_leipctnziv">
+      <w:hyperlink w:history="1" r:id="rIdu6bl5fszwl_fyaqixg5ec">
         <w:r>
           <w:rPr>
             <w:rFonts w:ascii="Simplified Arabic" w:cs="Simplified Arabic" w:eastAsia="Simplified Arabic" w:hAnsi="Simplified Arabic"/>
@@ -4679,7 +4679,7 @@
           <w:szCs w:val="28"/>
           <w:rtl/>
         </w:rPr>
-        <w:t xml:space="preserve">  ( https://doi.org/10.2147/MB.S70369 )</w:t>
+        <w:t xml:space="preserve"> ( https://doi.org/10.2147/MB.S70369 )</w:t>
       </w:r>
     </w:p>
     <w:p>
@@ -4816,7 +4816,7 @@
         </w:rPr>
         <w:t xml:space="preserve">رابط الدراسة: </w:t>
       </w:r>
-      <w:hyperlink w:history="1" r:id="rIdsfdu3i8siim1szxbcnlz_">
+      <w:hyperlink w:history="1" r:id="rIdrxacua9x-lrvfcxdclrzu">
         <w:r>
           <w:rPr>
             <w:rFonts w:ascii="Simplified Arabic" w:cs="Simplified Arabic" w:eastAsia="Simplified Arabic" w:hAnsi="Simplified Arabic"/>
@@ -4840,7 +4840,7 @@
           <w:szCs w:val="28"/>
           <w:rtl/>
         </w:rPr>
-        <w:t xml:space="preserve">  ( http://jama.jamanetwork.com/article.aspx?articleid=1818922 )</w:t>
+        <w:t xml:space="preserve"> ( http://jama.jamanetwork.com/article.aspx?articleid=1818922 )</w:t>
       </w:r>
     </w:p>
     <w:p>

</xml_diff>

<commit_message>
Restore full both-sides justification for body and footnotes
Co-Authored-By: Claude Fable 5 <noreply@anthropic.com>
Claude-Session: https://claude.ai/code/session_01ESPDZE2KAqBUfzv5HLVvG7
</commit_message>
<xml_diff>
--- a/seminar/Abd Almahdi Dahla 212684527 - Research Plan.docx
+++ b/seminar/Abd Almahdi Dahla 212684527 - Research Plan.docx
@@ -350,7 +350,7 @@
       <w:pPr>
         <w:bidi/>
         <w:spacing w:after="60" w:line="360"/>
-        <w:jc w:val="lowKashida"/>
+        <w:jc w:val="both"/>
       </w:pPr>
       <w:r>
         <w:rPr>
@@ -368,7 +368,7 @@
       <w:pPr>
         <w:bidi/>
         <w:spacing w:after="60" w:line="360"/>
-        <w:jc w:val="lowKashida"/>
+        <w:jc w:val="both"/>
       </w:pPr>
       <w:r>
         <w:rPr>
@@ -420,7 +420,7 @@
       <w:pPr>
         <w:bidi/>
         <w:spacing w:after="60" w:line="360"/>
-        <w:jc w:val="lowKashida"/>
+        <w:jc w:val="both"/>
       </w:pPr>
       <w:r>
         <w:rPr>
@@ -455,7 +455,7 @@
       <w:pPr>
         <w:bidi/>
         <w:spacing w:after="60" w:line="360"/>
-        <w:jc w:val="lowKashida"/>
+        <w:jc w:val="both"/>
       </w:pPr>
       <w:r>
         <w:rPr>
@@ -473,7 +473,7 @@
       <w:pPr>
         <w:bidi/>
         <w:spacing w:after="60" w:line="360"/>
-        <w:jc w:val="lowKashida"/>
+        <w:jc w:val="both"/>
       </w:pPr>
       <w:r>
         <w:rPr>
@@ -512,7 +512,7 @@
       <w:pPr>
         <w:bidi/>
         <w:spacing w:after="60" w:line="360"/>
-        <w:jc w:val="lowKashida"/>
+        <w:jc w:val="both"/>
       </w:pPr>
       <w:r>
         <w:rPr>
@@ -550,7 +550,7 @@
       <w:pPr>
         <w:bidi/>
         <w:spacing w:after="60" w:line="360"/>
-        <w:jc w:val="lowKashida"/>
+        <w:jc w:val="both"/>
       </w:pPr>
       <w:r>
         <w:rPr>
@@ -568,7 +568,7 @@
       <w:pPr>
         <w:bidi/>
         <w:spacing w:after="60" w:line="360"/>
-        <w:jc w:val="lowKashida"/>
+        <w:jc w:val="both"/>
       </w:pPr>
       <w:r>
         <w:rPr>
@@ -610,7 +610,7 @@
         </w:rPr>
         <w:t xml:space="preserve">رابط الدراسة: </w:t>
       </w:r>
-      <w:hyperlink w:history="1" r:id="rId5kxqguj_yxb52ku0yz9r8">
+      <w:hyperlink w:history="1" r:id="rIdanr0o7gxjyszpau240rve">
         <w:r>
           <w:rPr>
             <w:rFonts w:ascii="Simplified Arabic" w:cs="Simplified Arabic" w:eastAsia="Simplified Arabic" w:hAnsi="Simplified Arabic"/>
@@ -641,7 +641,7 @@
       <w:pPr>
         <w:bidi/>
         <w:spacing w:after="60" w:line="360"/>
-        <w:jc w:val="lowKashida"/>
+        <w:jc w:val="both"/>
       </w:pPr>
       <w:r>
         <w:rPr>
@@ -681,7 +681,7 @@
       <w:pPr>
         <w:bidi/>
         <w:spacing w:after="60" w:line="360"/>
-        <w:jc w:val="lowKashida"/>
+        <w:jc w:val="both"/>
       </w:pPr>
       <w:r>
         <w:rPr>
@@ -711,7 +711,7 @@
       <w:pPr>
         <w:bidi/>
         <w:spacing w:after="60" w:line="360"/>
-        <w:jc w:val="lowKashida"/>
+        <w:jc w:val="both"/>
       </w:pPr>
       <w:r>
         <w:rPr>
@@ -729,7 +729,7 @@
       <w:pPr>
         <w:bidi/>
         <w:spacing w:after="60" w:line="360"/>
-        <w:jc w:val="lowKashida"/>
+        <w:jc w:val="both"/>
       </w:pPr>
       <w:r>
         <w:rPr>
@@ -771,7 +771,7 @@
         </w:rPr>
         <w:t xml:space="preserve">رابط الدراسة: </w:t>
       </w:r>
-      <w:hyperlink w:history="1" r:id="rId3vvq0xvthc5tkxsv9uzjt">
+      <w:hyperlink w:history="1" r:id="rIdauyus5axfi71dby62mpgh">
         <w:r>
           <w:rPr>
             <w:rFonts w:ascii="Simplified Arabic" w:cs="Simplified Arabic" w:eastAsia="Simplified Arabic" w:hAnsi="Simplified Arabic"/>
@@ -802,7 +802,7 @@
       <w:pPr>
         <w:bidi/>
         <w:spacing w:after="60" w:line="360"/>
-        <w:jc w:val="lowKashida"/>
+        <w:jc w:val="both"/>
       </w:pPr>
       <w:r>
         <w:rPr>
@@ -842,7 +842,7 @@
       <w:pPr>
         <w:bidi/>
         <w:spacing w:after="60" w:line="360"/>
-        <w:jc w:val="lowKashida"/>
+        <w:jc w:val="both"/>
       </w:pPr>
       <w:r>
         <w:rPr>
@@ -872,7 +872,7 @@
       <w:pPr>
         <w:bidi/>
         <w:spacing w:after="60" w:line="360"/>
-        <w:jc w:val="lowKashida"/>
+        <w:jc w:val="both"/>
       </w:pPr>
       <w:r>
         <w:rPr>
@@ -890,7 +890,7 @@
       <w:pPr>
         <w:bidi/>
         <w:spacing w:after="60" w:line="360"/>
-        <w:jc w:val="lowKashida"/>
+        <w:jc w:val="both"/>
       </w:pPr>
       <w:r>
         <w:rPr>
@@ -932,7 +932,7 @@
         </w:rPr>
         <w:t xml:space="preserve">رابط الدراسة: </w:t>
       </w:r>
-      <w:hyperlink w:history="1" r:id="rIdwhih9dyciysf0t8okcgpy">
+      <w:hyperlink w:history="1" r:id="rIdvnf0tmqeqgxqqhbdb0uip">
         <w:r>
           <w:rPr>
             <w:rFonts w:ascii="Simplified Arabic" w:cs="Simplified Arabic" w:eastAsia="Simplified Arabic" w:hAnsi="Simplified Arabic"/>
@@ -963,7 +963,7 @@
       <w:pPr>
         <w:bidi/>
         <w:spacing w:after="60" w:line="360"/>
-        <w:jc w:val="lowKashida"/>
+        <w:jc w:val="both"/>
       </w:pPr>
       <w:r>
         <w:rPr>
@@ -1003,7 +1003,7 @@
       <w:pPr>
         <w:bidi/>
         <w:spacing w:after="60" w:line="360"/>
-        <w:jc w:val="lowKashida"/>
+        <w:jc w:val="both"/>
       </w:pPr>
       <w:r>
         <w:rPr>
@@ -1033,7 +1033,7 @@
       <w:pPr>
         <w:bidi/>
         <w:spacing w:after="60" w:line="360"/>
-        <w:jc w:val="lowKashida"/>
+        <w:jc w:val="both"/>
       </w:pPr>
       <w:r>
         <w:rPr>
@@ -1051,7 +1051,7 @@
       <w:pPr>
         <w:bidi/>
         <w:spacing w:after="60" w:line="360"/>
-        <w:jc w:val="lowKashida"/>
+        <w:jc w:val="both"/>
       </w:pPr>
       <w:r>
         <w:rPr>
@@ -1093,7 +1093,7 @@
         </w:rPr>
         <w:t xml:space="preserve">رابط الدراسة: </w:t>
       </w:r>
-      <w:hyperlink w:history="1" r:id="rIdkqyo_tuh8uccsg__l8m3b">
+      <w:hyperlink w:history="1" r:id="rId88lm2njzvyssydbutagqj">
         <w:r>
           <w:rPr>
             <w:rFonts w:ascii="Simplified Arabic" w:cs="Simplified Arabic" w:eastAsia="Simplified Arabic" w:hAnsi="Simplified Arabic"/>
@@ -1124,7 +1124,7 @@
       <w:pPr>
         <w:bidi/>
         <w:spacing w:after="60" w:line="360"/>
-        <w:jc w:val="lowKashida"/>
+        <w:jc w:val="both"/>
       </w:pPr>
       <w:r>
         <w:rPr>
@@ -1164,7 +1164,7 @@
       <w:pPr>
         <w:bidi/>
         <w:spacing w:after="60" w:line="360"/>
-        <w:jc w:val="lowKashida"/>
+        <w:jc w:val="both"/>
       </w:pPr>
       <w:r>
         <w:rPr>
@@ -1194,7 +1194,7 @@
       <w:pPr>
         <w:bidi/>
         <w:spacing w:after="60" w:line="360"/>
-        <w:jc w:val="lowKashida"/>
+        <w:jc w:val="both"/>
       </w:pPr>
       <w:r>
         <w:rPr>
@@ -1212,7 +1212,7 @@
       <w:pPr>
         <w:bidi/>
         <w:spacing w:after="60" w:line="360"/>
-        <w:jc w:val="lowKashida"/>
+        <w:jc w:val="both"/>
       </w:pPr>
       <w:r>
         <w:rPr>
@@ -1254,7 +1254,7 @@
         </w:rPr>
         <w:t xml:space="preserve">رابط الدراسة: </w:t>
       </w:r>
-      <w:hyperlink w:history="1" r:id="rIdcx3sxexgmpg5langqqglp">
+      <w:hyperlink w:history="1" r:id="rId_skctul_nyue_kqwuhmab">
         <w:r>
           <w:rPr>
             <w:rFonts w:ascii="Simplified Arabic" w:cs="Simplified Arabic" w:eastAsia="Simplified Arabic" w:hAnsi="Simplified Arabic"/>
@@ -1285,7 +1285,7 @@
       <w:pPr>
         <w:bidi/>
         <w:spacing w:after="60" w:line="360"/>
-        <w:jc w:val="lowKashida"/>
+        <w:jc w:val="both"/>
       </w:pPr>
       <w:r>
         <w:rPr>
@@ -1325,7 +1325,7 @@
       <w:pPr>
         <w:bidi/>
         <w:spacing w:after="60" w:line="360"/>
-        <w:jc w:val="lowKashida"/>
+        <w:jc w:val="both"/>
       </w:pPr>
       <w:r>
         <w:rPr>
@@ -1355,7 +1355,7 @@
       <w:pPr>
         <w:bidi/>
         <w:spacing w:after="60" w:line="360"/>
-        <w:jc w:val="lowKashida"/>
+        <w:jc w:val="both"/>
       </w:pPr>
       <w:r>
         <w:rPr>
@@ -1373,7 +1373,7 @@
       <w:pPr>
         <w:bidi/>
         <w:spacing w:after="60" w:line="360"/>
-        <w:jc w:val="lowKashida"/>
+        <w:jc w:val="both"/>
       </w:pPr>
       <w:r>
         <w:rPr>
@@ -1415,7 +1415,7 @@
         </w:rPr>
         <w:t xml:space="preserve">رابط الدراسة: </w:t>
       </w:r>
-      <w:hyperlink w:history="1" r:id="rIdoo7gitt6c-ed1hua05lgc">
+      <w:hyperlink w:history="1" r:id="rIdoql5wpprwxa1qhezkq9bc">
         <w:r>
           <w:rPr>
             <w:rFonts w:ascii="Simplified Arabic" w:cs="Simplified Arabic" w:eastAsia="Simplified Arabic" w:hAnsi="Simplified Arabic"/>
@@ -1446,7 +1446,7 @@
       <w:pPr>
         <w:bidi/>
         <w:spacing w:after="60" w:line="360"/>
-        <w:jc w:val="lowKashida"/>
+        <w:jc w:val="both"/>
       </w:pPr>
       <w:r>
         <w:rPr>
@@ -1486,7 +1486,7 @@
       <w:pPr>
         <w:bidi/>
         <w:spacing w:after="60" w:line="360"/>
-        <w:jc w:val="lowKashida"/>
+        <w:jc w:val="both"/>
       </w:pPr>
       <w:r>
         <w:rPr>
@@ -1516,7 +1516,7 @@
       <w:pPr>
         <w:bidi/>
         <w:spacing w:after="60" w:line="360"/>
-        <w:jc w:val="lowKashida"/>
+        <w:jc w:val="both"/>
       </w:pPr>
       <w:r>
         <w:rPr>
@@ -1534,7 +1534,7 @@
       <w:pPr>
         <w:bidi/>
         <w:spacing w:after="60" w:line="360"/>
-        <w:jc w:val="lowKashida"/>
+        <w:jc w:val="both"/>
       </w:pPr>
       <w:r>
         <w:rPr>
@@ -1576,7 +1576,7 @@
         </w:rPr>
         <w:t xml:space="preserve">رابط الدراسة: </w:t>
       </w:r>
-      <w:hyperlink w:history="1" r:id="rIdxynaoib4jkjsn3hois_no">
+      <w:hyperlink w:history="1" r:id="rIdwzqq0kxsomerovviqdrqw">
         <w:r>
           <w:rPr>
             <w:rFonts w:ascii="Simplified Arabic" w:cs="Simplified Arabic" w:eastAsia="Simplified Arabic" w:hAnsi="Simplified Arabic"/>
@@ -1607,7 +1607,7 @@
       <w:pPr>
         <w:bidi/>
         <w:spacing w:after="60" w:line="360"/>
-        <w:jc w:val="lowKashida"/>
+        <w:jc w:val="both"/>
       </w:pPr>
       <w:r>
         <w:rPr>
@@ -1647,7 +1647,7 @@
       <w:pPr>
         <w:bidi/>
         <w:spacing w:after="60" w:line="360"/>
-        <w:jc w:val="lowKashida"/>
+        <w:jc w:val="both"/>
       </w:pPr>
       <w:r>
         <w:rPr>
@@ -1677,7 +1677,7 @@
       <w:pPr>
         <w:bidi/>
         <w:spacing w:after="60" w:line="360"/>
-        <w:jc w:val="lowKashida"/>
+        <w:jc w:val="both"/>
       </w:pPr>
       <w:r>
         <w:rPr>
@@ -1695,7 +1695,7 @@
       <w:pPr>
         <w:bidi/>
         <w:spacing w:after="60" w:line="360"/>
-        <w:jc w:val="lowKashida"/>
+        <w:jc w:val="both"/>
       </w:pPr>
       <w:r>
         <w:rPr>
@@ -1737,7 +1737,7 @@
         </w:rPr>
         <w:t xml:space="preserve">رابط الدراسة: </w:t>
       </w:r>
-      <w:hyperlink w:history="1" r:id="rIdf8kyu0wt3i2xsfbyrhn1i">
+      <w:hyperlink w:history="1" r:id="rIdpjejwyifbvmfsvvxwkjsd">
         <w:r>
           <w:rPr>
             <w:rFonts w:ascii="Simplified Arabic" w:cs="Simplified Arabic" w:eastAsia="Simplified Arabic" w:hAnsi="Simplified Arabic"/>
@@ -1768,7 +1768,7 @@
       <w:pPr>
         <w:bidi/>
         <w:spacing w:after="60" w:line="360"/>
-        <w:jc w:val="lowKashida"/>
+        <w:jc w:val="both"/>
       </w:pPr>
       <w:r>
         <w:rPr>
@@ -1808,7 +1808,7 @@
       <w:pPr>
         <w:bidi/>
         <w:spacing w:after="60" w:line="360"/>
-        <w:jc w:val="lowKashida"/>
+        <w:jc w:val="both"/>
       </w:pPr>
       <w:r>
         <w:rPr>
@@ -1838,7 +1838,7 @@
       <w:pPr>
         <w:bidi/>
         <w:spacing w:after="60" w:line="360"/>
-        <w:jc w:val="lowKashida"/>
+        <w:jc w:val="both"/>
       </w:pPr>
       <w:r>
         <w:rPr>
@@ -1856,7 +1856,7 @@
       <w:pPr>
         <w:bidi/>
         <w:spacing w:after="60" w:line="360"/>
-        <w:jc w:val="lowKashida"/>
+        <w:jc w:val="both"/>
       </w:pPr>
       <w:r>
         <w:rPr>
@@ -1898,7 +1898,7 @@
         </w:rPr>
         <w:t xml:space="preserve">رابط الدراسة: </w:t>
       </w:r>
-      <w:hyperlink w:history="1" r:id="rIdyz9iccbu2mpzufmnz47zy">
+      <w:hyperlink w:history="1" r:id="rIdgiv3b9pgcn41prs8mvt-z">
         <w:r>
           <w:rPr>
             <w:rFonts w:ascii="Simplified Arabic" w:cs="Simplified Arabic" w:eastAsia="Simplified Arabic" w:hAnsi="Simplified Arabic"/>
@@ -1929,7 +1929,7 @@
       <w:pPr>
         <w:bidi/>
         <w:spacing w:after="60" w:line="360"/>
-        <w:jc w:val="lowKashida"/>
+        <w:jc w:val="both"/>
       </w:pPr>
       <w:r>
         <w:rPr>
@@ -1969,7 +1969,7 @@
       <w:pPr>
         <w:bidi/>
         <w:spacing w:after="60" w:line="360"/>
-        <w:jc w:val="lowKashida"/>
+        <w:jc w:val="both"/>
       </w:pPr>
       <w:r>
         <w:rPr>
@@ -1999,7 +1999,7 @@
       <w:pPr>
         <w:bidi/>
         <w:spacing w:after="60" w:line="360"/>
-        <w:jc w:val="lowKashida"/>
+        <w:jc w:val="both"/>
       </w:pPr>
       <w:r>
         <w:rPr>
@@ -2017,7 +2017,7 @@
       <w:pPr>
         <w:bidi/>
         <w:spacing w:after="60" w:line="360"/>
-        <w:jc w:val="lowKashida"/>
+        <w:jc w:val="both"/>
       </w:pPr>
       <w:r>
         <w:rPr>
@@ -2059,7 +2059,7 @@
         </w:rPr>
         <w:t xml:space="preserve">رابط الدراسة: </w:t>
       </w:r>
-      <w:hyperlink w:history="1" r:id="rIdz66x_dayemvrwyvf5lf4f">
+      <w:hyperlink w:history="1" r:id="rIdttnfcafuz7fh1lhurxvzn">
         <w:r>
           <w:rPr>
             <w:rFonts w:ascii="Simplified Arabic" w:cs="Simplified Arabic" w:eastAsia="Simplified Arabic" w:hAnsi="Simplified Arabic"/>
@@ -2090,7 +2090,7 @@
       <w:pPr>
         <w:bidi/>
         <w:spacing w:after="60" w:line="360"/>
-        <w:jc w:val="lowKashida"/>
+        <w:jc w:val="both"/>
       </w:pPr>
       <w:r>
         <w:rPr>
@@ -2130,7 +2130,7 @@
       <w:pPr>
         <w:bidi/>
         <w:spacing w:after="60" w:line="360"/>
-        <w:jc w:val="lowKashida"/>
+        <w:jc w:val="both"/>
       </w:pPr>
       <w:r>
         <w:rPr>
@@ -2160,7 +2160,7 @@
       <w:pPr>
         <w:bidi/>
         <w:spacing w:after="60" w:line="360"/>
-        <w:jc w:val="lowKashida"/>
+        <w:jc w:val="both"/>
       </w:pPr>
       <w:r>
         <w:rPr>
@@ -2178,7 +2178,7 @@
       <w:pPr>
         <w:bidi/>
         <w:spacing w:after="60" w:line="360"/>
-        <w:jc w:val="lowKashida"/>
+        <w:jc w:val="both"/>
       </w:pPr>
       <w:r>
         <w:rPr>
@@ -2220,7 +2220,7 @@
         </w:rPr>
         <w:t xml:space="preserve">رابط الدراسة: </w:t>
       </w:r>
-      <w:hyperlink w:history="1" r:id="rIdppz65ufj1c8n31gq9p2bh">
+      <w:hyperlink w:history="1" r:id="rIdqsawe_p5rct5yjb9ki0r1">
         <w:r>
           <w:rPr>
             <w:rFonts w:ascii="Simplified Arabic" w:cs="Simplified Arabic" w:eastAsia="Simplified Arabic" w:hAnsi="Simplified Arabic"/>
@@ -2251,7 +2251,7 @@
       <w:pPr>
         <w:bidi/>
         <w:spacing w:after="60" w:line="360"/>
-        <w:jc w:val="lowKashida"/>
+        <w:jc w:val="both"/>
       </w:pPr>
       <w:r>
         <w:rPr>
@@ -2291,7 +2291,7 @@
       <w:pPr>
         <w:bidi/>
         <w:spacing w:after="60" w:line="360"/>
-        <w:jc w:val="lowKashida"/>
+        <w:jc w:val="both"/>
       </w:pPr>
       <w:r>
         <w:rPr>
@@ -2321,7 +2321,7 @@
       <w:pPr>
         <w:bidi/>
         <w:spacing w:after="60" w:line="360"/>
-        <w:jc w:val="lowKashida"/>
+        <w:jc w:val="both"/>
       </w:pPr>
       <w:r>
         <w:rPr>
@@ -2339,7 +2339,7 @@
       <w:pPr>
         <w:bidi/>
         <w:spacing w:after="60" w:line="360"/>
-        <w:jc w:val="lowKashida"/>
+        <w:jc w:val="both"/>
       </w:pPr>
       <w:r>
         <w:rPr>
@@ -2381,7 +2381,7 @@
         </w:rPr>
         <w:t xml:space="preserve">رابط الدراسة: </w:t>
       </w:r>
-      <w:hyperlink w:history="1" r:id="rIdg1ewoxjky2yonzyntn3xj">
+      <w:hyperlink w:history="1" r:id="rIdcbita6liqvflkepaxemdz">
         <w:r>
           <w:rPr>
             <w:rFonts w:ascii="Simplified Arabic" w:cs="Simplified Arabic" w:eastAsia="Simplified Arabic" w:hAnsi="Simplified Arabic"/>
@@ -2412,7 +2412,7 @@
       <w:pPr>
         <w:bidi/>
         <w:spacing w:after="60" w:line="360"/>
-        <w:jc w:val="lowKashida"/>
+        <w:jc w:val="both"/>
       </w:pPr>
       <w:r>
         <w:rPr>
@@ -2452,7 +2452,7 @@
       <w:pPr>
         <w:bidi/>
         <w:spacing w:after="60" w:line="360"/>
-        <w:jc w:val="lowKashida"/>
+        <w:jc w:val="both"/>
       </w:pPr>
       <w:r>
         <w:rPr>
@@ -2482,7 +2482,7 @@
       <w:pPr>
         <w:bidi/>
         <w:spacing w:after="60" w:line="360"/>
-        <w:jc w:val="lowKashida"/>
+        <w:jc w:val="both"/>
       </w:pPr>
       <w:r>
         <w:rPr>
@@ -2500,7 +2500,7 @@
       <w:pPr>
         <w:bidi/>
         <w:spacing w:after="60" w:line="360"/>
-        <w:jc w:val="lowKashida"/>
+        <w:jc w:val="both"/>
       </w:pPr>
       <w:r>
         <w:rPr>
@@ -2542,7 +2542,7 @@
         </w:rPr>
         <w:t xml:space="preserve">رابط الدراسة: </w:t>
       </w:r>
-      <w:hyperlink w:history="1" r:id="rIdl5c_-hayewovhbcqykzuj">
+      <w:hyperlink w:history="1" r:id="rIduobx8p7bpfbeqmduoi6z3">
         <w:r>
           <w:rPr>
             <w:rFonts w:ascii="Simplified Arabic" w:cs="Simplified Arabic" w:eastAsia="Simplified Arabic" w:hAnsi="Simplified Arabic"/>
@@ -2573,7 +2573,7 @@
       <w:pPr>
         <w:bidi/>
         <w:spacing w:after="60" w:line="360"/>
-        <w:jc w:val="lowKashida"/>
+        <w:jc w:val="both"/>
       </w:pPr>
       <w:r>
         <w:rPr>
@@ -2613,7 +2613,7 @@
       <w:pPr>
         <w:bidi/>
         <w:spacing w:after="60" w:line="360"/>
-        <w:jc w:val="lowKashida"/>
+        <w:jc w:val="both"/>
       </w:pPr>
       <w:r>
         <w:rPr>
@@ -2643,7 +2643,7 @@
       <w:pPr>
         <w:bidi/>
         <w:spacing w:after="60" w:line="360"/>
-        <w:jc w:val="lowKashida"/>
+        <w:jc w:val="both"/>
       </w:pPr>
       <w:r>
         <w:rPr>
@@ -2661,7 +2661,7 @@
       <w:pPr>
         <w:bidi/>
         <w:spacing w:after="60" w:line="360"/>
-        <w:jc w:val="lowKashida"/>
+        <w:jc w:val="both"/>
       </w:pPr>
       <w:r>
         <w:rPr>
@@ -2703,7 +2703,7 @@
         </w:rPr>
         <w:t xml:space="preserve">رابط الدراسة: </w:t>
       </w:r>
-      <w:hyperlink w:history="1" r:id="rIdia30zpfoqwkwonokvn51w">
+      <w:hyperlink w:history="1" r:id="rIdtezfy-bqkyqkog0uankkn">
         <w:r>
           <w:rPr>
             <w:rFonts w:ascii="Simplified Arabic" w:cs="Simplified Arabic" w:eastAsia="Simplified Arabic" w:hAnsi="Simplified Arabic"/>
@@ -2734,7 +2734,7 @@
       <w:pPr>
         <w:bidi/>
         <w:spacing w:after="60" w:line="360"/>
-        <w:jc w:val="lowKashida"/>
+        <w:jc w:val="both"/>
       </w:pPr>
       <w:r>
         <w:rPr>
@@ -2774,7 +2774,7 @@
       <w:pPr>
         <w:bidi/>
         <w:spacing w:after="60" w:line="360"/>
-        <w:jc w:val="lowKashida"/>
+        <w:jc w:val="both"/>
       </w:pPr>
       <w:r>
         <w:rPr>
@@ -2804,7 +2804,7 @@
       <w:pPr>
         <w:bidi/>
         <w:spacing w:after="60" w:line="360"/>
-        <w:jc w:val="lowKashida"/>
+        <w:jc w:val="both"/>
       </w:pPr>
       <w:r>
         <w:rPr>
@@ -2822,7 +2822,7 @@
       <w:pPr>
         <w:bidi/>
         <w:spacing w:after="60" w:line="360"/>
-        <w:jc w:val="lowKashida"/>
+        <w:jc w:val="both"/>
       </w:pPr>
       <w:r>
         <w:rPr>
@@ -2864,7 +2864,7 @@
         </w:rPr>
         <w:t xml:space="preserve">رابط الدراسة: </w:t>
       </w:r>
-      <w:hyperlink w:history="1" r:id="rIdzvjxgiyaxhygr0hh4wq2t">
+      <w:hyperlink w:history="1" r:id="rIdqzguxjtwfuqanxahe7abc">
         <w:r>
           <w:rPr>
             <w:rFonts w:ascii="Simplified Arabic" w:cs="Simplified Arabic" w:eastAsia="Simplified Arabic" w:hAnsi="Simplified Arabic"/>
@@ -2895,7 +2895,7 @@
       <w:pPr>
         <w:bidi/>
         <w:spacing w:after="60" w:line="360"/>
-        <w:jc w:val="lowKashida"/>
+        <w:jc w:val="both"/>
       </w:pPr>
       <w:r>
         <w:rPr>
@@ -2935,7 +2935,7 @@
       <w:pPr>
         <w:bidi/>
         <w:spacing w:after="60" w:line="360"/>
-        <w:jc w:val="lowKashida"/>
+        <w:jc w:val="both"/>
       </w:pPr>
       <w:r>
         <w:rPr>
@@ -2965,7 +2965,7 @@
       <w:pPr>
         <w:bidi/>
         <w:spacing w:after="60" w:line="360"/>
-        <w:jc w:val="lowKashida"/>
+        <w:jc w:val="both"/>
       </w:pPr>
       <w:r>
         <w:rPr>
@@ -2983,7 +2983,7 @@
       <w:pPr>
         <w:bidi/>
         <w:spacing w:after="60" w:line="360"/>
-        <w:jc w:val="lowKashida"/>
+        <w:jc w:val="both"/>
       </w:pPr>
       <w:r>
         <w:rPr>
@@ -3025,7 +3025,7 @@
         </w:rPr>
         <w:t xml:space="preserve">رابط الدراسة: </w:t>
       </w:r>
-      <w:hyperlink w:history="1" r:id="rId0hkocbllwf0tbomec-iiy">
+      <w:hyperlink w:history="1" r:id="rIdbrfyehvyaoli_kq0l6cn0">
         <w:r>
           <w:rPr>
             <w:rFonts w:ascii="Simplified Arabic" w:cs="Simplified Arabic" w:eastAsia="Simplified Arabic" w:hAnsi="Simplified Arabic"/>
@@ -3056,7 +3056,7 @@
       <w:pPr>
         <w:bidi/>
         <w:spacing w:after="60" w:line="360"/>
-        <w:jc w:val="lowKashida"/>
+        <w:jc w:val="both"/>
       </w:pPr>
       <w:r>
         <w:rPr>
@@ -3096,7 +3096,7 @@
       <w:pPr>
         <w:bidi/>
         <w:spacing w:after="60" w:line="360"/>
-        <w:jc w:val="lowKashida"/>
+        <w:jc w:val="both"/>
       </w:pPr>
       <w:r>
         <w:rPr>
@@ -3126,7 +3126,7 @@
       <w:pPr>
         <w:bidi/>
         <w:spacing w:after="60" w:line="360"/>
-        <w:jc w:val="lowKashida"/>
+        <w:jc w:val="both"/>
       </w:pPr>
       <w:r>
         <w:rPr>
@@ -3144,7 +3144,7 @@
       <w:pPr>
         <w:bidi/>
         <w:spacing w:after="60" w:line="360"/>
-        <w:jc w:val="lowKashida"/>
+        <w:jc w:val="both"/>
       </w:pPr>
       <w:r>
         <w:rPr>
@@ -3186,7 +3186,7 @@
         </w:rPr>
         <w:t xml:space="preserve">رابط الدراسة: </w:t>
       </w:r>
-      <w:hyperlink w:history="1" r:id="rIdzvvjzbxl3i13kajeku9pd">
+      <w:hyperlink w:history="1" r:id="rId77h9ukgqvrskyeusqkycd">
         <w:r>
           <w:rPr>
             <w:rFonts w:ascii="Simplified Arabic" w:cs="Simplified Arabic" w:eastAsia="Simplified Arabic" w:hAnsi="Simplified Arabic"/>
@@ -3217,7 +3217,7 @@
       <w:pPr>
         <w:bidi/>
         <w:spacing w:after="60" w:line="360"/>
-        <w:jc w:val="lowKashida"/>
+        <w:jc w:val="both"/>
       </w:pPr>
       <w:r>
         <w:rPr>
@@ -3257,7 +3257,7 @@
       <w:pPr>
         <w:bidi/>
         <w:spacing w:after="60" w:line="360"/>
-        <w:jc w:val="lowKashida"/>
+        <w:jc w:val="both"/>
       </w:pPr>
       <w:r>
         <w:rPr>
@@ -3307,7 +3307,7 @@
       <w:pPr>
         <w:bidi/>
         <w:spacing w:after="60" w:line="360"/>
-        <w:jc w:val="lowKashida"/>
+        <w:jc w:val="both"/>
       </w:pPr>
       <w:r>
         <w:rPr>
@@ -3325,7 +3325,7 @@
       <w:pPr>
         <w:bidi/>
         <w:spacing w:after="60" w:line="360"/>
-        <w:jc w:val="lowKashida"/>
+        <w:jc w:val="both"/>
       </w:pPr>
       <w:r>
         <w:rPr>
@@ -3367,7 +3367,7 @@
         </w:rPr>
         <w:t xml:space="preserve">رابط الدراسة: </w:t>
       </w:r>
-      <w:hyperlink w:history="1" r:id="rIdqsp9as2ccypy9-044cvio">
+      <w:hyperlink w:history="1" r:id="rId5shjhdd3_8emqempx6acc">
         <w:r>
           <w:rPr>
             <w:rFonts w:ascii="Simplified Arabic" w:cs="Simplified Arabic" w:eastAsia="Simplified Arabic" w:hAnsi="Simplified Arabic"/>
@@ -3398,7 +3398,7 @@
       <w:pPr>
         <w:bidi/>
         <w:spacing w:after="60" w:line="360"/>
-        <w:jc w:val="lowKashida"/>
+        <w:jc w:val="both"/>
       </w:pPr>
       <w:r>
         <w:rPr>
@@ -3438,7 +3438,7 @@
       <w:pPr>
         <w:bidi/>
         <w:spacing w:after="60" w:line="360"/>
-        <w:jc w:val="lowKashida"/>
+        <w:jc w:val="both"/>
       </w:pPr>
       <w:r>
         <w:rPr>
@@ -3468,7 +3468,7 @@
       <w:pPr>
         <w:bidi/>
         <w:spacing w:after="60" w:line="360"/>
-        <w:jc w:val="lowKashida"/>
+        <w:jc w:val="both"/>
       </w:pPr>
       <w:r>
         <w:rPr>
@@ -3486,7 +3486,7 @@
       <w:pPr>
         <w:bidi/>
         <w:spacing w:after="60" w:line="360"/>
-        <w:jc w:val="lowKashida"/>
+        <w:jc w:val="both"/>
       </w:pPr>
       <w:r>
         <w:rPr>
@@ -3528,7 +3528,7 @@
         </w:rPr>
         <w:t xml:space="preserve">رابط الدراسة: </w:t>
       </w:r>
-      <w:hyperlink w:history="1" r:id="rId0fgtts53bztl1uwt9uglh">
+      <w:hyperlink w:history="1" r:id="rIdzqdwjvi5slsqushbupgjg">
         <w:r>
           <w:rPr>
             <w:rFonts w:ascii="Simplified Arabic" w:cs="Simplified Arabic" w:eastAsia="Simplified Arabic" w:hAnsi="Simplified Arabic"/>
@@ -3559,7 +3559,7 @@
       <w:pPr>
         <w:bidi/>
         <w:spacing w:after="60" w:line="360"/>
-        <w:jc w:val="lowKashida"/>
+        <w:jc w:val="both"/>
       </w:pPr>
       <w:r>
         <w:rPr>
@@ -3599,7 +3599,7 @@
       <w:pPr>
         <w:bidi/>
         <w:spacing w:after="60" w:line="360"/>
-        <w:jc w:val="lowKashida"/>
+        <w:jc w:val="both"/>
       </w:pPr>
       <w:r>
         <w:rPr>
@@ -3629,7 +3629,7 @@
       <w:pPr>
         <w:bidi/>
         <w:spacing w:after="60" w:line="360"/>
-        <w:jc w:val="lowKashida"/>
+        <w:jc w:val="both"/>
       </w:pPr>
       <w:r>
         <w:rPr>
@@ -3647,7 +3647,7 @@
       <w:pPr>
         <w:bidi/>
         <w:spacing w:after="60" w:line="360"/>
-        <w:jc w:val="lowKashida"/>
+        <w:jc w:val="both"/>
       </w:pPr>
       <w:r>
         <w:rPr>
@@ -3689,7 +3689,7 @@
         </w:rPr>
         <w:t xml:space="preserve">رابط الدراسة: </w:t>
       </w:r>
-      <w:hyperlink w:history="1" r:id="rIdgn9luqaz0x21cs-8ad7ga">
+      <w:hyperlink w:history="1" r:id="rId6ycflu1buipsneks7lid6">
         <w:r>
           <w:rPr>
             <w:rFonts w:ascii="Simplified Arabic" w:cs="Simplified Arabic" w:eastAsia="Simplified Arabic" w:hAnsi="Simplified Arabic"/>
@@ -3720,7 +3720,7 @@
       <w:pPr>
         <w:bidi/>
         <w:spacing w:after="60" w:line="360"/>
-        <w:jc w:val="lowKashida"/>
+        <w:jc w:val="both"/>
       </w:pPr>
       <w:r>
         <w:rPr>
@@ -3760,7 +3760,7 @@
       <w:pPr>
         <w:bidi/>
         <w:spacing w:after="60" w:line="360"/>
-        <w:jc w:val="lowKashida"/>
+        <w:jc w:val="both"/>
       </w:pPr>
       <w:r>
         <w:rPr>
@@ -3790,7 +3790,7 @@
       <w:pPr>
         <w:bidi/>
         <w:spacing w:after="60" w:line="360"/>
-        <w:jc w:val="lowKashida"/>
+        <w:jc w:val="both"/>
       </w:pPr>
       <w:r>
         <w:rPr>
@@ -3808,7 +3808,7 @@
       <w:pPr>
         <w:bidi/>
         <w:spacing w:after="60" w:line="360"/>
-        <w:jc w:val="lowKashida"/>
+        <w:jc w:val="both"/>
       </w:pPr>
       <w:r>
         <w:rPr>
@@ -3850,7 +3850,7 @@
         </w:rPr>
         <w:t xml:space="preserve">رابط الدراسة: </w:t>
       </w:r>
-      <w:hyperlink w:history="1" r:id="rIdjl-mwhmofor6onbipgg56">
+      <w:hyperlink w:history="1" r:id="rId-nobissjr5fvrpo-e4cw_">
         <w:r>
           <w:rPr>
             <w:rFonts w:ascii="Simplified Arabic" w:cs="Simplified Arabic" w:eastAsia="Simplified Arabic" w:hAnsi="Simplified Arabic"/>
@@ -3881,7 +3881,7 @@
       <w:pPr>
         <w:bidi/>
         <w:spacing w:after="60" w:line="360"/>
-        <w:jc w:val="lowKashida"/>
+        <w:jc w:val="both"/>
       </w:pPr>
       <w:r>
         <w:rPr>
@@ -3921,7 +3921,7 @@
       <w:pPr>
         <w:bidi/>
         <w:spacing w:after="60" w:line="360"/>
-        <w:jc w:val="lowKashida"/>
+        <w:jc w:val="both"/>
       </w:pPr>
       <w:r>
         <w:rPr>
@@ -3951,7 +3951,7 @@
       <w:pPr>
         <w:bidi/>
         <w:spacing w:after="60" w:line="360"/>
-        <w:jc w:val="lowKashida"/>
+        <w:jc w:val="both"/>
       </w:pPr>
       <w:r>
         <w:rPr>
@@ -3969,7 +3969,7 @@
       <w:pPr>
         <w:bidi/>
         <w:spacing w:after="60" w:line="360"/>
-        <w:jc w:val="lowKashida"/>
+        <w:jc w:val="both"/>
       </w:pPr>
       <w:r>
         <w:rPr>
@@ -4011,7 +4011,7 @@
         </w:rPr>
         <w:t xml:space="preserve">رابط الدراسة: </w:t>
       </w:r>
-      <w:hyperlink w:history="1" r:id="rIdxcmdkz_wcmux9lvmtxn-v">
+      <w:hyperlink w:history="1" r:id="rId7hslvr9-ozsp3ie6iuglr">
         <w:r>
           <w:rPr>
             <w:rFonts w:ascii="Simplified Arabic" w:cs="Simplified Arabic" w:eastAsia="Simplified Arabic" w:hAnsi="Simplified Arabic"/>
@@ -4042,7 +4042,7 @@
       <w:pPr>
         <w:bidi/>
         <w:spacing w:after="60" w:line="360"/>
-        <w:jc w:val="lowKashida"/>
+        <w:jc w:val="both"/>
       </w:pPr>
       <w:r>
         <w:rPr>
@@ -4082,7 +4082,7 @@
       <w:pPr>
         <w:bidi/>
         <w:spacing w:after="60" w:line="360"/>
-        <w:jc w:val="lowKashida"/>
+        <w:jc w:val="both"/>
       </w:pPr>
       <w:r>
         <w:rPr>
@@ -4112,7 +4112,7 @@
       <w:pPr>
         <w:bidi/>
         <w:spacing w:after="60" w:line="360"/>
-        <w:jc w:val="lowKashida"/>
+        <w:jc w:val="both"/>
       </w:pPr>
       <w:r>
         <w:rPr>
@@ -4130,7 +4130,7 @@
       <w:pPr>
         <w:bidi/>
         <w:spacing w:after="60" w:line="360"/>
-        <w:jc w:val="lowKashida"/>
+        <w:jc w:val="both"/>
       </w:pPr>
       <w:r>
         <w:rPr>
@@ -4172,7 +4172,7 @@
         </w:rPr>
         <w:t xml:space="preserve">رابط الدراسة: </w:t>
       </w:r>
-      <w:hyperlink w:history="1" r:id="rId620rqlqhuhpl_y18reued">
+      <w:hyperlink w:history="1" r:id="rIdoovzpcm4utfm8jczec4d2">
         <w:r>
           <w:rPr>
             <w:rFonts w:ascii="Simplified Arabic" w:cs="Simplified Arabic" w:eastAsia="Simplified Arabic" w:hAnsi="Simplified Arabic"/>
@@ -4203,7 +4203,7 @@
       <w:pPr>
         <w:bidi/>
         <w:spacing w:after="60" w:line="360"/>
-        <w:jc w:val="lowKashida"/>
+        <w:jc w:val="both"/>
       </w:pPr>
       <w:r>
         <w:rPr>
@@ -4243,7 +4243,7 @@
       <w:pPr>
         <w:bidi/>
         <w:spacing w:after="60" w:line="360"/>
-        <w:jc w:val="lowKashida"/>
+        <w:jc w:val="both"/>
       </w:pPr>
       <w:r>
         <w:rPr>
@@ -4273,7 +4273,7 @@
       <w:pPr>
         <w:bidi/>
         <w:spacing w:after="60" w:line="360"/>
-        <w:jc w:val="lowKashida"/>
+        <w:jc w:val="both"/>
       </w:pPr>
       <w:r>
         <w:rPr>
@@ -4291,7 +4291,7 @@
       <w:pPr>
         <w:bidi/>
         <w:spacing w:after="60" w:line="360"/>
-        <w:jc w:val="lowKashida"/>
+        <w:jc w:val="both"/>
       </w:pPr>
       <w:r>
         <w:rPr>
@@ -4333,7 +4333,7 @@
         </w:rPr>
         <w:t xml:space="preserve">رابط الدراسة: </w:t>
       </w:r>
-      <w:hyperlink w:history="1" r:id="rIdkxw_zl-trvs_p8vkbdozp">
+      <w:hyperlink w:history="1" r:id="rIdzssagmsg3lkouo590vszj">
         <w:r>
           <w:rPr>
             <w:rFonts w:ascii="Simplified Arabic" w:cs="Simplified Arabic" w:eastAsia="Simplified Arabic" w:hAnsi="Simplified Arabic"/>
@@ -4364,7 +4364,7 @@
       <w:pPr>
         <w:bidi/>
         <w:spacing w:after="60" w:line="360"/>
-        <w:jc w:val="lowKashida"/>
+        <w:jc w:val="both"/>
       </w:pPr>
       <w:r>
         <w:rPr>
@@ -4404,7 +4404,7 @@
       <w:pPr>
         <w:bidi/>
         <w:spacing w:after="60" w:line="360"/>
-        <w:jc w:val="lowKashida"/>
+        <w:jc w:val="both"/>
       </w:pPr>
       <w:r>
         <w:rPr>
@@ -4434,7 +4434,7 @@
       <w:pPr>
         <w:bidi/>
         <w:spacing w:after="60" w:line="360"/>
-        <w:jc w:val="lowKashida"/>
+        <w:jc w:val="both"/>
       </w:pPr>
       <w:r>
         <w:rPr>
@@ -4452,7 +4452,7 @@
       <w:pPr>
         <w:bidi/>
         <w:spacing w:after="60" w:line="360"/>
-        <w:jc w:val="lowKashida"/>
+        <w:jc w:val="both"/>
       </w:pPr>
       <w:r>
         <w:rPr>
@@ -4494,7 +4494,7 @@
         </w:rPr>
         <w:t xml:space="preserve">رابط الدراسة: </w:t>
       </w:r>
-      <w:hyperlink w:history="1" r:id="rIdnbjov2khhh7ka5gz9eua3">
+      <w:hyperlink w:history="1" r:id="rIdeugejrghip_tzlnrmoo27">
         <w:r>
           <w:rPr>
             <w:rFonts w:ascii="Simplified Arabic" w:cs="Simplified Arabic" w:eastAsia="Simplified Arabic" w:hAnsi="Simplified Arabic"/>
@@ -4525,7 +4525,7 @@
       <w:pPr>
         <w:bidi/>
         <w:spacing w:after="60" w:line="360"/>
-        <w:jc w:val="lowKashida"/>
+        <w:jc w:val="both"/>
       </w:pPr>
       <w:r>
         <w:rPr>
@@ -4565,7 +4565,7 @@
       <w:pPr>
         <w:bidi/>
         <w:spacing w:after="60" w:line="360"/>
-        <w:jc w:val="lowKashida"/>
+        <w:jc w:val="both"/>
       </w:pPr>
       <w:r>
         <w:rPr>
@@ -4595,7 +4595,7 @@
       <w:pPr>
         <w:bidi/>
         <w:spacing w:after="60" w:line="360"/>
-        <w:jc w:val="lowKashida"/>
+        <w:jc w:val="both"/>
       </w:pPr>
       <w:r>
         <w:rPr>
@@ -4613,7 +4613,7 @@
       <w:pPr>
         <w:bidi/>
         <w:spacing w:after="60" w:line="360"/>
-        <w:jc w:val="lowKashida"/>
+        <w:jc w:val="both"/>
       </w:pPr>
       <w:r>
         <w:rPr>
@@ -4655,7 +4655,7 @@
         </w:rPr>
         <w:t xml:space="preserve">رابط الدراسة: </w:t>
       </w:r>
-      <w:hyperlink w:history="1" r:id="rIdu6bl5fszwl_fyaqixg5ec">
+      <w:hyperlink w:history="1" r:id="rIduinubkpsokyoivl1ucal_">
         <w:r>
           <w:rPr>
             <w:rFonts w:ascii="Simplified Arabic" w:cs="Simplified Arabic" w:eastAsia="Simplified Arabic" w:hAnsi="Simplified Arabic"/>
@@ -4686,7 +4686,7 @@
       <w:pPr>
         <w:bidi/>
         <w:spacing w:after="60" w:line="360"/>
-        <w:jc w:val="lowKashida"/>
+        <w:jc w:val="both"/>
       </w:pPr>
       <w:r>
         <w:rPr>
@@ -4726,7 +4726,7 @@
       <w:pPr>
         <w:bidi/>
         <w:spacing w:after="60" w:line="360"/>
-        <w:jc w:val="lowKashida"/>
+        <w:jc w:val="both"/>
       </w:pPr>
       <w:r>
         <w:rPr>
@@ -4756,7 +4756,7 @@
       <w:pPr>
         <w:bidi/>
         <w:spacing w:after="60" w:line="360"/>
-        <w:jc w:val="lowKashida"/>
+        <w:jc w:val="both"/>
       </w:pPr>
       <w:r>
         <w:rPr>
@@ -4774,7 +4774,7 @@
       <w:pPr>
         <w:bidi/>
         <w:spacing w:after="60" w:line="360"/>
-        <w:jc w:val="lowKashida"/>
+        <w:jc w:val="both"/>
       </w:pPr>
       <w:r>
         <w:rPr>
@@ -4816,7 +4816,7 @@
         </w:rPr>
         <w:t xml:space="preserve">رابط الدراسة: </w:t>
       </w:r>
-      <w:hyperlink w:history="1" r:id="rIdrxacua9x-lrvfcxdclrzu">
+      <w:hyperlink w:history="1" r:id="rIdvhiyptc7wpyflphtp7vak">
         <w:r>
           <w:rPr>
             <w:rFonts w:ascii="Simplified Arabic" w:cs="Simplified Arabic" w:eastAsia="Simplified Arabic" w:hAnsi="Simplified Arabic"/>
@@ -4847,7 +4847,7 @@
       <w:pPr>
         <w:bidi/>
         <w:spacing w:after="60" w:line="360"/>
-        <w:jc w:val="lowKashida"/>
+        <w:jc w:val="both"/>
       </w:pPr>
       <w:r>
         <w:rPr>
@@ -4887,7 +4887,7 @@
       <w:pPr>
         <w:bidi/>
         <w:spacing w:after="60" w:line="360"/>
-        <w:jc w:val="lowKashida"/>
+        <w:jc w:val="both"/>
       </w:pPr>
       <w:r>
         <w:rPr>
@@ -4938,7 +4938,7 @@
       <w:pPr>
         <w:bidi/>
         <w:spacing w:after="60" w:line="360"/>
-        <w:jc w:val="lowKashida"/>
+        <w:jc w:val="both"/>
       </w:pPr>
       <w:r>
         <w:rPr>
@@ -4967,7 +4967,7 @@
       <w:pPr>
         <w:bidi/>
         <w:spacing w:after="60" w:line="360"/>
-        <w:jc w:val="lowKashida"/>
+        <w:jc w:val="both"/>
       </w:pPr>
       <w:r>
         <w:rPr>
@@ -4996,7 +4996,7 @@
       <w:pPr>
         <w:bidi/>
         <w:spacing w:after="60" w:line="360"/>
-        <w:jc w:val="lowKashida"/>
+        <w:jc w:val="both"/>
       </w:pPr>
       <w:r>
         <w:rPr>
@@ -5025,7 +5025,7 @@
       <w:pPr>
         <w:bidi/>
         <w:spacing w:after="60" w:line="360"/>
-        <w:jc w:val="lowKashida"/>
+        <w:jc w:val="both"/>
       </w:pPr>
       <w:r>
         <w:rPr>
@@ -5054,7 +5054,7 @@
       <w:pPr>
         <w:bidi/>
         <w:spacing w:after="60" w:line="360"/>
-        <w:jc w:val="lowKashida"/>
+        <w:jc w:val="both"/>
       </w:pPr>
       <w:r>
         <w:rPr>
@@ -5104,7 +5104,7 @@
       <w:pPr>
         <w:bidi/>
         <w:spacing w:after="60" w:line="360"/>
-        <w:jc w:val="lowKashida"/>
+        <w:jc w:val="both"/>
       </w:pPr>
       <w:r>
         <w:rPr>
@@ -5133,7 +5133,7 @@
       <w:pPr>
         <w:bidi/>
         <w:spacing w:after="60" w:line="360"/>
-        <w:jc w:val="lowKashida"/>
+        <w:jc w:val="both"/>
       </w:pPr>
       <w:r>
         <w:rPr>
@@ -5162,7 +5162,7 @@
       <w:pPr>
         <w:bidi/>
         <w:spacing w:after="60" w:line="360"/>
-        <w:jc w:val="lowKashida"/>
+        <w:jc w:val="both"/>
       </w:pPr>
       <w:r>
         <w:rPr>
@@ -5191,7 +5191,7 @@
       <w:pPr>
         <w:bidi/>
         <w:spacing w:after="60" w:line="360"/>
-        <w:jc w:val="lowKashida"/>
+        <w:jc w:val="both"/>
       </w:pPr>
       <w:r>
         <w:rPr>
@@ -5220,7 +5220,7 @@
       <w:pPr>
         <w:bidi/>
         <w:spacing w:after="60" w:line="360"/>
-        <w:jc w:val="lowKashida"/>
+        <w:jc w:val="both"/>
       </w:pPr>
       <w:r>
         <w:rPr>
@@ -5270,7 +5270,7 @@
       <w:pPr>
         <w:bidi/>
         <w:spacing w:after="60" w:line="360"/>
-        <w:jc w:val="lowKashida"/>
+        <w:jc w:val="both"/>
       </w:pPr>
       <w:r>
         <w:rPr>
@@ -5308,7 +5308,7 @@
       <w:pPr>
         <w:bidi/>
         <w:spacing w:after="60" w:line="360"/>
-        <w:jc w:val="lowKashida"/>
+        <w:jc w:val="both"/>
       </w:pPr>
       <w:r>
         <w:rPr>
@@ -5337,7 +5337,7 @@
       <w:pPr>
         <w:bidi/>
         <w:spacing w:after="60" w:line="360"/>
-        <w:jc w:val="lowKashida"/>
+        <w:jc w:val="both"/>
       </w:pPr>
       <w:r>
         <w:rPr>
@@ -5366,7 +5366,7 @@
       <w:pPr>
         <w:bidi/>
         <w:spacing w:after="60" w:line="360"/>
-        <w:jc w:val="lowKashida"/>
+        <w:jc w:val="both"/>
       </w:pPr>
       <w:r>
         <w:rPr>
@@ -5395,7 +5395,7 @@
       <w:pPr>
         <w:bidi/>
         <w:spacing w:after="60" w:line="360"/>
-        <w:jc w:val="lowKashida"/>
+        <w:jc w:val="both"/>
       </w:pPr>
       <w:r>
         <w:rPr>
@@ -5424,7 +5424,7 @@
       <w:pPr>
         <w:bidi/>
         <w:spacing w:after="60" w:line="360"/>
-        <w:jc w:val="lowKashida"/>
+        <w:jc w:val="both"/>
       </w:pPr>
       <w:r>
         <w:rPr>
@@ -5453,7 +5453,7 @@
       <w:pPr>
         <w:bidi/>
         <w:spacing w:after="60" w:line="360"/>
-        <w:jc w:val="lowKashida"/>
+        <w:jc w:val="both"/>
       </w:pPr>
       <w:r>
         <w:rPr>
@@ -5503,7 +5503,7 @@
       <w:pPr>
         <w:bidi/>
         <w:spacing w:after="60" w:line="360"/>
-        <w:jc w:val="lowKashida"/>
+        <w:jc w:val="both"/>
       </w:pPr>
       <w:r>
         <w:rPr>
@@ -5562,7 +5562,7 @@
       <w:pPr>
         <w:bidi/>
         <w:spacing w:after="60" w:line="360"/>
-        <w:jc w:val="lowKashida"/>
+        <w:jc w:val="both"/>
       </w:pPr>
       <w:r>
         <w:rPr>
@@ -5580,7 +5580,7 @@
       <w:pPr>
         <w:bidi/>
         <w:spacing w:after="60" w:line="360"/>
-        <w:jc w:val="lowKashida"/>
+        <w:jc w:val="both"/>
       </w:pPr>
       <w:r>
         <w:rPr>
@@ -5620,7 +5620,7 @@
       <w:pPr>
         <w:bidi/>
         <w:spacing w:after="60" w:line="360"/>
-        <w:jc w:val="lowKashida"/>
+        <w:jc w:val="both"/>
       </w:pPr>
       <w:r>
         <w:rPr>
@@ -5660,7 +5660,7 @@
       <w:pPr>
         <w:bidi/>
         <w:spacing w:after="60" w:line="360"/>
-        <w:jc w:val="lowKashida"/>
+        <w:jc w:val="both"/>
       </w:pPr>
       <w:r>
         <w:rPr>
@@ -5700,7 +5700,7 @@
       <w:pPr>
         <w:bidi/>
         <w:spacing w:after="60" w:line="360"/>
-        <w:jc w:val="lowKashida"/>
+        <w:jc w:val="both"/>
       </w:pPr>
       <w:r>
         <w:rPr>
@@ -5740,7 +5740,7 @@
       <w:pPr>
         <w:bidi/>
         <w:spacing w:after="60" w:line="360"/>
-        <w:jc w:val="lowKashida"/>
+        <w:jc w:val="both"/>
       </w:pPr>
       <w:r>
         <w:rPr>
@@ -5780,7 +5780,7 @@
       <w:pPr>
         <w:bidi/>
         <w:spacing w:after="60" w:line="360"/>
-        <w:jc w:val="lowKashida"/>
+        <w:jc w:val="both"/>
       </w:pPr>
       <w:r>
         <w:rPr>
@@ -5820,7 +5820,7 @@
       <w:pPr>
         <w:bidi/>
         <w:spacing w:after="60" w:line="360"/>
-        <w:jc w:val="lowKashida"/>
+        <w:jc w:val="both"/>
       </w:pPr>
       <w:r>
         <w:rPr>
@@ -5860,7 +5860,7 @@
       <w:pPr>
         <w:bidi/>
         <w:spacing w:after="60" w:line="360"/>
-        <w:jc w:val="lowKashida"/>
+        <w:jc w:val="both"/>
       </w:pPr>
       <w:r>
         <w:rPr>
@@ -5878,7 +5878,7 @@
       <w:pPr>
         <w:bidi/>
         <w:spacing w:after="60" w:line="360"/>
-        <w:jc w:val="lowKashida"/>
+        <w:jc w:val="both"/>
       </w:pPr>
       <w:r>
         <w:rPr>
@@ -5918,7 +5918,7 @@
       <w:pPr>
         <w:bidi/>
         <w:spacing w:after="60" w:line="360"/>
-        <w:jc w:val="lowKashida"/>
+        <w:jc w:val="both"/>
       </w:pPr>
       <w:r>
         <w:rPr>
@@ -5958,7 +5958,7 @@
       <w:pPr>
         <w:bidi/>
         <w:spacing w:after="60" w:line="360"/>
-        <w:jc w:val="lowKashida"/>
+        <w:jc w:val="both"/>
       </w:pPr>
       <w:r>
         <w:rPr>
@@ -5998,7 +5998,7 @@
       <w:pPr>
         <w:bidi/>
         <w:spacing w:after="60" w:line="360"/>
-        <w:jc w:val="lowKashida"/>
+        <w:jc w:val="both"/>
       </w:pPr>
       <w:r>
         <w:rPr>
@@ -6038,7 +6038,7 @@
       <w:pPr>
         <w:bidi/>
         <w:spacing w:after="60" w:line="360"/>
-        <w:jc w:val="lowKashida"/>
+        <w:jc w:val="both"/>
       </w:pPr>
       <w:r>
         <w:rPr>
@@ -6078,7 +6078,7 @@
       <w:pPr>
         <w:bidi/>
         <w:spacing w:after="60" w:line="360"/>
-        <w:jc w:val="lowKashida"/>
+        <w:jc w:val="both"/>
       </w:pPr>
       <w:r>
         <w:rPr>
@@ -6118,7 +6118,7 @@
       <w:pPr>
         <w:bidi/>
         <w:spacing w:after="60" w:line="360"/>
-        <w:jc w:val="lowKashida"/>
+        <w:jc w:val="both"/>
       </w:pPr>
       <w:r>
         <w:rPr>
@@ -6158,7 +6158,7 @@
       <w:pPr>
         <w:bidi/>
         <w:spacing w:after="60" w:line="360"/>
-        <w:jc w:val="lowKashida"/>
+        <w:jc w:val="both"/>
       </w:pPr>
       <w:r>
         <w:rPr>
@@ -6218,7 +6218,7 @@
       <w:pPr>
         <w:bidi/>
         <w:spacing w:after="60" w:line="360"/>
-        <w:jc w:val="lowKashida"/>
+        <w:jc w:val="both"/>
       </w:pPr>
       <w:r>
         <w:rPr>
@@ -6236,7 +6236,7 @@
       <w:pPr>
         <w:bidi/>
         <w:spacing w:after="60" w:line="360"/>
-        <w:jc w:val="lowKashida"/>
+        <w:jc w:val="both"/>
       </w:pPr>
       <w:r>
         <w:rPr>
@@ -6276,7 +6276,7 @@
       <w:pPr>
         <w:bidi/>
         <w:spacing w:after="60" w:line="360"/>
-        <w:jc w:val="lowKashida"/>
+        <w:jc w:val="both"/>
       </w:pPr>
       <w:r>
         <w:rPr>
@@ -6316,7 +6316,7 @@
       <w:pPr>
         <w:bidi/>
         <w:spacing w:after="60" w:line="360"/>
-        <w:jc w:val="lowKashida"/>
+        <w:jc w:val="both"/>
       </w:pPr>
       <w:r>
         <w:rPr>
@@ -6356,7 +6356,7 @@
       <w:pPr>
         <w:bidi/>
         <w:spacing w:after="60" w:line="360"/>
-        <w:jc w:val="lowKashida"/>
+        <w:jc w:val="both"/>
       </w:pPr>
       <w:r>
         <w:rPr>
@@ -6374,7 +6374,7 @@
       <w:pPr>
         <w:bidi/>
         <w:spacing w:after="60" w:line="360"/>
-        <w:jc w:val="lowKashida"/>
+        <w:jc w:val="both"/>
       </w:pPr>
       <w:r>
         <w:rPr>
@@ -6414,7 +6414,7 @@
       <w:pPr>
         <w:bidi/>
         <w:spacing w:after="60" w:line="360"/>
-        <w:jc w:val="lowKashida"/>
+        <w:jc w:val="both"/>
       </w:pPr>
       <w:r>
         <w:rPr>
@@ -6454,7 +6454,7 @@
       <w:pPr>
         <w:bidi/>
         <w:spacing w:after="60" w:line="360"/>
-        <w:jc w:val="lowKashida"/>
+        <w:jc w:val="both"/>
       </w:pPr>
       <w:r>
         <w:rPr>
@@ -6514,7 +6514,7 @@
       <w:pPr>
         <w:bidi/>
         <w:spacing w:after="60" w:line="360"/>
-        <w:jc w:val="lowKashida"/>
+        <w:jc w:val="both"/>
       </w:pPr>
       <w:r>
         <w:rPr>
@@ -6554,7 +6554,7 @@
       <w:pPr>
         <w:bidi/>
         <w:spacing w:after="60" w:line="360"/>
-        <w:jc w:val="lowKashida"/>
+        <w:jc w:val="both"/>
       </w:pPr>
       <w:r>
         <w:rPr>
@@ -6594,7 +6594,7 @@
       <w:pPr>
         <w:bidi/>
         <w:spacing w:after="60" w:line="360"/>
-        <w:jc w:val="lowKashida"/>
+        <w:jc w:val="both"/>
       </w:pPr>
       <w:r>
         <w:rPr>
@@ -6634,7 +6634,7 @@
       <w:pPr>
         <w:bidi/>
         <w:spacing w:after="60" w:line="360"/>
-        <w:jc w:val="lowKashida"/>
+        <w:jc w:val="both"/>
       </w:pPr>
       <w:r>
         <w:rPr>
@@ -6674,7 +6674,7 @@
       <w:pPr>
         <w:bidi/>
         <w:spacing w:after="60" w:line="360"/>
-        <w:jc w:val="lowKashida"/>
+        <w:jc w:val="both"/>
       </w:pPr>
       <w:r>
         <w:rPr>
@@ -6734,7 +6734,7 @@
       <w:pPr>
         <w:bidi/>
         <w:spacing w:after="60" w:line="360"/>
-        <w:jc w:val="lowKashida"/>
+        <w:jc w:val="both"/>
       </w:pPr>
       <w:r>
         <w:rPr>
@@ -6752,7 +6752,7 @@
       <w:pPr>
         <w:bidi/>
         <w:spacing w:after="60" w:line="360"/>
-        <w:jc w:val="lowKashida"/>
+        <w:jc w:val="both"/>
       </w:pPr>
       <w:r>
         <w:rPr>
@@ -6792,7 +6792,7 @@
       <w:pPr>
         <w:bidi/>
         <w:spacing w:after="60" w:line="360"/>
-        <w:jc w:val="lowKashida"/>
+        <w:jc w:val="both"/>
       </w:pPr>
       <w:r>
         <w:rPr>
@@ -6832,7 +6832,7 @@
       <w:pPr>
         <w:bidi/>
         <w:spacing w:after="60" w:line="360"/>
-        <w:jc w:val="lowKashida"/>
+        <w:jc w:val="both"/>
       </w:pPr>
       <w:r>
         <w:rPr>
@@ -6872,7 +6872,7 @@
       <w:pPr>
         <w:bidi/>
         <w:spacing w:after="60" w:line="360"/>
-        <w:jc w:val="lowKashida"/>
+        <w:jc w:val="both"/>
       </w:pPr>
       <w:r>
         <w:rPr>
@@ -6912,7 +6912,7 @@
       <w:pPr>
         <w:bidi/>
         <w:spacing w:after="60" w:line="360"/>
-        <w:jc w:val="lowKashida"/>
+        <w:jc w:val="both"/>
       </w:pPr>
       <w:r>
         <w:rPr>
@@ -6930,7 +6930,7 @@
       <w:pPr>
         <w:bidi/>
         <w:spacing w:after="60" w:line="360"/>
-        <w:jc w:val="lowKashida"/>
+        <w:jc w:val="both"/>
       </w:pPr>
       <w:r>
         <w:rPr>
@@ -6970,7 +6970,7 @@
       <w:pPr>
         <w:bidi/>
         <w:spacing w:after="60" w:line="360"/>
-        <w:jc w:val="lowKashida"/>
+        <w:jc w:val="both"/>
       </w:pPr>
       <w:r>
         <w:rPr>
@@ -7010,7 +7010,7 @@
       <w:pPr>
         <w:bidi/>
         <w:spacing w:after="60" w:line="360"/>
-        <w:jc w:val="lowKashida"/>
+        <w:jc w:val="both"/>
       </w:pPr>
       <w:r>
         <w:rPr>
@@ -7050,7 +7050,7 @@
       <w:pPr>
         <w:bidi/>
         <w:spacing w:after="60" w:line="360"/>
-        <w:jc w:val="lowKashida"/>
+        <w:jc w:val="both"/>
       </w:pPr>
       <w:r>
         <w:rPr>
@@ -7090,7 +7090,7 @@
       <w:pPr>
         <w:bidi/>
         <w:spacing w:after="60" w:line="360"/>
-        <w:jc w:val="lowKashida"/>
+        <w:jc w:val="both"/>
       </w:pPr>
       <w:r>
         <w:rPr>
@@ -7108,7 +7108,7 @@
       <w:pPr>
         <w:bidi/>
         <w:spacing w:after="60" w:line="360"/>
-        <w:jc w:val="lowKashida"/>
+        <w:jc w:val="both"/>
       </w:pPr>
       <w:r>
         <w:rPr>
@@ -7148,7 +7148,7 @@
       <w:pPr>
         <w:bidi/>
         <w:spacing w:after="60" w:line="360"/>
-        <w:jc w:val="lowKashida"/>
+        <w:jc w:val="both"/>
       </w:pPr>
       <w:r>
         <w:rPr>
@@ -7188,7 +7188,7 @@
       <w:pPr>
         <w:bidi/>
         <w:spacing w:after="60" w:line="360"/>
-        <w:jc w:val="lowKashida"/>
+        <w:jc w:val="both"/>
       </w:pPr>
       <w:r>
         <w:rPr>
@@ -7228,7 +7228,7 @@
       <w:pPr>
         <w:bidi/>
         <w:spacing w:after="60" w:line="360"/>
-        <w:jc w:val="lowKashida"/>
+        <w:jc w:val="both"/>
       </w:pPr>
       <w:r>
         <w:rPr>
@@ -7268,7 +7268,7 @@
       <w:pPr>
         <w:bidi/>
         <w:spacing w:after="60" w:line="360"/>
-        <w:jc w:val="lowKashida"/>
+        <w:jc w:val="both"/>
       </w:pPr>
       <w:r>
         <w:rPr>
@@ -7286,7 +7286,7 @@
       <w:pPr>
         <w:bidi/>
         <w:spacing w:after="60" w:line="360"/>
-        <w:jc w:val="lowKashida"/>
+        <w:jc w:val="both"/>
       </w:pPr>
       <w:r>
         <w:rPr>
@@ -7326,7 +7326,7 @@
       <w:pPr>
         <w:bidi/>
         <w:spacing w:after="60" w:line="360"/>
-        <w:jc w:val="lowKashida"/>
+        <w:jc w:val="both"/>
       </w:pPr>
       <w:r>
         <w:rPr>
@@ -7366,7 +7366,7 @@
       <w:pPr>
         <w:bidi/>
         <w:spacing w:after="60" w:line="360"/>
-        <w:jc w:val="lowKashida"/>
+        <w:jc w:val="both"/>
       </w:pPr>
       <w:r>
         <w:rPr>
@@ -7406,7 +7406,7 @@
       <w:pPr>
         <w:bidi/>
         <w:spacing w:after="60" w:line="360"/>
-        <w:jc w:val="lowKashida"/>
+        <w:jc w:val="both"/>
       </w:pPr>
       <w:r>
         <w:rPr>
@@ -7466,7 +7466,7 @@
       <w:pPr>
         <w:bidi/>
         <w:spacing w:after="60" w:line="360"/>
-        <w:jc w:val="lowKashida"/>
+        <w:jc w:val="both"/>
       </w:pPr>
       <w:r>
         <w:rPr>
@@ -7484,7 +7484,7 @@
       <w:pPr>
         <w:bidi/>
         <w:spacing w:after="60" w:line="360"/>
-        <w:jc w:val="lowKashida"/>
+        <w:jc w:val="both"/>
       </w:pPr>
       <w:r>
         <w:rPr>
@@ -7524,7 +7524,7 @@
       <w:pPr>
         <w:bidi/>
         <w:spacing w:after="60" w:line="360"/>
-        <w:jc w:val="lowKashida"/>
+        <w:jc w:val="both"/>
       </w:pPr>
       <w:r>
         <w:rPr>
@@ -7564,7 +7564,7 @@
       <w:pPr>
         <w:bidi/>
         <w:spacing w:after="60" w:line="360"/>
-        <w:jc w:val="lowKashida"/>
+        <w:jc w:val="both"/>
       </w:pPr>
       <w:r>
         <w:rPr>
@@ -7604,7 +7604,7 @@
       <w:pPr>
         <w:bidi/>
         <w:spacing w:after="60" w:line="360"/>
-        <w:jc w:val="lowKashida"/>
+        <w:jc w:val="both"/>
       </w:pPr>
       <w:r>
         <w:rPr>
@@ -7644,7 +7644,7 @@
       <w:pPr>
         <w:bidi/>
         <w:spacing w:after="60" w:line="360"/>
-        <w:jc w:val="lowKashida"/>
+        <w:jc w:val="both"/>
       </w:pPr>
       <w:r>
         <w:rPr>
@@ -7662,7 +7662,7 @@
       <w:pPr>
         <w:bidi/>
         <w:spacing w:after="60" w:line="360"/>
-        <w:jc w:val="lowKashida"/>
+        <w:jc w:val="both"/>
       </w:pPr>
       <w:r>
         <w:rPr>
@@ -7702,7 +7702,7 @@
       <w:pPr>
         <w:bidi/>
         <w:spacing w:after="60" w:line="360"/>
-        <w:jc w:val="lowKashida"/>
+        <w:jc w:val="both"/>
       </w:pPr>
       <w:r>
         <w:rPr>
@@ -7742,7 +7742,7 @@
       <w:pPr>
         <w:bidi/>
         <w:spacing w:after="60" w:line="360"/>
-        <w:jc w:val="lowKashida"/>
+        <w:jc w:val="both"/>
       </w:pPr>
       <w:r>
         <w:rPr>
@@ -7802,7 +7802,7 @@
       <w:pPr>
         <w:bidi/>
         <w:spacing w:after="60" w:line="360"/>
-        <w:jc w:val="lowKashida"/>
+        <w:jc w:val="both"/>
       </w:pPr>
       <w:r>
         <w:rPr>
@@ -7831,7 +7831,7 @@
       <w:pPr>
         <w:bidi/>
         <w:spacing w:after="60" w:line="360"/>
-        <w:jc w:val="lowKashida"/>
+        <w:jc w:val="both"/>
       </w:pPr>
       <w:r>
         <w:rPr>
@@ -7860,7 +7860,7 @@
       <w:pPr>
         <w:bidi/>
         <w:spacing w:after="60" w:line="360"/>
-        <w:jc w:val="lowKashida"/>
+        <w:jc w:val="both"/>
       </w:pPr>
       <w:r>
         <w:rPr>
@@ -7909,7 +7909,7 @@
       <w:pPr>
         <w:bidi/>
         <w:spacing w:after="60" w:line="360"/>
-        <w:jc w:val="lowKashida"/>
+        <w:jc w:val="both"/>
       </w:pPr>
       <w:r>
         <w:rPr>
@@ -7938,7 +7938,7 @@
       <w:pPr>
         <w:bidi/>
         <w:spacing w:after="60" w:line="360"/>
-        <w:jc w:val="lowKashida"/>
+        <w:jc w:val="both"/>
       </w:pPr>
       <w:r>
         <w:rPr>
@@ -7967,7 +7967,7 @@
       <w:pPr>
         <w:bidi/>
         <w:spacing w:after="60" w:line="360"/>
-        <w:jc w:val="lowKashida"/>
+        <w:jc w:val="both"/>
       </w:pPr>
       <w:r>
         <w:rPr>
@@ -7996,7 +7996,7 @@
       <w:pPr>
         <w:bidi/>
         <w:spacing w:after="60" w:line="360"/>
-        <w:jc w:val="lowKashida"/>
+        <w:jc w:val="both"/>
       </w:pPr>
       <w:r>
         <w:rPr>
@@ -8025,7 +8025,7 @@
       <w:pPr>
         <w:bidi/>
         <w:spacing w:after="60" w:line="360"/>
-        <w:jc w:val="lowKashida"/>
+        <w:jc w:val="both"/>
       </w:pPr>
       <w:r>
         <w:rPr>
@@ -8075,7 +8075,7 @@
       <w:pPr>
         <w:bidi/>
         <w:spacing w:after="60" w:line="360"/>
-        <w:jc w:val="lowKashida"/>
+        <w:jc w:val="both"/>
       </w:pPr>
       <w:r>
         <w:rPr>
@@ -8133,7 +8133,7 @@
       <w:pPr>
         <w:bidi/>
         <w:spacing w:after="60" w:line="360"/>
-        <w:jc w:val="lowKashida"/>
+        <w:jc w:val="both"/>
       </w:pPr>
       <w:r>
         <w:rPr>
@@ -8162,7 +8162,7 @@
       <w:pPr>
         <w:bidi/>
         <w:spacing w:after="60" w:line="360"/>
-        <w:jc w:val="lowKashida"/>
+        <w:jc w:val="both"/>
       </w:pPr>
       <w:r>
         <w:rPr>
@@ -8191,7 +8191,7 @@
       <w:pPr>
         <w:bidi/>
         <w:spacing w:after="60" w:line="360"/>
-        <w:jc w:val="lowKashida"/>
+        <w:jc w:val="both"/>
       </w:pPr>
       <w:r>
         <w:rPr>
@@ -8220,7 +8220,7 @@
       <w:pPr>
         <w:bidi/>
         <w:spacing w:after="60" w:line="360"/>
-        <w:jc w:val="lowKashida"/>
+        <w:jc w:val="both"/>
       </w:pPr>
       <w:r>
         <w:rPr>
@@ -8249,7 +8249,7 @@
       <w:pPr>
         <w:bidi/>
         <w:spacing w:after="60" w:line="360"/>
-        <w:jc w:val="lowKashida"/>
+        <w:jc w:val="both"/>
       </w:pPr>
       <w:r>
         <w:rPr>
@@ -8298,7 +8298,7 @@
       <w:pPr>
         <w:bidi/>
         <w:spacing w:after="60" w:line="360"/>
-        <w:jc w:val="lowKashida"/>
+        <w:jc w:val="both"/>
       </w:pPr>
       <w:r>
         <w:rPr>
@@ -8327,7 +8327,7 @@
       <w:pPr>
         <w:bidi/>
         <w:spacing w:after="60" w:line="360"/>
-        <w:jc w:val="lowKashida"/>
+        <w:jc w:val="both"/>
       </w:pPr>
       <w:r>
         <w:rPr>
@@ -8356,7 +8356,7 @@
       <w:pPr>
         <w:bidi/>
         <w:spacing w:after="60" w:line="360"/>
-        <w:jc w:val="lowKashida"/>
+        <w:jc w:val="both"/>
       </w:pPr>
       <w:r>
         <w:rPr>
@@ -8385,7 +8385,7 @@
       <w:pPr>
         <w:bidi/>
         <w:spacing w:after="60" w:line="360"/>
-        <w:jc w:val="lowKashida"/>
+        <w:jc w:val="both"/>
       </w:pPr>
       <w:r>
         <w:rPr>
@@ -8414,7 +8414,7 @@
       <w:pPr>
         <w:bidi/>
         <w:spacing w:after="60" w:line="360"/>
-        <w:jc w:val="lowKashida"/>
+        <w:jc w:val="both"/>
       </w:pPr>
       <w:r>
         <w:rPr>
@@ -8463,7 +8463,7 @@
       <w:pPr>
         <w:bidi/>
         <w:spacing w:after="60" w:line="360"/>
-        <w:jc w:val="lowKashida"/>
+        <w:jc w:val="both"/>
       </w:pPr>
       <w:r>
         <w:rPr>
@@ -8481,7 +8481,7 @@
       <w:pPr>
         <w:bidi/>
         <w:spacing w:after="60" w:line="360"/>
-        <w:jc w:val="lowKashida"/>
+        <w:jc w:val="both"/>
       </w:pPr>
       <w:r>
         <w:rPr>
@@ -8510,7 +8510,7 @@
       <w:pPr>
         <w:bidi/>
         <w:spacing w:after="60" w:line="360"/>
-        <w:jc w:val="lowKashida"/>
+        <w:jc w:val="both"/>
       </w:pPr>
       <w:r>
         <w:rPr>
@@ -8539,7 +8539,7 @@
       <w:pPr>
         <w:bidi/>
         <w:spacing w:after="60" w:line="360"/>
-        <w:jc w:val="lowKashida"/>
+        <w:jc w:val="both"/>
       </w:pPr>
       <w:r>
         <w:rPr>
@@ -8568,7 +8568,7 @@
       <w:pPr>
         <w:bidi/>
         <w:spacing w:after="60" w:line="360"/>
-        <w:jc w:val="lowKashida"/>
+        <w:jc w:val="both"/>
       </w:pPr>
       <w:r>
         <w:rPr>
@@ -8586,7 +8586,7 @@
       <w:pPr>
         <w:bidi/>
         <w:spacing w:after="60" w:line="360"/>
-        <w:jc w:val="lowKashida"/>
+        <w:jc w:val="both"/>
       </w:pPr>
       <w:r>
         <w:rPr>
@@ -8615,7 +8615,7 @@
       <w:pPr>
         <w:bidi/>
         <w:spacing w:after="60" w:line="360"/>
-        <w:jc w:val="lowKashida"/>
+        <w:jc w:val="both"/>
       </w:pPr>
       <w:r>
         <w:rPr>
@@ -8644,7 +8644,7 @@
       <w:pPr>
         <w:bidi/>
         <w:spacing w:after="60" w:line="360"/>
-        <w:jc w:val="lowKashida"/>
+        <w:jc w:val="both"/>
       </w:pPr>
       <w:r>
         <w:rPr>
@@ -8673,7 +8673,7 @@
       <w:pPr>
         <w:bidi/>
         <w:spacing w:after="60" w:line="360"/>
-        <w:jc w:val="lowKashida"/>
+        <w:jc w:val="both"/>
       </w:pPr>
       <w:r>
         <w:rPr>
@@ -8691,7 +8691,7 @@
       <w:pPr>
         <w:bidi/>
         <w:spacing w:after="60" w:line="360"/>
-        <w:jc w:val="lowKashida"/>
+        <w:jc w:val="both"/>
       </w:pPr>
       <w:r>
         <w:rPr>
@@ -8720,7 +8720,7 @@
       <w:pPr>
         <w:bidi/>
         <w:spacing w:after="60" w:line="360"/>
-        <w:jc w:val="lowKashida"/>
+        <w:jc w:val="both"/>
       </w:pPr>
       <w:r>
         <w:rPr>
@@ -8749,7 +8749,7 @@
       <w:pPr>
         <w:bidi/>
         <w:spacing w:after="60" w:line="360"/>
-        <w:jc w:val="lowKashida"/>
+        <w:jc w:val="both"/>
       </w:pPr>
       <w:r>
         <w:rPr>
@@ -8778,7 +8778,7 @@
       <w:pPr>
         <w:bidi/>
         <w:spacing w:after="60" w:line="360"/>
-        <w:jc w:val="lowKashida"/>
+        <w:jc w:val="both"/>
       </w:pPr>
       <w:r>
         <w:rPr>
@@ -8796,7 +8796,7 @@
       <w:pPr>
         <w:bidi/>
         <w:spacing w:after="60" w:line="360"/>
-        <w:jc w:val="lowKashida"/>
+        <w:jc w:val="both"/>
       </w:pPr>
       <w:r>
         <w:rPr>
@@ -8825,7 +8825,7 @@
       <w:pPr>
         <w:bidi/>
         <w:spacing w:after="60" w:line="360"/>
-        <w:jc w:val="lowKashida"/>
+        <w:jc w:val="both"/>
       </w:pPr>
       <w:r>
         <w:rPr>
@@ -8854,7 +8854,7 @@
       <w:pPr>
         <w:bidi/>
         <w:spacing w:after="60" w:line="360"/>
-        <w:jc w:val="lowKashida"/>
+        <w:jc w:val="both"/>
       </w:pPr>
       <w:r>
         <w:rPr>
@@ -8903,7 +8903,7 @@
       <w:pPr>
         <w:bidi/>
         <w:spacing w:after="60" w:line="360"/>
-        <w:jc w:val="lowKashida"/>
+        <w:jc w:val="both"/>
       </w:pPr>
       <w:r>
         <w:rPr>
@@ -8932,7 +8932,7 @@
       <w:pPr>
         <w:bidi/>
         <w:spacing w:after="60" w:line="360"/>
-        <w:jc w:val="lowKashida"/>
+        <w:jc w:val="both"/>
       </w:pPr>
       <w:r>
         <w:rPr>
@@ -8961,7 +8961,7 @@
       <w:pPr>
         <w:bidi/>
         <w:spacing w:after="60" w:line="360"/>
-        <w:jc w:val="lowKashida"/>
+        <w:jc w:val="both"/>
       </w:pPr>
       <w:r>
         <w:rPr>
@@ -8990,7 +8990,7 @@
       <w:pPr>
         <w:bidi/>
         <w:spacing w:after="60" w:line="360"/>
-        <w:jc w:val="lowKashida"/>
+        <w:jc w:val="both"/>
       </w:pPr>
       <w:r>
         <w:rPr>
@@ -9019,7 +9019,7 @@
       <w:pPr>
         <w:bidi/>
         <w:spacing w:after="60" w:line="360"/>
-        <w:jc w:val="lowKashida"/>
+        <w:jc w:val="both"/>
       </w:pPr>
       <w:r>
         <w:rPr>
@@ -9048,7 +9048,7 @@
       <w:pPr>
         <w:bidi/>
         <w:spacing w:after="60" w:line="360"/>
-        <w:jc w:val="lowKashida"/>
+        <w:jc w:val="both"/>
       </w:pPr>
       <w:r>
         <w:rPr>
@@ -9097,7 +9097,7 @@
       <w:pPr>
         <w:bidi/>
         <w:spacing w:after="60" w:line="360"/>
-        <w:jc w:val="lowKashida"/>
+        <w:jc w:val="both"/>
       </w:pPr>
       <w:r>
         <w:rPr>
@@ -9126,7 +9126,7 @@
       <w:pPr>
         <w:bidi/>
         <w:spacing w:after="60" w:line="360"/>
-        <w:jc w:val="lowKashida"/>
+        <w:jc w:val="both"/>
       </w:pPr>
       <w:r>
         <w:rPr>
@@ -9155,7 +9155,7 @@
       <w:pPr>
         <w:bidi/>
         <w:spacing w:after="60" w:line="360"/>
-        <w:jc w:val="lowKashida"/>
+        <w:jc w:val="both"/>
       </w:pPr>
       <w:r>
         <w:rPr>
@@ -9213,7 +9213,7 @@
       <w:pPr>
         <w:bidi/>
         <w:spacing w:after="60" w:line="360"/>
-        <w:jc w:val="lowKashida"/>
+        <w:jc w:val="both"/>
       </w:pPr>
       <w:r>
         <w:rPr>
@@ -9271,7 +9271,7 @@
       <w:pPr>
         <w:bidi/>
         <w:spacing w:after="60" w:line="360"/>
-        <w:jc w:val="lowKashida"/>
+        <w:jc w:val="both"/>
       </w:pPr>
       <w:r>
         <w:rPr>
@@ -9300,7 +9300,7 @@
       <w:pPr>
         <w:bidi/>
         <w:spacing w:after="60" w:line="360"/>
-        <w:jc w:val="lowKashida"/>
+        <w:jc w:val="both"/>
       </w:pPr>
       <w:r>
         <w:rPr>
@@ -9329,7 +9329,7 @@
       <w:pPr>
         <w:bidi/>
         <w:spacing w:after="60" w:line="360"/>
-        <w:jc w:val="lowKashida"/>
+        <w:jc w:val="both"/>
       </w:pPr>
       <w:r>
         <w:rPr>
@@ -9358,7 +9358,7 @@
       <w:pPr>
         <w:bidi/>
         <w:spacing w:after="60" w:line="360"/>
-        <w:jc w:val="lowKashida"/>
+        <w:jc w:val="both"/>
       </w:pPr>
       <w:r>
         <w:rPr>
@@ -9425,7 +9425,7 @@
       <w:pPr>
         <w:bidi/>
         <w:spacing w:after="60" w:line="360"/>
-        <w:jc w:val="lowKashida"/>
+        <w:jc w:val="both"/>
       </w:pPr>
       <w:r>
         <w:rPr>
@@ -9454,7 +9454,7 @@
       <w:pPr>
         <w:bidi/>
         <w:spacing w:after="60" w:line="360"/>
-        <w:jc w:val="lowKashida"/>
+        <w:jc w:val="both"/>
       </w:pPr>
       <w:r>
         <w:rPr>
@@ -9483,7 +9483,7 @@
       <w:pPr>
         <w:bidi/>
         <w:spacing w:after="60" w:line="360"/>
-        <w:jc w:val="lowKashida"/>
+        <w:jc w:val="both"/>
       </w:pPr>
       <w:r>
         <w:rPr>
@@ -9619,7 +9619,7 @@
       <w:pPr>
         <w:bidi/>
         <w:spacing w:after="60" w:line="360"/>
-        <w:jc w:val="lowKashida"/>
+        <w:jc w:val="both"/>
       </w:pPr>
       <w:r>
         <w:rPr>
@@ -9648,7 +9648,7 @@
       <w:pPr>
         <w:bidi/>
         <w:spacing w:after="60" w:line="360"/>
-        <w:jc w:val="lowKashida"/>
+        <w:jc w:val="both"/>
       </w:pPr>
       <w:r>
         <w:rPr>
@@ -9677,7 +9677,7 @@
       <w:pPr>
         <w:bidi/>
         <w:spacing w:after="60" w:line="360"/>
-        <w:jc w:val="lowKashida"/>
+        <w:jc w:val="both"/>
       </w:pPr>
       <w:r>
         <w:rPr>
@@ -9706,7 +9706,7 @@
       <w:pPr>
         <w:bidi/>
         <w:spacing w:after="60" w:line="360"/>
-        <w:jc w:val="lowKashida"/>
+        <w:jc w:val="both"/>
       </w:pPr>
       <w:r>
         <w:rPr>
@@ -9735,7 +9735,7 @@
       <w:pPr>
         <w:bidi/>
         <w:spacing w:after="60" w:line="360"/>
-        <w:jc w:val="lowKashida"/>
+        <w:jc w:val="both"/>
       </w:pPr>
       <w:r>
         <w:rPr>
@@ -9764,7 +9764,7 @@
       <w:pPr>
         <w:bidi/>
         <w:spacing w:after="60" w:line="360"/>
-        <w:jc w:val="lowKashida"/>
+        <w:jc w:val="both"/>
       </w:pPr>
       <w:r>
         <w:rPr>
@@ -9793,7 +9793,7 @@
       <w:pPr>
         <w:bidi/>
         <w:spacing w:after="60" w:line="360"/>
-        <w:jc w:val="lowKashida"/>
+        <w:jc w:val="both"/>
       </w:pPr>
       <w:r>
         <w:rPr>
@@ -9930,6 +9930,7 @@
       <w:pPr>
         <w:bidi/>
         <w:spacing w:line="240"/>
+        <w:jc w:val="both"/>
       </w:pPr>
       <w:r>
         <w:rPr>
@@ -9953,6 +9954,7 @@
       <w:pPr>
         <w:bidi/>
         <w:spacing w:line="240"/>
+        <w:jc w:val="both"/>
       </w:pPr>
       <w:r>
         <w:rPr>
@@ -9976,6 +9978,7 @@
       <w:pPr>
         <w:bidi/>
         <w:spacing w:line="240"/>
+        <w:jc w:val="both"/>
       </w:pPr>
       <w:r>
         <w:rPr>

</xml_diff>

<commit_message>
Fill submission date 30/08/2026 across cover, declaration and forms
Co-Authored-By: Claude Fable 5 <noreply@anthropic.com>
Claude-Session: https://claude.ai/code/session_01ESPDZE2KAqBUfzv5HLVvG7
</commit_message>
<xml_diff>
--- a/seminar/Abd Almahdi Dahla 212684527 - Research Plan.docx
+++ b/seminar/Abd Almahdi Dahla 212684527 - Research Plan.docx
@@ -322,7 +322,7 @@
           <w:szCs w:val="26"/>
           <w:rtl/>
         </w:rPr>
-        <w:t xml:space="preserve">تاريخ التّسليم: __\__\2026م</w:t>
+        <w:t xml:space="preserve">تاريخ التّسليم: 30\08\2026م</w:t>
       </w:r>
     </w:p>
     <w:p>
@@ -610,7 +610,7 @@
         </w:rPr>
         <w:t xml:space="preserve">رابط الدراسة: </w:t>
       </w:r>
-      <w:hyperlink w:history="1" r:id="rId0vmwposjqczo4sctkzryv">
+      <w:hyperlink w:history="1" r:id="rIdhfano4whyvrnxvaupezel">
         <w:r>
           <w:rPr>
             <w:rFonts w:ascii="Simplified Arabic" w:cs="Simplified Arabic" w:eastAsia="Simplified Arabic" w:hAnsi="Simplified Arabic"/>
@@ -771,7 +771,7 @@
         </w:rPr>
         <w:t xml:space="preserve">رابط الدراسة: </w:t>
       </w:r>
-      <w:hyperlink w:history="1" r:id="rIdbkirxnckwhgp9w_luogsx">
+      <w:hyperlink w:history="1" r:id="rId4v2ylmoueuohmkureybup">
         <w:r>
           <w:rPr>
             <w:rFonts w:ascii="Simplified Arabic" w:cs="Simplified Arabic" w:eastAsia="Simplified Arabic" w:hAnsi="Simplified Arabic"/>
@@ -932,7 +932,7 @@
         </w:rPr>
         <w:t xml:space="preserve">رابط الدراسة: </w:t>
       </w:r>
-      <w:hyperlink w:history="1" r:id="rIdqmxxezd0kiufuuxxg9zpi">
+      <w:hyperlink w:history="1" r:id="rIdqxiqzzielqnfkvjmas0_t">
         <w:r>
           <w:rPr>
             <w:rFonts w:ascii="Simplified Arabic" w:cs="Simplified Arabic" w:eastAsia="Simplified Arabic" w:hAnsi="Simplified Arabic"/>
@@ -1093,7 +1093,7 @@
         </w:rPr>
         <w:t xml:space="preserve">رابط الدراسة: </w:t>
       </w:r>
-      <w:hyperlink w:history="1" r:id="rIdxldpjowzntuo4zdl3nsps">
+      <w:hyperlink w:history="1" r:id="rIdqhstnnjydvr-lx3vxpzed">
         <w:r>
           <w:rPr>
             <w:rFonts w:ascii="Simplified Arabic" w:cs="Simplified Arabic" w:eastAsia="Simplified Arabic" w:hAnsi="Simplified Arabic"/>
@@ -1254,7 +1254,7 @@
         </w:rPr>
         <w:t xml:space="preserve">رابط الدراسة: </w:t>
       </w:r>
-      <w:hyperlink w:history="1" r:id="rIdpiwfp68xgtxkmvqwpykuo">
+      <w:hyperlink w:history="1" r:id="rIdukcs5r1mnmruilxklm0yj">
         <w:r>
           <w:rPr>
             <w:rFonts w:ascii="Simplified Arabic" w:cs="Simplified Arabic" w:eastAsia="Simplified Arabic" w:hAnsi="Simplified Arabic"/>
@@ -1415,7 +1415,7 @@
         </w:rPr>
         <w:t xml:space="preserve">رابط الدراسة: </w:t>
       </w:r>
-      <w:hyperlink w:history="1" r:id="rIdbxpsyvcijmaxja1cweng2">
+      <w:hyperlink w:history="1" r:id="rIdgfxoys4mayjyxuxnw7jqb">
         <w:r>
           <w:rPr>
             <w:rFonts w:ascii="Simplified Arabic" w:cs="Simplified Arabic" w:eastAsia="Simplified Arabic" w:hAnsi="Simplified Arabic"/>
@@ -1576,7 +1576,7 @@
         </w:rPr>
         <w:t xml:space="preserve">رابط الدراسة: </w:t>
       </w:r>
-      <w:hyperlink w:history="1" r:id="rId1mufktqay1sg_zgsbomga">
+      <w:hyperlink w:history="1" r:id="rIdtri39cnuj3at6fu1a7tzg">
         <w:r>
           <w:rPr>
             <w:rFonts w:ascii="Simplified Arabic" w:cs="Simplified Arabic" w:eastAsia="Simplified Arabic" w:hAnsi="Simplified Arabic"/>
@@ -1737,7 +1737,7 @@
         </w:rPr>
         <w:t xml:space="preserve">رابط الدراسة: </w:t>
       </w:r>
-      <w:hyperlink w:history="1" r:id="rId6dfu7in4yizwoowp4ntfb">
+      <w:hyperlink w:history="1" r:id="rId8mncxcvgc7hl4lwnxkyf_">
         <w:r>
           <w:rPr>
             <w:rFonts w:ascii="Simplified Arabic" w:cs="Simplified Arabic" w:eastAsia="Simplified Arabic" w:hAnsi="Simplified Arabic"/>
@@ -1898,7 +1898,7 @@
         </w:rPr>
         <w:t xml:space="preserve">رابط الدراسة: </w:t>
       </w:r>
-      <w:hyperlink w:history="1" r:id="rIdcxyjjzl1auim9sbq_u9gz">
+      <w:hyperlink w:history="1" r:id="rIdn2wk3_mq02t-fql33v8pj">
         <w:r>
           <w:rPr>
             <w:rFonts w:ascii="Simplified Arabic" w:cs="Simplified Arabic" w:eastAsia="Simplified Arabic" w:hAnsi="Simplified Arabic"/>
@@ -2059,7 +2059,7 @@
         </w:rPr>
         <w:t xml:space="preserve">رابط الدراسة: </w:t>
       </w:r>
-      <w:hyperlink w:history="1" r:id="rIdgh11rlwl7cpvp2pulqycq">
+      <w:hyperlink w:history="1" r:id="rIde2vz_nybfypgh8jysovb3">
         <w:r>
           <w:rPr>
             <w:rFonts w:ascii="Simplified Arabic" w:cs="Simplified Arabic" w:eastAsia="Simplified Arabic" w:hAnsi="Simplified Arabic"/>
@@ -2220,7 +2220,7 @@
         </w:rPr>
         <w:t xml:space="preserve">رابط الدراسة: </w:t>
       </w:r>
-      <w:hyperlink w:history="1" r:id="rIdwbvihyyn6d0unvwjhsci6">
+      <w:hyperlink w:history="1" r:id="rIdotdrzsp_6elmlcnobn2je">
         <w:r>
           <w:rPr>
             <w:rFonts w:ascii="Simplified Arabic" w:cs="Simplified Arabic" w:eastAsia="Simplified Arabic" w:hAnsi="Simplified Arabic"/>
@@ -2381,7 +2381,7 @@
         </w:rPr>
         <w:t xml:space="preserve">رابط الدراسة: </w:t>
       </w:r>
-      <w:hyperlink w:history="1" r:id="rIdnenwpq5n9kxoywlljhkbd">
+      <w:hyperlink w:history="1" r:id="rIdnrh1wlcc7apnnivq-a794">
         <w:r>
           <w:rPr>
             <w:rFonts w:ascii="Simplified Arabic" w:cs="Simplified Arabic" w:eastAsia="Simplified Arabic" w:hAnsi="Simplified Arabic"/>
@@ -2542,7 +2542,7 @@
         </w:rPr>
         <w:t xml:space="preserve">رابط الدراسة: </w:t>
       </w:r>
-      <w:hyperlink w:history="1" r:id="rId0lrjlouhhjolrmndxy2tx">
+      <w:hyperlink w:history="1" r:id="rIdfi416q5jd-cnnfwlt0vwz">
         <w:r>
           <w:rPr>
             <w:rFonts w:ascii="Simplified Arabic" w:cs="Simplified Arabic" w:eastAsia="Simplified Arabic" w:hAnsi="Simplified Arabic"/>
@@ -2703,7 +2703,7 @@
         </w:rPr>
         <w:t xml:space="preserve">رابط الدراسة: </w:t>
       </w:r>
-      <w:hyperlink w:history="1" r:id="rIdfabh5gf2_dcrpcvlmaocg">
+      <w:hyperlink w:history="1" r:id="rIdefeqypzjvip-ui2sxluoh">
         <w:r>
           <w:rPr>
             <w:rFonts w:ascii="Simplified Arabic" w:cs="Simplified Arabic" w:eastAsia="Simplified Arabic" w:hAnsi="Simplified Arabic"/>
@@ -2864,7 +2864,7 @@
         </w:rPr>
         <w:t xml:space="preserve">رابط الدراسة: </w:t>
       </w:r>
-      <w:hyperlink w:history="1" r:id="rIdu1zt46yxnualzkvmstu-8">
+      <w:hyperlink w:history="1" r:id="rId4s755vzptv2bubtj4anoy">
         <w:r>
           <w:rPr>
             <w:rFonts w:ascii="Simplified Arabic" w:cs="Simplified Arabic" w:eastAsia="Simplified Arabic" w:hAnsi="Simplified Arabic"/>
@@ -3025,7 +3025,7 @@
         </w:rPr>
         <w:t xml:space="preserve">رابط الدراسة: </w:t>
       </w:r>
-      <w:hyperlink w:history="1" r:id="rIda_gu50jfwzl5_jdon_jtc">
+      <w:hyperlink w:history="1" r:id="rIdsecleh03rtryzeds7fcfh">
         <w:r>
           <w:rPr>
             <w:rFonts w:ascii="Simplified Arabic" w:cs="Simplified Arabic" w:eastAsia="Simplified Arabic" w:hAnsi="Simplified Arabic"/>
@@ -3186,7 +3186,7 @@
         </w:rPr>
         <w:t xml:space="preserve">رابط الدراسة: </w:t>
       </w:r>
-      <w:hyperlink w:history="1" r:id="rIdlgw6ocscf3nvlmmyyzkit">
+      <w:hyperlink w:history="1" r:id="rIdm51ud775lmxeklq1imsgm">
         <w:r>
           <w:rPr>
             <w:rFonts w:ascii="Simplified Arabic" w:cs="Simplified Arabic" w:eastAsia="Simplified Arabic" w:hAnsi="Simplified Arabic"/>
@@ -3367,7 +3367,7 @@
         </w:rPr>
         <w:t xml:space="preserve">رابط الدراسة: </w:t>
       </w:r>
-      <w:hyperlink w:history="1" r:id="rIdzu2vyub01zz6xa2wzn2bd">
+      <w:hyperlink w:history="1" r:id="rIdk_nurcfnfvzwhlgjhj6tf">
         <w:r>
           <w:rPr>
             <w:rFonts w:ascii="Simplified Arabic" w:cs="Simplified Arabic" w:eastAsia="Simplified Arabic" w:hAnsi="Simplified Arabic"/>
@@ -3528,7 +3528,7 @@
         </w:rPr>
         <w:t xml:space="preserve">رابط الدراسة: </w:t>
       </w:r>
-      <w:hyperlink w:history="1" r:id="rIdxbecqxsxrpeujwqe9m_bx">
+      <w:hyperlink w:history="1" r:id="rIdoeifconc-uczxcybpxsyc">
         <w:r>
           <w:rPr>
             <w:rFonts w:ascii="Simplified Arabic" w:cs="Simplified Arabic" w:eastAsia="Simplified Arabic" w:hAnsi="Simplified Arabic"/>
@@ -3689,7 +3689,7 @@
         </w:rPr>
         <w:t xml:space="preserve">رابط الدراسة: </w:t>
       </w:r>
-      <w:hyperlink w:history="1" r:id="rId7yxcjqalhia9dbiwr-qmn">
+      <w:hyperlink w:history="1" r:id="rIdf0xkt9z7p6d78axu_9byj">
         <w:r>
           <w:rPr>
             <w:rFonts w:ascii="Simplified Arabic" w:cs="Simplified Arabic" w:eastAsia="Simplified Arabic" w:hAnsi="Simplified Arabic"/>
@@ -3850,7 +3850,7 @@
         </w:rPr>
         <w:t xml:space="preserve">رابط الدراسة: </w:t>
       </w:r>
-      <w:hyperlink w:history="1" r:id="rIdrg7i7ozsobnsovzizgwh9">
+      <w:hyperlink w:history="1" r:id="rId-e9gcdsmrjxla44zz7m4i">
         <w:r>
           <w:rPr>
             <w:rFonts w:ascii="Simplified Arabic" w:cs="Simplified Arabic" w:eastAsia="Simplified Arabic" w:hAnsi="Simplified Arabic"/>
@@ -4011,7 +4011,7 @@
         </w:rPr>
         <w:t xml:space="preserve">رابط الدراسة: </w:t>
       </w:r>
-      <w:hyperlink w:history="1" r:id="rIdygxdspaxbtahz6dtahtj-">
+      <w:hyperlink w:history="1" r:id="rIdzhgxjio0nsoar4jac5bv4">
         <w:r>
           <w:rPr>
             <w:rFonts w:ascii="Simplified Arabic" w:cs="Simplified Arabic" w:eastAsia="Simplified Arabic" w:hAnsi="Simplified Arabic"/>
@@ -4172,7 +4172,7 @@
         </w:rPr>
         <w:t xml:space="preserve">رابط الدراسة: </w:t>
       </w:r>
-      <w:hyperlink w:history="1" r:id="rIdxqpnaczy4nbsdnqxsvo4-">
+      <w:hyperlink w:history="1" r:id="rIdv5gqbfqc6uwbswym9f9uz">
         <w:r>
           <w:rPr>
             <w:rFonts w:ascii="Simplified Arabic" w:cs="Simplified Arabic" w:eastAsia="Simplified Arabic" w:hAnsi="Simplified Arabic"/>
@@ -4333,7 +4333,7 @@
         </w:rPr>
         <w:t xml:space="preserve">رابط الدراسة: </w:t>
       </w:r>
-      <w:hyperlink w:history="1" r:id="rIdxnaepnsgd_dm5iko548hb">
+      <w:hyperlink w:history="1" r:id="rId8vnzzse7qbnfik6v7q4ly">
         <w:r>
           <w:rPr>
             <w:rFonts w:ascii="Simplified Arabic" w:cs="Simplified Arabic" w:eastAsia="Simplified Arabic" w:hAnsi="Simplified Arabic"/>
@@ -4494,7 +4494,7 @@
         </w:rPr>
         <w:t xml:space="preserve">رابط الدراسة: </w:t>
       </w:r>
-      <w:hyperlink w:history="1" r:id="rIdvezxkrjjtqhc_gf8-bhdh">
+      <w:hyperlink w:history="1" r:id="rIdprknekzxul7leqb7hftke">
         <w:r>
           <w:rPr>
             <w:rFonts w:ascii="Simplified Arabic" w:cs="Simplified Arabic" w:eastAsia="Simplified Arabic" w:hAnsi="Simplified Arabic"/>
@@ -4655,7 +4655,7 @@
         </w:rPr>
         <w:t xml:space="preserve">رابط الدراسة: </w:t>
       </w:r>
-      <w:hyperlink w:history="1" r:id="rIdys2ffik8nhlehz_uz2n2l">
+      <w:hyperlink w:history="1" r:id="rIdtiwa1kwr6ylaspzmy7riy">
         <w:r>
           <w:rPr>
             <w:rFonts w:ascii="Simplified Arabic" w:cs="Simplified Arabic" w:eastAsia="Simplified Arabic" w:hAnsi="Simplified Arabic"/>
@@ -4816,7 +4816,7 @@
         </w:rPr>
         <w:t xml:space="preserve">رابط الدراسة: </w:t>
       </w:r>
-      <w:hyperlink w:history="1" r:id="rIdnsjqrarpuolwhdjmzdljt">
+      <w:hyperlink w:history="1" r:id="rIdkgepyf-sbyfsj5p9hsgob">
         <w:r>
           <w:rPr>
             <w:rFonts w:ascii="Simplified Arabic" w:cs="Simplified Arabic" w:eastAsia="Simplified Arabic" w:hAnsi="Simplified Arabic"/>

</xml_diff>